<commit_message>
Use plain black report formatting and remove web links
</commit_message>
<xml_diff>
--- a/reports/Отчет.docx
+++ b/reports/Отчет.docx
@@ -4,6 +4,7 @@
   <w:body>
     <w:p>
       <w:pPr>
+        <w:ind w:firstLine="0"/>
         <w:jc w:val="center"/>
       </w:pPr>
       <w:r>
@@ -12,6 +13,7 @@
     </w:p>
     <w:p>
       <w:pPr>
+        <w:ind w:firstLine="0"/>
         <w:jc w:val="center"/>
       </w:pPr>
       <w:r>
@@ -31,6 +33,7 @@
     </w:p>
     <w:p>
       <w:pPr>
+        <w:ind w:firstLine="0"/>
         <w:jc w:val="center"/>
       </w:pPr>
       <w:r>
@@ -39,6 +42,7 @@
     </w:p>
     <w:p>
       <w:pPr>
+        <w:ind w:firstLine="0"/>
         <w:jc w:val="center"/>
       </w:pPr>
       <w:r>
@@ -47,6 +51,7 @@
     </w:p>
     <w:p>
       <w:pPr>
+        <w:ind w:firstLine="0"/>
         <w:jc w:val="center"/>
       </w:pPr>
       <w:r>
@@ -79,6 +84,7 @@
     </w:p>
     <w:p>
       <w:pPr>
+        <w:ind w:firstLine="0"/>
         <w:jc w:val="center"/>
       </w:pPr>
       <w:r>
@@ -128,6 +134,7 @@
     </w:p>
     <w:p>
       <w:pPr>
+        <w:ind w:firstLine="0"/>
         <w:jc w:val="center"/>
       </w:pPr>
       <w:r>
@@ -149,6 +156,7 @@
     </w:p>
     <w:p>
       <w:pPr>
+        <w:ind w:firstLine="0"/>
         <w:jc w:val="center"/>
       </w:pPr>
       <w:r>
@@ -173,6 +181,7 @@
     </w:p>
     <w:p>
       <w:pPr>
+        <w:ind w:firstLine="0"/>
         <w:jc w:val="center"/>
       </w:pPr>
       <w:r>
@@ -191,6 +200,7 @@
     </w:p>
     <w:p>
       <w:pPr>
+        <w:ind w:firstLine="0"/>
         <w:jc w:val="center"/>
       </w:pPr>
       <w:r>
@@ -222,6 +232,7 @@
     </w:p>
     <w:p>
       <w:pPr>
+        <w:ind w:firstLine="0"/>
         <w:jc w:val="center"/>
       </w:pPr>
       <w:r>
@@ -251,6 +262,7 @@
     </w:p>
     <w:p>
       <w:pPr>
+        <w:ind w:firstLine="0"/>
         <w:jc w:val="center"/>
       </w:pPr>
       <w:r>
@@ -267,6 +279,7 @@
     </w:p>
     <w:p>
       <w:pPr>
+        <w:ind w:firstLine="0"/>
         <w:jc w:val="center"/>
       </w:pPr>
       <w:r>
@@ -290,6 +303,7 @@
     </w:p>
     <w:p>
       <w:pPr>
+        <w:ind w:firstLine="0"/>
         <w:jc w:val="center"/>
       </w:pPr>
       <w:r>
@@ -311,6 +325,7 @@
     </w:p>
     <w:p>
       <w:pPr>
+        <w:ind w:firstLine="0"/>
         <w:jc w:val="center"/>
       </w:pPr>
       <w:r>
@@ -356,6 +371,10 @@
             <w:tcW w:type="dxa" w:w="4986"/>
           </w:tcPr>
           <w:p>
+            <w:pPr>
+              <w:ind w:firstLine="0"/>
+              <w:jc w:val="left"/>
+            </w:pPr>
             <w:r>
               <w:t>Файл / функция</w:t>
             </w:r>
@@ -366,6 +385,10 @@
             <w:tcW w:type="dxa" w:w="4986"/>
           </w:tcPr>
           <w:p>
+            <w:pPr>
+              <w:ind w:firstLine="0"/>
+              <w:jc w:val="left"/>
+            </w:pPr>
             <w:r>
               <w:t>Назначение</w:t>
             </w:r>
@@ -378,6 +401,10 @@
             <w:tcW w:type="dxa" w:w="4986"/>
           </w:tcPr>
           <w:p>
+            <w:pPr>
+              <w:ind w:firstLine="0"/>
+              <w:jc w:val="left"/>
+            </w:pPr>
             <w:r>
               <w:t>Image.h, Image.cpp</w:t>
             </w:r>
@@ -388,6 +415,10 @@
             <w:tcW w:type="dxa" w:w="4986"/>
           </w:tcPr>
           <w:p>
+            <w:pPr>
+              <w:ind w:firstLine="0"/>
+              <w:jc w:val="left"/>
+            </w:pPr>
             <w:r>
               <w:t>Заданный интерфейс и работа с памятью, пикселями и PNG.</w:t>
             </w:r>
@@ -400,6 +431,10 @@
             <w:tcW w:type="dxa" w:w="4986"/>
           </w:tcPr>
           <w:p>
+            <w:pPr>
+              <w:ind w:firstLine="0"/>
+              <w:jc w:val="left"/>
+            </w:pPr>
             <w:r>
               <w:t>Processing.h, Processing.cpp</w:t>
             </w:r>
@@ -410,6 +445,10 @@
             <w:tcW w:type="dxa" w:w="4986"/>
           </w:tcPr>
           <w:p>
+            <w:pPr>
+              <w:ind w:firstLine="0"/>
+              <w:jc w:val="left"/>
+            </w:pPr>
             <w:r>
               <w:t>Отдельные функции обработки без расширения Image.</w:t>
             </w:r>
@@ -422,6 +461,10 @@
             <w:tcW w:type="dxa" w:w="4986"/>
           </w:tcPr>
           <w:p>
+            <w:pPr>
+              <w:ind w:firstLine="0"/>
+              <w:jc w:val="left"/>
+            </w:pPr>
             <w:r>
               <w:t>processing::grayscale</w:t>
             </w:r>
@@ -432,6 +475,10 @@
             <w:tcW w:type="dxa" w:w="4986"/>
           </w:tcPr>
           <w:p>
+            <w:pPr>
+              <w:ind w:firstLine="0"/>
+              <w:jc w:val="left"/>
+            </w:pPr>
             <w:r>
               <w:t>Преобразование яркости по (1).</w:t>
             </w:r>
@@ -444,6 +491,10 @@
             <w:tcW w:type="dxa" w:w="4986"/>
           </w:tcPr>
           <w:p>
+            <w:pPr>
+              <w:ind w:firstLine="0"/>
+              <w:jc w:val="left"/>
+            </w:pPr>
             <w:r>
               <w:t>processing::edges</w:t>
             </w:r>
@@ -454,6 +505,10 @@
             <w:tcW w:type="dxa" w:w="4986"/>
           </w:tcPr>
           <w:p>
+            <w:pPr>
+              <w:ind w:firstLine="0"/>
+              <w:jc w:val="left"/>
+            </w:pPr>
             <w:r>
               <w:t>Выбор Лапласа, Робертса или Собела; формулы (3)–(5).</w:t>
             </w:r>
@@ -466,6 +521,10 @@
             <w:tcW w:type="dxa" w:w="4986"/>
           </w:tcPr>
           <w:p>
+            <w:pPr>
+              <w:ind w:firstLine="0"/>
+              <w:jc w:val="left"/>
+            </w:pPr>
             <w:r>
               <w:t>processing::average</w:t>
             </w:r>
@@ -476,6 +535,10 @@
             <w:tcW w:type="dxa" w:w="4986"/>
           </w:tcPr>
           <w:p>
+            <w:pPr>
+              <w:ind w:firstLine="0"/>
+              <w:jc w:val="left"/>
+            </w:pPr>
             <w:r>
               <w:t>Равные или гауссовы веса; формулы (6), (7).</w:t>
             </w:r>
@@ -488,6 +551,10 @@
             <w:tcW w:type="dxa" w:w="4986"/>
           </w:tcPr>
           <w:p>
+            <w:pPr>
+              <w:ind w:firstLine="0"/>
+              <w:jc w:val="left"/>
+            </w:pPr>
             <w:r>
               <w:t>processing::rank</w:t>
             </w:r>
@@ -498,6 +565,10 @@
             <w:tcW w:type="dxa" w:w="4986"/>
           </w:tcPr>
           <w:p>
+            <w:pPr>
+              <w:ind w:firstLine="0"/>
+              <w:jc w:val="left"/>
+            </w:pPr>
             <w:r>
               <w:t>Минимум, медиана и максимум; формула (8).</w:t>
             </w:r>
@@ -510,6 +581,10 @@
             <w:tcW w:type="dxa" w:w="4986"/>
           </w:tcPr>
           <w:p>
+            <w:pPr>
+              <w:ind w:firstLine="0"/>
+              <w:jc w:val="left"/>
+            </w:pPr>
             <w:r>
               <w:t>main.cpp</w:t>
             </w:r>
@@ -520,6 +595,10 @@
             <w:tcW w:type="dxa" w:w="4986"/>
           </w:tcPr>
           <w:p>
+            <w:pPr>
+              <w:ind w:firstLine="0"/>
+              <w:jc w:val="left"/>
+            </w:pPr>
             <w:r>
               <w:t>Чтение пути входа и каталога выхода, последовательный запуск всех методов.</w:t>
             </w:r>
@@ -587,7 +666,7 @@
                     <pic:cNvPicPr/>
                   </pic:nvPicPr>
                   <pic:blipFill>
-                    <a:blip r:embed="rId9"/>
+                    <a:blip r:embed="rId10"/>
                     <a:stretch>
                       <a:fillRect/>
                     </a:stretch>
@@ -607,6 +686,10 @@
       </w:r>
     </w:p>
     <w:p>
+      <w:pPr>
+        <w:ind w:firstLine="0"/>
+        <w:jc w:val="center"/>
+      </w:pPr>
       <w:r>
         <w:rPr>
           <w:sz w:val="20"/>
@@ -659,7 +742,7 @@
                     <pic:cNvPicPr/>
                   </pic:nvPicPr>
                   <pic:blipFill>
-                    <a:blip r:embed="rId10"/>
+                    <a:blip r:embed="rId11"/>
                     <a:stretch>
                       <a:fillRect/>
                     </a:stretch>
@@ -679,6 +762,10 @@
       </w:r>
     </w:p>
     <w:p>
+      <w:pPr>
+        <w:ind w:firstLine="0"/>
+        <w:jc w:val="center"/>
+      </w:pPr>
       <w:r>
         <w:rPr>
           <w:sz w:val="20"/>
@@ -713,7 +800,7 @@
                     <pic:cNvPicPr/>
                   </pic:nvPicPr>
                   <pic:blipFill>
-                    <a:blip r:embed="rId11"/>
+                    <a:blip r:embed="rId12"/>
                     <a:stretch>
                       <a:fillRect/>
                     </a:stretch>
@@ -733,6 +820,10 @@
       </w:r>
     </w:p>
     <w:p>
+      <w:pPr>
+        <w:ind w:firstLine="0"/>
+        <w:jc w:val="center"/>
+      </w:pPr>
       <w:r>
         <w:rPr>
           <w:sz w:val="20"/>
@@ -780,7 +871,7 @@
                     <pic:cNvPicPr/>
                   </pic:nvPicPr>
                   <pic:blipFill>
-                    <a:blip r:embed="rId12"/>
+                    <a:blip r:embed="rId13"/>
                     <a:stretch>
                       <a:fillRect/>
                     </a:stretch>
@@ -800,6 +891,10 @@
       </w:r>
     </w:p>
     <w:p>
+      <w:pPr>
+        <w:ind w:firstLine="0"/>
+        <w:jc w:val="center"/>
+      </w:pPr>
       <w:r>
         <w:rPr>
           <w:sz w:val="20"/>
@@ -826,6 +921,10 @@
             <w:tcW w:type="dxa" w:w="1994"/>
           </w:tcPr>
           <w:p>
+            <w:pPr>
+              <w:ind w:firstLine="0"/>
+              <w:jc w:val="left"/>
+            </w:pPr>
             <w:r>
               <w:t>Метод</w:t>
             </w:r>
@@ -836,6 +935,10 @@
             <w:tcW w:type="dxa" w:w="1994"/>
           </w:tcPr>
           <w:p>
+            <w:pPr>
+              <w:ind w:firstLine="0"/>
+              <w:jc w:val="left"/>
+            </w:pPr>
             <w:r>
               <w:t>А: MSE</w:t>
             </w:r>
@@ -846,6 +949,10 @@
             <w:tcW w:type="dxa" w:w="1994"/>
           </w:tcPr>
           <w:p>
+            <w:pPr>
+              <w:ind w:firstLine="0"/>
+              <w:jc w:val="left"/>
+            </w:pPr>
             <w:r>
               <w:t>А: PSNR, дБ</w:t>
             </w:r>
@@ -856,6 +963,10 @@
             <w:tcW w:type="dxa" w:w="1994"/>
           </w:tcPr>
           <w:p>
+            <w:pPr>
+              <w:ind w:firstLine="0"/>
+              <w:jc w:val="left"/>
+            </w:pPr>
             <w:r>
               <w:t>Б: MSE</w:t>
             </w:r>
@@ -866,6 +977,10 @@
             <w:tcW w:type="dxa" w:w="1994"/>
           </w:tcPr>
           <w:p>
+            <w:pPr>
+              <w:ind w:firstLine="0"/>
+              <w:jc w:val="left"/>
+            </w:pPr>
             <w:r>
               <w:t>Б: PSNR, дБ</w:t>
             </w:r>
@@ -878,6 +993,10 @@
             <w:tcW w:type="dxa" w:w="1994"/>
           </w:tcPr>
           <w:p>
+            <w:pPr>
+              <w:ind w:firstLine="0"/>
+              <w:jc w:val="left"/>
+            </w:pPr>
             <w:r>
               <w:t>Вход с шумом</w:t>
             </w:r>
@@ -888,6 +1007,10 @@
             <w:tcW w:type="dxa" w:w="1994"/>
           </w:tcPr>
           <w:p>
+            <w:pPr>
+              <w:ind w:firstLine="0"/>
+              <w:jc w:val="left"/>
+            </w:pPr>
             <w:r>
               <w:t>321.50</w:t>
             </w:r>
@@ -898,6 +1021,10 @@
             <w:tcW w:type="dxa" w:w="1994"/>
           </w:tcPr>
           <w:p>
+            <w:pPr>
+              <w:ind w:firstLine="0"/>
+              <w:jc w:val="left"/>
+            </w:pPr>
             <w:r>
               <w:t>23.06</w:t>
             </w:r>
@@ -908,6 +1035,10 @@
             <w:tcW w:type="dxa" w:w="1994"/>
           </w:tcPr>
           <w:p>
+            <w:pPr>
+              <w:ind w:firstLine="0"/>
+              <w:jc w:val="left"/>
+            </w:pPr>
             <w:r>
               <w:t>321.63</w:t>
             </w:r>
@@ -918,6 +1049,10 @@
             <w:tcW w:type="dxa" w:w="1994"/>
           </w:tcPr>
           <w:p>
+            <w:pPr>
+              <w:ind w:firstLine="0"/>
+              <w:jc w:val="left"/>
+            </w:pPr>
             <w:r>
               <w:t>23.06</w:t>
             </w:r>
@@ -930,6 +1065,10 @@
             <w:tcW w:type="dxa" w:w="1994"/>
           </w:tcPr>
           <w:p>
+            <w:pPr>
+              <w:ind w:firstLine="0"/>
+              <w:jc w:val="left"/>
+            </w:pPr>
             <w:r>
               <w:t>Среднее 3×3</w:t>
             </w:r>
@@ -940,6 +1079,10 @@
             <w:tcW w:type="dxa" w:w="1994"/>
           </w:tcPr>
           <w:p>
+            <w:pPr>
+              <w:ind w:firstLine="0"/>
+              <w:jc w:val="left"/>
+            </w:pPr>
             <w:r>
               <w:t>111.66</w:t>
             </w:r>
@@ -950,6 +1093,10 @@
             <w:tcW w:type="dxa" w:w="1994"/>
           </w:tcPr>
           <w:p>
+            <w:pPr>
+              <w:ind w:firstLine="0"/>
+              <w:jc w:val="left"/>
+            </w:pPr>
             <w:r>
               <w:t>27.65</w:t>
             </w:r>
@@ -960,6 +1107,10 @@
             <w:tcW w:type="dxa" w:w="1994"/>
           </w:tcPr>
           <w:p>
+            <w:pPr>
+              <w:ind w:firstLine="0"/>
+              <w:jc w:val="left"/>
+            </w:pPr>
             <w:r>
               <w:t>437.16</w:t>
             </w:r>
@@ -970,6 +1121,10 @@
             <w:tcW w:type="dxa" w:w="1994"/>
           </w:tcPr>
           <w:p>
+            <w:pPr>
+              <w:ind w:firstLine="0"/>
+              <w:jc w:val="left"/>
+            </w:pPr>
             <w:r>
               <w:t>21.72</w:t>
             </w:r>
@@ -982,6 +1137,10 @@
             <w:tcW w:type="dxa" w:w="1994"/>
           </w:tcPr>
           <w:p>
+            <w:pPr>
+              <w:ind w:firstLine="0"/>
+              <w:jc w:val="left"/>
+            </w:pPr>
             <w:r>
               <w:t>Среднее 5×5</w:t>
             </w:r>
@@ -992,6 +1151,10 @@
             <w:tcW w:type="dxa" w:w="1994"/>
           </w:tcPr>
           <w:p>
+            <w:pPr>
+              <w:ind w:firstLine="0"/>
+              <w:jc w:val="left"/>
+            </w:pPr>
             <w:r>
               <w:t>147.53</w:t>
             </w:r>
@@ -1002,6 +1165,10 @@
             <w:tcW w:type="dxa" w:w="1994"/>
           </w:tcPr>
           <w:p>
+            <w:pPr>
+              <w:ind w:firstLine="0"/>
+              <w:jc w:val="left"/>
+            </w:pPr>
             <w:r>
               <w:t>26.44</w:t>
             </w:r>
@@ -1012,6 +1179,10 @@
             <w:tcW w:type="dxa" w:w="1994"/>
           </w:tcPr>
           <w:p>
+            <w:pPr>
+              <w:ind w:firstLine="0"/>
+              <w:jc w:val="left"/>
+            </w:pPr>
             <w:r>
               <w:t>873.40</w:t>
             </w:r>
@@ -1022,6 +1193,10 @@
             <w:tcW w:type="dxa" w:w="1994"/>
           </w:tcPr>
           <w:p>
+            <w:pPr>
+              <w:ind w:firstLine="0"/>
+              <w:jc w:val="left"/>
+            </w:pPr>
             <w:r>
               <w:t>18.72</w:t>
             </w:r>
@@ -1034,6 +1209,10 @@
             <w:tcW w:type="dxa" w:w="1994"/>
           </w:tcPr>
           <w:p>
+            <w:pPr>
+              <w:ind w:firstLine="0"/>
+              <w:jc w:val="left"/>
+            </w:pPr>
             <w:r>
               <w:t>Гаусс 5×5</w:t>
             </w:r>
@@ -1044,6 +1223,10 @@
             <w:tcW w:type="dxa" w:w="1994"/>
           </w:tcPr>
           <w:p>
+            <w:pPr>
+              <w:ind w:firstLine="0"/>
+              <w:jc w:val="left"/>
+            </w:pPr>
             <w:r>
               <w:t>95.38</w:t>
             </w:r>
@@ -1054,6 +1237,10 @@
             <w:tcW w:type="dxa" w:w="1994"/>
           </w:tcPr>
           <w:p>
+            <w:pPr>
+              <w:ind w:firstLine="0"/>
+              <w:jc w:val="left"/>
+            </w:pPr>
             <w:r>
               <w:t>28.34</w:t>
             </w:r>
@@ -1064,6 +1251,10 @@
             <w:tcW w:type="dxa" w:w="1994"/>
           </w:tcPr>
           <w:p>
+            <w:pPr>
+              <w:ind w:firstLine="0"/>
+              <w:jc w:val="left"/>
+            </w:pPr>
             <w:r>
               <w:t>400.27</w:t>
             </w:r>
@@ -1074,6 +1265,10 @@
             <w:tcW w:type="dxa" w:w="1994"/>
           </w:tcPr>
           <w:p>
+            <w:pPr>
+              <w:ind w:firstLine="0"/>
+              <w:jc w:val="left"/>
+            </w:pPr>
             <w:r>
               <w:t>22.11</w:t>
             </w:r>
@@ -1126,7 +1321,7 @@
                     <pic:cNvPicPr/>
                   </pic:nvPicPr>
                   <pic:blipFill>
-                    <a:blip r:embed="rId13"/>
+                    <a:blip r:embed="rId14"/>
                     <a:stretch>
                       <a:fillRect/>
                     </a:stretch>
@@ -1146,6 +1341,10 @@
       </w:r>
     </w:p>
     <w:p>
+      <w:pPr>
+        <w:ind w:firstLine="0"/>
+        <w:jc w:val="center"/>
+      </w:pPr>
       <w:r>
         <w:rPr>
           <w:sz w:val="20"/>
@@ -1172,6 +1371,10 @@
             <w:tcW w:type="dxa" w:w="1994"/>
           </w:tcPr>
           <w:p>
+            <w:pPr>
+              <w:ind w:firstLine="0"/>
+              <w:jc w:val="left"/>
+            </w:pPr>
             <w:r>
               <w:t>Метод</w:t>
             </w:r>
@@ -1182,6 +1385,10 @@
             <w:tcW w:type="dxa" w:w="1994"/>
           </w:tcPr>
           <w:p>
+            <w:pPr>
+              <w:ind w:firstLine="0"/>
+              <w:jc w:val="left"/>
+            </w:pPr>
             <w:r>
               <w:t>А: MSE</w:t>
             </w:r>
@@ -1192,6 +1399,10 @@
             <w:tcW w:type="dxa" w:w="1994"/>
           </w:tcPr>
           <w:p>
+            <w:pPr>
+              <w:ind w:firstLine="0"/>
+              <w:jc w:val="left"/>
+            </w:pPr>
             <w:r>
               <w:t>А: PSNR, дБ</w:t>
             </w:r>
@@ -1202,6 +1413,10 @@
             <w:tcW w:type="dxa" w:w="1994"/>
           </w:tcPr>
           <w:p>
+            <w:pPr>
+              <w:ind w:firstLine="0"/>
+              <w:jc w:val="left"/>
+            </w:pPr>
             <w:r>
               <w:t>Б: MSE</w:t>
             </w:r>
@@ -1212,6 +1427,10 @@
             <w:tcW w:type="dxa" w:w="1994"/>
           </w:tcPr>
           <w:p>
+            <w:pPr>
+              <w:ind w:firstLine="0"/>
+              <w:jc w:val="left"/>
+            </w:pPr>
             <w:r>
               <w:t>Б: PSNR, дБ</w:t>
             </w:r>
@@ -1224,6 +1443,10 @@
             <w:tcW w:type="dxa" w:w="1994"/>
           </w:tcPr>
           <w:p>
+            <w:pPr>
+              <w:ind w:firstLine="0"/>
+              <w:jc w:val="left"/>
+            </w:pPr>
             <w:r>
               <w:t>Вход с шумом</w:t>
             </w:r>
@@ -1234,6 +1457,10 @@
             <w:tcW w:type="dxa" w:w="1994"/>
           </w:tcPr>
           <w:p>
+            <w:pPr>
+              <w:ind w:firstLine="0"/>
+              <w:jc w:val="left"/>
+            </w:pPr>
             <w:r>
               <w:t>321.50</w:t>
             </w:r>
@@ -1244,6 +1471,10 @@
             <w:tcW w:type="dxa" w:w="1994"/>
           </w:tcPr>
           <w:p>
+            <w:pPr>
+              <w:ind w:firstLine="0"/>
+              <w:jc w:val="left"/>
+            </w:pPr>
             <w:r>
               <w:t>23.06</w:t>
             </w:r>
@@ -1254,6 +1485,10 @@
             <w:tcW w:type="dxa" w:w="1994"/>
           </w:tcPr>
           <w:p>
+            <w:pPr>
+              <w:ind w:firstLine="0"/>
+              <w:jc w:val="left"/>
+            </w:pPr>
             <w:r>
               <w:t>321.63</w:t>
             </w:r>
@@ -1264,6 +1499,10 @@
             <w:tcW w:type="dxa" w:w="1994"/>
           </w:tcPr>
           <w:p>
+            <w:pPr>
+              <w:ind w:firstLine="0"/>
+              <w:jc w:val="left"/>
+            </w:pPr>
             <w:r>
               <w:t>23.06</w:t>
             </w:r>
@@ -1276,6 +1515,10 @@
             <w:tcW w:type="dxa" w:w="1994"/>
           </w:tcPr>
           <w:p>
+            <w:pPr>
+              <w:ind w:firstLine="0"/>
+              <w:jc w:val="left"/>
+            </w:pPr>
             <w:r>
               <w:t>Медиана 3×3</w:t>
             </w:r>
@@ -1286,6 +1529,10 @@
             <w:tcW w:type="dxa" w:w="1994"/>
           </w:tcPr>
           <w:p>
+            <w:pPr>
+              <w:ind w:firstLine="0"/>
+              <w:jc w:val="left"/>
+            </w:pPr>
             <w:r>
               <w:t>65.27</w:t>
             </w:r>
@@ -1296,6 +1543,10 @@
             <w:tcW w:type="dxa" w:w="1994"/>
           </w:tcPr>
           <w:p>
+            <w:pPr>
+              <w:ind w:firstLine="0"/>
+              <w:jc w:val="left"/>
+            </w:pPr>
             <w:r>
               <w:t>29.98</w:t>
             </w:r>
@@ -1306,6 +1557,10 @@
             <w:tcW w:type="dxa" w:w="1994"/>
           </w:tcPr>
           <w:p>
+            <w:pPr>
+              <w:ind w:firstLine="0"/>
+              <w:jc w:val="left"/>
+            </w:pPr>
             <w:r>
               <w:t>124.90</w:t>
             </w:r>
@@ -1316,6 +1571,10 @@
             <w:tcW w:type="dxa" w:w="1994"/>
           </w:tcPr>
           <w:p>
+            <w:pPr>
+              <w:ind w:firstLine="0"/>
+              <w:jc w:val="left"/>
+            </w:pPr>
             <w:r>
               <w:t>27.17</w:t>
             </w:r>
@@ -1328,6 +1587,10 @@
             <w:tcW w:type="dxa" w:w="1994"/>
           </w:tcPr>
           <w:p>
+            <w:pPr>
+              <w:ind w:firstLine="0"/>
+              <w:jc w:val="left"/>
+            </w:pPr>
             <w:r>
               <w:t>Медиана 5×5</w:t>
             </w:r>
@@ -1338,6 +1601,10 @@
             <w:tcW w:type="dxa" w:w="1994"/>
           </w:tcPr>
           <w:p>
+            <w:pPr>
+              <w:ind w:firstLine="0"/>
+              <w:jc w:val="left"/>
+            </w:pPr>
             <w:r>
               <w:t>44.62</w:t>
             </w:r>
@@ -1348,6 +1615,10 @@
             <w:tcW w:type="dxa" w:w="1994"/>
           </w:tcPr>
           <w:p>
+            <w:pPr>
+              <w:ind w:firstLine="0"/>
+              <w:jc w:val="left"/>
+            </w:pPr>
             <w:r>
               <w:t>31.64</w:t>
             </w:r>
@@ -1358,6 +1629,10 @@
             <w:tcW w:type="dxa" w:w="1994"/>
           </w:tcPr>
           <w:p>
+            <w:pPr>
+              <w:ind w:firstLine="0"/>
+              <w:jc w:val="left"/>
+            </w:pPr>
             <w:r>
               <w:t>830.54</w:t>
             </w:r>
@@ -1368,6 +1643,10 @@
             <w:tcW w:type="dxa" w:w="1994"/>
           </w:tcPr>
           <w:p>
+            <w:pPr>
+              <w:ind w:firstLine="0"/>
+              <w:jc w:val="left"/>
+            </w:pPr>
             <w:r>
               <w:t>18.94</w:t>
             </w:r>
@@ -1380,6 +1659,10 @@
             <w:tcW w:type="dxa" w:w="1994"/>
           </w:tcPr>
           <w:p>
+            <w:pPr>
+              <w:ind w:firstLine="0"/>
+              <w:jc w:val="left"/>
+            </w:pPr>
             <w:r>
               <w:t>Минимум 3×3</w:t>
             </w:r>
@@ -1390,6 +1673,10 @@
             <w:tcW w:type="dxa" w:w="1994"/>
           </w:tcPr>
           <w:p>
+            <w:pPr>
+              <w:ind w:firstLine="0"/>
+              <w:jc w:val="left"/>
+            </w:pPr>
             <w:r>
               <w:t>1306.65</w:t>
             </w:r>
@@ -1400,6 +1687,10 @@
             <w:tcW w:type="dxa" w:w="1994"/>
           </w:tcPr>
           <w:p>
+            <w:pPr>
+              <w:ind w:firstLine="0"/>
+              <w:jc w:val="left"/>
+            </w:pPr>
             <w:r>
               <w:t>16.97</w:t>
             </w:r>
@@ -1410,6 +1701,10 @@
             <w:tcW w:type="dxa" w:w="1994"/>
           </w:tcPr>
           <w:p>
+            <w:pPr>
+              <w:ind w:firstLine="0"/>
+              <w:jc w:val="left"/>
+            </w:pPr>
             <w:r>
               <w:t>2975.02</w:t>
             </w:r>
@@ -1420,6 +1715,10 @@
             <w:tcW w:type="dxa" w:w="1994"/>
           </w:tcPr>
           <w:p>
+            <w:pPr>
+              <w:ind w:firstLine="0"/>
+              <w:jc w:val="left"/>
+            </w:pPr>
             <w:r>
               <w:t>13.40</w:t>
             </w:r>
@@ -1432,6 +1731,10 @@
             <w:tcW w:type="dxa" w:w="1994"/>
           </w:tcPr>
           <w:p>
+            <w:pPr>
+              <w:ind w:firstLine="0"/>
+              <w:jc w:val="left"/>
+            </w:pPr>
             <w:r>
               <w:t>Максимум 3×3</w:t>
             </w:r>
@@ -1442,6 +1745,10 @@
             <w:tcW w:type="dxa" w:w="1994"/>
           </w:tcPr>
           <w:p>
+            <w:pPr>
+              <w:ind w:firstLine="0"/>
+              <w:jc w:val="left"/>
+            </w:pPr>
             <w:r>
               <w:t>1230.13</w:t>
             </w:r>
@@ -1452,6 +1759,10 @@
             <w:tcW w:type="dxa" w:w="1994"/>
           </w:tcPr>
           <w:p>
+            <w:pPr>
+              <w:ind w:firstLine="0"/>
+              <w:jc w:val="left"/>
+            </w:pPr>
             <w:r>
               <w:t>17.23</w:t>
             </w:r>
@@ -1462,6 +1773,10 @@
             <w:tcW w:type="dxa" w:w="1994"/>
           </w:tcPr>
           <w:p>
+            <w:pPr>
+              <w:ind w:firstLine="0"/>
+              <w:jc w:val="left"/>
+            </w:pPr>
             <w:r>
               <w:t>2866.88</w:t>
             </w:r>
@@ -1472,6 +1787,10 @@
             <w:tcW w:type="dxa" w:w="1994"/>
           </w:tcPr>
           <w:p>
+            <w:pPr>
+              <w:ind w:firstLine="0"/>
+              <w:jc w:val="left"/>
+            </w:pPr>
             <w:r>
               <w:t>13.56</w:t>
             </w:r>
@@ -1542,17 +1861,17 @@
     </w:p>
     <w:p>
       <w:r>
-        <w:t>2. Библиотеки stb_image / stb_image_write: https://github.com/nothings/stb — чтение и запись PNG; файлы предоставлены в задании.</w:t>
+        <w:t>2. Библиотеки stb_image и stb_image_write для чтения и записи PNG. Заголовочные файлы предоставлены вместе с заданием.</w:t>
       </w:r>
     </w:p>
     <w:p>
       <w:r>
-        <w:t>3. doctest: https://github.com/doctest/doctest — тестовое окружение из задания.</w:t>
+        <w:t>3. Библиотека doctest. Тестовое окружение и проверки класса Image из материалов задания.</w:t>
       </w:r>
     </w:p>
     <w:p>
       <w:r>
-        <w:t>4. ImageMagick: https://imagemagick.org/script/command-line-options.php — параметры -seed, -attenuate, +noise Gaussian.</w:t>
+        <w:t>4. Справочная документация ImageMagick. Добавление гауссова шума, выбор его интенсивности и начального значения генератора.</w:t>
       </w:r>
     </w:p>
     <w:p>
@@ -1584,6 +1903,8 @@
     <w:p>
       <w:pPr>
         <w:spacing w:line="240" w:lineRule="auto"/>
+        <w:ind w:firstLine="0"/>
+        <w:jc w:val="left"/>
       </w:pPr>
       <w:r>
         <w:rPr>
@@ -1734,6 +2055,8 @@
     <w:p>
       <w:pPr>
         <w:spacing w:line="240" w:lineRule="auto"/>
+        <w:ind w:firstLine="0"/>
+        <w:jc w:val="left"/>
       </w:pPr>
       <w:r>
         <w:rPr>
@@ -1877,6 +2200,8 @@
     <w:p>
       <w:pPr>
         <w:spacing w:line="240" w:lineRule="auto"/>
+        <w:ind w:firstLine="0"/>
+        <w:jc w:val="left"/>
       </w:pPr>
       <w:r>
         <w:rPr>
@@ -2023,6 +2348,8 @@
     <w:p>
       <w:pPr>
         <w:spacing w:line="240" w:lineRule="auto"/>
+        <w:ind w:firstLine="0"/>
+        <w:jc w:val="left"/>
       </w:pPr>
       <w:r>
         <w:rPr>
@@ -2077,13 +2404,28 @@
       </w:r>
     </w:p>
     <w:sectPr>
+      <w:footerReference w:type="default" r:id="rId9"/>
       <w:pgSz w:w="12240" w:h="15840"/>
       <w:pgMar w:top="1134" w:right="1134" w:bottom="1134" w:left="1134" w:header="720" w:footer="720" w:gutter="0"/>
       <w:cols w:space="720"/>
+      <w:titlePg/>
       <w:docGrid w:linePitch="360"/>
     </w:sectPr>
   </w:body>
 </w:document>
+</file>
+
+<file path=word/footer1.xml><?xml version="1.0" encoding="utf-8"?>
+<w:ftr xmlns:m="http://schemas.openxmlformats.org/officeDocument/2006/math" xmlns:mc="http://schemas.openxmlformats.org/markup-compatibility/2006" xmlns:mo="http://schemas.microsoft.com/office/mac/office/2008/main" xmlns:mv="urn:schemas-microsoft-com:mac:vml" xmlns:o="urn:schemas-microsoft-com:office:office" xmlns:r="http://schemas.openxmlformats.org/officeDocument/2006/relationships" xmlns:v="urn:schemas-microsoft-com:vml" xmlns:w10="urn:schemas-microsoft-com:office:word" xmlns:w14="http://schemas.microsoft.com/office/word/2010/wordml" xmlns:w="http://schemas.openxmlformats.org/wordprocessingml/2006/main" xmlns:wne="http://schemas.microsoft.com/office/word/2006/wordml" xmlns:wp14="http://schemas.microsoft.com/office/word/2010/wordprocessingDrawing" xmlns:wp="http://schemas.openxmlformats.org/drawingml/2006/wordprocessingDrawing" xmlns:wpc="http://schemas.microsoft.com/office/word/2010/wordprocessingCanvas" xmlns:wpg="http://schemas.microsoft.com/office/word/2010/wordprocessingGroup" xmlns:wpi="http://schemas.microsoft.com/office/word/2010/wordprocessingInk" xmlns:wps="http://schemas.microsoft.com/office/word/2010/wordprocessingShape" mc:Ignorable="w14 wp14">
+  <w:p>
+    <w:pPr>
+      <w:pStyle w:val="Footer"/>
+      <w:ind w:firstLine="0"/>
+      <w:jc w:val="center"/>
+    </w:pPr>
+    <w:fldSimple w:instr="PAGE"/>
+  </w:p>
+</w:ftr>
 </file>
 
 <file path=word/numbering.xml><?xml version="1.0" encoding="utf-8"?>
@@ -2450,11 +2792,16 @@
     <w:qFormat/>
     <w:rsid w:val="00FC693F"/>
     <w:pPr>
-      <w:spacing w:after="120"/>
+      <w:widowControl/>
+      <w:spacing w:after="120" w:line="276" w:lineRule="auto"/>
+      <w:ind w:firstLine="709"/>
+      <w:jc w:val="both"/>
     </w:pPr>
     <w:rPr>
       <w:rFonts w:ascii="Times New Roman" w:hAnsi="Times New Roman"/>
+      <w:color w:val="000000"/>
       <w:sz w:val="24"/>
+      <w:u w:val="none"/>
     </w:rPr>
   </w:style>
   <w:style w:type="paragraph" w:styleId="Header">
@@ -2471,6 +2818,11 @@
       </w:tabs>
       <w:spacing w:after="0" w:line="240" w:lineRule="auto"/>
     </w:pPr>
+    <w:rPr>
+      <w:rFonts w:ascii="Times New Roman" w:hAnsi="Times New Roman"/>
+      <w:color w:val="000000"/>
+      <w:u w:val="none"/>
+    </w:rPr>
   </w:style>
   <w:style w:type="character" w:customStyle="1" w:styleId="HeaderChar">
     <w:name w:val="Header Char"/>
@@ -2478,6 +2830,11 @@
     <w:link w:val="Header"/>
     <w:uiPriority w:val="99"/>
     <w:rsid w:val="00E618BF"/>
+    <w:rPr>
+      <w:rFonts w:ascii="Times New Roman" w:hAnsi="Times New Roman"/>
+      <w:color w:val="000000"/>
+      <w:u w:val="none"/>
+    </w:rPr>
   </w:style>
   <w:style w:type="paragraph" w:styleId="Footer">
     <w:name w:val="footer"/>
@@ -2493,6 +2850,11 @@
       </w:tabs>
       <w:spacing w:after="0" w:line="240" w:lineRule="auto"/>
     </w:pPr>
+    <w:rPr>
+      <w:rFonts w:ascii="Times New Roman" w:hAnsi="Times New Roman"/>
+      <w:color w:val="000000"/>
+      <w:u w:val="none"/>
+    </w:rPr>
   </w:style>
   <w:style w:type="character" w:customStyle="1" w:styleId="FooterChar">
     <w:name w:val="Footer Char"/>
@@ -2500,6 +2862,11 @@
     <w:link w:val="Footer"/>
     <w:uiPriority w:val="99"/>
     <w:rsid w:val="00E618BF"/>
+    <w:rPr>
+      <w:rFonts w:ascii="Times New Roman" w:hAnsi="Times New Roman"/>
+      <w:color w:val="000000"/>
+      <w:u w:val="none"/>
+    </w:rPr>
   </w:style>
   <w:style w:type="paragraph" w:styleId="Heading1">
     <w:name w:val="heading 1"/>
@@ -2513,15 +2880,18 @@
       <w:keepNext/>
       <w:keepLines/>
       <w:spacing w:before="480" w:after="0"/>
+      <w:ind w:firstLine="0"/>
+      <w:jc w:val="left"/>
       <w:outlineLvl w:val="0"/>
     </w:pPr>
     <w:rPr>
-      <w:rFonts w:asciiTheme="majorHAnsi" w:eastAsiaTheme="majorEastAsia" w:hAnsiTheme="majorHAnsi" w:cstheme="majorBidi"/>
+      <w:rFonts w:ascii="Times New Roman" w:hAnsi="Times New Roman"/>
       <w:b/>
       <w:bCs/>
-      <w:color w:val="365F91" w:themeColor="accent1" w:themeShade="BF"/>
+      <w:color w:val="000000"/>
       <w:sz w:val="28"/>
       <w:szCs w:val="28"/>
+      <w:u w:val="none"/>
     </w:rPr>
   </w:style>
   <w:style w:type="paragraph" w:styleId="Heading2">
@@ -2540,12 +2910,13 @@
       <w:outlineLvl w:val="1"/>
     </w:pPr>
     <w:rPr>
-      <w:rFonts w:asciiTheme="majorHAnsi" w:eastAsiaTheme="majorEastAsia" w:hAnsiTheme="majorHAnsi" w:cstheme="majorBidi"/>
+      <w:rFonts w:ascii="Times New Roman" w:hAnsi="Times New Roman"/>
       <w:b/>
       <w:bCs/>
-      <w:color w:val="4F81BD" w:themeColor="accent1"/>
+      <w:color w:val="000000"/>
       <w:sz w:val="26"/>
       <w:szCs w:val="26"/>
+      <w:u w:val="none"/>
     </w:rPr>
   </w:style>
   <w:style w:type="paragraph" w:styleId="Heading3">
@@ -2564,10 +2935,11 @@
       <w:outlineLvl w:val="2"/>
     </w:pPr>
     <w:rPr>
-      <w:rFonts w:asciiTheme="majorHAnsi" w:eastAsiaTheme="majorEastAsia" w:hAnsiTheme="majorHAnsi" w:cstheme="majorBidi"/>
+      <w:rFonts w:ascii="Times New Roman" w:hAnsi="Times New Roman"/>
       <w:b/>
       <w:bCs/>
-      <w:color w:val="4F81BD" w:themeColor="accent1"/>
+      <w:color w:val="000000"/>
+      <w:u w:val="none"/>
     </w:rPr>
   </w:style>
   <w:style w:type="paragraph" w:styleId="Heading4">
@@ -2587,12 +2959,13 @@
       <w:outlineLvl w:val="3"/>
     </w:pPr>
     <w:rPr>
-      <w:rFonts w:asciiTheme="majorHAnsi" w:eastAsiaTheme="majorEastAsia" w:hAnsiTheme="majorHAnsi" w:cstheme="majorBidi"/>
+      <w:rFonts w:ascii="Times New Roman" w:hAnsi="Times New Roman"/>
       <w:b/>
       <w:bCs/>
       <w:i/>
       <w:iCs/>
-      <w:color w:val="4F81BD" w:themeColor="accent1"/>
+      <w:color w:val="000000"/>
+      <w:u w:val="none"/>
     </w:rPr>
   </w:style>
   <w:style w:type="paragraph" w:styleId="Heading5">
@@ -2612,8 +2985,9 @@
       <w:outlineLvl w:val="4"/>
     </w:pPr>
     <w:rPr>
-      <w:rFonts w:asciiTheme="majorHAnsi" w:eastAsiaTheme="majorEastAsia" w:hAnsiTheme="majorHAnsi" w:cstheme="majorBidi"/>
-      <w:color w:val="243F60" w:themeColor="accent1" w:themeShade="7F"/>
+      <w:rFonts w:ascii="Times New Roman" w:hAnsi="Times New Roman"/>
+      <w:color w:val="000000"/>
+      <w:u w:val="none"/>
     </w:rPr>
   </w:style>
   <w:style w:type="paragraph" w:styleId="Heading6">
@@ -2633,10 +3007,11 @@
       <w:outlineLvl w:val="5"/>
     </w:pPr>
     <w:rPr>
-      <w:rFonts w:asciiTheme="majorHAnsi" w:eastAsiaTheme="majorEastAsia" w:hAnsiTheme="majorHAnsi" w:cstheme="majorBidi"/>
+      <w:rFonts w:ascii="Times New Roman" w:hAnsi="Times New Roman"/>
       <w:i/>
       <w:iCs/>
-      <w:color w:val="243F60" w:themeColor="accent1" w:themeShade="7F"/>
+      <w:color w:val="000000"/>
+      <w:u w:val="none"/>
     </w:rPr>
   </w:style>
   <w:style w:type="paragraph" w:styleId="Heading7">
@@ -2656,10 +3031,11 @@
       <w:outlineLvl w:val="6"/>
     </w:pPr>
     <w:rPr>
-      <w:rFonts w:asciiTheme="majorHAnsi" w:eastAsiaTheme="majorEastAsia" w:hAnsiTheme="majorHAnsi" w:cstheme="majorBidi"/>
+      <w:rFonts w:ascii="Times New Roman" w:hAnsi="Times New Roman"/>
       <w:i/>
       <w:iCs/>
-      <w:color w:val="404040" w:themeColor="text1" w:themeTint="BF"/>
+      <w:color w:val="000000"/>
+      <w:u w:val="none"/>
     </w:rPr>
   </w:style>
   <w:style w:type="paragraph" w:styleId="Heading8">
@@ -2679,10 +3055,11 @@
       <w:outlineLvl w:val="7"/>
     </w:pPr>
     <w:rPr>
-      <w:rFonts w:asciiTheme="majorHAnsi" w:eastAsiaTheme="majorEastAsia" w:hAnsiTheme="majorHAnsi" w:cstheme="majorBidi"/>
-      <w:color w:val="4F81BD" w:themeColor="accent1"/>
+      <w:rFonts w:ascii="Times New Roman" w:hAnsi="Times New Roman"/>
+      <w:color w:val="000000"/>
       <w:sz w:val="20"/>
       <w:szCs w:val="20"/>
+      <w:u w:val="none"/>
     </w:rPr>
   </w:style>
   <w:style w:type="paragraph" w:styleId="Heading9">
@@ -2702,12 +3079,13 @@
       <w:outlineLvl w:val="8"/>
     </w:pPr>
     <w:rPr>
-      <w:rFonts w:asciiTheme="majorHAnsi" w:eastAsiaTheme="majorEastAsia" w:hAnsiTheme="majorHAnsi" w:cstheme="majorBidi"/>
+      <w:rFonts w:ascii="Times New Roman" w:hAnsi="Times New Roman"/>
       <w:i/>
       <w:iCs/>
-      <w:color w:val="404040" w:themeColor="text1" w:themeTint="BF"/>
+      <w:color w:val="000000"/>
       <w:sz w:val="20"/>
       <w:szCs w:val="20"/>
+      <w:u w:val="none"/>
     </w:rPr>
   </w:style>
   <w:style w:type="character" w:default="1" w:styleId="DefaultParagraphFont">
@@ -2715,12 +3093,22 @@
     <w:uiPriority w:val="1"/>
     <w:semiHidden/>
     <w:unhideWhenUsed/>
+    <w:rPr>
+      <w:rFonts w:ascii="Times New Roman" w:hAnsi="Times New Roman"/>
+      <w:color w:val="000000"/>
+      <w:u w:val="none"/>
+    </w:rPr>
   </w:style>
   <w:style w:type="table" w:default="1" w:styleId="TableNormal">
     <w:name w:val="Normal Table"/>
     <w:uiPriority w:val="99"/>
     <w:semiHidden/>
     <w:unhideWhenUsed/>
+    <w:rPr>
+      <w:rFonts w:ascii="Times New Roman" w:hAnsi="Times New Roman"/>
+      <w:color w:val="000000"/>
+      <w:u w:val="none"/>
+    </w:rPr>
     <w:tblPr>
       <w:tblInd w:w="0" w:type="dxa"/>
       <w:tblCellMar>
@@ -2745,6 +3133,11 @@
     <w:pPr>
       <w:spacing w:after="0" w:line="240" w:lineRule="auto"/>
     </w:pPr>
+    <w:rPr>
+      <w:rFonts w:ascii="Times New Roman" w:hAnsi="Times New Roman"/>
+      <w:color w:val="000000"/>
+      <w:u w:val="none"/>
+    </w:rPr>
   </w:style>
   <w:style w:type="character" w:customStyle="1" w:styleId="Heading1Char">
     <w:name w:val="Heading 1 Char"/>
@@ -2753,12 +3146,13 @@
     <w:uiPriority w:val="9"/>
     <w:rsid w:val="00FC693F"/>
     <w:rPr>
-      <w:rFonts w:asciiTheme="majorHAnsi" w:eastAsiaTheme="majorEastAsia" w:hAnsiTheme="majorHAnsi" w:cstheme="majorBidi"/>
+      <w:rFonts w:ascii="Times New Roman" w:hAnsi="Times New Roman"/>
       <w:b/>
       <w:bCs/>
-      <w:color w:val="365F91" w:themeColor="accent1" w:themeShade="BF"/>
+      <w:color w:val="000000"/>
       <w:sz w:val="28"/>
       <w:szCs w:val="28"/>
+      <w:u w:val="none"/>
     </w:rPr>
   </w:style>
   <w:style w:type="character" w:customStyle="1" w:styleId="Heading2Char">
@@ -2768,12 +3162,13 @@
     <w:uiPriority w:val="9"/>
     <w:rsid w:val="00FC693F"/>
     <w:rPr>
-      <w:rFonts w:asciiTheme="majorHAnsi" w:eastAsiaTheme="majorEastAsia" w:hAnsiTheme="majorHAnsi" w:cstheme="majorBidi"/>
+      <w:rFonts w:ascii="Times New Roman" w:hAnsi="Times New Roman"/>
       <w:b/>
       <w:bCs/>
-      <w:color w:val="4F81BD" w:themeColor="accent1"/>
+      <w:color w:val="000000"/>
       <w:sz w:val="26"/>
       <w:szCs w:val="26"/>
+      <w:u w:val="none"/>
     </w:rPr>
   </w:style>
   <w:style w:type="character" w:customStyle="1" w:styleId="Heading3Char">
@@ -2783,10 +3178,11 @@
     <w:uiPriority w:val="9"/>
     <w:rsid w:val="00FC693F"/>
     <w:rPr>
-      <w:rFonts w:asciiTheme="majorHAnsi" w:eastAsiaTheme="majorEastAsia" w:hAnsiTheme="majorHAnsi" w:cstheme="majorBidi"/>
+      <w:rFonts w:ascii="Times New Roman" w:hAnsi="Times New Roman"/>
       <w:b/>
       <w:bCs/>
-      <w:color w:val="4F81BD" w:themeColor="accent1"/>
+      <w:color w:val="000000"/>
+      <w:u w:val="none"/>
     </w:rPr>
   </w:style>
   <w:style w:type="paragraph" w:styleId="Title">
@@ -2805,12 +3201,13 @@
       <w:contextualSpacing/>
     </w:pPr>
     <w:rPr>
-      <w:rFonts w:asciiTheme="majorHAnsi" w:eastAsiaTheme="majorEastAsia" w:hAnsiTheme="majorHAnsi" w:cstheme="majorBidi"/>
-      <w:color w:val="17365D" w:themeColor="text2" w:themeShade="BF"/>
+      <w:rFonts w:ascii="Times New Roman" w:hAnsi="Times New Roman"/>
+      <w:color w:val="000000"/>
       <w:spacing w:val="5"/>
       <w:kern w:val="28"/>
       <w:sz w:val="52"/>
       <w:szCs w:val="52"/>
+      <w:u w:val="none"/>
     </w:rPr>
   </w:style>
   <w:style w:type="character" w:customStyle="1" w:styleId="TitleChar">
@@ -2820,12 +3217,13 @@
     <w:uiPriority w:val="10"/>
     <w:rsid w:val="00FC693F"/>
     <w:rPr>
-      <w:rFonts w:asciiTheme="majorHAnsi" w:eastAsiaTheme="majorEastAsia" w:hAnsiTheme="majorHAnsi" w:cstheme="majorBidi"/>
-      <w:color w:val="17365D" w:themeColor="text2" w:themeShade="BF"/>
+      <w:rFonts w:ascii="Times New Roman" w:hAnsi="Times New Roman"/>
+      <w:color w:val="000000"/>
       <w:spacing w:val="5"/>
       <w:kern w:val="28"/>
       <w:sz w:val="52"/>
       <w:szCs w:val="52"/>
+      <w:u w:val="none"/>
     </w:rPr>
   </w:style>
   <w:style w:type="paragraph" w:styleId="Subtitle">
@@ -2842,13 +3240,14 @@
       </w:numPr>
     </w:pPr>
     <w:rPr>
-      <w:rFonts w:asciiTheme="majorHAnsi" w:eastAsiaTheme="majorEastAsia" w:hAnsiTheme="majorHAnsi" w:cstheme="majorBidi"/>
+      <w:rFonts w:ascii="Times New Roman" w:hAnsi="Times New Roman"/>
       <w:i/>
       <w:iCs/>
-      <w:color w:val="4F81BD" w:themeColor="accent1"/>
+      <w:color w:val="000000"/>
       <w:spacing w:val="15"/>
       <w:sz w:val="24"/>
       <w:szCs w:val="24"/>
+      <w:u w:val="none"/>
     </w:rPr>
   </w:style>
   <w:style w:type="character" w:customStyle="1" w:styleId="SubtitleChar">
@@ -2858,13 +3257,14 @@
     <w:uiPriority w:val="11"/>
     <w:rsid w:val="00FC693F"/>
     <w:rPr>
-      <w:rFonts w:asciiTheme="majorHAnsi" w:eastAsiaTheme="majorEastAsia" w:hAnsiTheme="majorHAnsi" w:cstheme="majorBidi"/>
+      <w:rFonts w:ascii="Times New Roman" w:hAnsi="Times New Roman"/>
       <w:i/>
       <w:iCs/>
-      <w:color w:val="4F81BD" w:themeColor="accent1"/>
+      <w:color w:val="000000"/>
       <w:spacing w:val="15"/>
       <w:sz w:val="24"/>
       <w:szCs w:val="24"/>
+      <w:u w:val="none"/>
     </w:rPr>
   </w:style>
   <w:style w:type="paragraph" w:styleId="ListParagraph">
@@ -2877,6 +3277,11 @@
       <w:ind w:left="720"/>
       <w:contextualSpacing/>
     </w:pPr>
+    <w:rPr>
+      <w:rFonts w:ascii="Times New Roman" w:hAnsi="Times New Roman"/>
+      <w:color w:val="000000"/>
+      <w:u w:val="none"/>
+    </w:rPr>
   </w:style>
   <w:style w:type="paragraph" w:styleId="BodyText">
     <w:name w:val="Body Text"/>
@@ -2888,6 +3293,11 @@
     <w:pPr>
       <w:spacing w:after="120"/>
     </w:pPr>
+    <w:rPr>
+      <w:rFonts w:ascii="Times New Roman" w:hAnsi="Times New Roman"/>
+      <w:color w:val="000000"/>
+      <w:u w:val="none"/>
+    </w:rPr>
   </w:style>
   <w:style w:type="character" w:customStyle="1" w:styleId="BodyTextChar">
     <w:name w:val="Body Text Char"/>
@@ -2895,6 +3305,11 @@
     <w:link w:val="BodyText"/>
     <w:uiPriority w:val="99"/>
     <w:rsid w:val="00AA1D8D"/>
+    <w:rPr>
+      <w:rFonts w:ascii="Times New Roman" w:hAnsi="Times New Roman"/>
+      <w:color w:val="000000"/>
+      <w:u w:val="none"/>
+    </w:rPr>
   </w:style>
   <w:style w:type="paragraph" w:styleId="BodyText2">
     <w:name w:val="Body Text 2"/>
@@ -2906,6 +3321,11 @@
     <w:pPr>
       <w:spacing w:after="120" w:line="480" w:lineRule="auto"/>
     </w:pPr>
+    <w:rPr>
+      <w:rFonts w:ascii="Times New Roman" w:hAnsi="Times New Roman"/>
+      <w:color w:val="000000"/>
+      <w:u w:val="none"/>
+    </w:rPr>
   </w:style>
   <w:style w:type="character" w:customStyle="1" w:styleId="BodyText2Char">
     <w:name w:val="Body Text 2 Char"/>
@@ -2913,6 +3333,11 @@
     <w:link w:val="BodyText2"/>
     <w:uiPriority w:val="99"/>
     <w:rsid w:val="00AA1D8D"/>
+    <w:rPr>
+      <w:rFonts w:ascii="Times New Roman" w:hAnsi="Times New Roman"/>
+      <w:color w:val="000000"/>
+      <w:u w:val="none"/>
+    </w:rPr>
   </w:style>
   <w:style w:type="paragraph" w:styleId="BodyText3">
     <w:name w:val="Body Text 3"/>
@@ -2925,8 +3350,11 @@
       <w:spacing w:after="120"/>
     </w:pPr>
     <w:rPr>
+      <w:rFonts w:ascii="Times New Roman" w:hAnsi="Times New Roman"/>
+      <w:color w:val="000000"/>
       <w:sz w:val="16"/>
       <w:szCs w:val="16"/>
+      <w:u w:val="none"/>
     </w:rPr>
   </w:style>
   <w:style w:type="character" w:customStyle="1" w:styleId="BodyText3Char">
@@ -2936,8 +3364,11 @@
     <w:uiPriority w:val="99"/>
     <w:rsid w:val="00AA1D8D"/>
     <w:rPr>
+      <w:rFonts w:ascii="Times New Roman" w:hAnsi="Times New Roman"/>
+      <w:color w:val="000000"/>
       <w:sz w:val="16"/>
       <w:szCs w:val="16"/>
+      <w:u w:val="none"/>
     </w:rPr>
   </w:style>
   <w:style w:type="paragraph" w:styleId="List">
@@ -2950,6 +3381,11 @@
       <w:ind w:left="360" w:hanging="360"/>
       <w:contextualSpacing/>
     </w:pPr>
+    <w:rPr>
+      <w:rFonts w:ascii="Times New Roman" w:hAnsi="Times New Roman"/>
+      <w:color w:val="000000"/>
+      <w:u w:val="none"/>
+    </w:rPr>
   </w:style>
   <w:style w:type="paragraph" w:styleId="List2">
     <w:name w:val="List 2"/>
@@ -2961,6 +3397,11 @@
       <w:ind w:left="720" w:hanging="360"/>
       <w:contextualSpacing/>
     </w:pPr>
+    <w:rPr>
+      <w:rFonts w:ascii="Times New Roman" w:hAnsi="Times New Roman"/>
+      <w:color w:val="000000"/>
+      <w:u w:val="none"/>
+    </w:rPr>
   </w:style>
   <w:style w:type="paragraph" w:styleId="List3">
     <w:name w:val="List 3"/>
@@ -2972,6 +3413,11 @@
       <w:ind w:left="1080" w:hanging="360"/>
       <w:contextualSpacing/>
     </w:pPr>
+    <w:rPr>
+      <w:rFonts w:ascii="Times New Roman" w:hAnsi="Times New Roman"/>
+      <w:color w:val="000000"/>
+      <w:u w:val="none"/>
+    </w:rPr>
   </w:style>
   <w:style w:type="paragraph" w:styleId="ListBullet">
     <w:name w:val="List Bullet"/>
@@ -2985,6 +3431,11 @@
       </w:numPr>
       <w:contextualSpacing/>
     </w:pPr>
+    <w:rPr>
+      <w:rFonts w:ascii="Times New Roman" w:hAnsi="Times New Roman"/>
+      <w:color w:val="000000"/>
+      <w:u w:val="none"/>
+    </w:rPr>
   </w:style>
   <w:style w:type="paragraph" w:styleId="ListBullet2">
     <w:name w:val="List Bullet 2"/>
@@ -2998,6 +3449,11 @@
       </w:numPr>
       <w:contextualSpacing/>
     </w:pPr>
+    <w:rPr>
+      <w:rFonts w:ascii="Times New Roman" w:hAnsi="Times New Roman"/>
+      <w:color w:val="000000"/>
+      <w:u w:val="none"/>
+    </w:rPr>
   </w:style>
   <w:style w:type="paragraph" w:styleId="ListBullet3">
     <w:name w:val="List Bullet 3"/>
@@ -3011,6 +3467,11 @@
       </w:numPr>
       <w:contextualSpacing/>
     </w:pPr>
+    <w:rPr>
+      <w:rFonts w:ascii="Times New Roman" w:hAnsi="Times New Roman"/>
+      <w:color w:val="000000"/>
+      <w:u w:val="none"/>
+    </w:rPr>
   </w:style>
   <w:style w:type="paragraph" w:styleId="ListNumber">
     <w:name w:val="List Number"/>
@@ -3024,6 +3485,11 @@
       </w:numPr>
       <w:contextualSpacing/>
     </w:pPr>
+    <w:rPr>
+      <w:rFonts w:ascii="Times New Roman" w:hAnsi="Times New Roman"/>
+      <w:color w:val="000000"/>
+      <w:u w:val="none"/>
+    </w:rPr>
   </w:style>
   <w:style w:type="paragraph" w:styleId="ListNumber2">
     <w:name w:val="List Number 2"/>
@@ -3037,6 +3503,11 @@
       </w:numPr>
       <w:contextualSpacing/>
     </w:pPr>
+    <w:rPr>
+      <w:rFonts w:ascii="Times New Roman" w:hAnsi="Times New Roman"/>
+      <w:color w:val="000000"/>
+      <w:u w:val="none"/>
+    </w:rPr>
   </w:style>
   <w:style w:type="paragraph" w:styleId="ListNumber3">
     <w:name w:val="List Number 3"/>
@@ -3050,6 +3521,11 @@
       </w:numPr>
       <w:contextualSpacing/>
     </w:pPr>
+    <w:rPr>
+      <w:rFonts w:ascii="Times New Roman" w:hAnsi="Times New Roman"/>
+      <w:color w:val="000000"/>
+      <w:u w:val="none"/>
+    </w:rPr>
   </w:style>
   <w:style w:type="paragraph" w:styleId="ListContinue">
     <w:name w:val="List Continue"/>
@@ -3062,6 +3538,11 @@
       <w:ind w:left="360"/>
       <w:contextualSpacing/>
     </w:pPr>
+    <w:rPr>
+      <w:rFonts w:ascii="Times New Roman" w:hAnsi="Times New Roman"/>
+      <w:color w:val="000000"/>
+      <w:u w:val="none"/>
+    </w:rPr>
   </w:style>
   <w:style w:type="paragraph" w:styleId="ListContinue2">
     <w:name w:val="List Continue 2"/>
@@ -3074,6 +3555,11 @@
       <w:ind w:left="720"/>
       <w:contextualSpacing/>
     </w:pPr>
+    <w:rPr>
+      <w:rFonts w:ascii="Times New Roman" w:hAnsi="Times New Roman"/>
+      <w:color w:val="000000"/>
+      <w:u w:val="none"/>
+    </w:rPr>
   </w:style>
   <w:style w:type="paragraph" w:styleId="ListContinue3">
     <w:name w:val="List Continue 3"/>
@@ -3086,6 +3572,11 @@
       <w:ind w:left="1080"/>
       <w:contextualSpacing/>
     </w:pPr>
+    <w:rPr>
+      <w:rFonts w:ascii="Times New Roman" w:hAnsi="Times New Roman"/>
+      <w:color w:val="000000"/>
+      <w:u w:val="none"/>
+    </w:rPr>
   </w:style>
   <w:style w:type="paragraph" w:styleId="MacroText">
     <w:name w:val="macro"/>
@@ -3105,9 +3596,11 @@
       </w:tabs>
     </w:pPr>
     <w:rPr>
-      <w:rFonts w:ascii="Courier" w:hAnsi="Courier"/>
+      <w:rFonts w:ascii="Times New Roman" w:hAnsi="Times New Roman"/>
+      <w:color w:val="000000"/>
       <w:sz w:val="20"/>
       <w:szCs w:val="20"/>
+      <w:u w:val="none"/>
     </w:rPr>
   </w:style>
   <w:style w:type="character" w:customStyle="1" w:styleId="MacroTextChar">
@@ -3117,9 +3610,11 @@
     <w:uiPriority w:val="99"/>
     <w:rsid w:val="0029639D"/>
     <w:rPr>
-      <w:rFonts w:ascii="Courier" w:hAnsi="Courier"/>
+      <w:rFonts w:ascii="Times New Roman" w:hAnsi="Times New Roman"/>
+      <w:color w:val="000000"/>
       <w:sz w:val="20"/>
       <w:szCs w:val="20"/>
+      <w:u w:val="none"/>
     </w:rPr>
   </w:style>
   <w:style w:type="paragraph" w:styleId="Quote">
@@ -3131,9 +3626,11 @@
     <w:qFormat/>
     <w:rsid w:val="00FC693F"/>
     <w:rPr>
+      <w:rFonts w:ascii="Times New Roman" w:hAnsi="Times New Roman"/>
       <w:i/>
       <w:iCs/>
-      <w:color w:val="000000" w:themeColor="text1"/>
+      <w:color w:val="000000"/>
+      <w:u w:val="none"/>
     </w:rPr>
   </w:style>
   <w:style w:type="character" w:customStyle="1" w:styleId="QuoteChar">
@@ -3143,9 +3640,11 @@
     <w:uiPriority w:val="29"/>
     <w:rsid w:val="00FC693F"/>
     <w:rPr>
+      <w:rFonts w:ascii="Times New Roman" w:hAnsi="Times New Roman"/>
       <w:i/>
       <w:iCs/>
-      <w:color w:val="000000" w:themeColor="text1"/>
+      <w:color w:val="000000"/>
+      <w:u w:val="none"/>
     </w:rPr>
   </w:style>
   <w:style w:type="character" w:customStyle="1" w:styleId="Heading4Char">
@@ -3156,12 +3655,13 @@
     <w:semiHidden/>
     <w:rsid w:val="00FC693F"/>
     <w:rPr>
-      <w:rFonts w:asciiTheme="majorHAnsi" w:eastAsiaTheme="majorEastAsia" w:hAnsiTheme="majorHAnsi" w:cstheme="majorBidi"/>
+      <w:rFonts w:ascii="Times New Roman" w:hAnsi="Times New Roman"/>
       <w:b/>
       <w:bCs/>
       <w:i/>
       <w:iCs/>
-      <w:color w:val="4F81BD" w:themeColor="accent1"/>
+      <w:color w:val="000000"/>
+      <w:u w:val="none"/>
     </w:rPr>
   </w:style>
   <w:style w:type="character" w:customStyle="1" w:styleId="Heading5Char">
@@ -3172,8 +3672,9 @@
     <w:semiHidden/>
     <w:rsid w:val="00FC693F"/>
     <w:rPr>
-      <w:rFonts w:asciiTheme="majorHAnsi" w:eastAsiaTheme="majorEastAsia" w:hAnsiTheme="majorHAnsi" w:cstheme="majorBidi"/>
-      <w:color w:val="243F60" w:themeColor="accent1" w:themeShade="7F"/>
+      <w:rFonts w:ascii="Times New Roman" w:hAnsi="Times New Roman"/>
+      <w:color w:val="000000"/>
+      <w:u w:val="none"/>
     </w:rPr>
   </w:style>
   <w:style w:type="character" w:customStyle="1" w:styleId="Heading6Char">
@@ -3184,10 +3685,11 @@
     <w:semiHidden/>
     <w:rsid w:val="00FC693F"/>
     <w:rPr>
-      <w:rFonts w:asciiTheme="majorHAnsi" w:eastAsiaTheme="majorEastAsia" w:hAnsiTheme="majorHAnsi" w:cstheme="majorBidi"/>
+      <w:rFonts w:ascii="Times New Roman" w:hAnsi="Times New Roman"/>
       <w:i/>
       <w:iCs/>
-      <w:color w:val="243F60" w:themeColor="accent1" w:themeShade="7F"/>
+      <w:color w:val="000000"/>
+      <w:u w:val="none"/>
     </w:rPr>
   </w:style>
   <w:style w:type="character" w:customStyle="1" w:styleId="Heading7Char">
@@ -3198,10 +3700,11 @@
     <w:semiHidden/>
     <w:rsid w:val="00FC693F"/>
     <w:rPr>
-      <w:rFonts w:asciiTheme="majorHAnsi" w:eastAsiaTheme="majorEastAsia" w:hAnsiTheme="majorHAnsi" w:cstheme="majorBidi"/>
+      <w:rFonts w:ascii="Times New Roman" w:hAnsi="Times New Roman"/>
       <w:i/>
       <w:iCs/>
-      <w:color w:val="404040" w:themeColor="text1" w:themeTint="BF"/>
+      <w:color w:val="000000"/>
+      <w:u w:val="none"/>
     </w:rPr>
   </w:style>
   <w:style w:type="character" w:customStyle="1" w:styleId="Heading8Char">
@@ -3212,10 +3715,11 @@
     <w:semiHidden/>
     <w:rsid w:val="00FC693F"/>
     <w:rPr>
-      <w:rFonts w:asciiTheme="majorHAnsi" w:eastAsiaTheme="majorEastAsia" w:hAnsiTheme="majorHAnsi" w:cstheme="majorBidi"/>
-      <w:color w:val="4F81BD" w:themeColor="accent1"/>
+      <w:rFonts w:ascii="Times New Roman" w:hAnsi="Times New Roman"/>
+      <w:color w:val="000000"/>
       <w:sz w:val="20"/>
       <w:szCs w:val="20"/>
+      <w:u w:val="none"/>
     </w:rPr>
   </w:style>
   <w:style w:type="character" w:customStyle="1" w:styleId="Heading9Char">
@@ -3226,12 +3730,13 @@
     <w:semiHidden/>
     <w:rsid w:val="00FC693F"/>
     <w:rPr>
-      <w:rFonts w:asciiTheme="majorHAnsi" w:eastAsiaTheme="majorEastAsia" w:hAnsiTheme="majorHAnsi" w:cstheme="majorBidi"/>
+      <w:rFonts w:ascii="Times New Roman" w:hAnsi="Times New Roman"/>
       <w:i/>
       <w:iCs/>
-      <w:color w:val="404040" w:themeColor="text1" w:themeTint="BF"/>
+      <w:color w:val="000000"/>
       <w:sz w:val="20"/>
       <w:szCs w:val="20"/>
+      <w:u w:val="none"/>
     </w:rPr>
   </w:style>
   <w:style w:type="paragraph" w:styleId="Caption">
@@ -3247,11 +3752,13 @@
       <w:spacing w:line="240" w:lineRule="auto"/>
     </w:pPr>
     <w:rPr>
+      <w:rFonts w:ascii="Times New Roman" w:hAnsi="Times New Roman"/>
       <w:b/>
       <w:bCs/>
-      <w:color w:val="4F81BD" w:themeColor="accent1"/>
+      <w:color w:val="000000"/>
       <w:sz w:val="18"/>
       <w:szCs w:val="18"/>
+      <w:u w:val="none"/>
     </w:rPr>
   </w:style>
   <w:style w:type="character" w:styleId="Strong">
@@ -3261,8 +3768,11 @@
     <w:qFormat/>
     <w:rsid w:val="00FC693F"/>
     <w:rPr>
+      <w:rFonts w:ascii="Times New Roman" w:hAnsi="Times New Roman"/>
       <w:b/>
       <w:bCs/>
+      <w:color w:val="000000"/>
+      <w:u w:val="none"/>
     </w:rPr>
   </w:style>
   <w:style w:type="character" w:styleId="Emphasis">
@@ -3272,8 +3782,11 @@
     <w:qFormat/>
     <w:rsid w:val="00FC693F"/>
     <w:rPr>
+      <w:rFonts w:ascii="Times New Roman" w:hAnsi="Times New Roman"/>
       <w:i/>
       <w:iCs/>
+      <w:color w:val="000000"/>
+      <w:u w:val="none"/>
     </w:rPr>
   </w:style>
   <w:style w:type="paragraph" w:styleId="IntenseQuote">
@@ -3292,11 +3805,13 @@
       <w:ind w:left="936" w:right="936"/>
     </w:pPr>
     <w:rPr>
+      <w:rFonts w:ascii="Times New Roman" w:hAnsi="Times New Roman"/>
       <w:b/>
       <w:bCs/>
       <w:i/>
       <w:iCs/>
-      <w:color w:val="4F81BD" w:themeColor="accent1"/>
+      <w:color w:val="000000"/>
+      <w:u w:val="none"/>
     </w:rPr>
   </w:style>
   <w:style w:type="character" w:customStyle="1" w:styleId="IntenseQuoteChar">
@@ -3306,11 +3821,13 @@
     <w:uiPriority w:val="30"/>
     <w:rsid w:val="00FC693F"/>
     <w:rPr>
+      <w:rFonts w:ascii="Times New Roman" w:hAnsi="Times New Roman"/>
       <w:b/>
       <w:bCs/>
       <w:i/>
       <w:iCs/>
-      <w:color w:val="4F81BD" w:themeColor="accent1"/>
+      <w:color w:val="000000"/>
+      <w:u w:val="none"/>
     </w:rPr>
   </w:style>
   <w:style w:type="character" w:styleId="SubtleEmphasis">
@@ -3320,9 +3837,11 @@
     <w:qFormat/>
     <w:rsid w:val="00FC693F"/>
     <w:rPr>
+      <w:rFonts w:ascii="Times New Roman" w:hAnsi="Times New Roman"/>
       <w:i/>
       <w:iCs/>
-      <w:color w:val="808080" w:themeColor="text1" w:themeTint="7F"/>
+      <w:color w:val="000000"/>
+      <w:u w:val="none"/>
     </w:rPr>
   </w:style>
   <w:style w:type="character" w:styleId="IntenseEmphasis">
@@ -3332,11 +3851,13 @@
     <w:qFormat/>
     <w:rsid w:val="00FC693F"/>
     <w:rPr>
+      <w:rFonts w:ascii="Times New Roman" w:hAnsi="Times New Roman"/>
       <w:b/>
       <w:bCs/>
       <w:i/>
       <w:iCs/>
-      <w:color w:val="4F81BD" w:themeColor="accent1"/>
+      <w:color w:val="000000"/>
+      <w:u w:val="none"/>
     </w:rPr>
   </w:style>
   <w:style w:type="character" w:styleId="SubtleReference">
@@ -3346,9 +3867,10 @@
     <w:qFormat/>
     <w:rsid w:val="00FC693F"/>
     <w:rPr>
+      <w:rFonts w:ascii="Times New Roman" w:hAnsi="Times New Roman"/>
       <w:smallCaps/>
-      <w:color w:val="C0504D" w:themeColor="accent2"/>
-      <w:u w:val="single"/>
+      <w:color w:val="000000"/>
+      <w:u w:val="none"/>
     </w:rPr>
   </w:style>
   <w:style w:type="character" w:styleId="IntenseReference">
@@ -3358,12 +3880,13 @@
     <w:qFormat/>
     <w:rsid w:val="00FC693F"/>
     <w:rPr>
+      <w:rFonts w:ascii="Times New Roman" w:hAnsi="Times New Roman"/>
       <w:b/>
       <w:bCs/>
       <w:smallCaps/>
-      <w:color w:val="C0504D" w:themeColor="accent2"/>
+      <w:color w:val="000000"/>
       <w:spacing w:val="5"/>
-      <w:u w:val="single"/>
+      <w:u w:val="none"/>
     </w:rPr>
   </w:style>
   <w:style w:type="character" w:styleId="BookTitle">
@@ -3373,10 +3896,13 @@
     <w:qFormat/>
     <w:rsid w:val="00FC693F"/>
     <w:rPr>
+      <w:rFonts w:ascii="Times New Roman" w:hAnsi="Times New Roman"/>
       <w:b/>
       <w:bCs/>
       <w:smallCaps/>
+      <w:color w:val="000000"/>
       <w:spacing w:val="5"/>
+      <w:u w:val="none"/>
     </w:rPr>
   </w:style>
   <w:style w:type="paragraph" w:styleId="TOCHeading">
@@ -3391,6 +3917,11 @@
     <w:pPr>
       <w:outlineLvl w:val="9"/>
     </w:pPr>
+    <w:rPr>
+      <w:rFonts w:ascii="Times New Roman" w:hAnsi="Times New Roman"/>
+      <w:color w:val="000000"/>
+      <w:u w:val="none"/>
+    </w:rPr>
   </w:style>
   <w:style w:type="table" w:styleId="TableGrid">
     <w:name w:val="Table Grid"/>
@@ -3400,6 +3931,11 @@
     <w:pPr>
       <w:spacing w:after="0" w:line="240" w:lineRule="auto"/>
     </w:pPr>
+    <w:rPr>
+      <w:rFonts w:ascii="Times New Roman" w:hAnsi="Times New Roman"/>
+      <w:color w:val="000000"/>
+      <w:u w:val="none"/>
+    </w:rPr>
     <w:tblPr>
       <w:tblInd w:w="0" w:type="dxa"/>
       <w:tblBorders>
@@ -3427,7 +3963,9 @@
       <w:spacing w:after="0" w:line="240" w:lineRule="auto"/>
     </w:pPr>
     <w:rPr>
-      <w:color w:val="000000" w:themeColor="text1" w:themeShade="BF"/>
+      <w:rFonts w:ascii="Times New Roman" w:hAnsi="Times New Roman"/>
+      <w:color w:val="000000"/>
+      <w:u w:val="none"/>
     </w:rPr>
     <w:tblPr>
       <w:tblStyleRowBandSize w:val="1"/>
@@ -3530,7 +4068,9 @@
       <w:spacing w:after="0" w:line="240" w:lineRule="auto"/>
     </w:pPr>
     <w:rPr>
-      <w:color w:val="365F91" w:themeColor="accent1" w:themeShade="BF"/>
+      <w:rFonts w:ascii="Times New Roman" w:hAnsi="Times New Roman"/>
+      <w:color w:val="000000"/>
+      <w:u w:val="none"/>
     </w:rPr>
     <w:tblPr>
       <w:tblStyleRowBandSize w:val="1"/>
@@ -3633,7 +4173,9 @@
       <w:spacing w:after="0" w:line="240" w:lineRule="auto"/>
     </w:pPr>
     <w:rPr>
-      <w:color w:val="943634" w:themeColor="accent2" w:themeShade="BF"/>
+      <w:rFonts w:ascii="Times New Roman" w:hAnsi="Times New Roman"/>
+      <w:color w:val="000000"/>
+      <w:u w:val="none"/>
     </w:rPr>
     <w:tblPr>
       <w:tblStyleRowBandSize w:val="1"/>
@@ -3736,7 +4278,9 @@
       <w:spacing w:after="0" w:line="240" w:lineRule="auto"/>
     </w:pPr>
     <w:rPr>
-      <w:color w:val="76923C" w:themeColor="accent3" w:themeShade="BF"/>
+      <w:rFonts w:ascii="Times New Roman" w:hAnsi="Times New Roman"/>
+      <w:color w:val="000000"/>
+      <w:u w:val="none"/>
     </w:rPr>
     <w:tblPr>
       <w:tblStyleRowBandSize w:val="1"/>
@@ -3839,7 +4383,9 @@
       <w:spacing w:after="0" w:line="240" w:lineRule="auto"/>
     </w:pPr>
     <w:rPr>
-      <w:color w:val="5F497A" w:themeColor="accent4" w:themeShade="BF"/>
+      <w:rFonts w:ascii="Times New Roman" w:hAnsi="Times New Roman"/>
+      <w:color w:val="000000"/>
+      <w:u w:val="none"/>
     </w:rPr>
     <w:tblPr>
       <w:tblStyleRowBandSize w:val="1"/>
@@ -3942,7 +4488,9 @@
       <w:spacing w:after="0" w:line="240" w:lineRule="auto"/>
     </w:pPr>
     <w:rPr>
-      <w:color w:val="31849B" w:themeColor="accent5" w:themeShade="BF"/>
+      <w:rFonts w:ascii="Times New Roman" w:hAnsi="Times New Roman"/>
+      <w:color w:val="000000"/>
+      <w:u w:val="none"/>
     </w:rPr>
     <w:tblPr>
       <w:tblStyleRowBandSize w:val="1"/>
@@ -4045,7 +4593,9 @@
       <w:spacing w:after="0" w:line="240" w:lineRule="auto"/>
     </w:pPr>
     <w:rPr>
-      <w:color w:val="E36C0A" w:themeColor="accent6" w:themeShade="BF"/>
+      <w:rFonts w:ascii="Times New Roman" w:hAnsi="Times New Roman"/>
+      <w:color w:val="000000"/>
+      <w:u w:val="none"/>
     </w:rPr>
     <w:tblPr>
       <w:tblStyleRowBandSize w:val="1"/>
@@ -4147,6 +4697,11 @@
     <w:pPr>
       <w:spacing w:after="0" w:line="240" w:lineRule="auto"/>
     </w:pPr>
+    <w:rPr>
+      <w:rFonts w:ascii="Times New Roman" w:hAnsi="Times New Roman"/>
+      <w:color w:val="000000"/>
+      <w:u w:val="none"/>
+    </w:rPr>
     <w:tblPr>
       <w:tblStyleRowBandSize w:val="1"/>
       <w:tblStyleColBandSize w:val="1"/>
@@ -4171,7 +4726,7 @@
       <w:rPr>
         <w:b/>
         <w:bCs/>
-        <w:color w:val="FFFFFF" w:themeColor="background1"/>
+        <w:color w:val="000000"/>
       </w:rPr>
       <w:tblPr/>
       <w:tcPr>
@@ -4239,6 +4794,11 @@
     <w:pPr>
       <w:spacing w:after="0" w:line="240" w:lineRule="auto"/>
     </w:pPr>
+    <w:rPr>
+      <w:rFonts w:ascii="Times New Roman" w:hAnsi="Times New Roman"/>
+      <w:color w:val="000000"/>
+      <w:u w:val="none"/>
+    </w:rPr>
     <w:tblPr>
       <w:tblStyleRowBandSize w:val="1"/>
       <w:tblStyleColBandSize w:val="1"/>
@@ -4263,7 +4823,7 @@
       <w:rPr>
         <w:b/>
         <w:bCs/>
-        <w:color w:val="FFFFFF" w:themeColor="background1"/>
+        <w:color w:val="000000"/>
       </w:rPr>
       <w:tblPr/>
       <w:tcPr>
@@ -4331,6 +4891,11 @@
     <w:pPr>
       <w:spacing w:after="0" w:line="240" w:lineRule="auto"/>
     </w:pPr>
+    <w:rPr>
+      <w:rFonts w:ascii="Times New Roman" w:hAnsi="Times New Roman"/>
+      <w:color w:val="000000"/>
+      <w:u w:val="none"/>
+    </w:rPr>
     <w:tblPr>
       <w:tblStyleRowBandSize w:val="1"/>
       <w:tblStyleColBandSize w:val="1"/>
@@ -4355,7 +4920,7 @@
       <w:rPr>
         <w:b/>
         <w:bCs/>
-        <w:color w:val="FFFFFF" w:themeColor="background1"/>
+        <w:color w:val="000000"/>
       </w:rPr>
       <w:tblPr/>
       <w:tcPr>
@@ -4423,6 +4988,11 @@
     <w:pPr>
       <w:spacing w:after="0" w:line="240" w:lineRule="auto"/>
     </w:pPr>
+    <w:rPr>
+      <w:rFonts w:ascii="Times New Roman" w:hAnsi="Times New Roman"/>
+      <w:color w:val="000000"/>
+      <w:u w:val="none"/>
+    </w:rPr>
     <w:tblPr>
       <w:tblStyleRowBandSize w:val="1"/>
       <w:tblStyleColBandSize w:val="1"/>
@@ -4447,7 +5017,7 @@
       <w:rPr>
         <w:b/>
         <w:bCs/>
-        <w:color w:val="FFFFFF" w:themeColor="background1"/>
+        <w:color w:val="000000"/>
       </w:rPr>
       <w:tblPr/>
       <w:tcPr>
@@ -4515,6 +5085,11 @@
     <w:pPr>
       <w:spacing w:after="0" w:line="240" w:lineRule="auto"/>
     </w:pPr>
+    <w:rPr>
+      <w:rFonts w:ascii="Times New Roman" w:hAnsi="Times New Roman"/>
+      <w:color w:val="000000"/>
+      <w:u w:val="none"/>
+    </w:rPr>
     <w:tblPr>
       <w:tblStyleRowBandSize w:val="1"/>
       <w:tblStyleColBandSize w:val="1"/>
@@ -4539,7 +5114,7 @@
       <w:rPr>
         <w:b/>
         <w:bCs/>
-        <w:color w:val="FFFFFF" w:themeColor="background1"/>
+        <w:color w:val="000000"/>
       </w:rPr>
       <w:tblPr/>
       <w:tcPr>
@@ -4607,6 +5182,11 @@
     <w:pPr>
       <w:spacing w:after="0" w:line="240" w:lineRule="auto"/>
     </w:pPr>
+    <w:rPr>
+      <w:rFonts w:ascii="Times New Roman" w:hAnsi="Times New Roman"/>
+      <w:color w:val="000000"/>
+      <w:u w:val="none"/>
+    </w:rPr>
     <w:tblPr>
       <w:tblStyleRowBandSize w:val="1"/>
       <w:tblStyleColBandSize w:val="1"/>
@@ -4631,7 +5211,7 @@
       <w:rPr>
         <w:b/>
         <w:bCs/>
-        <w:color w:val="FFFFFF" w:themeColor="background1"/>
+        <w:color w:val="000000"/>
       </w:rPr>
       <w:tblPr/>
       <w:tcPr>
@@ -4699,6 +5279,11 @@
     <w:pPr>
       <w:spacing w:after="0" w:line="240" w:lineRule="auto"/>
     </w:pPr>
+    <w:rPr>
+      <w:rFonts w:ascii="Times New Roman" w:hAnsi="Times New Roman"/>
+      <w:color w:val="000000"/>
+      <w:u w:val="none"/>
+    </w:rPr>
     <w:tblPr>
       <w:tblStyleRowBandSize w:val="1"/>
       <w:tblStyleColBandSize w:val="1"/>
@@ -4723,7 +5308,7 @@
       <w:rPr>
         <w:b/>
         <w:bCs/>
-        <w:color w:val="FFFFFF" w:themeColor="background1"/>
+        <w:color w:val="000000"/>
       </w:rPr>
       <w:tblPr/>
       <w:tcPr>
@@ -4791,6 +5376,11 @@
     <w:pPr>
       <w:spacing w:after="0" w:line="240" w:lineRule="auto"/>
     </w:pPr>
+    <w:rPr>
+      <w:rFonts w:ascii="Times New Roman" w:hAnsi="Times New Roman"/>
+      <w:color w:val="000000"/>
+      <w:u w:val="none"/>
+    </w:rPr>
     <w:tblPr>
       <w:tblStyleRowBandSize w:val="1"/>
       <w:tblStyleColBandSize w:val="1"/>
@@ -4921,6 +5511,11 @@
     <w:pPr>
       <w:spacing w:after="0" w:line="240" w:lineRule="auto"/>
     </w:pPr>
+    <w:rPr>
+      <w:rFonts w:ascii="Times New Roman" w:hAnsi="Times New Roman"/>
+      <w:color w:val="000000"/>
+      <w:u w:val="none"/>
+    </w:rPr>
     <w:tblPr>
       <w:tblStyleRowBandSize w:val="1"/>
       <w:tblStyleColBandSize w:val="1"/>
@@ -5051,6 +5646,11 @@
     <w:pPr>
       <w:spacing w:after="0" w:line="240" w:lineRule="auto"/>
     </w:pPr>
+    <w:rPr>
+      <w:rFonts w:ascii="Times New Roman" w:hAnsi="Times New Roman"/>
+      <w:color w:val="000000"/>
+      <w:u w:val="none"/>
+    </w:rPr>
     <w:tblPr>
       <w:tblStyleRowBandSize w:val="1"/>
       <w:tblStyleColBandSize w:val="1"/>
@@ -5181,6 +5781,11 @@
     <w:pPr>
       <w:spacing w:after="0" w:line="240" w:lineRule="auto"/>
     </w:pPr>
+    <w:rPr>
+      <w:rFonts w:ascii="Times New Roman" w:hAnsi="Times New Roman"/>
+      <w:color w:val="000000"/>
+      <w:u w:val="none"/>
+    </w:rPr>
     <w:tblPr>
       <w:tblStyleRowBandSize w:val="1"/>
       <w:tblStyleColBandSize w:val="1"/>
@@ -5311,6 +5916,11 @@
     <w:pPr>
       <w:spacing w:after="0" w:line="240" w:lineRule="auto"/>
     </w:pPr>
+    <w:rPr>
+      <w:rFonts w:ascii="Times New Roman" w:hAnsi="Times New Roman"/>
+      <w:color w:val="000000"/>
+      <w:u w:val="none"/>
+    </w:rPr>
     <w:tblPr>
       <w:tblStyleRowBandSize w:val="1"/>
       <w:tblStyleColBandSize w:val="1"/>
@@ -5441,6 +6051,11 @@
     <w:pPr>
       <w:spacing w:after="0" w:line="240" w:lineRule="auto"/>
     </w:pPr>
+    <w:rPr>
+      <w:rFonts w:ascii="Times New Roman" w:hAnsi="Times New Roman"/>
+      <w:color w:val="000000"/>
+      <w:u w:val="none"/>
+    </w:rPr>
     <w:tblPr>
       <w:tblStyleRowBandSize w:val="1"/>
       <w:tblStyleColBandSize w:val="1"/>
@@ -5571,6 +6186,11 @@
     <w:pPr>
       <w:spacing w:after="0" w:line="240" w:lineRule="auto"/>
     </w:pPr>
+    <w:rPr>
+      <w:rFonts w:ascii="Times New Roman" w:hAnsi="Times New Roman"/>
+      <w:color w:val="000000"/>
+      <w:u w:val="none"/>
+    </w:rPr>
     <w:tblPr>
       <w:tblStyleRowBandSize w:val="1"/>
       <w:tblStyleColBandSize w:val="1"/>
@@ -5701,6 +6321,11 @@
     <w:pPr>
       <w:spacing w:after="0" w:line="240" w:lineRule="auto"/>
     </w:pPr>
+    <w:rPr>
+      <w:rFonts w:ascii="Times New Roman" w:hAnsi="Times New Roman"/>
+      <w:color w:val="000000"/>
+      <w:u w:val="none"/>
+    </w:rPr>
     <w:tblPr>
       <w:tblStyleRowBandSize w:val="1"/>
       <w:tblStyleColBandSize w:val="1"/>
@@ -5726,7 +6351,7 @@
       <w:rPr>
         <w:b/>
         <w:bCs/>
-        <w:color w:val="FFFFFF" w:themeColor="background1"/>
+        <w:color w:val="000000"/>
       </w:rPr>
       <w:tblPr/>
       <w:tcPr>
@@ -5807,6 +6432,11 @@
     <w:pPr>
       <w:spacing w:after="0" w:line="240" w:lineRule="auto"/>
     </w:pPr>
+    <w:rPr>
+      <w:rFonts w:ascii="Times New Roman" w:hAnsi="Times New Roman"/>
+      <w:color w:val="000000"/>
+      <w:u w:val="none"/>
+    </w:rPr>
     <w:tblPr>
       <w:tblStyleRowBandSize w:val="1"/>
       <w:tblStyleColBandSize w:val="1"/>
@@ -5832,7 +6462,7 @@
       <w:rPr>
         <w:b/>
         <w:bCs/>
-        <w:color w:val="FFFFFF" w:themeColor="background1"/>
+        <w:color w:val="000000"/>
       </w:rPr>
       <w:tblPr/>
       <w:tcPr>
@@ -5913,6 +6543,11 @@
     <w:pPr>
       <w:spacing w:after="0" w:line="240" w:lineRule="auto"/>
     </w:pPr>
+    <w:rPr>
+      <w:rFonts w:ascii="Times New Roman" w:hAnsi="Times New Roman"/>
+      <w:color w:val="000000"/>
+      <w:u w:val="none"/>
+    </w:rPr>
     <w:tblPr>
       <w:tblStyleRowBandSize w:val="1"/>
       <w:tblStyleColBandSize w:val="1"/>
@@ -5938,7 +6573,7 @@
       <w:rPr>
         <w:b/>
         <w:bCs/>
-        <w:color w:val="FFFFFF" w:themeColor="background1"/>
+        <w:color w:val="000000"/>
       </w:rPr>
       <w:tblPr/>
       <w:tcPr>
@@ -6019,6 +6654,11 @@
     <w:pPr>
       <w:spacing w:after="0" w:line="240" w:lineRule="auto"/>
     </w:pPr>
+    <w:rPr>
+      <w:rFonts w:ascii="Times New Roman" w:hAnsi="Times New Roman"/>
+      <w:color w:val="000000"/>
+      <w:u w:val="none"/>
+    </w:rPr>
     <w:tblPr>
       <w:tblStyleRowBandSize w:val="1"/>
       <w:tblStyleColBandSize w:val="1"/>
@@ -6044,7 +6684,7 @@
       <w:rPr>
         <w:b/>
         <w:bCs/>
-        <w:color w:val="FFFFFF" w:themeColor="background1"/>
+        <w:color w:val="000000"/>
       </w:rPr>
       <w:tblPr/>
       <w:tcPr>
@@ -6125,6 +6765,11 @@
     <w:pPr>
       <w:spacing w:after="0" w:line="240" w:lineRule="auto"/>
     </w:pPr>
+    <w:rPr>
+      <w:rFonts w:ascii="Times New Roman" w:hAnsi="Times New Roman"/>
+      <w:color w:val="000000"/>
+      <w:u w:val="none"/>
+    </w:rPr>
     <w:tblPr>
       <w:tblStyleRowBandSize w:val="1"/>
       <w:tblStyleColBandSize w:val="1"/>
@@ -6150,7 +6795,7 @@
       <w:rPr>
         <w:b/>
         <w:bCs/>
-        <w:color w:val="FFFFFF" w:themeColor="background1"/>
+        <w:color w:val="000000"/>
       </w:rPr>
       <w:tblPr/>
       <w:tcPr>
@@ -6231,6 +6876,11 @@
     <w:pPr>
       <w:spacing w:after="0" w:line="240" w:lineRule="auto"/>
     </w:pPr>
+    <w:rPr>
+      <w:rFonts w:ascii="Times New Roman" w:hAnsi="Times New Roman"/>
+      <w:color w:val="000000"/>
+      <w:u w:val="none"/>
+    </w:rPr>
     <w:tblPr>
       <w:tblStyleRowBandSize w:val="1"/>
       <w:tblStyleColBandSize w:val="1"/>
@@ -6256,7 +6906,7 @@
       <w:rPr>
         <w:b/>
         <w:bCs/>
-        <w:color w:val="FFFFFF" w:themeColor="background1"/>
+        <w:color w:val="000000"/>
       </w:rPr>
       <w:tblPr/>
       <w:tcPr>
@@ -6337,6 +6987,11 @@
     <w:pPr>
       <w:spacing w:after="0" w:line="240" w:lineRule="auto"/>
     </w:pPr>
+    <w:rPr>
+      <w:rFonts w:ascii="Times New Roman" w:hAnsi="Times New Roman"/>
+      <w:color w:val="000000"/>
+      <w:u w:val="none"/>
+    </w:rPr>
     <w:tblPr>
       <w:tblStyleRowBandSize w:val="1"/>
       <w:tblStyleColBandSize w:val="1"/>
@@ -6362,7 +7017,7 @@
       <w:rPr>
         <w:b/>
         <w:bCs/>
-        <w:color w:val="FFFFFF" w:themeColor="background1"/>
+        <w:color w:val="000000"/>
       </w:rPr>
       <w:tblPr/>
       <w:tcPr>
@@ -6443,6 +7098,11 @@
     <w:pPr>
       <w:spacing w:after="0" w:line="240" w:lineRule="auto"/>
     </w:pPr>
+    <w:rPr>
+      <w:rFonts w:ascii="Times New Roman" w:hAnsi="Times New Roman"/>
+      <w:color w:val="000000"/>
+      <w:u w:val="none"/>
+    </w:rPr>
     <w:tblPr>
       <w:tblStyleRowBandSize w:val="1"/>
       <w:tblStyleColBandSize w:val="1"/>
@@ -6465,7 +7125,7 @@
       <w:rPr>
         <w:b/>
         <w:bCs/>
-        <w:color w:val="FFFFFF" w:themeColor="background1"/>
+        <w:color w:val="000000"/>
       </w:rPr>
       <w:tblPr/>
       <w:tcPr>
@@ -6485,7 +7145,7 @@
         <w:spacing w:before="0" w:after="0" w:line="240" w:lineRule="auto"/>
       </w:pPr>
       <w:rPr>
-        <w:color w:val="auto"/>
+        <w:color w:val="000000"/>
       </w:rPr>
       <w:tblPr/>
       <w:tcPr>
@@ -6504,7 +7164,7 @@
       <w:rPr>
         <w:b/>
         <w:bCs/>
-        <w:color w:val="FFFFFF" w:themeColor="background1"/>
+        <w:color w:val="000000"/>
       </w:rPr>
       <w:tblPr/>
       <w:tcPr>
@@ -6523,7 +7183,7 @@
       <w:rPr>
         <w:b/>
         <w:bCs/>
-        <w:color w:val="FFFFFF" w:themeColor="background1"/>
+        <w:color w:val="000000"/>
       </w:rPr>
       <w:tblPr/>
       <w:tcPr>
@@ -6569,7 +7229,7 @@
     </w:tblStylePr>
     <w:tblStylePr w:type="nwCell">
       <w:rPr>
-        <w:color w:val="FFFFFF" w:themeColor="background1"/>
+        <w:color w:val="000000"/>
       </w:rPr>
       <w:tblPr/>
       <w:tcPr>
@@ -6592,6 +7252,11 @@
     <w:pPr>
       <w:spacing w:after="0" w:line="240" w:lineRule="auto"/>
     </w:pPr>
+    <w:rPr>
+      <w:rFonts w:ascii="Times New Roman" w:hAnsi="Times New Roman"/>
+      <w:color w:val="000000"/>
+      <w:u w:val="none"/>
+    </w:rPr>
     <w:tblPr>
       <w:tblStyleRowBandSize w:val="1"/>
       <w:tblStyleColBandSize w:val="1"/>
@@ -6614,7 +7279,7 @@
       <w:rPr>
         <w:b/>
         <w:bCs/>
-        <w:color w:val="FFFFFF" w:themeColor="background1"/>
+        <w:color w:val="000000"/>
       </w:rPr>
       <w:tblPr/>
       <w:tcPr>
@@ -6634,7 +7299,7 @@
         <w:spacing w:before="0" w:after="0" w:line="240" w:lineRule="auto"/>
       </w:pPr>
       <w:rPr>
-        <w:color w:val="auto"/>
+        <w:color w:val="000000"/>
       </w:rPr>
       <w:tblPr/>
       <w:tcPr>
@@ -6653,7 +7318,7 @@
       <w:rPr>
         <w:b/>
         <w:bCs/>
-        <w:color w:val="FFFFFF" w:themeColor="background1"/>
+        <w:color w:val="000000"/>
       </w:rPr>
       <w:tblPr/>
       <w:tcPr>
@@ -6672,7 +7337,7 @@
       <w:rPr>
         <w:b/>
         <w:bCs/>
-        <w:color w:val="FFFFFF" w:themeColor="background1"/>
+        <w:color w:val="000000"/>
       </w:rPr>
       <w:tblPr/>
       <w:tcPr>
@@ -6718,7 +7383,7 @@
     </w:tblStylePr>
     <w:tblStylePr w:type="nwCell">
       <w:rPr>
-        <w:color w:val="FFFFFF" w:themeColor="background1"/>
+        <w:color w:val="000000"/>
       </w:rPr>
       <w:tblPr/>
       <w:tcPr>
@@ -6741,6 +7406,11 @@
     <w:pPr>
       <w:spacing w:after="0" w:line="240" w:lineRule="auto"/>
     </w:pPr>
+    <w:rPr>
+      <w:rFonts w:ascii="Times New Roman" w:hAnsi="Times New Roman"/>
+      <w:color w:val="000000"/>
+      <w:u w:val="none"/>
+    </w:rPr>
     <w:tblPr>
       <w:tblStyleRowBandSize w:val="1"/>
       <w:tblStyleColBandSize w:val="1"/>
@@ -6763,7 +7433,7 @@
       <w:rPr>
         <w:b/>
         <w:bCs/>
-        <w:color w:val="FFFFFF" w:themeColor="background1"/>
+        <w:color w:val="000000"/>
       </w:rPr>
       <w:tblPr/>
       <w:tcPr>
@@ -6783,7 +7453,7 @@
         <w:spacing w:before="0" w:after="0" w:line="240" w:lineRule="auto"/>
       </w:pPr>
       <w:rPr>
-        <w:color w:val="auto"/>
+        <w:color w:val="000000"/>
       </w:rPr>
       <w:tblPr/>
       <w:tcPr>
@@ -6802,7 +7472,7 @@
       <w:rPr>
         <w:b/>
         <w:bCs/>
-        <w:color w:val="FFFFFF" w:themeColor="background1"/>
+        <w:color w:val="000000"/>
       </w:rPr>
       <w:tblPr/>
       <w:tcPr>
@@ -6821,7 +7491,7 @@
       <w:rPr>
         <w:b/>
         <w:bCs/>
-        <w:color w:val="FFFFFF" w:themeColor="background1"/>
+        <w:color w:val="000000"/>
       </w:rPr>
       <w:tblPr/>
       <w:tcPr>
@@ -6867,7 +7537,7 @@
     </w:tblStylePr>
     <w:tblStylePr w:type="nwCell">
       <w:rPr>
-        <w:color w:val="FFFFFF" w:themeColor="background1"/>
+        <w:color w:val="000000"/>
       </w:rPr>
       <w:tblPr/>
       <w:tcPr>
@@ -6890,6 +7560,11 @@
     <w:pPr>
       <w:spacing w:after="0" w:line="240" w:lineRule="auto"/>
     </w:pPr>
+    <w:rPr>
+      <w:rFonts w:ascii="Times New Roman" w:hAnsi="Times New Roman"/>
+      <w:color w:val="000000"/>
+      <w:u w:val="none"/>
+    </w:rPr>
     <w:tblPr>
       <w:tblStyleRowBandSize w:val="1"/>
       <w:tblStyleColBandSize w:val="1"/>
@@ -6912,7 +7587,7 @@
       <w:rPr>
         <w:b/>
         <w:bCs/>
-        <w:color w:val="FFFFFF" w:themeColor="background1"/>
+        <w:color w:val="000000"/>
       </w:rPr>
       <w:tblPr/>
       <w:tcPr>
@@ -6932,7 +7607,7 @@
         <w:spacing w:before="0" w:after="0" w:line="240" w:lineRule="auto"/>
       </w:pPr>
       <w:rPr>
-        <w:color w:val="auto"/>
+        <w:color w:val="000000"/>
       </w:rPr>
       <w:tblPr/>
       <w:tcPr>
@@ -6951,7 +7626,7 @@
       <w:rPr>
         <w:b/>
         <w:bCs/>
-        <w:color w:val="FFFFFF" w:themeColor="background1"/>
+        <w:color w:val="000000"/>
       </w:rPr>
       <w:tblPr/>
       <w:tcPr>
@@ -6970,7 +7645,7 @@
       <w:rPr>
         <w:b/>
         <w:bCs/>
-        <w:color w:val="FFFFFF" w:themeColor="background1"/>
+        <w:color w:val="000000"/>
       </w:rPr>
       <w:tblPr/>
       <w:tcPr>
@@ -7016,7 +7691,7 @@
     </w:tblStylePr>
     <w:tblStylePr w:type="nwCell">
       <w:rPr>
-        <w:color w:val="FFFFFF" w:themeColor="background1"/>
+        <w:color w:val="000000"/>
       </w:rPr>
       <w:tblPr/>
       <w:tcPr>
@@ -7039,6 +7714,11 @@
     <w:pPr>
       <w:spacing w:after="0" w:line="240" w:lineRule="auto"/>
     </w:pPr>
+    <w:rPr>
+      <w:rFonts w:ascii="Times New Roman" w:hAnsi="Times New Roman"/>
+      <w:color w:val="000000"/>
+      <w:u w:val="none"/>
+    </w:rPr>
     <w:tblPr>
       <w:tblStyleRowBandSize w:val="1"/>
       <w:tblStyleColBandSize w:val="1"/>
@@ -7061,7 +7741,7 @@
       <w:rPr>
         <w:b/>
         <w:bCs/>
-        <w:color w:val="FFFFFF" w:themeColor="background1"/>
+        <w:color w:val="000000"/>
       </w:rPr>
       <w:tblPr/>
       <w:tcPr>
@@ -7081,7 +7761,7 @@
         <w:spacing w:before="0" w:after="0" w:line="240" w:lineRule="auto"/>
       </w:pPr>
       <w:rPr>
-        <w:color w:val="auto"/>
+        <w:color w:val="000000"/>
       </w:rPr>
       <w:tblPr/>
       <w:tcPr>
@@ -7100,7 +7780,7 @@
       <w:rPr>
         <w:b/>
         <w:bCs/>
-        <w:color w:val="FFFFFF" w:themeColor="background1"/>
+        <w:color w:val="000000"/>
       </w:rPr>
       <w:tblPr/>
       <w:tcPr>
@@ -7119,7 +7799,7 @@
       <w:rPr>
         <w:b/>
         <w:bCs/>
-        <w:color w:val="FFFFFF" w:themeColor="background1"/>
+        <w:color w:val="000000"/>
       </w:rPr>
       <w:tblPr/>
       <w:tcPr>
@@ -7165,7 +7845,7 @@
     </w:tblStylePr>
     <w:tblStylePr w:type="nwCell">
       <w:rPr>
-        <w:color w:val="FFFFFF" w:themeColor="background1"/>
+        <w:color w:val="000000"/>
       </w:rPr>
       <w:tblPr/>
       <w:tcPr>
@@ -7188,6 +7868,11 @@
     <w:pPr>
       <w:spacing w:after="0" w:line="240" w:lineRule="auto"/>
     </w:pPr>
+    <w:rPr>
+      <w:rFonts w:ascii="Times New Roman" w:hAnsi="Times New Roman"/>
+      <w:color w:val="000000"/>
+      <w:u w:val="none"/>
+    </w:rPr>
     <w:tblPr>
       <w:tblStyleRowBandSize w:val="1"/>
       <w:tblStyleColBandSize w:val="1"/>
@@ -7210,7 +7895,7 @@
       <w:rPr>
         <w:b/>
         <w:bCs/>
-        <w:color w:val="FFFFFF" w:themeColor="background1"/>
+        <w:color w:val="000000"/>
       </w:rPr>
       <w:tblPr/>
       <w:tcPr>
@@ -7230,7 +7915,7 @@
         <w:spacing w:before="0" w:after="0" w:line="240" w:lineRule="auto"/>
       </w:pPr>
       <w:rPr>
-        <w:color w:val="auto"/>
+        <w:color w:val="000000"/>
       </w:rPr>
       <w:tblPr/>
       <w:tcPr>
@@ -7249,7 +7934,7 @@
       <w:rPr>
         <w:b/>
         <w:bCs/>
-        <w:color w:val="FFFFFF" w:themeColor="background1"/>
+        <w:color w:val="000000"/>
       </w:rPr>
       <w:tblPr/>
       <w:tcPr>
@@ -7268,7 +7953,7 @@
       <w:rPr>
         <w:b/>
         <w:bCs/>
-        <w:color w:val="FFFFFF" w:themeColor="background1"/>
+        <w:color w:val="000000"/>
       </w:rPr>
       <w:tblPr/>
       <w:tcPr>
@@ -7314,7 +7999,7 @@
     </w:tblStylePr>
     <w:tblStylePr w:type="nwCell">
       <w:rPr>
-        <w:color w:val="FFFFFF" w:themeColor="background1"/>
+        <w:color w:val="000000"/>
       </w:rPr>
       <w:tblPr/>
       <w:tcPr>
@@ -7337,6 +8022,11 @@
     <w:pPr>
       <w:spacing w:after="0" w:line="240" w:lineRule="auto"/>
     </w:pPr>
+    <w:rPr>
+      <w:rFonts w:ascii="Times New Roman" w:hAnsi="Times New Roman"/>
+      <w:color w:val="000000"/>
+      <w:u w:val="none"/>
+    </w:rPr>
     <w:tblPr>
       <w:tblStyleRowBandSize w:val="1"/>
       <w:tblStyleColBandSize w:val="1"/>
@@ -7359,7 +8049,7 @@
       <w:rPr>
         <w:b/>
         <w:bCs/>
-        <w:color w:val="FFFFFF" w:themeColor="background1"/>
+        <w:color w:val="000000"/>
       </w:rPr>
       <w:tblPr/>
       <w:tcPr>
@@ -7379,7 +8069,7 @@
         <w:spacing w:before="0" w:after="0" w:line="240" w:lineRule="auto"/>
       </w:pPr>
       <w:rPr>
-        <w:color w:val="auto"/>
+        <w:color w:val="000000"/>
       </w:rPr>
       <w:tblPr/>
       <w:tcPr>
@@ -7398,7 +8088,7 @@
       <w:rPr>
         <w:b/>
         <w:bCs/>
-        <w:color w:val="FFFFFF" w:themeColor="background1"/>
+        <w:color w:val="000000"/>
       </w:rPr>
       <w:tblPr/>
       <w:tcPr>
@@ -7417,7 +8107,7 @@
       <w:rPr>
         <w:b/>
         <w:bCs/>
-        <w:color w:val="FFFFFF" w:themeColor="background1"/>
+        <w:color w:val="000000"/>
       </w:rPr>
       <w:tblPr/>
       <w:tcPr>
@@ -7463,7 +8153,7 @@
     </w:tblStylePr>
     <w:tblStylePr w:type="nwCell">
       <w:rPr>
-        <w:color w:val="FFFFFF" w:themeColor="background1"/>
+        <w:color w:val="000000"/>
       </w:rPr>
       <w:tblPr/>
       <w:tcPr>
@@ -7487,7 +8177,9 @@
       <w:spacing w:after="0" w:line="240" w:lineRule="auto"/>
     </w:pPr>
     <w:rPr>
-      <w:color w:val="000000" w:themeColor="text1"/>
+      <w:rFonts w:ascii="Times New Roman" w:hAnsi="Times New Roman"/>
+      <w:color w:val="000000"/>
+      <w:u w:val="none"/>
     </w:rPr>
     <w:tblPr>
       <w:tblStyleRowBandSize w:val="1"/>
@@ -7520,7 +8212,7 @@
       <w:rPr>
         <w:b/>
         <w:bCs/>
-        <w:color w:val="1F497D" w:themeColor="text2"/>
+        <w:color w:val="000000"/>
       </w:rPr>
       <w:tblPr/>
       <w:tcPr>
@@ -7571,7 +8263,9 @@
       <w:spacing w:after="0" w:line="240" w:lineRule="auto"/>
     </w:pPr>
     <w:rPr>
-      <w:color w:val="000000" w:themeColor="text1"/>
+      <w:rFonts w:ascii="Times New Roman" w:hAnsi="Times New Roman"/>
+      <w:color w:val="000000"/>
+      <w:u w:val="none"/>
     </w:rPr>
     <w:tblPr>
       <w:tblStyleRowBandSize w:val="1"/>
@@ -7604,7 +8298,7 @@
       <w:rPr>
         <w:b/>
         <w:bCs/>
-        <w:color w:val="1F497D" w:themeColor="text2"/>
+        <w:color w:val="000000"/>
       </w:rPr>
       <w:tblPr/>
       <w:tcPr>
@@ -7655,7 +8349,9 @@
       <w:spacing w:after="0" w:line="240" w:lineRule="auto"/>
     </w:pPr>
     <w:rPr>
-      <w:color w:val="000000" w:themeColor="text1"/>
+      <w:rFonts w:ascii="Times New Roman" w:hAnsi="Times New Roman"/>
+      <w:color w:val="000000"/>
+      <w:u w:val="none"/>
     </w:rPr>
     <w:tblPr>
       <w:tblStyleRowBandSize w:val="1"/>
@@ -7688,7 +8384,7 @@
       <w:rPr>
         <w:b/>
         <w:bCs/>
-        <w:color w:val="1F497D" w:themeColor="text2"/>
+        <w:color w:val="000000"/>
       </w:rPr>
       <w:tblPr/>
       <w:tcPr>
@@ -7739,7 +8435,9 @@
       <w:spacing w:after="0" w:line="240" w:lineRule="auto"/>
     </w:pPr>
     <w:rPr>
-      <w:color w:val="000000" w:themeColor="text1"/>
+      <w:rFonts w:ascii="Times New Roman" w:hAnsi="Times New Roman"/>
+      <w:color w:val="000000"/>
+      <w:u w:val="none"/>
     </w:rPr>
     <w:tblPr>
       <w:tblStyleRowBandSize w:val="1"/>
@@ -7772,7 +8470,7 @@
       <w:rPr>
         <w:b/>
         <w:bCs/>
-        <w:color w:val="1F497D" w:themeColor="text2"/>
+        <w:color w:val="000000"/>
       </w:rPr>
       <w:tblPr/>
       <w:tcPr>
@@ -7823,7 +8521,9 @@
       <w:spacing w:after="0" w:line="240" w:lineRule="auto"/>
     </w:pPr>
     <w:rPr>
-      <w:color w:val="000000" w:themeColor="text1"/>
+      <w:rFonts w:ascii="Times New Roman" w:hAnsi="Times New Roman"/>
+      <w:color w:val="000000"/>
+      <w:u w:val="none"/>
     </w:rPr>
     <w:tblPr>
       <w:tblStyleRowBandSize w:val="1"/>
@@ -7856,7 +8556,7 @@
       <w:rPr>
         <w:b/>
         <w:bCs/>
-        <w:color w:val="1F497D" w:themeColor="text2"/>
+        <w:color w:val="000000"/>
       </w:rPr>
       <w:tblPr/>
       <w:tcPr>
@@ -7907,7 +8607,9 @@
       <w:spacing w:after="0" w:line="240" w:lineRule="auto"/>
     </w:pPr>
     <w:rPr>
-      <w:color w:val="000000" w:themeColor="text1"/>
+      <w:rFonts w:ascii="Times New Roman" w:hAnsi="Times New Roman"/>
+      <w:color w:val="000000"/>
+      <w:u w:val="none"/>
     </w:rPr>
     <w:tblPr>
       <w:tblStyleRowBandSize w:val="1"/>
@@ -7940,7 +8642,7 @@
       <w:rPr>
         <w:b/>
         <w:bCs/>
-        <w:color w:val="1F497D" w:themeColor="text2"/>
+        <w:color w:val="000000"/>
       </w:rPr>
       <w:tblPr/>
       <w:tcPr>
@@ -7991,7 +8693,9 @@
       <w:spacing w:after="0" w:line="240" w:lineRule="auto"/>
     </w:pPr>
     <w:rPr>
-      <w:color w:val="000000" w:themeColor="text1"/>
+      <w:rFonts w:ascii="Times New Roman" w:hAnsi="Times New Roman"/>
+      <w:color w:val="000000"/>
+      <w:u w:val="none"/>
     </w:rPr>
     <w:tblPr>
       <w:tblStyleRowBandSize w:val="1"/>
@@ -8024,7 +8728,7 @@
       <w:rPr>
         <w:b/>
         <w:bCs/>
-        <w:color w:val="1F497D" w:themeColor="text2"/>
+        <w:color w:val="000000"/>
       </w:rPr>
       <w:tblPr/>
       <w:tcPr>
@@ -8075,8 +8779,9 @@
       <w:spacing w:after="0" w:line="240" w:lineRule="auto"/>
     </w:pPr>
     <w:rPr>
-      <w:rFonts w:asciiTheme="majorHAnsi" w:eastAsiaTheme="majorEastAsia" w:hAnsiTheme="majorHAnsi" w:cstheme="majorBidi"/>
-      <w:color w:val="000000" w:themeColor="text1"/>
+      <w:rFonts w:ascii="Times New Roman" w:hAnsi="Times New Roman"/>
+      <w:color w:val="000000"/>
+      <w:u w:val="none"/>
     </w:rPr>
     <w:tblPr>
       <w:tblStyleRowBandSize w:val="1"/>
@@ -8203,8 +8908,9 @@
       <w:spacing w:after="0" w:line="240" w:lineRule="auto"/>
     </w:pPr>
     <w:rPr>
-      <w:rFonts w:asciiTheme="majorHAnsi" w:eastAsiaTheme="majorEastAsia" w:hAnsiTheme="majorHAnsi" w:cstheme="majorBidi"/>
-      <w:color w:val="000000" w:themeColor="text1"/>
+      <w:rFonts w:ascii="Times New Roman" w:hAnsi="Times New Roman"/>
+      <w:color w:val="000000"/>
+      <w:u w:val="none"/>
     </w:rPr>
     <w:tblPr>
       <w:tblStyleRowBandSize w:val="1"/>
@@ -8331,8 +9037,9 @@
       <w:spacing w:after="0" w:line="240" w:lineRule="auto"/>
     </w:pPr>
     <w:rPr>
-      <w:rFonts w:asciiTheme="majorHAnsi" w:eastAsiaTheme="majorEastAsia" w:hAnsiTheme="majorHAnsi" w:cstheme="majorBidi"/>
-      <w:color w:val="000000" w:themeColor="text1"/>
+      <w:rFonts w:ascii="Times New Roman" w:hAnsi="Times New Roman"/>
+      <w:color w:val="000000"/>
+      <w:u w:val="none"/>
     </w:rPr>
     <w:tblPr>
       <w:tblStyleRowBandSize w:val="1"/>
@@ -8459,8 +9166,9 @@
       <w:spacing w:after="0" w:line="240" w:lineRule="auto"/>
     </w:pPr>
     <w:rPr>
-      <w:rFonts w:asciiTheme="majorHAnsi" w:eastAsiaTheme="majorEastAsia" w:hAnsiTheme="majorHAnsi" w:cstheme="majorBidi"/>
-      <w:color w:val="000000" w:themeColor="text1"/>
+      <w:rFonts w:ascii="Times New Roman" w:hAnsi="Times New Roman"/>
+      <w:color w:val="000000"/>
+      <w:u w:val="none"/>
     </w:rPr>
     <w:tblPr>
       <w:tblStyleRowBandSize w:val="1"/>
@@ -8587,8 +9295,9 @@
       <w:spacing w:after="0" w:line="240" w:lineRule="auto"/>
     </w:pPr>
     <w:rPr>
-      <w:rFonts w:asciiTheme="majorHAnsi" w:eastAsiaTheme="majorEastAsia" w:hAnsiTheme="majorHAnsi" w:cstheme="majorBidi"/>
-      <w:color w:val="000000" w:themeColor="text1"/>
+      <w:rFonts w:ascii="Times New Roman" w:hAnsi="Times New Roman"/>
+      <w:color w:val="000000"/>
+      <w:u w:val="none"/>
     </w:rPr>
     <w:tblPr>
       <w:tblStyleRowBandSize w:val="1"/>
@@ -8715,8 +9424,9 @@
       <w:spacing w:after="0" w:line="240" w:lineRule="auto"/>
     </w:pPr>
     <w:rPr>
-      <w:rFonts w:asciiTheme="majorHAnsi" w:eastAsiaTheme="majorEastAsia" w:hAnsiTheme="majorHAnsi" w:cstheme="majorBidi"/>
-      <w:color w:val="000000" w:themeColor="text1"/>
+      <w:rFonts w:ascii="Times New Roman" w:hAnsi="Times New Roman"/>
+      <w:color w:val="000000"/>
+      <w:u w:val="none"/>
     </w:rPr>
     <w:tblPr>
       <w:tblStyleRowBandSize w:val="1"/>
@@ -8843,8 +9553,9 @@
       <w:spacing w:after="0" w:line="240" w:lineRule="auto"/>
     </w:pPr>
     <w:rPr>
-      <w:rFonts w:asciiTheme="majorHAnsi" w:eastAsiaTheme="majorEastAsia" w:hAnsiTheme="majorHAnsi" w:cstheme="majorBidi"/>
-      <w:color w:val="000000" w:themeColor="text1"/>
+      <w:rFonts w:ascii="Times New Roman" w:hAnsi="Times New Roman"/>
+      <w:color w:val="000000"/>
+      <w:u w:val="none"/>
     </w:rPr>
     <w:tblPr>
       <w:tblStyleRowBandSize w:val="1"/>
@@ -8970,6 +9681,11 @@
     <w:pPr>
       <w:spacing w:after="0" w:line="240" w:lineRule="auto"/>
     </w:pPr>
+    <w:rPr>
+      <w:rFonts w:ascii="Times New Roman" w:hAnsi="Times New Roman"/>
+      <w:color w:val="000000"/>
+      <w:u w:val="none"/>
+    </w:rPr>
     <w:tblPr>
       <w:tblStyleRowBandSize w:val="1"/>
       <w:tblStyleColBandSize w:val="1"/>
@@ -9043,6 +9759,11 @@
     <w:pPr>
       <w:spacing w:after="0" w:line="240" w:lineRule="auto"/>
     </w:pPr>
+    <w:rPr>
+      <w:rFonts w:ascii="Times New Roman" w:hAnsi="Times New Roman"/>
+      <w:color w:val="000000"/>
+      <w:u w:val="none"/>
+    </w:rPr>
     <w:tblPr>
       <w:tblStyleRowBandSize w:val="1"/>
       <w:tblStyleColBandSize w:val="1"/>
@@ -9116,6 +9837,11 @@
     <w:pPr>
       <w:spacing w:after="0" w:line="240" w:lineRule="auto"/>
     </w:pPr>
+    <w:rPr>
+      <w:rFonts w:ascii="Times New Roman" w:hAnsi="Times New Roman"/>
+      <w:color w:val="000000"/>
+      <w:u w:val="none"/>
+    </w:rPr>
     <w:tblPr>
       <w:tblStyleRowBandSize w:val="1"/>
       <w:tblStyleColBandSize w:val="1"/>
@@ -9189,6 +9915,11 @@
     <w:pPr>
       <w:spacing w:after="0" w:line="240" w:lineRule="auto"/>
     </w:pPr>
+    <w:rPr>
+      <w:rFonts w:ascii="Times New Roman" w:hAnsi="Times New Roman"/>
+      <w:color w:val="000000"/>
+      <w:u w:val="none"/>
+    </w:rPr>
     <w:tblPr>
       <w:tblStyleRowBandSize w:val="1"/>
       <w:tblStyleColBandSize w:val="1"/>
@@ -9262,6 +9993,11 @@
     <w:pPr>
       <w:spacing w:after="0" w:line="240" w:lineRule="auto"/>
     </w:pPr>
+    <w:rPr>
+      <w:rFonts w:ascii="Times New Roman" w:hAnsi="Times New Roman"/>
+      <w:color w:val="000000"/>
+      <w:u w:val="none"/>
+    </w:rPr>
     <w:tblPr>
       <w:tblStyleRowBandSize w:val="1"/>
       <w:tblStyleColBandSize w:val="1"/>
@@ -9335,6 +10071,11 @@
     <w:pPr>
       <w:spacing w:after="0" w:line="240" w:lineRule="auto"/>
     </w:pPr>
+    <w:rPr>
+      <w:rFonts w:ascii="Times New Roman" w:hAnsi="Times New Roman"/>
+      <w:color w:val="000000"/>
+      <w:u w:val="none"/>
+    </w:rPr>
     <w:tblPr>
       <w:tblStyleRowBandSize w:val="1"/>
       <w:tblStyleColBandSize w:val="1"/>
@@ -9408,6 +10149,11 @@
     <w:pPr>
       <w:spacing w:after="0" w:line="240" w:lineRule="auto"/>
     </w:pPr>
+    <w:rPr>
+      <w:rFonts w:ascii="Times New Roman" w:hAnsi="Times New Roman"/>
+      <w:color w:val="000000"/>
+      <w:u w:val="none"/>
+    </w:rPr>
     <w:tblPr>
       <w:tblStyleRowBandSize w:val="1"/>
       <w:tblStyleColBandSize w:val="1"/>
@@ -9482,8 +10228,9 @@
       <w:spacing w:after="0" w:line="240" w:lineRule="auto"/>
     </w:pPr>
     <w:rPr>
-      <w:rFonts w:asciiTheme="majorHAnsi" w:eastAsiaTheme="majorEastAsia" w:hAnsiTheme="majorHAnsi" w:cstheme="majorBidi"/>
-      <w:color w:val="000000" w:themeColor="text1"/>
+      <w:rFonts w:ascii="Times New Roman" w:hAnsi="Times New Roman"/>
+      <w:color w:val="000000"/>
+      <w:u w:val="none"/>
     </w:rPr>
     <w:tblPr>
       <w:tblStyleRowBandSize w:val="1"/>
@@ -9511,7 +10258,7 @@
       <w:rPr>
         <w:b/>
         <w:bCs/>
-        <w:color w:val="000000" w:themeColor="text1"/>
+        <w:color w:val="000000"/>
       </w:rPr>
       <w:tblPr/>
       <w:tcPr>
@@ -9522,7 +10269,7 @@
       <w:rPr>
         <w:b/>
         <w:bCs/>
-        <w:color w:val="000000" w:themeColor="text1"/>
+        <w:color w:val="000000"/>
       </w:rPr>
       <w:tblPr/>
       <w:tcPr>
@@ -9541,7 +10288,7 @@
       <w:rPr>
         <w:b/>
         <w:bCs/>
-        <w:color w:val="000000" w:themeColor="text1"/>
+        <w:color w:val="000000"/>
       </w:rPr>
       <w:tblPr/>
       <w:tcPr>
@@ -9560,7 +10307,7 @@
       <w:rPr>
         <w:b w:val="0"/>
         <w:bCs w:val="0"/>
-        <w:color w:val="000000" w:themeColor="text1"/>
+        <w:color w:val="000000"/>
       </w:rPr>
       <w:tblPr/>
       <w:tcPr>
@@ -9607,8 +10354,9 @@
       <w:spacing w:after="0" w:line="240" w:lineRule="auto"/>
     </w:pPr>
     <w:rPr>
-      <w:rFonts w:asciiTheme="majorHAnsi" w:eastAsiaTheme="majorEastAsia" w:hAnsiTheme="majorHAnsi" w:cstheme="majorBidi"/>
-      <w:color w:val="000000" w:themeColor="text1"/>
+      <w:rFonts w:ascii="Times New Roman" w:hAnsi="Times New Roman"/>
+      <w:color w:val="000000"/>
+      <w:u w:val="none"/>
     </w:rPr>
     <w:tblPr>
       <w:tblStyleRowBandSize w:val="1"/>
@@ -9636,7 +10384,7 @@
       <w:rPr>
         <w:b/>
         <w:bCs/>
-        <w:color w:val="000000" w:themeColor="text1"/>
+        <w:color w:val="000000"/>
       </w:rPr>
       <w:tblPr/>
       <w:tcPr>
@@ -9647,7 +10395,7 @@
       <w:rPr>
         <w:b/>
         <w:bCs/>
-        <w:color w:val="000000" w:themeColor="text1"/>
+        <w:color w:val="000000"/>
       </w:rPr>
       <w:tblPr/>
       <w:tcPr>
@@ -9666,7 +10414,7 @@
       <w:rPr>
         <w:b/>
         <w:bCs/>
-        <w:color w:val="000000" w:themeColor="text1"/>
+        <w:color w:val="000000"/>
       </w:rPr>
       <w:tblPr/>
       <w:tcPr>
@@ -9685,7 +10433,7 @@
       <w:rPr>
         <w:b w:val="0"/>
         <w:bCs w:val="0"/>
-        <w:color w:val="000000" w:themeColor="text1"/>
+        <w:color w:val="000000"/>
       </w:rPr>
       <w:tblPr/>
       <w:tcPr>
@@ -9732,8 +10480,9 @@
       <w:spacing w:after="0" w:line="240" w:lineRule="auto"/>
     </w:pPr>
     <w:rPr>
-      <w:rFonts w:asciiTheme="majorHAnsi" w:eastAsiaTheme="majorEastAsia" w:hAnsiTheme="majorHAnsi" w:cstheme="majorBidi"/>
-      <w:color w:val="000000" w:themeColor="text1"/>
+      <w:rFonts w:ascii="Times New Roman" w:hAnsi="Times New Roman"/>
+      <w:color w:val="000000"/>
+      <w:u w:val="none"/>
     </w:rPr>
     <w:tblPr>
       <w:tblStyleRowBandSize w:val="1"/>
@@ -9761,7 +10510,7 @@
       <w:rPr>
         <w:b/>
         <w:bCs/>
-        <w:color w:val="000000" w:themeColor="text1"/>
+        <w:color w:val="000000"/>
       </w:rPr>
       <w:tblPr/>
       <w:tcPr>
@@ -9772,7 +10521,7 @@
       <w:rPr>
         <w:b/>
         <w:bCs/>
-        <w:color w:val="000000" w:themeColor="text1"/>
+        <w:color w:val="000000"/>
       </w:rPr>
       <w:tblPr/>
       <w:tcPr>
@@ -9791,7 +10540,7 @@
       <w:rPr>
         <w:b/>
         <w:bCs/>
-        <w:color w:val="000000" w:themeColor="text1"/>
+        <w:color w:val="000000"/>
       </w:rPr>
       <w:tblPr/>
       <w:tcPr>
@@ -9810,7 +10559,7 @@
       <w:rPr>
         <w:b w:val="0"/>
         <w:bCs w:val="0"/>
-        <w:color w:val="000000" w:themeColor="text1"/>
+        <w:color w:val="000000"/>
       </w:rPr>
       <w:tblPr/>
       <w:tcPr>
@@ -9857,8 +10606,9 @@
       <w:spacing w:after="0" w:line="240" w:lineRule="auto"/>
     </w:pPr>
     <w:rPr>
-      <w:rFonts w:asciiTheme="majorHAnsi" w:eastAsiaTheme="majorEastAsia" w:hAnsiTheme="majorHAnsi" w:cstheme="majorBidi"/>
-      <w:color w:val="000000" w:themeColor="text1"/>
+      <w:rFonts w:ascii="Times New Roman" w:hAnsi="Times New Roman"/>
+      <w:color w:val="000000"/>
+      <w:u w:val="none"/>
     </w:rPr>
     <w:tblPr>
       <w:tblStyleRowBandSize w:val="1"/>
@@ -9886,7 +10636,7 @@
       <w:rPr>
         <w:b/>
         <w:bCs/>
-        <w:color w:val="000000" w:themeColor="text1"/>
+        <w:color w:val="000000"/>
       </w:rPr>
       <w:tblPr/>
       <w:tcPr>
@@ -9897,7 +10647,7 @@
       <w:rPr>
         <w:b/>
         <w:bCs/>
-        <w:color w:val="000000" w:themeColor="text1"/>
+        <w:color w:val="000000"/>
       </w:rPr>
       <w:tblPr/>
       <w:tcPr>
@@ -9916,7 +10666,7 @@
       <w:rPr>
         <w:b/>
         <w:bCs/>
-        <w:color w:val="000000" w:themeColor="text1"/>
+        <w:color w:val="000000"/>
       </w:rPr>
       <w:tblPr/>
       <w:tcPr>
@@ -9935,7 +10685,7 @@
       <w:rPr>
         <w:b w:val="0"/>
         <w:bCs w:val="0"/>
-        <w:color w:val="000000" w:themeColor="text1"/>
+        <w:color w:val="000000"/>
       </w:rPr>
       <w:tblPr/>
       <w:tcPr>
@@ -9982,8 +10732,9 @@
       <w:spacing w:after="0" w:line="240" w:lineRule="auto"/>
     </w:pPr>
     <w:rPr>
-      <w:rFonts w:asciiTheme="majorHAnsi" w:eastAsiaTheme="majorEastAsia" w:hAnsiTheme="majorHAnsi" w:cstheme="majorBidi"/>
-      <w:color w:val="000000" w:themeColor="text1"/>
+      <w:rFonts w:ascii="Times New Roman" w:hAnsi="Times New Roman"/>
+      <w:color w:val="000000"/>
+      <w:u w:val="none"/>
     </w:rPr>
     <w:tblPr>
       <w:tblStyleRowBandSize w:val="1"/>
@@ -10011,7 +10762,7 @@
       <w:rPr>
         <w:b/>
         <w:bCs/>
-        <w:color w:val="000000" w:themeColor="text1"/>
+        <w:color w:val="000000"/>
       </w:rPr>
       <w:tblPr/>
       <w:tcPr>
@@ -10022,7 +10773,7 @@
       <w:rPr>
         <w:b/>
         <w:bCs/>
-        <w:color w:val="000000" w:themeColor="text1"/>
+        <w:color w:val="000000"/>
       </w:rPr>
       <w:tblPr/>
       <w:tcPr>
@@ -10041,7 +10792,7 @@
       <w:rPr>
         <w:b/>
         <w:bCs/>
-        <w:color w:val="000000" w:themeColor="text1"/>
+        <w:color w:val="000000"/>
       </w:rPr>
       <w:tblPr/>
       <w:tcPr>
@@ -10060,7 +10811,7 @@
       <w:rPr>
         <w:b w:val="0"/>
         <w:bCs w:val="0"/>
-        <w:color w:val="000000" w:themeColor="text1"/>
+        <w:color w:val="000000"/>
       </w:rPr>
       <w:tblPr/>
       <w:tcPr>
@@ -10107,8 +10858,9 @@
       <w:spacing w:after="0" w:line="240" w:lineRule="auto"/>
     </w:pPr>
     <w:rPr>
-      <w:rFonts w:asciiTheme="majorHAnsi" w:eastAsiaTheme="majorEastAsia" w:hAnsiTheme="majorHAnsi" w:cstheme="majorBidi"/>
-      <w:color w:val="000000" w:themeColor="text1"/>
+      <w:rFonts w:ascii="Times New Roman" w:hAnsi="Times New Roman"/>
+      <w:color w:val="000000"/>
+      <w:u w:val="none"/>
     </w:rPr>
     <w:tblPr>
       <w:tblStyleRowBandSize w:val="1"/>
@@ -10136,7 +10888,7 @@
       <w:rPr>
         <w:b/>
         <w:bCs/>
-        <w:color w:val="000000" w:themeColor="text1"/>
+        <w:color w:val="000000"/>
       </w:rPr>
       <w:tblPr/>
       <w:tcPr>
@@ -10147,7 +10899,7 @@
       <w:rPr>
         <w:b/>
         <w:bCs/>
-        <w:color w:val="000000" w:themeColor="text1"/>
+        <w:color w:val="000000"/>
       </w:rPr>
       <w:tblPr/>
       <w:tcPr>
@@ -10166,7 +10918,7 @@
       <w:rPr>
         <w:b/>
         <w:bCs/>
-        <w:color w:val="000000" w:themeColor="text1"/>
+        <w:color w:val="000000"/>
       </w:rPr>
       <w:tblPr/>
       <w:tcPr>
@@ -10185,7 +10937,7 @@
       <w:rPr>
         <w:b w:val="0"/>
         <w:bCs w:val="0"/>
-        <w:color w:val="000000" w:themeColor="text1"/>
+        <w:color w:val="000000"/>
       </w:rPr>
       <w:tblPr/>
       <w:tcPr>
@@ -10232,8 +10984,9 @@
       <w:spacing w:after="0" w:line="240" w:lineRule="auto"/>
     </w:pPr>
     <w:rPr>
-      <w:rFonts w:asciiTheme="majorHAnsi" w:eastAsiaTheme="majorEastAsia" w:hAnsiTheme="majorHAnsi" w:cstheme="majorBidi"/>
-      <w:color w:val="000000" w:themeColor="text1"/>
+      <w:rFonts w:ascii="Times New Roman" w:hAnsi="Times New Roman"/>
+      <w:color w:val="000000"/>
+      <w:u w:val="none"/>
     </w:rPr>
     <w:tblPr>
       <w:tblStyleRowBandSize w:val="1"/>
@@ -10261,7 +11014,7 @@
       <w:rPr>
         <w:b/>
         <w:bCs/>
-        <w:color w:val="000000" w:themeColor="text1"/>
+        <w:color w:val="000000"/>
       </w:rPr>
       <w:tblPr/>
       <w:tcPr>
@@ -10272,7 +11025,7 @@
       <w:rPr>
         <w:b/>
         <w:bCs/>
-        <w:color w:val="000000" w:themeColor="text1"/>
+        <w:color w:val="000000"/>
       </w:rPr>
       <w:tblPr/>
       <w:tcPr>
@@ -10291,7 +11044,7 @@
       <w:rPr>
         <w:b/>
         <w:bCs/>
-        <w:color w:val="000000" w:themeColor="text1"/>
+        <w:color w:val="000000"/>
       </w:rPr>
       <w:tblPr/>
       <w:tcPr>
@@ -10310,7 +11063,7 @@
       <w:rPr>
         <w:b w:val="0"/>
         <w:bCs w:val="0"/>
-        <w:color w:val="000000" w:themeColor="text1"/>
+        <w:color w:val="000000"/>
       </w:rPr>
       <w:tblPr/>
       <w:tcPr>
@@ -10356,6 +11109,11 @@
     <w:pPr>
       <w:spacing w:after="0" w:line="240" w:lineRule="auto"/>
     </w:pPr>
+    <w:rPr>
+      <w:rFonts w:ascii="Times New Roman" w:hAnsi="Times New Roman"/>
+      <w:color w:val="000000"/>
+      <w:u w:val="none"/>
+    </w:rPr>
     <w:tblPr>
       <w:tblStyleRowBandSize w:val="1"/>
       <w:tblStyleColBandSize w:val="1"/>
@@ -10384,7 +11142,7 @@
         <w:bCs/>
         <w:i w:val="0"/>
         <w:iCs w:val="0"/>
-        <w:color w:val="FFFFFF" w:themeColor="background1"/>
+        <w:color w:val="000000"/>
       </w:rPr>
       <w:tblPr/>
       <w:tcPr>
@@ -10405,7 +11163,7 @@
         <w:bCs/>
         <w:i w:val="0"/>
         <w:iCs w:val="0"/>
-        <w:color w:val="FFFFFF" w:themeColor="background1"/>
+        <w:color w:val="000000"/>
       </w:rPr>
       <w:tblPr/>
       <w:tcPr>
@@ -10426,7 +11184,7 @@
         <w:bCs/>
         <w:i w:val="0"/>
         <w:iCs w:val="0"/>
-        <w:color w:val="FFFFFF" w:themeColor="background1"/>
+        <w:color w:val="000000"/>
       </w:rPr>
       <w:tblPr/>
       <w:tcPr>
@@ -10445,7 +11203,7 @@
         <w:bCs/>
         <w:i w:val="0"/>
         <w:iCs w:val="0"/>
-        <w:color w:val="FFFFFF" w:themeColor="background1"/>
+        <w:color w:val="000000"/>
       </w:rPr>
       <w:tblPr/>
       <w:tcPr>
@@ -10497,6 +11255,11 @@
     <w:pPr>
       <w:spacing w:after="0" w:line="240" w:lineRule="auto"/>
     </w:pPr>
+    <w:rPr>
+      <w:rFonts w:ascii="Times New Roman" w:hAnsi="Times New Roman"/>
+      <w:color w:val="000000"/>
+      <w:u w:val="none"/>
+    </w:rPr>
     <w:tblPr>
       <w:tblStyleRowBandSize w:val="1"/>
       <w:tblStyleColBandSize w:val="1"/>
@@ -10525,7 +11288,7 @@
         <w:bCs/>
         <w:i w:val="0"/>
         <w:iCs w:val="0"/>
-        <w:color w:val="FFFFFF" w:themeColor="background1"/>
+        <w:color w:val="000000"/>
       </w:rPr>
       <w:tblPr/>
       <w:tcPr>
@@ -10546,7 +11309,7 @@
         <w:bCs/>
         <w:i w:val="0"/>
         <w:iCs w:val="0"/>
-        <w:color w:val="FFFFFF" w:themeColor="background1"/>
+        <w:color w:val="000000"/>
       </w:rPr>
       <w:tblPr/>
       <w:tcPr>
@@ -10567,7 +11330,7 @@
         <w:bCs/>
         <w:i w:val="0"/>
         <w:iCs w:val="0"/>
-        <w:color w:val="FFFFFF" w:themeColor="background1"/>
+        <w:color w:val="000000"/>
       </w:rPr>
       <w:tblPr/>
       <w:tcPr>
@@ -10586,7 +11349,7 @@
         <w:bCs/>
         <w:i w:val="0"/>
         <w:iCs w:val="0"/>
-        <w:color w:val="FFFFFF" w:themeColor="background1"/>
+        <w:color w:val="000000"/>
       </w:rPr>
       <w:tblPr/>
       <w:tcPr>
@@ -10638,6 +11401,11 @@
     <w:pPr>
       <w:spacing w:after="0" w:line="240" w:lineRule="auto"/>
     </w:pPr>
+    <w:rPr>
+      <w:rFonts w:ascii="Times New Roman" w:hAnsi="Times New Roman"/>
+      <w:color w:val="000000"/>
+      <w:u w:val="none"/>
+    </w:rPr>
     <w:tblPr>
       <w:tblStyleRowBandSize w:val="1"/>
       <w:tblStyleColBandSize w:val="1"/>
@@ -10666,7 +11434,7 @@
         <w:bCs/>
         <w:i w:val="0"/>
         <w:iCs w:val="0"/>
-        <w:color w:val="FFFFFF" w:themeColor="background1"/>
+        <w:color w:val="000000"/>
       </w:rPr>
       <w:tblPr/>
       <w:tcPr>
@@ -10687,7 +11455,7 @@
         <w:bCs/>
         <w:i w:val="0"/>
         <w:iCs w:val="0"/>
-        <w:color w:val="FFFFFF" w:themeColor="background1"/>
+        <w:color w:val="000000"/>
       </w:rPr>
       <w:tblPr/>
       <w:tcPr>
@@ -10708,7 +11476,7 @@
         <w:bCs/>
         <w:i w:val="0"/>
         <w:iCs w:val="0"/>
-        <w:color w:val="FFFFFF" w:themeColor="background1"/>
+        <w:color w:val="000000"/>
       </w:rPr>
       <w:tblPr/>
       <w:tcPr>
@@ -10727,7 +11495,7 @@
         <w:bCs/>
         <w:i w:val="0"/>
         <w:iCs w:val="0"/>
-        <w:color w:val="FFFFFF" w:themeColor="background1"/>
+        <w:color w:val="000000"/>
       </w:rPr>
       <w:tblPr/>
       <w:tcPr>
@@ -10779,6 +11547,11 @@
     <w:pPr>
       <w:spacing w:after="0" w:line="240" w:lineRule="auto"/>
     </w:pPr>
+    <w:rPr>
+      <w:rFonts w:ascii="Times New Roman" w:hAnsi="Times New Roman"/>
+      <w:color w:val="000000"/>
+      <w:u w:val="none"/>
+    </w:rPr>
     <w:tblPr>
       <w:tblStyleRowBandSize w:val="1"/>
       <w:tblStyleColBandSize w:val="1"/>
@@ -10807,7 +11580,7 @@
         <w:bCs/>
         <w:i w:val="0"/>
         <w:iCs w:val="0"/>
-        <w:color w:val="FFFFFF" w:themeColor="background1"/>
+        <w:color w:val="000000"/>
       </w:rPr>
       <w:tblPr/>
       <w:tcPr>
@@ -10828,7 +11601,7 @@
         <w:bCs/>
         <w:i w:val="0"/>
         <w:iCs w:val="0"/>
-        <w:color w:val="FFFFFF" w:themeColor="background1"/>
+        <w:color w:val="000000"/>
       </w:rPr>
       <w:tblPr/>
       <w:tcPr>
@@ -10849,7 +11622,7 @@
         <w:bCs/>
         <w:i w:val="0"/>
         <w:iCs w:val="0"/>
-        <w:color w:val="FFFFFF" w:themeColor="background1"/>
+        <w:color w:val="000000"/>
       </w:rPr>
       <w:tblPr/>
       <w:tcPr>
@@ -10868,7 +11641,7 @@
         <w:bCs/>
         <w:i w:val="0"/>
         <w:iCs w:val="0"/>
-        <w:color w:val="FFFFFF" w:themeColor="background1"/>
+        <w:color w:val="000000"/>
       </w:rPr>
       <w:tblPr/>
       <w:tcPr>
@@ -10920,6 +11693,11 @@
     <w:pPr>
       <w:spacing w:after="0" w:line="240" w:lineRule="auto"/>
     </w:pPr>
+    <w:rPr>
+      <w:rFonts w:ascii="Times New Roman" w:hAnsi="Times New Roman"/>
+      <w:color w:val="000000"/>
+      <w:u w:val="none"/>
+    </w:rPr>
     <w:tblPr>
       <w:tblStyleRowBandSize w:val="1"/>
       <w:tblStyleColBandSize w:val="1"/>
@@ -10948,7 +11726,7 @@
         <w:bCs/>
         <w:i w:val="0"/>
         <w:iCs w:val="0"/>
-        <w:color w:val="FFFFFF" w:themeColor="background1"/>
+        <w:color w:val="000000"/>
       </w:rPr>
       <w:tblPr/>
       <w:tcPr>
@@ -10969,7 +11747,7 @@
         <w:bCs/>
         <w:i w:val="0"/>
         <w:iCs w:val="0"/>
-        <w:color w:val="FFFFFF" w:themeColor="background1"/>
+        <w:color w:val="000000"/>
       </w:rPr>
       <w:tblPr/>
       <w:tcPr>
@@ -10990,7 +11768,7 @@
         <w:bCs/>
         <w:i w:val="0"/>
         <w:iCs w:val="0"/>
-        <w:color w:val="FFFFFF" w:themeColor="background1"/>
+        <w:color w:val="000000"/>
       </w:rPr>
       <w:tblPr/>
       <w:tcPr>
@@ -11009,7 +11787,7 @@
         <w:bCs/>
         <w:i w:val="0"/>
         <w:iCs w:val="0"/>
-        <w:color w:val="FFFFFF" w:themeColor="background1"/>
+        <w:color w:val="000000"/>
       </w:rPr>
       <w:tblPr/>
       <w:tcPr>
@@ -11061,6 +11839,11 @@
     <w:pPr>
       <w:spacing w:after="0" w:line="240" w:lineRule="auto"/>
     </w:pPr>
+    <w:rPr>
+      <w:rFonts w:ascii="Times New Roman" w:hAnsi="Times New Roman"/>
+      <w:color w:val="000000"/>
+      <w:u w:val="none"/>
+    </w:rPr>
     <w:tblPr>
       <w:tblStyleRowBandSize w:val="1"/>
       <w:tblStyleColBandSize w:val="1"/>
@@ -11089,7 +11872,7 @@
         <w:bCs/>
         <w:i w:val="0"/>
         <w:iCs w:val="0"/>
-        <w:color w:val="FFFFFF" w:themeColor="background1"/>
+        <w:color w:val="000000"/>
       </w:rPr>
       <w:tblPr/>
       <w:tcPr>
@@ -11110,7 +11893,7 @@
         <w:bCs/>
         <w:i w:val="0"/>
         <w:iCs w:val="0"/>
-        <w:color w:val="FFFFFF" w:themeColor="background1"/>
+        <w:color w:val="000000"/>
       </w:rPr>
       <w:tblPr/>
       <w:tcPr>
@@ -11131,7 +11914,7 @@
         <w:bCs/>
         <w:i w:val="0"/>
         <w:iCs w:val="0"/>
-        <w:color w:val="FFFFFF" w:themeColor="background1"/>
+        <w:color w:val="000000"/>
       </w:rPr>
       <w:tblPr/>
       <w:tcPr>
@@ -11150,7 +11933,7 @@
         <w:bCs/>
         <w:i w:val="0"/>
         <w:iCs w:val="0"/>
-        <w:color w:val="FFFFFF" w:themeColor="background1"/>
+        <w:color w:val="000000"/>
       </w:rPr>
       <w:tblPr/>
       <w:tcPr>
@@ -11202,6 +11985,11 @@
     <w:pPr>
       <w:spacing w:after="0" w:line="240" w:lineRule="auto"/>
     </w:pPr>
+    <w:rPr>
+      <w:rFonts w:ascii="Times New Roman" w:hAnsi="Times New Roman"/>
+      <w:color w:val="000000"/>
+      <w:u w:val="none"/>
+    </w:rPr>
     <w:tblPr>
       <w:tblStyleRowBandSize w:val="1"/>
       <w:tblStyleColBandSize w:val="1"/>
@@ -11230,7 +12018,7 @@
         <w:bCs/>
         <w:i w:val="0"/>
         <w:iCs w:val="0"/>
-        <w:color w:val="FFFFFF" w:themeColor="background1"/>
+        <w:color w:val="000000"/>
       </w:rPr>
       <w:tblPr/>
       <w:tcPr>
@@ -11251,7 +12039,7 @@
         <w:bCs/>
         <w:i w:val="0"/>
         <w:iCs w:val="0"/>
-        <w:color w:val="FFFFFF" w:themeColor="background1"/>
+        <w:color w:val="000000"/>
       </w:rPr>
       <w:tblPr/>
       <w:tcPr>
@@ -11272,7 +12060,7 @@
         <w:bCs/>
         <w:i w:val="0"/>
         <w:iCs w:val="0"/>
-        <w:color w:val="FFFFFF" w:themeColor="background1"/>
+        <w:color w:val="000000"/>
       </w:rPr>
       <w:tblPr/>
       <w:tcPr>
@@ -11291,7 +12079,7 @@
         <w:bCs/>
         <w:i w:val="0"/>
         <w:iCs w:val="0"/>
-        <w:color w:val="FFFFFF" w:themeColor="background1"/>
+        <w:color w:val="000000"/>
       </w:rPr>
       <w:tblPr/>
       <w:tcPr>
@@ -11344,7 +12132,9 @@
       <w:spacing w:after="0" w:line="240" w:lineRule="auto"/>
     </w:pPr>
     <w:rPr>
-      <w:color w:val="FFFFFF" w:themeColor="background1"/>
+      <w:rFonts w:ascii="Times New Roman" w:hAnsi="Times New Roman"/>
+      <w:color w:val="000000"/>
+      <w:u w:val="none"/>
     </w:rPr>
     <w:tblPr>
       <w:tblStyleRowBandSize w:val="1"/>
@@ -11458,7 +12248,9 @@
       <w:spacing w:after="0" w:line="240" w:lineRule="auto"/>
     </w:pPr>
     <w:rPr>
-      <w:color w:val="FFFFFF" w:themeColor="background1"/>
+      <w:rFonts w:ascii="Times New Roman" w:hAnsi="Times New Roman"/>
+      <w:color w:val="000000"/>
+      <w:u w:val="none"/>
     </w:rPr>
     <w:tblPr>
       <w:tblStyleRowBandSize w:val="1"/>
@@ -11572,7 +12364,9 @@
       <w:spacing w:after="0" w:line="240" w:lineRule="auto"/>
     </w:pPr>
     <w:rPr>
-      <w:color w:val="FFFFFF" w:themeColor="background1"/>
+      <w:rFonts w:ascii="Times New Roman" w:hAnsi="Times New Roman"/>
+      <w:color w:val="000000"/>
+      <w:u w:val="none"/>
     </w:rPr>
     <w:tblPr>
       <w:tblStyleRowBandSize w:val="1"/>
@@ -11686,7 +12480,9 @@
       <w:spacing w:after="0" w:line="240" w:lineRule="auto"/>
     </w:pPr>
     <w:rPr>
-      <w:color w:val="FFFFFF" w:themeColor="background1"/>
+      <w:rFonts w:ascii="Times New Roman" w:hAnsi="Times New Roman"/>
+      <w:color w:val="000000"/>
+      <w:u w:val="none"/>
     </w:rPr>
     <w:tblPr>
       <w:tblStyleRowBandSize w:val="1"/>
@@ -11800,7 +12596,9 @@
       <w:spacing w:after="0" w:line="240" w:lineRule="auto"/>
     </w:pPr>
     <w:rPr>
-      <w:color w:val="FFFFFF" w:themeColor="background1"/>
+      <w:rFonts w:ascii="Times New Roman" w:hAnsi="Times New Roman"/>
+      <w:color w:val="000000"/>
+      <w:u w:val="none"/>
     </w:rPr>
     <w:tblPr>
       <w:tblStyleRowBandSize w:val="1"/>
@@ -11914,7 +12712,9 @@
       <w:spacing w:after="0" w:line="240" w:lineRule="auto"/>
     </w:pPr>
     <w:rPr>
-      <w:color w:val="FFFFFF" w:themeColor="background1"/>
+      <w:rFonts w:ascii="Times New Roman" w:hAnsi="Times New Roman"/>
+      <w:color w:val="000000"/>
+      <w:u w:val="none"/>
     </w:rPr>
     <w:tblPr>
       <w:tblStyleRowBandSize w:val="1"/>
@@ -12028,7 +12828,9 @@
       <w:spacing w:after="0" w:line="240" w:lineRule="auto"/>
     </w:pPr>
     <w:rPr>
-      <w:color w:val="FFFFFF" w:themeColor="background1"/>
+      <w:rFonts w:ascii="Times New Roman" w:hAnsi="Times New Roman"/>
+      <w:color w:val="000000"/>
+      <w:u w:val="none"/>
     </w:rPr>
     <w:tblPr>
       <w:tblStyleRowBandSize w:val="1"/>
@@ -12142,7 +12944,9 @@
       <w:spacing w:after="0" w:line="240" w:lineRule="auto"/>
     </w:pPr>
     <w:rPr>
-      <w:color w:val="000000" w:themeColor="text1"/>
+      <w:rFonts w:ascii="Times New Roman" w:hAnsi="Times New Roman"/>
+      <w:color w:val="000000"/>
+      <w:u w:val="none"/>
     </w:rPr>
     <w:tblPr>
       <w:tblStyleRowBandSize w:val="1"/>
@@ -12188,7 +12992,7 @@
       <w:rPr>
         <w:b/>
         <w:bCs/>
-        <w:color w:val="FFFFFF" w:themeColor="background1"/>
+        <w:color w:val="000000"/>
       </w:rPr>
       <w:tblPr/>
       <w:tcPr>
@@ -12200,7 +13004,7 @@
     </w:tblStylePr>
     <w:tblStylePr w:type="firstCol">
       <w:rPr>
-        <w:color w:val="FFFFFF" w:themeColor="background1"/>
+        <w:color w:val="000000"/>
       </w:rPr>
       <w:tblPr/>
       <w:tcPr>
@@ -12217,7 +13021,7 @@
     </w:tblStylePr>
     <w:tblStylePr w:type="lastCol">
       <w:rPr>
-        <w:color w:val="FFFFFF" w:themeColor="background1"/>
+        <w:color w:val="000000"/>
       </w:rPr>
       <w:tblPr/>
       <w:tcPr>
@@ -12246,12 +13050,12 @@
     </w:tblStylePr>
     <w:tblStylePr w:type="neCell">
       <w:rPr>
-        <w:color w:val="000000" w:themeColor="text1"/>
+        <w:color w:val="000000"/>
       </w:rPr>
     </w:tblStylePr>
     <w:tblStylePr w:type="nwCell">
       <w:rPr>
-        <w:color w:val="000000" w:themeColor="text1"/>
+        <w:color w:val="000000"/>
       </w:rPr>
     </w:tblStylePr>
   </w:style>
@@ -12264,7 +13068,9 @@
       <w:spacing w:after="0" w:line="240" w:lineRule="auto"/>
     </w:pPr>
     <w:rPr>
-      <w:color w:val="000000" w:themeColor="text1"/>
+      <w:rFonts w:ascii="Times New Roman" w:hAnsi="Times New Roman"/>
+      <w:color w:val="000000"/>
+      <w:u w:val="none"/>
     </w:rPr>
     <w:tblPr>
       <w:tblStyleRowBandSize w:val="1"/>
@@ -12310,7 +13116,7 @@
       <w:rPr>
         <w:b/>
         <w:bCs/>
-        <w:color w:val="FFFFFF" w:themeColor="background1"/>
+        <w:color w:val="000000"/>
       </w:rPr>
       <w:tblPr/>
       <w:tcPr>
@@ -12322,7 +13128,7 @@
     </w:tblStylePr>
     <w:tblStylePr w:type="firstCol">
       <w:rPr>
-        <w:color w:val="FFFFFF" w:themeColor="background1"/>
+        <w:color w:val="000000"/>
       </w:rPr>
       <w:tblPr/>
       <w:tcPr>
@@ -12339,7 +13145,7 @@
     </w:tblStylePr>
     <w:tblStylePr w:type="lastCol">
       <w:rPr>
-        <w:color w:val="FFFFFF" w:themeColor="background1"/>
+        <w:color w:val="000000"/>
       </w:rPr>
       <w:tblPr/>
       <w:tcPr>
@@ -12368,12 +13174,12 @@
     </w:tblStylePr>
     <w:tblStylePr w:type="neCell">
       <w:rPr>
-        <w:color w:val="000000" w:themeColor="text1"/>
+        <w:color w:val="000000"/>
       </w:rPr>
     </w:tblStylePr>
     <w:tblStylePr w:type="nwCell">
       <w:rPr>
-        <w:color w:val="000000" w:themeColor="text1"/>
+        <w:color w:val="000000"/>
       </w:rPr>
     </w:tblStylePr>
   </w:style>
@@ -12386,7 +13192,9 @@
       <w:spacing w:after="0" w:line="240" w:lineRule="auto"/>
     </w:pPr>
     <w:rPr>
-      <w:color w:val="000000" w:themeColor="text1"/>
+      <w:rFonts w:ascii="Times New Roman" w:hAnsi="Times New Roman"/>
+      <w:color w:val="000000"/>
+      <w:u w:val="none"/>
     </w:rPr>
     <w:tblPr>
       <w:tblStyleRowBandSize w:val="1"/>
@@ -12432,7 +13240,7 @@
       <w:rPr>
         <w:b/>
         <w:bCs/>
-        <w:color w:val="FFFFFF" w:themeColor="background1"/>
+        <w:color w:val="000000"/>
       </w:rPr>
       <w:tblPr/>
       <w:tcPr>
@@ -12444,7 +13252,7 @@
     </w:tblStylePr>
     <w:tblStylePr w:type="firstCol">
       <w:rPr>
-        <w:color w:val="FFFFFF" w:themeColor="background1"/>
+        <w:color w:val="000000"/>
       </w:rPr>
       <w:tblPr/>
       <w:tcPr>
@@ -12461,7 +13269,7 @@
     </w:tblStylePr>
     <w:tblStylePr w:type="lastCol">
       <w:rPr>
-        <w:color w:val="FFFFFF" w:themeColor="background1"/>
+        <w:color w:val="000000"/>
       </w:rPr>
       <w:tblPr/>
       <w:tcPr>
@@ -12490,12 +13298,12 @@
     </w:tblStylePr>
     <w:tblStylePr w:type="neCell">
       <w:rPr>
-        <w:color w:val="000000" w:themeColor="text1"/>
+        <w:color w:val="000000"/>
       </w:rPr>
     </w:tblStylePr>
     <w:tblStylePr w:type="nwCell">
       <w:rPr>
-        <w:color w:val="000000" w:themeColor="text1"/>
+        <w:color w:val="000000"/>
       </w:rPr>
     </w:tblStylePr>
   </w:style>
@@ -12508,7 +13316,9 @@
       <w:spacing w:after="0" w:line="240" w:lineRule="auto"/>
     </w:pPr>
     <w:rPr>
-      <w:color w:val="000000" w:themeColor="text1"/>
+      <w:rFonts w:ascii="Times New Roman" w:hAnsi="Times New Roman"/>
+      <w:color w:val="000000"/>
+      <w:u w:val="none"/>
     </w:rPr>
     <w:tblPr>
       <w:tblStyleRowBandSize w:val="1"/>
@@ -12554,7 +13364,7 @@
       <w:rPr>
         <w:b/>
         <w:bCs/>
-        <w:color w:val="FFFFFF" w:themeColor="background1"/>
+        <w:color w:val="000000"/>
       </w:rPr>
       <w:tblPr/>
       <w:tcPr>
@@ -12566,7 +13376,7 @@
     </w:tblStylePr>
     <w:tblStylePr w:type="firstCol">
       <w:rPr>
-        <w:color w:val="FFFFFF" w:themeColor="background1"/>
+        <w:color w:val="000000"/>
       </w:rPr>
       <w:tblPr/>
       <w:tcPr>
@@ -12583,7 +13393,7 @@
     </w:tblStylePr>
     <w:tblStylePr w:type="lastCol">
       <w:rPr>
-        <w:color w:val="FFFFFF" w:themeColor="background1"/>
+        <w:color w:val="000000"/>
       </w:rPr>
       <w:tblPr/>
       <w:tcPr>
@@ -12620,7 +13430,9 @@
       <w:spacing w:after="0" w:line="240" w:lineRule="auto"/>
     </w:pPr>
     <w:rPr>
-      <w:color w:val="000000" w:themeColor="text1"/>
+      <w:rFonts w:ascii="Times New Roman" w:hAnsi="Times New Roman"/>
+      <w:color w:val="000000"/>
+      <w:u w:val="none"/>
     </w:rPr>
     <w:tblPr>
       <w:tblStyleRowBandSize w:val="1"/>
@@ -12666,7 +13478,7 @@
       <w:rPr>
         <w:b/>
         <w:bCs/>
-        <w:color w:val="FFFFFF" w:themeColor="background1"/>
+        <w:color w:val="000000"/>
       </w:rPr>
       <w:tblPr/>
       <w:tcPr>
@@ -12678,7 +13490,7 @@
     </w:tblStylePr>
     <w:tblStylePr w:type="firstCol">
       <w:rPr>
-        <w:color w:val="FFFFFF" w:themeColor="background1"/>
+        <w:color w:val="000000"/>
       </w:rPr>
       <w:tblPr/>
       <w:tcPr>
@@ -12695,7 +13507,7 @@
     </w:tblStylePr>
     <w:tblStylePr w:type="lastCol">
       <w:rPr>
-        <w:color w:val="FFFFFF" w:themeColor="background1"/>
+        <w:color w:val="000000"/>
       </w:rPr>
       <w:tblPr/>
       <w:tcPr>
@@ -12724,12 +13536,12 @@
     </w:tblStylePr>
     <w:tblStylePr w:type="neCell">
       <w:rPr>
-        <w:color w:val="000000" w:themeColor="text1"/>
+        <w:color w:val="000000"/>
       </w:rPr>
     </w:tblStylePr>
     <w:tblStylePr w:type="nwCell">
       <w:rPr>
-        <w:color w:val="000000" w:themeColor="text1"/>
+        <w:color w:val="000000"/>
       </w:rPr>
     </w:tblStylePr>
   </w:style>
@@ -12742,7 +13554,9 @@
       <w:spacing w:after="0" w:line="240" w:lineRule="auto"/>
     </w:pPr>
     <w:rPr>
-      <w:color w:val="000000" w:themeColor="text1"/>
+      <w:rFonts w:ascii="Times New Roman" w:hAnsi="Times New Roman"/>
+      <w:color w:val="000000"/>
+      <w:u w:val="none"/>
     </w:rPr>
     <w:tblPr>
       <w:tblStyleRowBandSize w:val="1"/>
@@ -12788,7 +13602,7 @@
       <w:rPr>
         <w:b/>
         <w:bCs/>
-        <w:color w:val="FFFFFF" w:themeColor="background1"/>
+        <w:color w:val="000000"/>
       </w:rPr>
       <w:tblPr/>
       <w:tcPr>
@@ -12800,7 +13614,7 @@
     </w:tblStylePr>
     <w:tblStylePr w:type="firstCol">
       <w:rPr>
-        <w:color w:val="FFFFFF" w:themeColor="background1"/>
+        <w:color w:val="000000"/>
       </w:rPr>
       <w:tblPr/>
       <w:tcPr>
@@ -12817,7 +13631,7 @@
     </w:tblStylePr>
     <w:tblStylePr w:type="lastCol">
       <w:rPr>
-        <w:color w:val="FFFFFF" w:themeColor="background1"/>
+        <w:color w:val="000000"/>
       </w:rPr>
       <w:tblPr/>
       <w:tcPr>
@@ -12846,12 +13660,12 @@
     </w:tblStylePr>
     <w:tblStylePr w:type="neCell">
       <w:rPr>
-        <w:color w:val="000000" w:themeColor="text1"/>
+        <w:color w:val="000000"/>
       </w:rPr>
     </w:tblStylePr>
     <w:tblStylePr w:type="nwCell">
       <w:rPr>
-        <w:color w:val="000000" w:themeColor="text1"/>
+        <w:color w:val="000000"/>
       </w:rPr>
     </w:tblStylePr>
   </w:style>
@@ -12864,7 +13678,9 @@
       <w:spacing w:after="0" w:line="240" w:lineRule="auto"/>
     </w:pPr>
     <w:rPr>
-      <w:color w:val="000000" w:themeColor="text1"/>
+      <w:rFonts w:ascii="Times New Roman" w:hAnsi="Times New Roman"/>
+      <w:color w:val="000000"/>
+      <w:u w:val="none"/>
     </w:rPr>
     <w:tblPr>
       <w:tblStyleRowBandSize w:val="1"/>
@@ -12910,7 +13726,7 @@
       <w:rPr>
         <w:b/>
         <w:bCs/>
-        <w:color w:val="FFFFFF" w:themeColor="background1"/>
+        <w:color w:val="000000"/>
       </w:rPr>
       <w:tblPr/>
       <w:tcPr>
@@ -12922,7 +13738,7 @@
     </w:tblStylePr>
     <w:tblStylePr w:type="firstCol">
       <w:rPr>
-        <w:color w:val="FFFFFF" w:themeColor="background1"/>
+        <w:color w:val="000000"/>
       </w:rPr>
       <w:tblPr/>
       <w:tcPr>
@@ -12939,7 +13755,7 @@
     </w:tblStylePr>
     <w:tblStylePr w:type="lastCol">
       <w:rPr>
-        <w:color w:val="FFFFFF" w:themeColor="background1"/>
+        <w:color w:val="000000"/>
       </w:rPr>
       <w:tblPr/>
       <w:tcPr>
@@ -12968,12 +13784,12 @@
     </w:tblStylePr>
     <w:tblStylePr w:type="neCell">
       <w:rPr>
-        <w:color w:val="000000" w:themeColor="text1"/>
+        <w:color w:val="000000"/>
       </w:rPr>
     </w:tblStylePr>
     <w:tblStylePr w:type="nwCell">
       <w:rPr>
-        <w:color w:val="000000" w:themeColor="text1"/>
+        <w:color w:val="000000"/>
       </w:rPr>
     </w:tblStylePr>
   </w:style>
@@ -12986,7 +13802,9 @@
       <w:spacing w:after="0" w:line="240" w:lineRule="auto"/>
     </w:pPr>
     <w:rPr>
-      <w:color w:val="000000" w:themeColor="text1"/>
+      <w:rFonts w:ascii="Times New Roman" w:hAnsi="Times New Roman"/>
+      <w:color w:val="000000"/>
+      <w:u w:val="none"/>
     </w:rPr>
     <w:tblPr>
       <w:tblStyleRowBandSize w:val="1"/>
@@ -13006,7 +13824,7 @@
       <w:rPr>
         <w:b/>
         <w:bCs/>
-        <w:color w:val="FFFFFF" w:themeColor="background1"/>
+        <w:color w:val="000000"/>
       </w:rPr>
       <w:tblPr/>
       <w:tcPr>
@@ -13020,7 +13838,7 @@
       <w:rPr>
         <w:b/>
         <w:bCs/>
-        <w:color w:val="9E3A38" w:themeColor="accent2" w:themeShade="CC"/>
+        <w:color w:val="000000"/>
       </w:rPr>
       <w:tblPr/>
       <w:tcPr>
@@ -13072,7 +13890,9 @@
       <w:spacing w:after="0" w:line="240" w:lineRule="auto"/>
     </w:pPr>
     <w:rPr>
-      <w:color w:val="000000" w:themeColor="text1"/>
+      <w:rFonts w:ascii="Times New Roman" w:hAnsi="Times New Roman"/>
+      <w:color w:val="000000"/>
+      <w:u w:val="none"/>
     </w:rPr>
     <w:tblPr>
       <w:tblStyleRowBandSize w:val="1"/>
@@ -13092,7 +13912,7 @@
       <w:rPr>
         <w:b/>
         <w:bCs/>
-        <w:color w:val="FFFFFF" w:themeColor="background1"/>
+        <w:color w:val="000000"/>
       </w:rPr>
       <w:tblPr/>
       <w:tcPr>
@@ -13106,7 +13926,7 @@
       <w:rPr>
         <w:b/>
         <w:bCs/>
-        <w:color w:val="9E3A38" w:themeColor="accent2" w:themeShade="CC"/>
+        <w:color w:val="000000"/>
       </w:rPr>
       <w:tblPr/>
       <w:tcPr>
@@ -13158,7 +13978,9 @@
       <w:spacing w:after="0" w:line="240" w:lineRule="auto"/>
     </w:pPr>
     <w:rPr>
-      <w:color w:val="000000" w:themeColor="text1"/>
+      <w:rFonts w:ascii="Times New Roman" w:hAnsi="Times New Roman"/>
+      <w:color w:val="000000"/>
+      <w:u w:val="none"/>
     </w:rPr>
     <w:tblPr>
       <w:tblStyleRowBandSize w:val="1"/>
@@ -13178,7 +14000,7 @@
       <w:rPr>
         <w:b/>
         <w:bCs/>
-        <w:color w:val="FFFFFF" w:themeColor="background1"/>
+        <w:color w:val="000000"/>
       </w:rPr>
       <w:tblPr/>
       <w:tcPr>
@@ -13192,7 +14014,7 @@
       <w:rPr>
         <w:b/>
         <w:bCs/>
-        <w:color w:val="9E3A38" w:themeColor="accent2" w:themeShade="CC"/>
+        <w:color w:val="000000"/>
       </w:rPr>
       <w:tblPr/>
       <w:tcPr>
@@ -13244,7 +14066,9 @@
       <w:spacing w:after="0" w:line="240" w:lineRule="auto"/>
     </w:pPr>
     <w:rPr>
-      <w:color w:val="000000" w:themeColor="text1"/>
+      <w:rFonts w:ascii="Times New Roman" w:hAnsi="Times New Roman"/>
+      <w:color w:val="000000"/>
+      <w:u w:val="none"/>
     </w:rPr>
     <w:tblPr>
       <w:tblStyleRowBandSize w:val="1"/>
@@ -13264,7 +14088,7 @@
       <w:rPr>
         <w:b/>
         <w:bCs/>
-        <w:color w:val="FFFFFF" w:themeColor="background1"/>
+        <w:color w:val="000000"/>
       </w:rPr>
       <w:tblPr/>
       <w:tcPr>
@@ -13278,7 +14102,7 @@
       <w:rPr>
         <w:b/>
         <w:bCs/>
-        <w:color w:val="664E82" w:themeColor="accent4" w:themeShade="CC"/>
+        <w:color w:val="000000"/>
       </w:rPr>
       <w:tblPr/>
       <w:tcPr>
@@ -13330,7 +14154,9 @@
       <w:spacing w:after="0" w:line="240" w:lineRule="auto"/>
     </w:pPr>
     <w:rPr>
-      <w:color w:val="000000" w:themeColor="text1"/>
+      <w:rFonts w:ascii="Times New Roman" w:hAnsi="Times New Roman"/>
+      <w:color w:val="000000"/>
+      <w:u w:val="none"/>
     </w:rPr>
     <w:tblPr>
       <w:tblStyleRowBandSize w:val="1"/>
@@ -13350,7 +14176,7 @@
       <w:rPr>
         <w:b/>
         <w:bCs/>
-        <w:color w:val="FFFFFF" w:themeColor="background1"/>
+        <w:color w:val="000000"/>
       </w:rPr>
       <w:tblPr/>
       <w:tcPr>
@@ -13364,7 +14190,7 @@
       <w:rPr>
         <w:b/>
         <w:bCs/>
-        <w:color w:val="7E9C40" w:themeColor="accent3" w:themeShade="CC"/>
+        <w:color w:val="000000"/>
       </w:rPr>
       <w:tblPr/>
       <w:tcPr>
@@ -13416,7 +14242,9 @@
       <w:spacing w:after="0" w:line="240" w:lineRule="auto"/>
     </w:pPr>
     <w:rPr>
-      <w:color w:val="000000" w:themeColor="text1"/>
+      <w:rFonts w:ascii="Times New Roman" w:hAnsi="Times New Roman"/>
+      <w:color w:val="000000"/>
+      <w:u w:val="none"/>
     </w:rPr>
     <w:tblPr>
       <w:tblStyleRowBandSize w:val="1"/>
@@ -13436,7 +14264,7 @@
       <w:rPr>
         <w:b/>
         <w:bCs/>
-        <w:color w:val="FFFFFF" w:themeColor="background1"/>
+        <w:color w:val="000000"/>
       </w:rPr>
       <w:tblPr/>
       <w:tcPr>
@@ -13450,7 +14278,7 @@
       <w:rPr>
         <w:b/>
         <w:bCs/>
-        <w:color w:val="F2730A" w:themeColor="accent6" w:themeShade="CC"/>
+        <w:color w:val="000000"/>
       </w:rPr>
       <w:tblPr/>
       <w:tcPr>
@@ -13502,7 +14330,9 @@
       <w:spacing w:after="0" w:line="240" w:lineRule="auto"/>
     </w:pPr>
     <w:rPr>
-      <w:color w:val="000000" w:themeColor="text1"/>
+      <w:rFonts w:ascii="Times New Roman" w:hAnsi="Times New Roman"/>
+      <w:color w:val="000000"/>
+      <w:u w:val="none"/>
     </w:rPr>
     <w:tblPr>
       <w:tblStyleRowBandSize w:val="1"/>
@@ -13522,7 +14352,7 @@
       <w:rPr>
         <w:b/>
         <w:bCs/>
-        <w:color w:val="FFFFFF" w:themeColor="background1"/>
+        <w:color w:val="000000"/>
       </w:rPr>
       <w:tblPr/>
       <w:tcPr>
@@ -13536,7 +14366,7 @@
       <w:rPr>
         <w:b/>
         <w:bCs/>
-        <w:color w:val="348DA5" w:themeColor="accent5" w:themeShade="CC"/>
+        <w:color w:val="000000"/>
       </w:rPr>
       <w:tblPr/>
       <w:tcPr>
@@ -13588,7 +14418,9 @@
       <w:spacing w:after="0" w:line="240" w:lineRule="auto"/>
     </w:pPr>
     <w:rPr>
-      <w:color w:val="000000" w:themeColor="text1"/>
+      <w:rFonts w:ascii="Times New Roman" w:hAnsi="Times New Roman"/>
+      <w:color w:val="000000"/>
+      <w:u w:val="none"/>
     </w:rPr>
     <w:tblPr>
       <w:tblStyleRowBandSize w:val="1"/>
@@ -13621,7 +14453,7 @@
       <w:rPr>
         <w:b/>
         <w:bCs/>
-        <w:color w:val="000000" w:themeColor="text1"/>
+        <w:color w:val="000000"/>
       </w:rPr>
       <w:tblPr/>
       <w:tcPr>
@@ -13630,7 +14462,7 @@
     </w:tblStylePr>
     <w:tblStylePr w:type="firstCol">
       <w:rPr>
-        <w:color w:val="FFFFFF" w:themeColor="background1"/>
+        <w:color w:val="000000"/>
       </w:rPr>
       <w:tblPr/>
       <w:tcPr>
@@ -13639,7 +14471,7 @@
     </w:tblStylePr>
     <w:tblStylePr w:type="lastCol">
       <w:rPr>
-        <w:color w:val="FFFFFF" w:themeColor="background1"/>
+        <w:color w:val="000000"/>
       </w:rPr>
       <w:tblPr/>
       <w:tcPr>
@@ -13668,7 +14500,9 @@
       <w:spacing w:after="0" w:line="240" w:lineRule="auto"/>
     </w:pPr>
     <w:rPr>
-      <w:color w:val="000000" w:themeColor="text1"/>
+      <w:rFonts w:ascii="Times New Roman" w:hAnsi="Times New Roman"/>
+      <w:color w:val="000000"/>
+      <w:u w:val="none"/>
     </w:rPr>
     <w:tblPr>
       <w:tblStyleRowBandSize w:val="1"/>
@@ -13701,7 +14535,7 @@
       <w:rPr>
         <w:b/>
         <w:bCs/>
-        <w:color w:val="000000" w:themeColor="text1"/>
+        <w:color w:val="000000"/>
       </w:rPr>
       <w:tblPr/>
       <w:tcPr>
@@ -13710,7 +14544,7 @@
     </w:tblStylePr>
     <w:tblStylePr w:type="firstCol">
       <w:rPr>
-        <w:color w:val="FFFFFF" w:themeColor="background1"/>
+        <w:color w:val="000000"/>
       </w:rPr>
       <w:tblPr/>
       <w:tcPr>
@@ -13719,7 +14553,7 @@
     </w:tblStylePr>
     <w:tblStylePr w:type="lastCol">
       <w:rPr>
-        <w:color w:val="FFFFFF" w:themeColor="background1"/>
+        <w:color w:val="000000"/>
       </w:rPr>
       <w:tblPr/>
       <w:tcPr>
@@ -13748,7 +14582,9 @@
       <w:spacing w:after="0" w:line="240" w:lineRule="auto"/>
     </w:pPr>
     <w:rPr>
-      <w:color w:val="000000" w:themeColor="text1"/>
+      <w:rFonts w:ascii="Times New Roman" w:hAnsi="Times New Roman"/>
+      <w:color w:val="000000"/>
+      <w:u w:val="none"/>
     </w:rPr>
     <w:tblPr>
       <w:tblStyleRowBandSize w:val="1"/>
@@ -13781,7 +14617,7 @@
       <w:rPr>
         <w:b/>
         <w:bCs/>
-        <w:color w:val="000000" w:themeColor="text1"/>
+        <w:color w:val="000000"/>
       </w:rPr>
       <w:tblPr/>
       <w:tcPr>
@@ -13790,7 +14626,7 @@
     </w:tblStylePr>
     <w:tblStylePr w:type="firstCol">
       <w:rPr>
-        <w:color w:val="FFFFFF" w:themeColor="background1"/>
+        <w:color w:val="000000"/>
       </w:rPr>
       <w:tblPr/>
       <w:tcPr>
@@ -13799,7 +14635,7 @@
     </w:tblStylePr>
     <w:tblStylePr w:type="lastCol">
       <w:rPr>
-        <w:color w:val="FFFFFF" w:themeColor="background1"/>
+        <w:color w:val="000000"/>
       </w:rPr>
       <w:tblPr/>
       <w:tcPr>
@@ -13828,7 +14664,9 @@
       <w:spacing w:after="0" w:line="240" w:lineRule="auto"/>
     </w:pPr>
     <w:rPr>
-      <w:color w:val="000000" w:themeColor="text1"/>
+      <w:rFonts w:ascii="Times New Roman" w:hAnsi="Times New Roman"/>
+      <w:color w:val="000000"/>
+      <w:u w:val="none"/>
     </w:rPr>
     <w:tblPr>
       <w:tblStyleRowBandSize w:val="1"/>
@@ -13861,7 +14699,7 @@
       <w:rPr>
         <w:b/>
         <w:bCs/>
-        <w:color w:val="000000" w:themeColor="text1"/>
+        <w:color w:val="000000"/>
       </w:rPr>
       <w:tblPr/>
       <w:tcPr>
@@ -13870,7 +14708,7 @@
     </w:tblStylePr>
     <w:tblStylePr w:type="firstCol">
       <w:rPr>
-        <w:color w:val="FFFFFF" w:themeColor="background1"/>
+        <w:color w:val="000000"/>
       </w:rPr>
       <w:tblPr/>
       <w:tcPr>
@@ -13879,7 +14717,7 @@
     </w:tblStylePr>
     <w:tblStylePr w:type="lastCol">
       <w:rPr>
-        <w:color w:val="FFFFFF" w:themeColor="background1"/>
+        <w:color w:val="000000"/>
       </w:rPr>
       <w:tblPr/>
       <w:tcPr>
@@ -13908,7 +14746,9 @@
       <w:spacing w:after="0" w:line="240" w:lineRule="auto"/>
     </w:pPr>
     <w:rPr>
-      <w:color w:val="000000" w:themeColor="text1"/>
+      <w:rFonts w:ascii="Times New Roman" w:hAnsi="Times New Roman"/>
+      <w:color w:val="000000"/>
+      <w:u w:val="none"/>
     </w:rPr>
     <w:tblPr>
       <w:tblStyleRowBandSize w:val="1"/>
@@ -13941,7 +14781,7 @@
       <w:rPr>
         <w:b/>
         <w:bCs/>
-        <w:color w:val="000000" w:themeColor="text1"/>
+        <w:color w:val="000000"/>
       </w:rPr>
       <w:tblPr/>
       <w:tcPr>
@@ -13950,7 +14790,7 @@
     </w:tblStylePr>
     <w:tblStylePr w:type="firstCol">
       <w:rPr>
-        <w:color w:val="FFFFFF" w:themeColor="background1"/>
+        <w:color w:val="000000"/>
       </w:rPr>
       <w:tblPr/>
       <w:tcPr>
@@ -13959,7 +14799,7 @@
     </w:tblStylePr>
     <w:tblStylePr w:type="lastCol">
       <w:rPr>
-        <w:color w:val="FFFFFF" w:themeColor="background1"/>
+        <w:color w:val="000000"/>
       </w:rPr>
       <w:tblPr/>
       <w:tcPr>
@@ -13988,7 +14828,9 @@
       <w:spacing w:after="0" w:line="240" w:lineRule="auto"/>
     </w:pPr>
     <w:rPr>
-      <w:color w:val="000000" w:themeColor="text1"/>
+      <w:rFonts w:ascii="Times New Roman" w:hAnsi="Times New Roman"/>
+      <w:color w:val="000000"/>
+      <w:u w:val="none"/>
     </w:rPr>
     <w:tblPr>
       <w:tblStyleRowBandSize w:val="1"/>
@@ -14021,7 +14863,7 @@
       <w:rPr>
         <w:b/>
         <w:bCs/>
-        <w:color w:val="000000" w:themeColor="text1"/>
+        <w:color w:val="000000"/>
       </w:rPr>
       <w:tblPr/>
       <w:tcPr>
@@ -14030,7 +14872,7 @@
     </w:tblStylePr>
     <w:tblStylePr w:type="firstCol">
       <w:rPr>
-        <w:color w:val="FFFFFF" w:themeColor="background1"/>
+        <w:color w:val="000000"/>
       </w:rPr>
       <w:tblPr/>
       <w:tcPr>
@@ -14039,7 +14881,7 @@
     </w:tblStylePr>
     <w:tblStylePr w:type="lastCol">
       <w:rPr>
-        <w:color w:val="FFFFFF" w:themeColor="background1"/>
+        <w:color w:val="000000"/>
       </w:rPr>
       <w:tblPr/>
       <w:tcPr>
@@ -14068,7 +14910,9 @@
       <w:spacing w:after="0" w:line="240" w:lineRule="auto"/>
     </w:pPr>
     <w:rPr>
-      <w:color w:val="000000" w:themeColor="text1"/>
+      <w:rFonts w:ascii="Times New Roman" w:hAnsi="Times New Roman"/>
+      <w:color w:val="000000"/>
+      <w:u w:val="none"/>
     </w:rPr>
     <w:tblPr>
       <w:tblStyleRowBandSize w:val="1"/>
@@ -14101,7 +14945,7 @@
       <w:rPr>
         <w:b/>
         <w:bCs/>
-        <w:color w:val="000000" w:themeColor="text1"/>
+        <w:color w:val="000000"/>
       </w:rPr>
       <w:tblPr/>
       <w:tcPr>
@@ -14110,7 +14954,7 @@
     </w:tblStylePr>
     <w:tblStylePr w:type="firstCol">
       <w:rPr>
-        <w:color w:val="FFFFFF" w:themeColor="background1"/>
+        <w:color w:val="000000"/>
       </w:rPr>
       <w:tblPr/>
       <w:tcPr>
@@ -14119,7 +14963,7 @@
     </w:tblStylePr>
     <w:tblStylePr w:type="lastCol">
       <w:rPr>
-        <w:color w:val="FFFFFF" w:themeColor="background1"/>
+        <w:color w:val="000000"/>
       </w:rPr>
       <w:tblPr/>
       <w:tcPr>

</xml_diff>

<commit_message>
Match report typography and page layout to supplied sample
</commit_message>
<xml_diff>
--- a/reports/Отчет.docx
+++ b/reports/Отчет.docx
@@ -4,19 +4,43 @@
   <w:body>
     <w:p>
       <w:pPr>
-        <w:ind w:firstLine="0"/>
+        <w:keepNext w:val="0"/>
+        <w:keepLines w:val="0"/>
+        <w:pageBreakBefore w:val="0"/>
+        <w:spacing w:before="0" w:after="280" w:line="360" w:lineRule="auto"/>
+        <w:ind w:left="0" w:right="0" w:firstLine="720"/>
         <w:jc w:val="center"/>
       </w:pPr>
       <w:r>
+        <w:rPr>
+          <w:rFonts w:ascii="Times New Roman" w:hAnsi="Times New Roman" w:eastAsia="Times New Roman" w:cs="Times New Roman"/>
+          <w:b w:val="0"/>
+          <w:i w:val="0"/>
+          <w:color w:val="000000"/>
+          <w:sz w:val="28"/>
+          <w:u w:val="none"/>
+        </w:rPr>
         <w:t>МИНОБРНАУКИ РОССИИ</w:t>
       </w:r>
     </w:p>
     <w:p>
       <w:pPr>
-        <w:ind w:firstLine="0"/>
+        <w:keepNext w:val="0"/>
+        <w:keepLines w:val="0"/>
+        <w:pageBreakBefore w:val="0"/>
+        <w:spacing w:before="280" w:after="280" w:line="360" w:lineRule="auto"/>
+        <w:ind w:left="0" w:right="0" w:firstLine="0"/>
         <w:jc w:val="center"/>
       </w:pPr>
       <w:r>
+        <w:rPr>
+          <w:rFonts w:ascii="Times New Roman" w:hAnsi="Times New Roman" w:eastAsia="Times New Roman" w:cs="Times New Roman"/>
+          <w:b w:val="0"/>
+          <w:i w:val="0"/>
+          <w:color w:val="000000"/>
+          <w:sz w:val="28"/>
+          <w:u w:val="none"/>
+        </w:rPr>
         <w:t>Воронежский государственный университет</w:t>
         <w:br/>
         <w:t>Факультет прикладной математики, информатики и механики</w:t>
@@ -25,7 +49,23 @@
       </w:r>
     </w:p>
     <w:p>
+      <w:pPr>
+        <w:keepNext w:val="0"/>
+        <w:keepLines w:val="0"/>
+        <w:pageBreakBefore w:val="0"/>
+        <w:spacing w:before="0" w:after="0" w:line="280" w:lineRule="exact"/>
+        <w:ind w:left="0" w:right="0" w:firstLine="0"/>
+        <w:jc w:val="center"/>
+      </w:pPr>
       <w:r>
+        <w:rPr>
+          <w:rFonts w:ascii="Times New Roman" w:hAnsi="Times New Roman" w:eastAsia="Times New Roman" w:cs="Times New Roman"/>
+          <w:b w:val="0"/>
+          <w:i w:val="0"/>
+          <w:color w:val="000000"/>
+          <w:sz w:val="28"/>
+          <w:u w:val="none"/>
+        </w:rPr>
         <w:br/>
         <w:br/>
         <w:br/>
@@ -33,42 +73,110 @@
     </w:p>
     <w:p>
       <w:pPr>
-        <w:ind w:firstLine="0"/>
+        <w:keepNext w:val="0"/>
+        <w:keepLines w:val="0"/>
+        <w:pageBreakBefore w:val="0"/>
+        <w:spacing w:before="280" w:after="280" w:line="360" w:lineRule="auto"/>
+        <w:ind w:left="0" w:right="0" w:firstLine="0"/>
         <w:jc w:val="center"/>
       </w:pPr>
       <w:r>
+        <w:rPr>
+          <w:rFonts w:ascii="Times New Roman" w:hAnsi="Times New Roman" w:eastAsia="Times New Roman" w:cs="Times New Roman"/>
+          <w:b/>
+          <w:i w:val="0"/>
+          <w:color w:val="000000"/>
+          <w:sz w:val="28"/>
+          <w:u w:val="none"/>
+        </w:rPr>
         <w:t>Цифровая обработка изображений</w:t>
       </w:r>
     </w:p>
     <w:p>
       <w:pPr>
-        <w:ind w:firstLine="0"/>
+        <w:keepNext w:val="0"/>
+        <w:keepLines w:val="0"/>
+        <w:pageBreakBefore w:val="0"/>
+        <w:spacing w:before="280" w:after="280" w:line="360" w:lineRule="auto"/>
+        <w:ind w:left="0" w:right="0" w:firstLine="0"/>
         <w:jc w:val="center"/>
       </w:pPr>
       <w:r>
+        <w:rPr>
+          <w:rFonts w:ascii="Times New Roman" w:hAnsi="Times New Roman" w:eastAsia="Times New Roman" w:cs="Times New Roman"/>
+          <w:b w:val="0"/>
+          <w:i w:val="0"/>
+          <w:color w:val="000000"/>
+          <w:sz w:val="28"/>
+          <w:u w:val="none"/>
+        </w:rPr>
         <w:t>Лабораторная работа № 2</w:t>
       </w:r>
     </w:p>
     <w:p>
       <w:pPr>
-        <w:ind w:firstLine="0"/>
+        <w:keepNext w:val="0"/>
+        <w:keepLines w:val="0"/>
+        <w:pageBreakBefore w:val="0"/>
+        <w:spacing w:before="280" w:after="280" w:line="360" w:lineRule="auto"/>
+        <w:ind w:left="0" w:right="0" w:firstLine="0"/>
         <w:jc w:val="center"/>
       </w:pPr>
       <w:r>
+        <w:rPr>
+          <w:rFonts w:ascii="Times New Roman" w:hAnsi="Times New Roman" w:eastAsia="Times New Roman" w:cs="Times New Roman"/>
+          <w:b w:val="0"/>
+          <w:i w:val="0"/>
+          <w:color w:val="000000"/>
+          <w:sz w:val="28"/>
+          <w:u w:val="none"/>
+        </w:rPr>
         <w:t>Выделение контуров и пространственная фильтрация</w:t>
         <w:br/>
         <w:t>Варианты 1, 2 и 3</w:t>
       </w:r>
     </w:p>
     <w:p>
+      <w:pPr>
+        <w:keepNext w:val="0"/>
+        <w:keepLines w:val="0"/>
+        <w:pageBreakBefore w:val="0"/>
+        <w:spacing w:before="0" w:after="0" w:line="280" w:lineRule="exact"/>
+        <w:ind w:left="0" w:right="0" w:firstLine="0"/>
+        <w:jc w:val="center"/>
+      </w:pPr>
       <w:r>
+        <w:rPr>
+          <w:rFonts w:ascii="Times New Roman" w:hAnsi="Times New Roman" w:eastAsia="Times New Roman" w:cs="Times New Roman"/>
+          <w:b w:val="0"/>
+          <w:i w:val="0"/>
+          <w:color w:val="000000"/>
+          <w:sz w:val="28"/>
+          <w:u w:val="none"/>
+        </w:rPr>
         <w:br/>
         <w:br/>
         <w:br/>
       </w:r>
     </w:p>
     <w:p>
+      <w:pPr>
+        <w:keepNext w:val="0"/>
+        <w:keepLines w:val="0"/>
+        <w:pageBreakBefore w:val="0"/>
+        <w:spacing w:before="280" w:after="280" w:line="360" w:lineRule="auto"/>
+        <w:ind w:left="0" w:right="0" w:firstLine="0"/>
+        <w:jc w:val="left"/>
+      </w:pPr>
       <w:r>
+        <w:rPr>
+          <w:rFonts w:ascii="Times New Roman" w:hAnsi="Times New Roman" w:eastAsia="Times New Roman" w:cs="Times New Roman"/>
+          <w:b w:val="0"/>
+          <w:i w:val="0"/>
+          <w:color w:val="000000"/>
+          <w:sz w:val="28"/>
+          <w:u w:val="none"/>
+        </w:rPr>
         <w:t>Выполнил(а): __________________________</w:t>
         <w:br/>
         <w:t>Группа: ______________________________</w:t>
@@ -77,91 +185,276 @@
       </w:r>
     </w:p>
     <w:p>
+      <w:pPr>
+        <w:keepNext w:val="0"/>
+        <w:keepLines w:val="0"/>
+        <w:pageBreakBefore w:val="0"/>
+        <w:spacing w:before="0" w:after="0" w:line="280" w:lineRule="exact"/>
+        <w:ind w:left="0" w:right="0" w:firstLine="0"/>
+        <w:jc w:val="center"/>
+      </w:pPr>
       <w:r>
+        <w:rPr>
+          <w:rFonts w:ascii="Times New Roman" w:hAnsi="Times New Roman" w:eastAsia="Times New Roman" w:cs="Times New Roman"/>
+          <w:b w:val="0"/>
+          <w:i w:val="0"/>
+          <w:color w:val="000000"/>
+          <w:sz w:val="28"/>
+          <w:u w:val="none"/>
+        </w:rPr>
         <w:br/>
         <w:br/>
       </w:r>
     </w:p>
     <w:p>
       <w:pPr>
-        <w:ind w:firstLine="0"/>
+        <w:keepNext w:val="0"/>
+        <w:keepLines w:val="0"/>
+        <w:pageBreakBefore w:val="0"/>
+        <w:spacing w:before="280" w:after="280" w:line="360" w:lineRule="auto"/>
+        <w:ind w:left="0" w:right="0" w:firstLine="0"/>
         <w:jc w:val="center"/>
       </w:pPr>
       <w:r>
+        <w:rPr>
+          <w:rFonts w:ascii="Times New Roman" w:hAnsi="Times New Roman" w:eastAsia="Times New Roman" w:cs="Times New Roman"/>
+          <w:b w:val="0"/>
+          <w:i w:val="0"/>
+          <w:color w:val="000000"/>
+          <w:sz w:val="28"/>
+          <w:u w:val="none"/>
+        </w:rPr>
         <w:t>Воронеж, 2026</w:t>
       </w:r>
     </w:p>
     <w:p>
+      <w:pPr>
+        <w:keepNext w:val="0"/>
+        <w:keepLines w:val="0"/>
+        <w:pageBreakBefore w:val="0"/>
+        <w:spacing w:before="0" w:after="0" w:line="20" w:lineRule="exact"/>
+        <w:ind w:firstLine="720" w:left="0" w:right="0"/>
+        <w:jc w:val="both"/>
+      </w:pPr>
       <w:r>
-        <w:br w:type="page"/>
+        <w:rPr>
+          <w:rFonts w:ascii="Times New Roman" w:hAnsi="Times New Roman" w:eastAsia="Times New Roman" w:cs="Times New Roman"/>
+          <w:b w:val="0"/>
+          <w:i w:val="0"/>
+          <w:color w:val="000000"/>
+          <w:sz w:val="2"/>
+          <w:u w:val="none"/>
+        </w:rPr>
       </w:r>
     </w:p>
     <w:p>
       <w:pPr>
         <w:pStyle w:val="Heading1"/>
+        <w:keepNext/>
+        <w:keepLines/>
+        <w:pageBreakBefore/>
+        <w:spacing w:before="0" w:after="0" w:line="360" w:lineRule="auto"/>
+        <w:ind w:left="0" w:right="0" w:firstLine="0"/>
+        <w:jc w:val="center"/>
       </w:pPr>
       <w:r>
+        <w:rPr>
+          <w:rFonts w:ascii="Times New Roman" w:hAnsi="Times New Roman" w:eastAsia="Times New Roman" w:cs="Times New Roman"/>
+          <w:b/>
+          <w:i w:val="0"/>
+          <w:color w:val="000000"/>
+          <w:sz w:val="28"/>
+          <w:u w:val="none"/>
+        </w:rPr>
         <w:t>1. Постановка задачи</w:t>
       </w:r>
     </w:p>
     <w:p>
+      <w:pPr>
+        <w:keepNext w:val="0"/>
+        <w:keepLines w:val="0"/>
+        <w:pageBreakBefore w:val="0"/>
+        <w:spacing w:before="0" w:after="0" w:line="360" w:lineRule="auto"/>
+        <w:ind w:firstLine="720" w:left="0" w:right="0"/>
+        <w:jc w:val="both"/>
+      </w:pPr>
       <w:r>
+        <w:rPr>
+          <w:rFonts w:ascii="Times New Roman" w:hAnsi="Times New Roman" w:eastAsia="Times New Roman" w:cs="Times New Roman"/>
+          <w:b w:val="0"/>
+          <w:i w:val="0"/>
+          <w:color w:val="000000"/>
+          <w:sz w:val="28"/>
+          <w:u w:val="none"/>
+        </w:rPr>
         <w:t>Вариант 1. Выделение контуров на изображении операторами Лапласа, Робертса и Собела. Вариант 2. Удаление гауссова шума в пространственной области усредняющими фильтрами. Вариант 3. Удаление гауссова шума порядковыми фильтрами.</w:t>
       </w:r>
     </w:p>
     <w:p>
+      <w:pPr>
+        <w:keepNext w:val="0"/>
+        <w:keepLines w:val="0"/>
+        <w:pageBreakBefore w:val="0"/>
+        <w:spacing w:before="0" w:after="0" w:line="360" w:lineRule="auto"/>
+        <w:ind w:firstLine="720" w:left="0" w:right="0"/>
+        <w:jc w:val="both"/>
+      </w:pPr>
       <w:r>
+        <w:rPr>
+          <w:rFonts w:ascii="Times New Roman" w:hAnsi="Times New Roman" w:eastAsia="Times New Roman" w:cs="Times New Roman"/>
+          <w:b w:val="0"/>
+          <w:i w:val="0"/>
+          <w:color w:val="000000"/>
+          <w:sz w:val="28"/>
+          <w:u w:val="none"/>
+        </w:rPr>
         <w:t>Требуется реализовать программу на C++, подготовить изображения, демонстрирующие различия методов, и проанализировать результаты. Цвет не является предметом работы, поэтому обработка выполняется в градациях серого. Все варианты представлены в одном проекте и одном отчёте.</w:t>
       </w:r>
     </w:p>
     <w:p>
+      <w:pPr>
+        <w:keepNext w:val="0"/>
+        <w:keepLines w:val="0"/>
+        <w:pageBreakBefore w:val="0"/>
+        <w:spacing w:before="0" w:after="0" w:line="360" w:lineRule="auto"/>
+        <w:ind w:firstLine="720" w:left="0" w:right="0"/>
+        <w:jc w:val="both"/>
+      </w:pPr>
       <w:r>
+        <w:rPr>
+          <w:rFonts w:ascii="Times New Roman" w:hAnsi="Times New Roman" w:eastAsia="Times New Roman" w:cs="Times New Roman"/>
+          <w:b w:val="0"/>
+          <w:i w:val="0"/>
+          <w:color w:val="000000"/>
+          <w:sz w:val="28"/>
+          <w:u w:val="none"/>
+        </w:rPr>
         <w:t>Дополнительно реализуется заданный класс Image: чтение и запись PNG, поддержка 1–4 каналов, работа с пикселями, глубокое копирование и безопасное поведение пустого объекта. Интерфейс Image.h сохранён без добавления методов.</w:t>
       </w:r>
     </w:p>
     <w:p>
       <w:pPr>
         <w:pStyle w:val="Heading1"/>
+        <w:keepNext/>
+        <w:keepLines/>
+        <w:pageBreakBefore w:val="0"/>
+        <w:spacing w:before="0" w:after="0" w:line="360" w:lineRule="auto"/>
+        <w:ind w:left="0" w:right="0" w:firstLine="0"/>
+        <w:jc w:val="center"/>
       </w:pPr>
       <w:r>
+        <w:rPr>
+          <w:rFonts w:ascii="Times New Roman" w:hAnsi="Times New Roman" w:eastAsia="Times New Roman" w:cs="Times New Roman"/>
+          <w:b/>
+          <w:i w:val="0"/>
+          <w:color w:val="000000"/>
+          <w:sz w:val="28"/>
+          <w:u w:val="none"/>
+        </w:rPr>
         <w:t>2. Математическая модель</w:t>
       </w:r>
     </w:p>
     <w:p>
+      <w:pPr>
+        <w:keepNext w:val="0"/>
+        <w:keepLines w:val="0"/>
+        <w:pageBreakBefore w:val="0"/>
+        <w:spacing w:before="0" w:after="0" w:line="360" w:lineRule="auto"/>
+        <w:ind w:firstLine="720" w:left="0" w:right="0"/>
+        <w:jc w:val="both"/>
+      </w:pPr>
       <w:r>
+        <w:rPr>
+          <w:rFonts w:ascii="Times New Roman" w:hAnsi="Times New Roman" w:eastAsia="Times New Roman" w:cs="Times New Roman"/>
+          <w:b w:val="0"/>
+          <w:i w:val="0"/>
+          <w:color w:val="000000"/>
+          <w:sz w:val="28"/>
+          <w:u w:val="none"/>
+        </w:rPr>
         <w:t>Пусть f(x,y) — яркость пикселя, 0 ≤ f ≤ 255. Цветной вход преобразуется в полутоновый по формуле (1); для одно- и двухканального входа используется непосредственно канал яркости.</w:t>
       </w:r>
     </w:p>
     <w:p>
       <w:pPr>
-        <w:ind w:firstLine="0"/>
+        <w:keepNext w:val="0"/>
+        <w:keepLines/>
+        <w:pageBreakBefore w:val="0"/>
+        <w:spacing w:before="0" w:after="0" w:line="360" w:lineRule="auto"/>
+        <w:ind w:left="0" w:right="0" w:firstLine="0"/>
         <w:jc w:val="center"/>
       </w:pPr>
       <w:r>
         <w:rPr>
-          <w:sz w:val="20"/>
+          <w:rFonts w:ascii="Times New Roman" w:hAnsi="Times New Roman" w:eastAsia="Times New Roman" w:cs="Times New Roman"/>
+          <w:b w:val="0"/>
+          <w:i w:val="0"/>
+          <w:color w:val="000000"/>
+          <w:sz w:val="28"/>
+          <w:u w:val="none"/>
         </w:rPr>
         <w:t>f = round(0.299 R + 0.587 G + 0.114 B).  (1)</w:t>
       </w:r>
     </w:p>
     <w:p>
+      <w:pPr>
+        <w:keepNext w:val="0"/>
+        <w:keepLines w:val="0"/>
+        <w:pageBreakBefore w:val="0"/>
+        <w:spacing w:before="0" w:after="0" w:line="360" w:lineRule="auto"/>
+        <w:ind w:firstLine="720" w:left="0" w:right="0"/>
+        <w:jc w:val="both"/>
+      </w:pPr>
       <w:r>
+        <w:rPr>
+          <w:rFonts w:ascii="Times New Roman" w:hAnsi="Times New Roman" w:eastAsia="Times New Roman" w:cs="Times New Roman"/>
+          <w:b w:val="0"/>
+          <w:i w:val="0"/>
+          <w:color w:val="000000"/>
+          <w:sz w:val="28"/>
+          <w:u w:val="none"/>
+        </w:rPr>
         <w:t>Все окрестности за пределами растра продолжаются ближайшим граничным значением: координаты ограничиваются диапазонами [0,W−1] и [0,H−1]. Это предотвращает появление ложного контура на постоянном фоне у края изображения.</w:t>
       </w:r>
     </w:p>
     <w:p>
+      <w:pPr>
+        <w:keepNext w:val="0"/>
+        <w:keepLines w:val="0"/>
+        <w:pageBreakBefore w:val="0"/>
+        <w:spacing w:before="0" w:after="0" w:line="360" w:lineRule="auto"/>
+        <w:ind w:firstLine="720" w:left="0" w:right="0"/>
+        <w:jc w:val="both"/>
+      </w:pPr>
       <w:r>
+        <w:rPr>
+          <w:rFonts w:ascii="Times New Roman" w:hAnsi="Times New Roman" w:eastAsia="Times New Roman" w:cs="Times New Roman"/>
+          <w:b w:val="0"/>
+          <w:i w:val="0"/>
+          <w:color w:val="000000"/>
+          <w:sz w:val="28"/>
+          <w:u w:val="none"/>
+        </w:rPr>
         <w:t>Итоговые значения округляются до ближайшего целого и ограничиваются диапазоном байта. Ограничение амплитуды не является нормализацией по максимуму конкретного изображения:</w:t>
       </w:r>
     </w:p>
     <w:p>
       <w:pPr>
-        <w:ind w:firstLine="0"/>
+        <w:keepNext w:val="0"/>
+        <w:keepLines/>
+        <w:pageBreakBefore w:val="0"/>
+        <w:spacing w:before="0" w:after="0" w:line="360" w:lineRule="auto"/>
+        <w:ind w:left="0" w:right="0" w:firstLine="0"/>
         <w:jc w:val="center"/>
       </w:pPr>
       <w:r>
         <w:rPr>
-          <w:sz w:val="20"/>
+          <w:rFonts w:ascii="Times New Roman" w:hAnsi="Times New Roman" w:eastAsia="Times New Roman" w:cs="Times New Roman"/>
+          <w:b w:val="0"/>
+          <w:i w:val="0"/>
+          <w:color w:val="000000"/>
+          <w:sz w:val="28"/>
+          <w:u w:val="none"/>
         </w:rPr>
         <w:t>Q(t) = round(min(255, max(0, t))).  (2)</w:t>
       </w:r>
@@ -169,24 +462,63 @@
     <w:p>
       <w:pPr>
         <w:pStyle w:val="Heading1"/>
+        <w:keepNext/>
+        <w:keepLines/>
+        <w:pageBreakBefore w:val="0"/>
+        <w:spacing w:before="0" w:after="0" w:line="360" w:lineRule="auto"/>
+        <w:ind w:left="0" w:right="0" w:firstLine="0"/>
+        <w:jc w:val="center"/>
       </w:pPr>
       <w:r>
+        <w:rPr>
+          <w:rFonts w:ascii="Times New Roman" w:hAnsi="Times New Roman" w:eastAsia="Times New Roman" w:cs="Times New Roman"/>
+          <w:b/>
+          <w:i w:val="0"/>
+          <w:color w:val="000000"/>
+          <w:sz w:val="28"/>
+          <w:u w:val="none"/>
+        </w:rPr>
         <w:t>2.1. Операторы выделения контуров</w:t>
       </w:r>
     </w:p>
     <w:p>
+      <w:pPr>
+        <w:keepNext w:val="0"/>
+        <w:keepLines w:val="0"/>
+        <w:pageBreakBefore w:val="0"/>
+        <w:spacing w:before="0" w:after="0" w:line="360" w:lineRule="auto"/>
+        <w:ind w:firstLine="720" w:left="0" w:right="0"/>
+        <w:jc w:val="both"/>
+      </w:pPr>
       <w:r>
+        <w:rPr>
+          <w:rFonts w:ascii="Times New Roman" w:hAnsi="Times New Roman" w:eastAsia="Times New Roman" w:cs="Times New Roman"/>
+          <w:b w:val="0"/>
+          <w:i w:val="0"/>
+          <w:color w:val="000000"/>
+          <w:sz w:val="28"/>
+          <w:u w:val="none"/>
+        </w:rPr>
         <w:t>Для Лапласа используется четырёхсвязная дискретная вторая производная (3). Модуль позволяет отобразить положительные и отрицательные отклики одной яркостью.</w:t>
       </w:r>
     </w:p>
     <w:p>
       <w:pPr>
-        <w:ind w:firstLine="0"/>
+        <w:keepNext w:val="0"/>
+        <w:keepLines/>
+        <w:pageBreakBefore w:val="0"/>
+        <w:spacing w:before="0" w:after="0" w:line="360" w:lineRule="auto"/>
+        <w:ind w:left="0" w:right="0" w:firstLine="0"/>
         <w:jc w:val="center"/>
       </w:pPr>
       <w:r>
         <w:rPr>
-          <w:sz w:val="20"/>
+          <w:rFonts w:ascii="Times New Roman" w:hAnsi="Times New Roman" w:eastAsia="Times New Roman" w:cs="Times New Roman"/>
+          <w:b w:val="0"/>
+          <w:i w:val="0"/>
+          <w:color w:val="000000"/>
+          <w:sz w:val="28"/>
+          <w:u w:val="none"/>
         </w:rPr>
         <w:t>L = f(x−1,y)+f(x+1,y)+f(x,y−1)+f(x,y+1)−4f(x,y);</w:t>
         <w:br/>
@@ -194,18 +526,43 @@
       </w:r>
     </w:p>
     <w:p>
+      <w:pPr>
+        <w:keepNext w:val="0"/>
+        <w:keepLines w:val="0"/>
+        <w:pageBreakBefore w:val="0"/>
+        <w:spacing w:before="0" w:after="0" w:line="360" w:lineRule="auto"/>
+        <w:ind w:firstLine="720" w:left="0" w:right="0"/>
+        <w:jc w:val="both"/>
+      </w:pPr>
       <w:r>
+        <w:rPr>
+          <w:rFonts w:ascii="Times New Roman" w:hAnsi="Times New Roman" w:eastAsia="Times New Roman" w:cs="Times New Roman"/>
+          <w:b w:val="0"/>
+          <w:i w:val="0"/>
+          <w:color w:val="000000"/>
+          <w:sz w:val="28"/>
+          <w:u w:val="none"/>
+        </w:rPr>
         <w:t>Робертс вычисляет две диагональные разности в окне 2×2. Результат определяется длиной вектора (4). Малое окно обеспечивает компактный отклик, но не содержит усреднения шума.</w:t>
       </w:r>
     </w:p>
     <w:p>
       <w:pPr>
-        <w:ind w:firstLine="0"/>
+        <w:keepNext w:val="0"/>
+        <w:keepLines/>
+        <w:pageBreakBefore w:val="0"/>
+        <w:spacing w:before="0" w:after="0" w:line="360" w:lineRule="auto"/>
+        <w:ind w:left="0" w:right="0" w:firstLine="0"/>
         <w:jc w:val="center"/>
       </w:pPr>
       <w:r>
         <w:rPr>
-          <w:sz w:val="20"/>
+          <w:rFonts w:ascii="Times New Roman" w:hAnsi="Times New Roman" w:eastAsia="Times New Roman" w:cs="Times New Roman"/>
+          <w:b w:val="0"/>
+          <w:i w:val="0"/>
+          <w:color w:val="000000"/>
+          <w:sz w:val="28"/>
+          <w:u w:val="none"/>
         </w:rPr>
         <w:t>a = f(x,y)−f(x+1,y+1); b = f(x+1,y)−f(x,y+1);</w:t>
         <w:br/>
@@ -213,31 +570,85 @@
       </w:r>
     </w:p>
     <w:p>
+      <w:pPr>
+        <w:keepNext w:val="0"/>
+        <w:keepLines w:val="0"/>
+        <w:pageBreakBefore w:val="0"/>
+        <w:spacing w:before="0" w:after="0" w:line="20" w:lineRule="exact"/>
+        <w:ind w:firstLine="720" w:left="0" w:right="0"/>
+        <w:jc w:val="both"/>
+      </w:pPr>
       <w:r>
-        <w:br w:type="page"/>
+        <w:rPr>
+          <w:rFonts w:ascii="Times New Roman" w:hAnsi="Times New Roman" w:eastAsia="Times New Roman" w:cs="Times New Roman"/>
+          <w:b w:val="0"/>
+          <w:i w:val="0"/>
+          <w:color w:val="000000"/>
+          <w:sz w:val="2"/>
+          <w:u w:val="none"/>
+        </w:rPr>
       </w:r>
     </w:p>
     <w:p>
       <w:pPr>
         <w:pStyle w:val="Heading1"/>
+        <w:keepNext/>
+        <w:keepLines/>
+        <w:pageBreakBefore w:val="0"/>
+        <w:spacing w:before="0" w:after="0" w:line="360" w:lineRule="auto"/>
+        <w:ind w:left="0" w:right="0" w:firstLine="0"/>
+        <w:jc w:val="center"/>
       </w:pPr>
       <w:r>
+        <w:rPr>
+          <w:rFonts w:ascii="Times New Roman" w:hAnsi="Times New Roman" w:eastAsia="Times New Roman" w:cs="Times New Roman"/>
+          <w:b/>
+          <w:i w:val="0"/>
+          <w:color w:val="000000"/>
+          <w:sz w:val="28"/>
+          <w:u w:val="none"/>
+        </w:rPr>
         <w:t>2.2. Собел и фильтры подавления шума</w:t>
       </w:r>
     </w:p>
     <w:p>
+      <w:pPr>
+        <w:keepNext w:val="0"/>
+        <w:keepLines w:val="0"/>
+        <w:pageBreakBefore w:val="0"/>
+        <w:spacing w:before="0" w:after="0" w:line="360" w:lineRule="auto"/>
+        <w:ind w:firstLine="720" w:left="0" w:right="0"/>
+        <w:jc w:val="both"/>
+      </w:pPr>
       <w:r>
+        <w:rPr>
+          <w:rFonts w:ascii="Times New Roman" w:hAnsi="Times New Roman" w:eastAsia="Times New Roman" w:cs="Times New Roman"/>
+          <w:b w:val="0"/>
+          <w:i w:val="0"/>
+          <w:color w:val="000000"/>
+          <w:sz w:val="28"/>
+          <w:u w:val="none"/>
+        </w:rPr>
         <w:t>Собел использует две маски 3×3 (5). Каждая совмещает разность по одной координате и усреднение по другой. Суммирование выполняется по соответствующим смещениям маски.</w:t>
       </w:r>
     </w:p>
     <w:p>
       <w:pPr>
-        <w:ind w:firstLine="0"/>
+        <w:keepNext w:val="0"/>
+        <w:keepLines/>
+        <w:pageBreakBefore w:val="0"/>
+        <w:spacing w:before="0" w:after="0" w:line="360" w:lineRule="auto"/>
+        <w:ind w:left="0" w:right="0" w:firstLine="0"/>
         <w:jc w:val="center"/>
       </w:pPr>
       <w:r>
         <w:rPr>
-          <w:sz w:val="20"/>
+          <w:rFonts w:ascii="Times New Roman" w:hAnsi="Times New Roman" w:eastAsia="Times New Roman" w:cs="Times New Roman"/>
+          <w:b w:val="0"/>
+          <w:i w:val="0"/>
+          <w:color w:val="000000"/>
+          <w:sz w:val="28"/>
+          <w:u w:val="none"/>
         </w:rPr>
         <w:t>Sx = [−1 0 1; −2 0 2; −1 0 1];</w:t>
         <w:br/>
@@ -251,40 +662,106 @@
       </w:r>
     </w:p>
     <w:p>
+      <w:pPr>
+        <w:keepNext w:val="0"/>
+        <w:keepLines w:val="0"/>
+        <w:pageBreakBefore w:val="0"/>
+        <w:spacing w:before="0" w:after="0" w:line="360" w:lineRule="auto"/>
+        <w:ind w:firstLine="720" w:left="0" w:right="0"/>
+        <w:jc w:val="both"/>
+      </w:pPr>
       <w:r>
+        <w:rPr>
+          <w:rFonts w:ascii="Times New Roman" w:hAnsi="Times New Roman" w:eastAsia="Times New Roman" w:cs="Times New Roman"/>
+          <w:b w:val="0"/>
+          <w:i w:val="0"/>
+          <w:color w:val="000000"/>
+          <w:sz w:val="28"/>
+          <w:u w:val="none"/>
+        </w:rPr>
         <w:t>Порядок для всех трёх операторов: получить яркостное изображение; вычислить разности по (3), (4) или (5) для каждого пикселя; применить (2); записать результат в новый объект Image. Исходное изображение не изменяется.</w:t>
       </w:r>
     </w:p>
     <w:p>
+      <w:pPr>
+        <w:keepNext w:val="0"/>
+        <w:keepLines w:val="0"/>
+        <w:pageBreakBefore w:val="0"/>
+        <w:spacing w:before="0" w:after="0" w:line="360" w:lineRule="auto"/>
+        <w:ind w:firstLine="720" w:left="0" w:right="0"/>
+        <w:jc w:val="both"/>
+      </w:pPr>
       <w:r>
+        <w:rPr>
+          <w:rFonts w:ascii="Times New Roman" w:hAnsi="Times New Roman" w:eastAsia="Times New Roman" w:cs="Times New Roman"/>
+          <w:b w:val="0"/>
+          <w:i w:val="0"/>
+          <w:color w:val="000000"/>
+          <w:sz w:val="28"/>
+          <w:u w:val="none"/>
+        </w:rPr>
         <w:t>При арифметическом усреднении (6) все k² пикселей окна имеют одинаковый вес. В работе сравниваются k=3 и k=5; радиус окна r=(k−1)/2.</w:t>
       </w:r>
     </w:p>
     <w:p>
       <w:pPr>
-        <w:ind w:firstLine="0"/>
+        <w:keepNext w:val="0"/>
+        <w:keepLines/>
+        <w:pageBreakBefore w:val="0"/>
+        <w:spacing w:before="0" w:after="0" w:line="360" w:lineRule="auto"/>
+        <w:ind w:left="0" w:right="0" w:firstLine="0"/>
         <w:jc w:val="center"/>
       </w:pPr>
       <w:r>
         <w:rPr>
-          <w:sz w:val="20"/>
+          <w:rFonts w:ascii="Times New Roman" w:hAnsi="Times New Roman" w:eastAsia="Times New Roman" w:cs="Times New Roman"/>
+          <w:b w:val="0"/>
+          <w:i w:val="0"/>
+          <w:color w:val="000000"/>
+          <w:sz w:val="28"/>
+          <w:u w:val="none"/>
         </w:rPr>
         <w:t>g(x,y) = Q((1/k²) Σ_i Σ_j f(x+i,y+j)), i,j = −r,…,r.  (6)</w:t>
       </w:r>
     </w:p>
     <w:p>
+      <w:pPr>
+        <w:keepNext w:val="0"/>
+        <w:keepLines w:val="0"/>
+        <w:pageBreakBefore w:val="0"/>
+        <w:spacing w:before="0" w:after="0" w:line="360" w:lineRule="auto"/>
+        <w:ind w:firstLine="720" w:left="0" w:right="0"/>
+        <w:jc w:val="both"/>
+      </w:pPr>
       <w:r>
+        <w:rPr>
+          <w:rFonts w:ascii="Times New Roman" w:hAnsi="Times New Roman" w:eastAsia="Times New Roman" w:cs="Times New Roman"/>
+          <w:b w:val="0"/>
+          <w:i w:val="0"/>
+          <w:color w:val="000000"/>
+          <w:sz w:val="28"/>
+          <w:u w:val="none"/>
+        </w:rPr>
         <w:t>Гауссово усреднение (7) придаёт больший вес близким пикселям. Постоянный множитель гауссовой функции сокращается при нормировании. Используется окно 5×5, σ=1.0.</w:t>
       </w:r>
     </w:p>
     <w:p>
       <w:pPr>
-        <w:ind w:firstLine="0"/>
+        <w:keepNext w:val="0"/>
+        <w:keepLines/>
+        <w:pageBreakBefore w:val="0"/>
+        <w:spacing w:before="0" w:after="0" w:line="360" w:lineRule="auto"/>
+        <w:ind w:left="0" w:right="0" w:firstLine="0"/>
         <w:jc w:val="center"/>
       </w:pPr>
       <w:r>
         <w:rPr>
-          <w:sz w:val="20"/>
+          <w:rFonts w:ascii="Times New Roman" w:hAnsi="Times New Roman" w:eastAsia="Times New Roman" w:cs="Times New Roman"/>
+          <w:b w:val="0"/>
+          <w:i w:val="0"/>
+          <w:color w:val="000000"/>
+          <w:sz w:val="28"/>
+          <w:u w:val="none"/>
         </w:rPr>
         <w:t>v(i,j) = exp(−(i²+j²)/(2σ²)); w(i,j) = v(i,j)/ΣᵢΣⱼv(i,j);</w:t>
         <w:br/>
@@ -292,45 +769,127 @@
       </w:r>
     </w:p>
     <w:p>
+      <w:pPr>
+        <w:keepNext w:val="0"/>
+        <w:keepLines w:val="0"/>
+        <w:pageBreakBefore w:val="0"/>
+        <w:spacing w:before="0" w:after="0" w:line="360" w:lineRule="auto"/>
+        <w:ind w:firstLine="720" w:left="0" w:right="0"/>
+        <w:jc w:val="both"/>
+      </w:pPr>
       <w:r>
+        <w:rPr>
+          <w:rFonts w:ascii="Times New Roman" w:hAnsi="Times New Roman" w:eastAsia="Times New Roman" w:cs="Times New Roman"/>
+          <w:b w:val="0"/>
+          <w:i w:val="0"/>
+          <w:color w:val="000000"/>
+          <w:sz w:val="28"/>
+          <w:u w:val="none"/>
+        </w:rPr>
         <w:t>Алгоритм усреднения: сформировать и нормировать веса; для каждого пикселя суммировать взвешенные значения окна; округлить результат по (2). При σ=0 программа выбирает равные веса (6), не подставляя ноль в гауссову формулу.</w:t>
       </w:r>
     </w:p>
     <w:p>
+      <w:pPr>
+        <w:keepNext w:val="0"/>
+        <w:keepLines w:val="0"/>
+        <w:pageBreakBefore w:val="0"/>
+        <w:spacing w:before="0" w:after="0" w:line="360" w:lineRule="auto"/>
+        <w:ind w:firstLine="720" w:left="0" w:right="0"/>
+        <w:jc w:val="both"/>
+      </w:pPr>
       <w:r>
+        <w:rPr>
+          <w:rFonts w:ascii="Times New Roman" w:hAnsi="Times New Roman" w:eastAsia="Times New Roman" w:cs="Times New Roman"/>
+          <w:b w:val="0"/>
+          <w:i w:val="0"/>
+          <w:color w:val="000000"/>
+          <w:sz w:val="28"/>
+          <w:u w:val="none"/>
+        </w:rPr>
         <w:t>Для порядковых фильтров составляется набор значений окна, расположенный по возрастанию z₁ ≤ … ≤ zₙ, где n=k². Тогда (8) определяет три разные операции:</w:t>
       </w:r>
     </w:p>
     <w:p>
       <w:pPr>
-        <w:ind w:firstLine="0"/>
+        <w:keepNext w:val="0"/>
+        <w:keepLines/>
+        <w:pageBreakBefore w:val="0"/>
+        <w:spacing w:before="0" w:after="0" w:line="360" w:lineRule="auto"/>
+        <w:ind w:left="0" w:right="0" w:firstLine="0"/>
         <w:jc w:val="center"/>
       </w:pPr>
       <w:r>
         <w:rPr>
-          <w:sz w:val="20"/>
+          <w:rFonts w:ascii="Times New Roman" w:hAnsi="Times New Roman" w:eastAsia="Times New Roman" w:cs="Times New Roman"/>
+          <w:b w:val="0"/>
+          <w:i w:val="0"/>
+          <w:color w:val="000000"/>
+          <w:sz w:val="28"/>
+          <w:u w:val="none"/>
         </w:rPr>
         <w:t>g_min = z₁;  g_med = z[(n+1)/2];  g_max = zₙ.  (8)</w:t>
       </w:r>
     </w:p>
     <w:p>
+      <w:pPr>
+        <w:keepNext w:val="0"/>
+        <w:keepLines w:val="0"/>
+        <w:pageBreakBefore w:val="0"/>
+        <w:spacing w:before="0" w:after="0" w:line="360" w:lineRule="auto"/>
+        <w:ind w:firstLine="720" w:left="0" w:right="0"/>
+        <w:jc w:val="both"/>
+      </w:pPr>
       <w:r>
+        <w:rPr>
+          <w:rFonts w:ascii="Times New Roman" w:hAnsi="Times New Roman" w:eastAsia="Times New Roman" w:cs="Times New Roman"/>
+          <w:b w:val="0"/>
+          <w:i w:val="0"/>
+          <w:color w:val="000000"/>
+          <w:sz w:val="28"/>
+          <w:u w:val="none"/>
+        </w:rPr>
         <w:t>Минимум сужает светлые области, максимум расширяет их. Медиана выбирает центральное значение и менее чувствительна к отдельным выбросам, однако также способна удалять мелкие детали. В программе медиана находится через std::nth_element без полной сортировки.</w:t>
       </w:r>
     </w:p>
     <w:p>
+      <w:pPr>
+        <w:keepNext w:val="0"/>
+        <w:keepLines w:val="0"/>
+        <w:pageBreakBefore w:val="0"/>
+        <w:spacing w:before="0" w:after="0" w:line="360" w:lineRule="auto"/>
+        <w:ind w:firstLine="720" w:left="0" w:right="0"/>
+        <w:jc w:val="both"/>
+      </w:pPr>
       <w:r>
+        <w:rPr>
+          <w:rFonts w:ascii="Times New Roman" w:hAnsi="Times New Roman" w:eastAsia="Times New Roman" w:cs="Times New Roman"/>
+          <w:b w:val="0"/>
+          <w:i w:val="0"/>
+          <w:color w:val="000000"/>
+          <w:sz w:val="28"/>
+          <w:u w:val="none"/>
+        </w:rPr>
         <w:t>Для численного сравнения с чистым эталоном используются средняя квадратичная ошибка MSE и PSNR (9). Меньшая MSE и больший PSNR соответствуют лучшему совпадению яркостей, но не заменяют оценку сохранности деталей.</w:t>
       </w:r>
     </w:p>
     <w:p>
       <w:pPr>
-        <w:ind w:firstLine="0"/>
+        <w:keepNext w:val="0"/>
+        <w:keepLines/>
+        <w:pageBreakBefore w:val="0"/>
+        <w:spacing w:before="0" w:after="0" w:line="360" w:lineRule="auto"/>
+        <w:ind w:left="0" w:right="0" w:firstLine="0"/>
         <w:jc w:val="center"/>
       </w:pPr>
       <w:r>
         <w:rPr>
-          <w:sz w:val="20"/>
+          <w:rFonts w:ascii="Times New Roman" w:hAnsi="Times New Roman" w:eastAsia="Times New Roman" w:cs="Times New Roman"/>
+          <w:b w:val="0"/>
+          <w:i w:val="0"/>
+          <w:color w:val="000000"/>
+          <w:sz w:val="28"/>
+          <w:u w:val="none"/>
         </w:rPr>
         <w:t>MSE = (1/(WH)) Σ_x Σ_y (g(x,y)−f(x,y))²;</w:t>
         <w:br/>
@@ -338,268 +897,499 @@
       </w:r>
     </w:p>
     <w:p>
+      <w:pPr>
+        <w:keepNext w:val="0"/>
+        <w:keepLines w:val="0"/>
+        <w:pageBreakBefore w:val="0"/>
+        <w:spacing w:before="0" w:after="0" w:line="20" w:lineRule="exact"/>
+        <w:ind w:firstLine="720" w:left="0" w:right="0"/>
+        <w:jc w:val="both"/>
+      </w:pPr>
       <w:r>
-        <w:br w:type="page"/>
+        <w:rPr>
+          <w:rFonts w:ascii="Times New Roman" w:hAnsi="Times New Roman" w:eastAsia="Times New Roman" w:cs="Times New Roman"/>
+          <w:b w:val="0"/>
+          <w:i w:val="0"/>
+          <w:color w:val="000000"/>
+          <w:sz w:val="2"/>
+          <w:u w:val="none"/>
+        </w:rPr>
       </w:r>
     </w:p>
     <w:p>
       <w:pPr>
         <w:pStyle w:val="Heading1"/>
+        <w:keepNext/>
+        <w:keepLines/>
+        <w:pageBreakBefore w:val="0"/>
+        <w:spacing w:before="0" w:after="0" w:line="360" w:lineRule="auto"/>
+        <w:ind w:left="0" w:right="0" w:firstLine="0"/>
+        <w:jc w:val="center"/>
       </w:pPr>
       <w:r>
+        <w:rPr>
+          <w:rFonts w:ascii="Times New Roman" w:hAnsi="Times New Roman" w:eastAsia="Times New Roman" w:cs="Times New Roman"/>
+          <w:b/>
+          <w:i w:val="0"/>
+          <w:color w:val="000000"/>
+          <w:sz w:val="28"/>
+          <w:u w:val="none"/>
+        </w:rPr>
         <w:t>3. Программная реализация и проверка</w:t>
       </w:r>
     </w:p>
     <w:p>
+      <w:pPr>
+        <w:keepNext w:val="0"/>
+        <w:keepLines w:val="0"/>
+        <w:pageBreakBefore w:val="0"/>
+        <w:spacing w:before="0" w:after="0" w:line="360" w:lineRule="auto"/>
+        <w:ind w:firstLine="720" w:left="0" w:right="0"/>
+        <w:jc w:val="both"/>
+      </w:pPr>
       <w:r>
+        <w:rPr>
+          <w:rFonts w:ascii="Times New Roman" w:hAnsi="Times New Roman" w:eastAsia="Times New Roman" w:cs="Times New Roman"/>
+          <w:b w:val="0"/>
+          <w:i w:val="0"/>
+          <w:color w:val="000000"/>
+          <w:sz w:val="28"/>
+          <w:u w:val="none"/>
+        </w:rPr>
         <w:t>Реализация написана на C++17. Внешние библиотеки из задания используются только для PNG (stb_image, stb_image_write) и тестов (doctest). Готовые функции фильтрации сторонних библиотек не используются.</w:t>
       </w:r>
     </w:p>
     <w:tbl>
       <w:tblPr>
         <w:tblStyle w:val="TableGrid"/>
-        <w:tblW w:type="auto" w:w="0"/>
+        <w:tblW w:type="dxa" w:w="9355"/>
+        <w:tblLayout w:type="fixed"/>
         <w:tblLook w:firstColumn="1" w:firstRow="1" w:lastColumn="0" w:lastRow="0" w:noHBand="0" w:noVBand="1" w:val="04A0"/>
       </w:tblPr>
       <w:tblGrid>
-        <w:gridCol w:w="4986"/>
-        <w:gridCol w:w="4986"/>
+        <w:gridCol w:w="4677"/>
+        <w:gridCol w:w="4677"/>
       </w:tblGrid>
       <w:tr>
+        <w:trPr>
+          <w:cantSplit/>
+          <w:tblHeader/>
+        </w:trPr>
         <w:tc>
           <w:tcPr>
-            <w:tcW w:type="dxa" w:w="4986"/>
+            <w:tcW w:type="dxa" w:w="4677"/>
           </w:tcPr>
           <w:p>
             <w:pPr>
+              <w:keepNext/>
+              <w:spacing w:before="0" w:after="0" w:line="360" w:lineRule="auto"/>
               <w:ind w:firstLine="0"/>
               <w:jc w:val="left"/>
             </w:pPr>
             <w:r>
+              <w:rPr>
+                <w:rFonts w:ascii="Times New Roman" w:hAnsi="Times New Roman" w:eastAsia="Times New Roman" w:cs="Times New Roman"/>
+                <w:b w:val="0"/>
+                <w:i w:val="0"/>
+                <w:color w:val="000000"/>
+                <w:sz w:val="28"/>
+                <w:u w:val="none"/>
+              </w:rPr>
               <w:t>Файл / функция</w:t>
             </w:r>
           </w:p>
         </w:tc>
         <w:tc>
           <w:tcPr>
-            <w:tcW w:type="dxa" w:w="4986"/>
+            <w:tcW w:type="dxa" w:w="4677"/>
           </w:tcPr>
           <w:p>
             <w:pPr>
+              <w:keepNext/>
+              <w:spacing w:before="0" w:after="0" w:line="360" w:lineRule="auto"/>
               <w:ind w:firstLine="0"/>
               <w:jc w:val="left"/>
             </w:pPr>
             <w:r>
+              <w:rPr>
+                <w:rFonts w:ascii="Times New Roman" w:hAnsi="Times New Roman" w:eastAsia="Times New Roman" w:cs="Times New Roman"/>
+                <w:b w:val="0"/>
+                <w:i w:val="0"/>
+                <w:color w:val="000000"/>
+                <w:sz w:val="28"/>
+                <w:u w:val="none"/>
+              </w:rPr>
               <w:t>Назначение</w:t>
             </w:r>
           </w:p>
         </w:tc>
       </w:tr>
       <w:tr>
+        <w:trPr>
+          <w:cantSplit/>
+        </w:trPr>
         <w:tc>
           <w:tcPr>
-            <w:tcW w:type="dxa" w:w="4986"/>
+            <w:tcW w:type="dxa" w:w="4677"/>
           </w:tcPr>
           <w:p>
             <w:pPr>
+              <w:keepNext w:val="0"/>
+              <w:spacing w:before="0" w:after="0" w:line="360" w:lineRule="auto"/>
               <w:ind w:firstLine="0"/>
               <w:jc w:val="left"/>
             </w:pPr>
             <w:r>
+              <w:rPr>
+                <w:rFonts w:ascii="Times New Roman" w:hAnsi="Times New Roman" w:eastAsia="Times New Roman" w:cs="Times New Roman"/>
+                <w:b w:val="0"/>
+                <w:i w:val="0"/>
+                <w:color w:val="000000"/>
+                <w:sz w:val="28"/>
+                <w:u w:val="none"/>
+              </w:rPr>
               <w:t>Image.h, Image.cpp</w:t>
             </w:r>
           </w:p>
         </w:tc>
         <w:tc>
           <w:tcPr>
-            <w:tcW w:type="dxa" w:w="4986"/>
+            <w:tcW w:type="dxa" w:w="4677"/>
           </w:tcPr>
           <w:p>
             <w:pPr>
+              <w:keepNext w:val="0"/>
+              <w:spacing w:before="0" w:after="0" w:line="360" w:lineRule="auto"/>
               <w:ind w:firstLine="0"/>
               <w:jc w:val="left"/>
             </w:pPr>
             <w:r>
+              <w:rPr>
+                <w:rFonts w:ascii="Times New Roman" w:hAnsi="Times New Roman" w:eastAsia="Times New Roman" w:cs="Times New Roman"/>
+                <w:b w:val="0"/>
+                <w:i w:val="0"/>
+                <w:color w:val="000000"/>
+                <w:sz w:val="28"/>
+                <w:u w:val="none"/>
+              </w:rPr>
               <w:t>Заданный интерфейс и работа с памятью, пикселями и PNG.</w:t>
             </w:r>
           </w:p>
         </w:tc>
       </w:tr>
       <w:tr>
+        <w:trPr>
+          <w:cantSplit/>
+        </w:trPr>
         <w:tc>
           <w:tcPr>
-            <w:tcW w:type="dxa" w:w="4986"/>
+            <w:tcW w:type="dxa" w:w="4677"/>
           </w:tcPr>
           <w:p>
             <w:pPr>
+              <w:keepNext w:val="0"/>
+              <w:spacing w:before="0" w:after="0" w:line="360" w:lineRule="auto"/>
               <w:ind w:firstLine="0"/>
               <w:jc w:val="left"/>
             </w:pPr>
             <w:r>
+              <w:rPr>
+                <w:rFonts w:ascii="Times New Roman" w:hAnsi="Times New Roman" w:eastAsia="Times New Roman" w:cs="Times New Roman"/>
+                <w:b w:val="0"/>
+                <w:i w:val="0"/>
+                <w:color w:val="000000"/>
+                <w:sz w:val="28"/>
+                <w:u w:val="none"/>
+              </w:rPr>
               <w:t>Processing.h, Processing.cpp</w:t>
             </w:r>
           </w:p>
         </w:tc>
         <w:tc>
           <w:tcPr>
-            <w:tcW w:type="dxa" w:w="4986"/>
+            <w:tcW w:type="dxa" w:w="4677"/>
           </w:tcPr>
           <w:p>
             <w:pPr>
+              <w:keepNext w:val="0"/>
+              <w:spacing w:before="0" w:after="0" w:line="360" w:lineRule="auto"/>
               <w:ind w:firstLine="0"/>
               <w:jc w:val="left"/>
             </w:pPr>
             <w:r>
+              <w:rPr>
+                <w:rFonts w:ascii="Times New Roman" w:hAnsi="Times New Roman" w:eastAsia="Times New Roman" w:cs="Times New Roman"/>
+                <w:b w:val="0"/>
+                <w:i w:val="0"/>
+                <w:color w:val="000000"/>
+                <w:sz w:val="28"/>
+                <w:u w:val="none"/>
+              </w:rPr>
               <w:t>Отдельные функции обработки без расширения Image.</w:t>
             </w:r>
           </w:p>
         </w:tc>
       </w:tr>
       <w:tr>
+        <w:trPr>
+          <w:cantSplit/>
+        </w:trPr>
         <w:tc>
           <w:tcPr>
-            <w:tcW w:type="dxa" w:w="4986"/>
+            <w:tcW w:type="dxa" w:w="4677"/>
           </w:tcPr>
           <w:p>
             <w:pPr>
+              <w:keepNext w:val="0"/>
+              <w:spacing w:before="0" w:after="0" w:line="360" w:lineRule="auto"/>
               <w:ind w:firstLine="0"/>
               <w:jc w:val="left"/>
             </w:pPr>
             <w:r>
+              <w:rPr>
+                <w:rFonts w:ascii="Times New Roman" w:hAnsi="Times New Roman" w:eastAsia="Times New Roman" w:cs="Times New Roman"/>
+                <w:b w:val="0"/>
+                <w:i w:val="0"/>
+                <w:color w:val="000000"/>
+                <w:sz w:val="28"/>
+                <w:u w:val="none"/>
+              </w:rPr>
               <w:t>processing::grayscale</w:t>
             </w:r>
           </w:p>
         </w:tc>
         <w:tc>
           <w:tcPr>
-            <w:tcW w:type="dxa" w:w="4986"/>
+            <w:tcW w:type="dxa" w:w="4677"/>
           </w:tcPr>
           <w:p>
             <w:pPr>
+              <w:keepNext w:val="0"/>
+              <w:spacing w:before="0" w:after="0" w:line="360" w:lineRule="auto"/>
               <w:ind w:firstLine="0"/>
               <w:jc w:val="left"/>
             </w:pPr>
             <w:r>
+              <w:rPr>
+                <w:rFonts w:ascii="Times New Roman" w:hAnsi="Times New Roman" w:eastAsia="Times New Roman" w:cs="Times New Roman"/>
+                <w:b w:val="0"/>
+                <w:i w:val="0"/>
+                <w:color w:val="000000"/>
+                <w:sz w:val="28"/>
+                <w:u w:val="none"/>
+              </w:rPr>
               <w:t>Преобразование яркости по (1).</w:t>
             </w:r>
           </w:p>
         </w:tc>
       </w:tr>
       <w:tr>
+        <w:trPr>
+          <w:cantSplit/>
+        </w:trPr>
         <w:tc>
           <w:tcPr>
-            <w:tcW w:type="dxa" w:w="4986"/>
+            <w:tcW w:type="dxa" w:w="4677"/>
           </w:tcPr>
           <w:p>
             <w:pPr>
+              <w:keepNext w:val="0"/>
+              <w:spacing w:before="0" w:after="0" w:line="360" w:lineRule="auto"/>
               <w:ind w:firstLine="0"/>
               <w:jc w:val="left"/>
             </w:pPr>
             <w:r>
+              <w:rPr>
+                <w:rFonts w:ascii="Times New Roman" w:hAnsi="Times New Roman" w:eastAsia="Times New Roman" w:cs="Times New Roman"/>
+                <w:b w:val="0"/>
+                <w:i w:val="0"/>
+                <w:color w:val="000000"/>
+                <w:sz w:val="28"/>
+                <w:u w:val="none"/>
+              </w:rPr>
               <w:t>processing::edges</w:t>
             </w:r>
           </w:p>
         </w:tc>
         <w:tc>
           <w:tcPr>
-            <w:tcW w:type="dxa" w:w="4986"/>
+            <w:tcW w:type="dxa" w:w="4677"/>
           </w:tcPr>
           <w:p>
             <w:pPr>
+              <w:keepNext w:val="0"/>
+              <w:spacing w:before="0" w:after="0" w:line="360" w:lineRule="auto"/>
               <w:ind w:firstLine="0"/>
               <w:jc w:val="left"/>
             </w:pPr>
             <w:r>
+              <w:rPr>
+                <w:rFonts w:ascii="Times New Roman" w:hAnsi="Times New Roman" w:eastAsia="Times New Roman" w:cs="Times New Roman"/>
+                <w:b w:val="0"/>
+                <w:i w:val="0"/>
+                <w:color w:val="000000"/>
+                <w:sz w:val="28"/>
+                <w:u w:val="none"/>
+              </w:rPr>
               <w:t>Выбор Лапласа, Робертса или Собела; формулы (3)–(5).</w:t>
             </w:r>
           </w:p>
         </w:tc>
       </w:tr>
       <w:tr>
+        <w:trPr>
+          <w:cantSplit/>
+        </w:trPr>
         <w:tc>
           <w:tcPr>
-            <w:tcW w:type="dxa" w:w="4986"/>
+            <w:tcW w:type="dxa" w:w="4677"/>
           </w:tcPr>
           <w:p>
             <w:pPr>
+              <w:keepNext w:val="0"/>
+              <w:spacing w:before="0" w:after="0" w:line="360" w:lineRule="auto"/>
               <w:ind w:firstLine="0"/>
               <w:jc w:val="left"/>
             </w:pPr>
             <w:r>
+              <w:rPr>
+                <w:rFonts w:ascii="Times New Roman" w:hAnsi="Times New Roman" w:eastAsia="Times New Roman" w:cs="Times New Roman"/>
+                <w:b w:val="0"/>
+                <w:i w:val="0"/>
+                <w:color w:val="000000"/>
+                <w:sz w:val="28"/>
+                <w:u w:val="none"/>
+              </w:rPr>
               <w:t>processing::average</w:t>
             </w:r>
           </w:p>
         </w:tc>
         <w:tc>
           <w:tcPr>
-            <w:tcW w:type="dxa" w:w="4986"/>
+            <w:tcW w:type="dxa" w:w="4677"/>
           </w:tcPr>
           <w:p>
             <w:pPr>
+              <w:keepNext w:val="0"/>
+              <w:spacing w:before="0" w:after="0" w:line="360" w:lineRule="auto"/>
               <w:ind w:firstLine="0"/>
               <w:jc w:val="left"/>
             </w:pPr>
             <w:r>
+              <w:rPr>
+                <w:rFonts w:ascii="Times New Roman" w:hAnsi="Times New Roman" w:eastAsia="Times New Roman" w:cs="Times New Roman"/>
+                <w:b w:val="0"/>
+                <w:i w:val="0"/>
+                <w:color w:val="000000"/>
+                <w:sz w:val="28"/>
+                <w:u w:val="none"/>
+              </w:rPr>
               <w:t>Равные или гауссовы веса; формулы (6), (7).</w:t>
             </w:r>
           </w:p>
         </w:tc>
       </w:tr>
       <w:tr>
+        <w:trPr>
+          <w:cantSplit/>
+        </w:trPr>
         <w:tc>
           <w:tcPr>
-            <w:tcW w:type="dxa" w:w="4986"/>
+            <w:tcW w:type="dxa" w:w="4677"/>
           </w:tcPr>
           <w:p>
             <w:pPr>
+              <w:keepNext w:val="0"/>
+              <w:spacing w:before="0" w:after="0" w:line="360" w:lineRule="auto"/>
               <w:ind w:firstLine="0"/>
               <w:jc w:val="left"/>
             </w:pPr>
             <w:r>
+              <w:rPr>
+                <w:rFonts w:ascii="Times New Roman" w:hAnsi="Times New Roman" w:eastAsia="Times New Roman" w:cs="Times New Roman"/>
+                <w:b w:val="0"/>
+                <w:i w:val="0"/>
+                <w:color w:val="000000"/>
+                <w:sz w:val="28"/>
+                <w:u w:val="none"/>
+              </w:rPr>
               <w:t>processing::rank</w:t>
             </w:r>
           </w:p>
         </w:tc>
         <w:tc>
           <w:tcPr>
-            <w:tcW w:type="dxa" w:w="4986"/>
+            <w:tcW w:type="dxa" w:w="4677"/>
           </w:tcPr>
           <w:p>
             <w:pPr>
+              <w:keepNext w:val="0"/>
+              <w:spacing w:before="0" w:after="0" w:line="360" w:lineRule="auto"/>
               <w:ind w:firstLine="0"/>
               <w:jc w:val="left"/>
             </w:pPr>
             <w:r>
+              <w:rPr>
+                <w:rFonts w:ascii="Times New Roman" w:hAnsi="Times New Roman" w:eastAsia="Times New Roman" w:cs="Times New Roman"/>
+                <w:b w:val="0"/>
+                <w:i w:val="0"/>
+                <w:color w:val="000000"/>
+                <w:sz w:val="28"/>
+                <w:u w:val="none"/>
+              </w:rPr>
               <w:t>Минимум, медиана и максимум; формула (8).</w:t>
             </w:r>
           </w:p>
         </w:tc>
       </w:tr>
       <w:tr>
+        <w:trPr>
+          <w:cantSplit/>
+        </w:trPr>
         <w:tc>
           <w:tcPr>
-            <w:tcW w:type="dxa" w:w="4986"/>
+            <w:tcW w:type="dxa" w:w="4677"/>
           </w:tcPr>
           <w:p>
             <w:pPr>
+              <w:keepNext w:val="0"/>
+              <w:spacing w:before="0" w:after="0" w:line="360" w:lineRule="auto"/>
               <w:ind w:firstLine="0"/>
               <w:jc w:val="left"/>
             </w:pPr>
             <w:r>
+              <w:rPr>
+                <w:rFonts w:ascii="Times New Roman" w:hAnsi="Times New Roman" w:eastAsia="Times New Roman" w:cs="Times New Roman"/>
+                <w:b w:val="0"/>
+                <w:i w:val="0"/>
+                <w:color w:val="000000"/>
+                <w:sz w:val="28"/>
+                <w:u w:val="none"/>
+              </w:rPr>
               <w:t>main.cpp</w:t>
             </w:r>
           </w:p>
         </w:tc>
         <w:tc>
           <w:tcPr>
-            <w:tcW w:type="dxa" w:w="4986"/>
+            <w:tcW w:type="dxa" w:w="4677"/>
           </w:tcPr>
           <w:p>
             <w:pPr>
+              <w:keepNext w:val="0"/>
+              <w:spacing w:before="0" w:after="0" w:line="360" w:lineRule="auto"/>
               <w:ind w:firstLine="0"/>
               <w:jc w:val="left"/>
             </w:pPr>
             <w:r>
+              <w:rPr>
+                <w:rFonts w:ascii="Times New Roman" w:hAnsi="Times New Roman" w:eastAsia="Times New Roman" w:cs="Times New Roman"/>
+                <w:b w:val="0"/>
+                <w:i w:val="0"/>
+                <w:color w:val="000000"/>
+                <w:sz w:val="28"/>
+                <w:u w:val="none"/>
+              </w:rPr>
               <w:t>Чтение пути входа и каталога выхода, последовательный запуск всех методов.</w:t>
             </w:r>
           </w:p>
@@ -607,50 +1397,191 @@
       </w:tr>
     </w:tbl>
     <w:p>
+      <w:pPr>
+        <w:keepNext w:val="0"/>
+        <w:keepLines w:val="0"/>
+        <w:pageBreakBefore w:val="0"/>
+        <w:spacing w:before="0" w:after="0" w:line="360" w:lineRule="auto"/>
+        <w:ind w:firstLine="720" w:left="0" w:right="0"/>
+        <w:jc w:val="both"/>
+      </w:pPr>
       <w:r>
+        <w:rPr>
+          <w:rFonts w:ascii="Times New Roman" w:hAnsi="Times New Roman" w:eastAsia="Times New Roman" w:cs="Times New Roman"/>
+          <w:b w:val="0"/>
+          <w:i w:val="0"/>
+          <w:color w:val="000000"/>
+          <w:sz w:val="28"/>
+          <w:u w:val="none"/>
+        </w:rPr>
         <w:t>Данные Image хранятся в std::unique_ptr&lt;uint8_t[]&gt;. Копирование выделяет отдельную память. Для 1–2 каналов getColor возвращает яркость в r, а g и b устанавливает в ноль согласно смыслу предоставленных тестов. Для 3–4 каналов возвращается RGB. setColor сохраняет альфа-канал; при создании двух- и четырёхканального изображения он равен 255. При недопустимых координатах объект и выходные аргументы не меняются.</w:t>
       </w:r>
     </w:p>
     <w:p>
+      <w:pPr>
+        <w:keepNext w:val="0"/>
+        <w:keepLines w:val="0"/>
+        <w:pageBreakBefore w:val="0"/>
+        <w:spacing w:before="0" w:after="0" w:line="360" w:lineRule="auto"/>
+        <w:ind w:firstLine="720" w:left="0" w:right="0"/>
+        <w:jc w:val="both"/>
+      </w:pPr>
       <w:r>
+        <w:rPr>
+          <w:rFonts w:ascii="Times New Roman" w:hAnsi="Times New Roman" w:eastAsia="Times New Roman" w:cs="Times New Roman"/>
+          <w:b w:val="0"/>
+          <w:i w:val="0"/>
+          <w:color w:val="000000"/>
+          <w:sz w:val="28"/>
+          <w:u w:val="none"/>
+        </w:rPr>
         <w:t>Сборка и запуск из корня проекта: make; make test; make demo. Для своего файла: ./build/lab input.png output/my_image. Программа сохраняет 11 PNG: полутоновый вход, три результата выделения контуров, три усреднения и четыре порядковых фильтра. Ошибка чтения или записи приводит к ненулевому коду завершения.</w:t>
       </w:r>
     </w:p>
     <w:p>
+      <w:pPr>
+        <w:keepNext w:val="0"/>
+        <w:keepLines w:val="0"/>
+        <w:pageBreakBefore w:val="0"/>
+        <w:spacing w:before="0" w:after="0" w:line="360" w:lineRule="auto"/>
+        <w:ind w:firstLine="720" w:left="0" w:right="0"/>
+        <w:jc w:val="both"/>
+      </w:pPr>
       <w:r>
+        <w:rPr>
+          <w:rFonts w:ascii="Times New Roman" w:hAnsi="Times New Roman" w:eastAsia="Times New Roman" w:cs="Times New Roman"/>
+          <w:b w:val="0"/>
+          <w:i w:val="0"/>
+          <w:color w:val="000000"/>
+          <w:sz w:val="28"/>
+          <w:u w:val="none"/>
+        </w:rPr>
         <w:t>В текущей проверке выполнено 18 тестовых случаев, 474 проверки; ошибок и пропущенных тестов нет. Из них 12 случаев взяты из задания и активированы, ещё 6 проверяют дополнительные свойства. Тесты и приложение собираются отдельно, поэтому конфликт двух main исключён.</w:t>
       </w:r>
     </w:p>
     <w:p>
+      <w:pPr>
+        <w:keepNext w:val="0"/>
+        <w:keepLines w:val="0"/>
+        <w:pageBreakBefore w:val="0"/>
+        <w:spacing w:before="0" w:after="0" w:line="360" w:lineRule="auto"/>
+        <w:ind w:firstLine="720" w:left="0" w:right="0"/>
+        <w:jc w:val="both"/>
+      </w:pPr>
       <w:r>
+        <w:rPr>
+          <w:rFonts w:ascii="Times New Roman" w:hAnsi="Times New Roman" w:eastAsia="Times New Roman" w:cs="Times New Roman"/>
+          <w:b w:val="0"/>
+          <w:i w:val="0"/>
+          <w:color w:val="000000"/>
+          <w:sz w:val="28"/>
+          <w:u w:val="none"/>
+        </w:rPr>
         <w:t>Дополнительные проверки: нулевой отклик контурных операторов на постоянном поле; сохранение его яркости всеми фильтрами, включая края; ручной расчёт отклика на ступень; результат обработки одиночного импульса; сохранение альфа-канала после PNG-записи; независимость присваиваемой копии; отклонение некорректных размеров окна.</w:t>
       </w:r>
     </w:p>
     <w:p>
+      <w:pPr>
+        <w:keepNext w:val="0"/>
+        <w:keepLines w:val="0"/>
+        <w:pageBreakBefore w:val="0"/>
+        <w:spacing w:before="0" w:after="0" w:line="360" w:lineRule="auto"/>
+        <w:ind w:firstLine="720" w:left="0" w:right="0"/>
+        <w:jc w:val="both"/>
+      </w:pPr>
       <w:r>
+        <w:rPr>
+          <w:rFonts w:ascii="Times New Roman" w:hAnsi="Times New Roman" w:eastAsia="Times New Roman" w:cs="Times New Roman"/>
+          <w:b w:val="0"/>
+          <w:i w:val="0"/>
+          <w:color w:val="000000"/>
+          <w:sz w:val="28"/>
+          <w:u w:val="none"/>
+        </w:rPr>
         <w:t>Для ступени 0→40 проверены отклики Лапласа 40, Робертса round(40√2)=57 и Собела 160. Для импульса 255 среднее 3×3 даёт 28, гауссово окно 3×3 при σ=1 даёт 52, медиана и минимум — 0. Такие проверки связывают реализацию с математическими формулами, а не только с успешным запуском.</w:t>
       </w:r>
     </w:p>
     <w:p>
+      <w:pPr>
+        <w:keepNext w:val="0"/>
+        <w:keepLines w:val="0"/>
+        <w:pageBreakBefore w:val="0"/>
+        <w:spacing w:before="0" w:after="0" w:line="20" w:lineRule="exact"/>
+        <w:ind w:firstLine="720" w:left="0" w:right="0"/>
+        <w:jc w:val="both"/>
+      </w:pPr>
       <w:r>
-        <w:br w:type="page"/>
+        <w:rPr>
+          <w:rFonts w:ascii="Times New Roman" w:hAnsi="Times New Roman" w:eastAsia="Times New Roman" w:cs="Times New Roman"/>
+          <w:b w:val="0"/>
+          <w:i w:val="0"/>
+          <w:color w:val="000000"/>
+          <w:sz w:val="2"/>
+          <w:u w:val="none"/>
+        </w:rPr>
       </w:r>
     </w:p>
     <w:p>
       <w:pPr>
         <w:pStyle w:val="Heading1"/>
+        <w:keepNext/>
+        <w:keepLines/>
+        <w:pageBreakBefore w:val="0"/>
+        <w:spacing w:before="0" w:after="0" w:line="360" w:lineRule="auto"/>
+        <w:ind w:left="0" w:right="0" w:firstLine="0"/>
+        <w:jc w:val="center"/>
       </w:pPr>
       <w:r>
+        <w:rPr>
+          <w:rFonts w:ascii="Times New Roman" w:hAnsi="Times New Roman" w:eastAsia="Times New Roman" w:cs="Times New Roman"/>
+          <w:b/>
+          <w:i w:val="0"/>
+          <w:color w:val="000000"/>
+          <w:sz w:val="28"/>
+          <w:u w:val="none"/>
+        </w:rPr>
         <w:t>4. Тестовые изображения</w:t>
       </w:r>
     </w:p>
     <w:p>
+      <w:pPr>
+        <w:keepNext w:val="0"/>
+        <w:keepLines w:val="0"/>
+        <w:pageBreakBefore w:val="0"/>
+        <w:spacing w:before="0" w:after="0" w:line="360" w:lineRule="auto"/>
+        <w:ind w:firstLine="720" w:left="0" w:right="0"/>
+        <w:jc w:val="both"/>
+      </w:pPr>
       <w:r>
+        <w:rPr>
+          <w:rFonts w:ascii="Times New Roman" w:hAnsi="Times New Roman" w:eastAsia="Times New Roman" w:cs="Times New Roman"/>
+          <w:b w:val="0"/>
+          <w:i w:val="0"/>
+          <w:color w:val="000000"/>
+          <w:sz w:val="28"/>
+          <w:u w:val="none"/>
+        </w:rPr>
         <w:t>Подготовлены две самостоятельные сцены 256×192 пикселя. Набор А содержит прямоугольник, круг, треугольник, крупные однородные области и участок линейного изменения яркости. Набор Б содержит тонкие горизонтальные и вертикальные штрихи, шахматный фрагмент, окружность и диагональ на градиентном фоне. Первый набор удобен для оценки шума на ровном фоне, второй — для обнаружения потери деталей.</w:t>
       </w:r>
     </w:p>
     <w:p>
+      <w:pPr>
+        <w:keepNext/>
+        <w:keepLines/>
+        <w:pageBreakBefore w:val="0"/>
+        <w:spacing w:before="0" w:after="0" w:line="360" w:lineRule="auto"/>
+        <w:ind w:left="0" w:right="0" w:firstLine="0"/>
+        <w:jc w:val="center"/>
+      </w:pPr>
       <w:r>
+        <w:rPr>
+          <w:rFonts w:ascii="Times New Roman" w:hAnsi="Times New Roman" w:eastAsia="Times New Roman" w:cs="Times New Roman"/>
+          <w:b w:val="0"/>
+          <w:i w:val="0"/>
+          <w:color w:val="000000"/>
+          <w:sz w:val="28"/>
+          <w:u w:val="none"/>
+        </w:rPr>
         <w:drawing>
           <wp:inline xmlns:a="http://schemas.openxmlformats.org/drawingml/2006/main" xmlns:pic="http://schemas.openxmlformats.org/drawingml/2006/picture">
             <wp:extent cx="5400000" cy="4447059"/>
@@ -687,49 +1618,151 @@
     </w:p>
     <w:p>
       <w:pPr>
-        <w:ind w:firstLine="0"/>
+        <w:keepNext w:val="0"/>
+        <w:keepLines/>
+        <w:pageBreakBefore w:val="0"/>
+        <w:spacing w:before="0" w:after="0" w:line="360" w:lineRule="auto"/>
+        <w:ind w:left="0" w:right="0" w:firstLine="720"/>
         <w:jc w:val="center"/>
       </w:pPr>
       <w:r>
         <w:rPr>
-          <w:sz w:val="20"/>
+          <w:rFonts w:ascii="Times New Roman" w:hAnsi="Times New Roman" w:eastAsia="Times New Roman" w:cs="Times New Roman"/>
+          <w:b w:val="0"/>
+          <w:i w:val="0"/>
+          <w:color w:val="000000"/>
+          <w:sz w:val="28"/>
+          <w:u w:val="none"/>
         </w:rPr>
         <w:t>Рисунок 1. Чистые эталоны (слева) и соответствующие изображения с гауссовым шумом (справа).</w:t>
       </w:r>
     </w:p>
     <w:p>
+      <w:pPr>
+        <w:keepNext w:val="0"/>
+        <w:keepLines w:val="0"/>
+        <w:pageBreakBefore w:val="0"/>
+        <w:spacing w:before="0" w:after="0" w:line="360" w:lineRule="auto"/>
+        <w:ind w:firstLine="720" w:left="0" w:right="0"/>
+        <w:jc w:val="both"/>
+      </w:pPr>
       <w:r>
+        <w:rPr>
+          <w:rFonts w:ascii="Times New Roman" w:hAnsi="Times New Roman" w:eastAsia="Times New Roman" w:cs="Times New Roman"/>
+          <w:b w:val="0"/>
+          <w:i w:val="0"/>
+          <w:color w:val="000000"/>
+          <w:sz w:val="28"/>
+          <w:u w:val="none"/>
+        </w:rPr>
         <w:t>Шум добавлен вне программы фильтрации редактором ImageMagick: -seed 731 (А) / 1201 (Б), -attenuate 0.9 +noise Gaussian, глубина 8 бит. После добавления результат сохранён в PNG. Тестовые сцены подготовлены специально для сравнения этих методов.</w:t>
       </w:r>
     </w:p>
     <w:p>
+      <w:pPr>
+        <w:keepNext w:val="0"/>
+        <w:keepLines w:val="0"/>
+        <w:pageBreakBefore w:val="0"/>
+        <w:spacing w:before="0" w:after="0" w:line="360" w:lineRule="auto"/>
+        <w:ind w:firstLine="720" w:left="0" w:right="0"/>
+        <w:jc w:val="both"/>
+      </w:pPr>
       <w:r>
+        <w:rPr>
+          <w:rFonts w:ascii="Times New Roman" w:hAnsi="Times New Roman" w:eastAsia="Times New Roman" w:cs="Times New Roman"/>
+          <w:b w:val="0"/>
+          <w:i w:val="0"/>
+          <w:color w:val="000000"/>
+          <w:sz w:val="28"/>
+          <w:u w:val="none"/>
+        </w:rPr>
         <w:t>Измеренное стандартное отклонение разности с эталоном составляет 17.92 для А и 17.92 для Б. Средняя разность равна -0.60 и -0.65; небольшое смещение связано в том числе с дискретизацией. Значения после добавления шума ограничиваются диапазоном 0–255.</w:t>
       </w:r>
     </w:p>
     <w:p>
+      <w:pPr>
+        <w:keepNext w:val="0"/>
+        <w:keepLines w:val="0"/>
+        <w:pageBreakBefore w:val="0"/>
+        <w:spacing w:before="0" w:after="0" w:line="360" w:lineRule="auto"/>
+        <w:ind w:firstLine="720" w:left="0" w:right="0"/>
+        <w:jc w:val="both"/>
+      </w:pPr>
       <w:r>
+        <w:rPr>
+          <w:rFonts w:ascii="Times New Roman" w:hAnsi="Times New Roman" w:eastAsia="Times New Roman" w:cs="Times New Roman"/>
+          <w:b w:val="0"/>
+          <w:i w:val="0"/>
+          <w:color w:val="000000"/>
+          <w:sz w:val="28"/>
+          <w:u w:val="none"/>
+        </w:rPr>
         <w:t>Для обоих вариантов подавления шума используются одинаковые зашумлённые входы. Чистые эталоны сохранены отдельно, поэтому ошибка по (9) вычисляется относительно известного исходного сигнала.</w:t>
       </w:r>
     </w:p>
     <w:p>
+      <w:pPr>
+        <w:keepNext w:val="0"/>
+        <w:keepLines w:val="0"/>
+        <w:pageBreakBefore w:val="0"/>
+        <w:spacing w:before="0" w:after="0" w:line="20" w:lineRule="exact"/>
+        <w:ind w:firstLine="720" w:left="0" w:right="0"/>
+        <w:jc w:val="both"/>
+      </w:pPr>
       <w:r>
-        <w:br w:type="page"/>
+        <w:rPr>
+          <w:rFonts w:ascii="Times New Roman" w:hAnsi="Times New Roman" w:eastAsia="Times New Roman" w:cs="Times New Roman"/>
+          <w:b w:val="0"/>
+          <w:i w:val="0"/>
+          <w:color w:val="000000"/>
+          <w:sz w:val="2"/>
+          <w:u w:val="none"/>
+        </w:rPr>
       </w:r>
     </w:p>
     <w:p>
       <w:pPr>
         <w:pStyle w:val="Heading1"/>
+        <w:keepNext/>
+        <w:keepLines/>
+        <w:pageBreakBefore w:val="0"/>
+        <w:spacing w:before="0" w:after="0" w:line="360" w:lineRule="auto"/>
+        <w:ind w:left="0" w:right="0" w:firstLine="0"/>
+        <w:jc w:val="center"/>
       </w:pPr>
       <w:r>
+        <w:rPr>
+          <w:rFonts w:ascii="Times New Roman" w:hAnsi="Times New Roman" w:eastAsia="Times New Roman" w:cs="Times New Roman"/>
+          <w:b/>
+          <w:i w:val="0"/>
+          <w:color w:val="000000"/>
+          <w:sz w:val="28"/>
+          <w:u w:val="none"/>
+        </w:rPr>
         <w:t>5. Вариант 1: выделение контуров</w:t>
       </w:r>
     </w:p>
     <w:p>
+      <w:pPr>
+        <w:keepNext/>
+        <w:keepLines/>
+        <w:pageBreakBefore w:val="0"/>
+        <w:spacing w:before="0" w:after="0" w:line="360" w:lineRule="auto"/>
+        <w:ind w:left="0" w:right="0" w:firstLine="0"/>
+        <w:jc w:val="center"/>
+      </w:pPr>
       <w:r>
+        <w:rPr>
+          <w:rFonts w:ascii="Times New Roman" w:hAnsi="Times New Roman" w:eastAsia="Times New Roman" w:cs="Times New Roman"/>
+          <w:b w:val="0"/>
+          <w:i w:val="0"/>
+          <w:color w:val="000000"/>
+          <w:sz w:val="28"/>
+          <w:u w:val="none"/>
+        </w:rPr>
         <w:drawing>
           <wp:inline xmlns:a="http://schemas.openxmlformats.org/drawingml/2006/main" xmlns:pic="http://schemas.openxmlformats.org/drawingml/2006/picture">
-            <wp:extent cx="6120000" cy="2520000"/>
+            <wp:extent cx="5940425" cy="2446057"/>
             <wp:docPr id="2" name="Picture 2"/>
             <wp:cNvGraphicFramePr>
               <a:graphicFrameLocks noChangeAspect="1"/>
@@ -750,7 +1783,7 @@
                   <pic:spPr>
                     <a:xfrm>
                       <a:off x="0" y="0"/>
-                      <a:ext cx="6120000" cy="2520000"/>
+                      <a:ext cx="5940425" cy="2446057"/>
                     </a:xfrm>
                     <a:prstGeom prst="rect"/>
                   </pic:spPr>
@@ -763,31 +1796,88 @@
     </w:p>
     <w:p>
       <w:pPr>
-        <w:ind w:firstLine="0"/>
+        <w:keepNext w:val="0"/>
+        <w:keepLines/>
+        <w:pageBreakBefore w:val="0"/>
+        <w:spacing w:before="0" w:after="0" w:line="360" w:lineRule="auto"/>
+        <w:ind w:left="0" w:right="0" w:firstLine="720"/>
         <w:jc w:val="center"/>
       </w:pPr>
       <w:r>
         <w:rPr>
-          <w:sz w:val="20"/>
+          <w:rFonts w:ascii="Times New Roman" w:hAnsi="Times New Roman" w:eastAsia="Times New Roman" w:cs="Times New Roman"/>
+          <w:b w:val="0"/>
+          <w:i w:val="0"/>
+          <w:color w:val="000000"/>
+          <w:sz w:val="28"/>
+          <w:u w:val="none"/>
         </w:rPr>
         <w:t>Рисунок 2. Сверху набор А, снизу набор Б. В каждом ряду: вход, Лаплас, Робертс, Собел.</w:t>
       </w:r>
     </w:p>
     <w:p>
+      <w:pPr>
+        <w:keepNext w:val="0"/>
+        <w:keepLines w:val="0"/>
+        <w:pageBreakBefore w:val="0"/>
+        <w:spacing w:before="0" w:after="0" w:line="360" w:lineRule="auto"/>
+        <w:ind w:firstLine="720" w:left="0" w:right="0"/>
+        <w:jc w:val="both"/>
+      </w:pPr>
       <w:r>
+        <w:rPr>
+          <w:rFonts w:ascii="Times New Roman" w:hAnsi="Times New Roman" w:eastAsia="Times New Roman" w:cs="Times New Roman"/>
+          <w:b w:val="0"/>
+          <w:i w:val="0"/>
+          <w:color w:val="000000"/>
+          <w:sz w:val="28"/>
+          <w:u w:val="none"/>
+        </w:rPr>
         <w:t>На наборе А Лаплас выделяет обе стороны скачка яркости, поскольку соседние значения второй разности имеют разные знаки, а отображается их модуль (3). Робертс даёт компактный отклик на границах фигур и реагирует на диагональные перепады. Собел формирует более широкий яркий контур из-за окна 3×3 и коэффициентов ±2.</w:t>
       </w:r>
     </w:p>
     <w:p>
+      <w:pPr>
+        <w:keepNext w:val="0"/>
+        <w:keepLines w:val="0"/>
+        <w:pageBreakBefore w:val="0"/>
+        <w:spacing w:before="0" w:after="0" w:line="360" w:lineRule="auto"/>
+        <w:ind w:firstLine="720" w:left="0" w:right="0"/>
+        <w:jc w:val="both"/>
+      </w:pPr>
       <w:r>
+        <w:rPr>
+          <w:rFonts w:ascii="Times New Roman" w:hAnsi="Times New Roman" w:eastAsia="Times New Roman" w:cs="Times New Roman"/>
+          <w:b w:val="0"/>
+          <w:i w:val="0"/>
+          <w:color w:val="000000"/>
+          <w:sz w:val="28"/>
+          <w:u w:val="none"/>
+        </w:rPr>
         <w:t>Набор Б показывает, что тонкие штрихи создают близко расположенные отклики; при пересечении или сближении линий они могут сливаться. На линейном градиенте внутренняя вторая разность Лапласа близка к нулю, а операторы первого порядка реагируют на изменение яркости. В местах целочисленного округления возможен слабый остаточный отклик.</w:t>
       </w:r>
     </w:p>
     <w:p>
+      <w:pPr>
+        <w:keepNext/>
+        <w:keepLines/>
+        <w:pageBreakBefore w:val="0"/>
+        <w:spacing w:before="0" w:after="0" w:line="360" w:lineRule="auto"/>
+        <w:ind w:left="0" w:right="0" w:firstLine="0"/>
+        <w:jc w:val="center"/>
+      </w:pPr>
       <w:r>
+        <w:rPr>
+          <w:rFonts w:ascii="Times New Roman" w:hAnsi="Times New Roman" w:eastAsia="Times New Roman" w:cs="Times New Roman"/>
+          <w:b w:val="0"/>
+          <w:i w:val="0"/>
+          <w:color w:val="000000"/>
+          <w:sz w:val="28"/>
+          <w:u w:val="none"/>
+        </w:rPr>
         <w:drawing>
           <wp:inline xmlns:a="http://schemas.openxmlformats.org/drawingml/2006/main" xmlns:pic="http://schemas.openxmlformats.org/drawingml/2006/picture">
-            <wp:extent cx="6120000" cy="1260000"/>
+            <wp:extent cx="5940425" cy="1223029"/>
             <wp:docPr id="3" name="Picture 3"/>
             <wp:cNvGraphicFramePr>
               <a:graphicFrameLocks noChangeAspect="1"/>
@@ -808,7 +1898,7 @@
                   <pic:spPr>
                     <a:xfrm>
                       <a:off x="0" y="0"/>
-                      <a:ext cx="6120000" cy="1260000"/>
+                      <a:ext cx="5940425" cy="1223029"/>
                     </a:xfrm>
                     <a:prstGeom prst="rect"/>
                   </pic:spPr>
@@ -821,44 +1911,130 @@
     </w:p>
     <w:p>
       <w:pPr>
-        <w:ind w:firstLine="0"/>
+        <w:keepNext w:val="0"/>
+        <w:keepLines/>
+        <w:pageBreakBefore w:val="0"/>
+        <w:spacing w:before="0" w:after="0" w:line="360" w:lineRule="auto"/>
+        <w:ind w:left="0" w:right="0" w:firstLine="720"/>
         <w:jc w:val="center"/>
       </w:pPr>
       <w:r>
         <w:rPr>
-          <w:sz w:val="20"/>
+          <w:rFonts w:ascii="Times New Roman" w:hAnsi="Times New Roman" w:eastAsia="Times New Roman" w:cs="Times New Roman"/>
+          <w:b w:val="0"/>
+          <w:i w:val="0"/>
+          <w:color w:val="000000"/>
+          <w:sz w:val="28"/>
+          <w:u w:val="none"/>
         </w:rPr>
         <w:t>Рисунок 3. Набор А с шумом и результаты тех же трёх операторов.</w:t>
       </w:r>
     </w:p>
     <w:p>
+      <w:pPr>
+        <w:keepNext w:val="0"/>
+        <w:keepLines w:val="0"/>
+        <w:pageBreakBefore w:val="0"/>
+        <w:spacing w:before="0" w:after="0" w:line="360" w:lineRule="auto"/>
+        <w:ind w:firstLine="720" w:left="0" w:right="0"/>
+        <w:jc w:val="both"/>
+      </w:pPr>
       <w:r>
+        <w:rPr>
+          <w:rFonts w:ascii="Times New Roman" w:hAnsi="Times New Roman" w:eastAsia="Times New Roman" w:cs="Times New Roman"/>
+          <w:b w:val="0"/>
+          <w:i w:val="0"/>
+          <w:color w:val="000000"/>
+          <w:sz w:val="28"/>
+          <w:u w:val="none"/>
+        </w:rPr>
         <w:t>На зашумлённом входе появляются отклики внутри однородных областей: дифференцирование усиливает локальные колебания. У Собела есть сглаживание в поперечном направлении, однако его ненормированные маски также усиливают амплитуду. Сравнивать только яркость шумового фона у трёх выходов некорректно, поскольку коэффициенты операторов различаются. Во всех случаях изображения по рисунку 2 позволяют отделить полезную реакцию на границу от реакции на шум.</w:t>
       </w:r>
     </w:p>
     <w:p>
+      <w:pPr>
+        <w:keepNext w:val="0"/>
+        <w:keepLines w:val="0"/>
+        <w:pageBreakBefore w:val="0"/>
+        <w:spacing w:before="0" w:after="0" w:line="360" w:lineRule="auto"/>
+        <w:ind w:firstLine="720" w:left="0" w:right="0"/>
+        <w:jc w:val="both"/>
+      </w:pPr>
       <w:r>
+        <w:rPr>
+          <w:rFonts w:ascii="Times New Roman" w:hAnsi="Times New Roman" w:eastAsia="Times New Roman" w:cs="Times New Roman"/>
+          <w:b w:val="0"/>
+          <w:i w:val="0"/>
+          <w:color w:val="000000"/>
+          <w:sz w:val="28"/>
+          <w:u w:val="none"/>
+        </w:rPr>
         <w:t>При сильных перепадах результат ограничивается 255 по (2). Поэтому яркость контура после насыщения уже не пропорциональна точной величине производной. Предварительное подавление шума могло бы уменьшить ложные отклики, но в этом сравнении операторы применены непосредственно ко входу, чтобы показать их собственные свойства.</w:t>
       </w:r>
     </w:p>
     <w:p>
+      <w:pPr>
+        <w:keepNext w:val="0"/>
+        <w:keepLines w:val="0"/>
+        <w:pageBreakBefore w:val="0"/>
+        <w:spacing w:before="0" w:after="0" w:line="20" w:lineRule="exact"/>
+        <w:ind w:firstLine="720" w:left="0" w:right="0"/>
+        <w:jc w:val="both"/>
+      </w:pPr>
       <w:r>
-        <w:br w:type="page"/>
+        <w:rPr>
+          <w:rFonts w:ascii="Times New Roman" w:hAnsi="Times New Roman" w:eastAsia="Times New Roman" w:cs="Times New Roman"/>
+          <w:b w:val="0"/>
+          <w:i w:val="0"/>
+          <w:color w:val="000000"/>
+          <w:sz w:val="2"/>
+          <w:u w:val="none"/>
+        </w:rPr>
       </w:r>
     </w:p>
     <w:p>
       <w:pPr>
         <w:pStyle w:val="Heading1"/>
+        <w:keepNext/>
+        <w:keepLines/>
+        <w:pageBreakBefore w:val="0"/>
+        <w:spacing w:before="0" w:after="0" w:line="360" w:lineRule="auto"/>
+        <w:ind w:left="0" w:right="0" w:firstLine="0"/>
+        <w:jc w:val="center"/>
       </w:pPr>
       <w:r>
+        <w:rPr>
+          <w:rFonts w:ascii="Times New Roman" w:hAnsi="Times New Roman" w:eastAsia="Times New Roman" w:cs="Times New Roman"/>
+          <w:b/>
+          <w:i w:val="0"/>
+          <w:color w:val="000000"/>
+          <w:sz w:val="28"/>
+          <w:u w:val="none"/>
+        </w:rPr>
         <w:t>6. Вариант 2: усредняющие фильтры</w:t>
       </w:r>
     </w:p>
     <w:p>
+      <w:pPr>
+        <w:keepNext/>
+        <w:keepLines/>
+        <w:pageBreakBefore w:val="0"/>
+        <w:spacing w:before="0" w:after="0" w:line="360" w:lineRule="auto"/>
+        <w:ind w:left="0" w:right="0" w:firstLine="0"/>
+        <w:jc w:val="center"/>
+      </w:pPr>
       <w:r>
+        <w:rPr>
+          <w:rFonts w:ascii="Times New Roman" w:hAnsi="Times New Roman" w:eastAsia="Times New Roman" w:cs="Times New Roman"/>
+          <w:b w:val="0"/>
+          <w:i w:val="0"/>
+          <w:color w:val="000000"/>
+          <w:sz w:val="28"/>
+          <w:u w:val="none"/>
+        </w:rPr>
         <w:drawing>
           <wp:inline xmlns:a="http://schemas.openxmlformats.org/drawingml/2006/main" xmlns:pic="http://schemas.openxmlformats.org/drawingml/2006/picture">
-            <wp:extent cx="6120000" cy="2520000"/>
+            <wp:extent cx="5940425" cy="2446057"/>
             <wp:docPr id="4" name="Picture 4"/>
             <wp:cNvGraphicFramePr>
               <a:graphicFrameLocks noChangeAspect="1"/>
@@ -879,7 +2055,7 @@
                   <pic:spPr>
                     <a:xfrm>
                       <a:off x="0" y="0"/>
-                      <a:ext cx="6120000" cy="2520000"/>
+                      <a:ext cx="5940425" cy="2446057"/>
                     </a:xfrm>
                     <a:prstGeom prst="rect"/>
                   </pic:spPr>
@@ -892,12 +2068,21 @@
     </w:p>
     <w:p>
       <w:pPr>
-        <w:ind w:firstLine="0"/>
+        <w:keepNext w:val="0"/>
+        <w:keepLines/>
+        <w:pageBreakBefore w:val="0"/>
+        <w:spacing w:before="0" w:after="0" w:line="360" w:lineRule="auto"/>
+        <w:ind w:left="0" w:right="0" w:firstLine="720"/>
         <w:jc w:val="center"/>
       </w:pPr>
       <w:r>
         <w:rPr>
-          <w:sz w:val="20"/>
+          <w:rFonts w:ascii="Times New Roman" w:hAnsi="Times New Roman" w:eastAsia="Times New Roman" w:cs="Times New Roman"/>
+          <w:b w:val="0"/>
+          <w:i w:val="0"/>
+          <w:color w:val="000000"/>
+          <w:sz w:val="28"/>
+          <w:u w:val="none"/>
         </w:rPr>
         <w:t>Рисунок 4. Сверху набор А, снизу набор Б. Вход с шумом; среднее 3×3; среднее 5×5; Гаусс 5×5, σ=1.</w:t>
       </w:r>
@@ -905,371 +2090,638 @@
     <w:tbl>
       <w:tblPr>
         <w:tblStyle w:val="TableGrid"/>
-        <w:tblW w:type="auto" w:w="0"/>
+        <w:tblW w:type="dxa" w:w="9355"/>
+        <w:tblLayout w:type="fixed"/>
         <w:tblLook w:firstColumn="1" w:firstRow="1" w:lastColumn="0" w:lastRow="0" w:noHBand="0" w:noVBand="1" w:val="04A0"/>
       </w:tblPr>
       <w:tblGrid>
-        <w:gridCol w:w="1994"/>
-        <w:gridCol w:w="1994"/>
-        <w:gridCol w:w="1994"/>
-        <w:gridCol w:w="1994"/>
-        <w:gridCol w:w="1994"/>
+        <w:gridCol w:w="1871"/>
+        <w:gridCol w:w="1871"/>
+        <w:gridCol w:w="1871"/>
+        <w:gridCol w:w="1871"/>
+        <w:gridCol w:w="1871"/>
       </w:tblGrid>
       <w:tr>
+        <w:trPr>
+          <w:cantSplit/>
+          <w:tblHeader/>
+        </w:trPr>
         <w:tc>
           <w:tcPr>
-            <w:tcW w:type="dxa" w:w="1994"/>
+            <w:tcW w:type="dxa" w:w="1871"/>
           </w:tcPr>
           <w:p>
             <w:pPr>
+              <w:keepNext/>
+              <w:spacing w:before="0" w:after="0" w:line="360" w:lineRule="auto"/>
               <w:ind w:firstLine="0"/>
               <w:jc w:val="left"/>
             </w:pPr>
             <w:r>
+              <w:rPr>
+                <w:rFonts w:ascii="Times New Roman" w:hAnsi="Times New Roman" w:eastAsia="Times New Roman" w:cs="Times New Roman"/>
+                <w:b w:val="0"/>
+                <w:i w:val="0"/>
+                <w:color w:val="000000"/>
+                <w:sz w:val="28"/>
+                <w:u w:val="none"/>
+              </w:rPr>
               <w:t>Метод</w:t>
             </w:r>
           </w:p>
         </w:tc>
         <w:tc>
           <w:tcPr>
-            <w:tcW w:type="dxa" w:w="1994"/>
+            <w:tcW w:type="dxa" w:w="1871"/>
           </w:tcPr>
           <w:p>
             <w:pPr>
+              <w:keepNext/>
+              <w:spacing w:before="0" w:after="0" w:line="360" w:lineRule="auto"/>
               <w:ind w:firstLine="0"/>
               <w:jc w:val="left"/>
             </w:pPr>
             <w:r>
+              <w:rPr>
+                <w:rFonts w:ascii="Times New Roman" w:hAnsi="Times New Roman" w:eastAsia="Times New Roman" w:cs="Times New Roman"/>
+                <w:b w:val="0"/>
+                <w:i w:val="0"/>
+                <w:color w:val="000000"/>
+                <w:sz w:val="28"/>
+                <w:u w:val="none"/>
+              </w:rPr>
               <w:t>А: MSE</w:t>
             </w:r>
           </w:p>
         </w:tc>
         <w:tc>
           <w:tcPr>
-            <w:tcW w:type="dxa" w:w="1994"/>
+            <w:tcW w:type="dxa" w:w="1871"/>
           </w:tcPr>
           <w:p>
             <w:pPr>
+              <w:keepNext/>
+              <w:spacing w:before="0" w:after="0" w:line="360" w:lineRule="auto"/>
               <w:ind w:firstLine="0"/>
               <w:jc w:val="left"/>
             </w:pPr>
             <w:r>
+              <w:rPr>
+                <w:rFonts w:ascii="Times New Roman" w:hAnsi="Times New Roman" w:eastAsia="Times New Roman" w:cs="Times New Roman"/>
+                <w:b w:val="0"/>
+                <w:i w:val="0"/>
+                <w:color w:val="000000"/>
+                <w:sz w:val="28"/>
+                <w:u w:val="none"/>
+              </w:rPr>
               <w:t>А: PSNR, дБ</w:t>
             </w:r>
           </w:p>
         </w:tc>
         <w:tc>
           <w:tcPr>
-            <w:tcW w:type="dxa" w:w="1994"/>
+            <w:tcW w:type="dxa" w:w="1871"/>
           </w:tcPr>
           <w:p>
             <w:pPr>
+              <w:keepNext/>
+              <w:spacing w:before="0" w:after="0" w:line="360" w:lineRule="auto"/>
               <w:ind w:firstLine="0"/>
               <w:jc w:val="left"/>
             </w:pPr>
             <w:r>
+              <w:rPr>
+                <w:rFonts w:ascii="Times New Roman" w:hAnsi="Times New Roman" w:eastAsia="Times New Roman" w:cs="Times New Roman"/>
+                <w:b w:val="0"/>
+                <w:i w:val="0"/>
+                <w:color w:val="000000"/>
+                <w:sz w:val="28"/>
+                <w:u w:val="none"/>
+              </w:rPr>
               <w:t>Б: MSE</w:t>
             </w:r>
           </w:p>
         </w:tc>
         <w:tc>
           <w:tcPr>
-            <w:tcW w:type="dxa" w:w="1994"/>
+            <w:tcW w:type="dxa" w:w="1871"/>
           </w:tcPr>
           <w:p>
             <w:pPr>
+              <w:keepNext/>
+              <w:spacing w:before="0" w:after="0" w:line="360" w:lineRule="auto"/>
               <w:ind w:firstLine="0"/>
               <w:jc w:val="left"/>
             </w:pPr>
             <w:r>
+              <w:rPr>
+                <w:rFonts w:ascii="Times New Roman" w:hAnsi="Times New Roman" w:eastAsia="Times New Roman" w:cs="Times New Roman"/>
+                <w:b w:val="0"/>
+                <w:i w:val="0"/>
+                <w:color w:val="000000"/>
+                <w:sz w:val="28"/>
+                <w:u w:val="none"/>
+              </w:rPr>
               <w:t>Б: PSNR, дБ</w:t>
             </w:r>
           </w:p>
         </w:tc>
       </w:tr>
       <w:tr>
+        <w:trPr>
+          <w:cantSplit/>
+        </w:trPr>
         <w:tc>
           <w:tcPr>
-            <w:tcW w:type="dxa" w:w="1994"/>
+            <w:tcW w:type="dxa" w:w="1871"/>
           </w:tcPr>
           <w:p>
             <w:pPr>
+              <w:keepNext w:val="0"/>
+              <w:spacing w:before="0" w:after="0" w:line="360" w:lineRule="auto"/>
               <w:ind w:firstLine="0"/>
               <w:jc w:val="left"/>
             </w:pPr>
             <w:r>
+              <w:rPr>
+                <w:rFonts w:ascii="Times New Roman" w:hAnsi="Times New Roman" w:eastAsia="Times New Roman" w:cs="Times New Roman"/>
+                <w:b w:val="0"/>
+                <w:i w:val="0"/>
+                <w:color w:val="000000"/>
+                <w:sz w:val="28"/>
+                <w:u w:val="none"/>
+              </w:rPr>
               <w:t>Вход с шумом</w:t>
             </w:r>
           </w:p>
         </w:tc>
         <w:tc>
           <w:tcPr>
-            <w:tcW w:type="dxa" w:w="1994"/>
+            <w:tcW w:type="dxa" w:w="1871"/>
           </w:tcPr>
           <w:p>
             <w:pPr>
+              <w:keepNext w:val="0"/>
+              <w:spacing w:before="0" w:after="0" w:line="360" w:lineRule="auto"/>
               <w:ind w:firstLine="0"/>
               <w:jc w:val="left"/>
             </w:pPr>
             <w:r>
+              <w:rPr>
+                <w:rFonts w:ascii="Times New Roman" w:hAnsi="Times New Roman" w:eastAsia="Times New Roman" w:cs="Times New Roman"/>
+                <w:b w:val="0"/>
+                <w:i w:val="0"/>
+                <w:color w:val="000000"/>
+                <w:sz w:val="28"/>
+                <w:u w:val="none"/>
+              </w:rPr>
               <w:t>321.50</w:t>
             </w:r>
           </w:p>
         </w:tc>
         <w:tc>
           <w:tcPr>
-            <w:tcW w:type="dxa" w:w="1994"/>
+            <w:tcW w:type="dxa" w:w="1871"/>
           </w:tcPr>
           <w:p>
             <w:pPr>
+              <w:keepNext w:val="0"/>
+              <w:spacing w:before="0" w:after="0" w:line="360" w:lineRule="auto"/>
               <w:ind w:firstLine="0"/>
               <w:jc w:val="left"/>
             </w:pPr>
             <w:r>
+              <w:rPr>
+                <w:rFonts w:ascii="Times New Roman" w:hAnsi="Times New Roman" w:eastAsia="Times New Roman" w:cs="Times New Roman"/>
+                <w:b w:val="0"/>
+                <w:i w:val="0"/>
+                <w:color w:val="000000"/>
+                <w:sz w:val="28"/>
+                <w:u w:val="none"/>
+              </w:rPr>
               <w:t>23.06</w:t>
             </w:r>
           </w:p>
         </w:tc>
         <w:tc>
           <w:tcPr>
-            <w:tcW w:type="dxa" w:w="1994"/>
+            <w:tcW w:type="dxa" w:w="1871"/>
           </w:tcPr>
           <w:p>
             <w:pPr>
+              <w:keepNext w:val="0"/>
+              <w:spacing w:before="0" w:after="0" w:line="360" w:lineRule="auto"/>
               <w:ind w:firstLine="0"/>
               <w:jc w:val="left"/>
             </w:pPr>
             <w:r>
+              <w:rPr>
+                <w:rFonts w:ascii="Times New Roman" w:hAnsi="Times New Roman" w:eastAsia="Times New Roman" w:cs="Times New Roman"/>
+                <w:b w:val="0"/>
+                <w:i w:val="0"/>
+                <w:color w:val="000000"/>
+                <w:sz w:val="28"/>
+                <w:u w:val="none"/>
+              </w:rPr>
               <w:t>321.63</w:t>
             </w:r>
           </w:p>
         </w:tc>
         <w:tc>
           <w:tcPr>
-            <w:tcW w:type="dxa" w:w="1994"/>
+            <w:tcW w:type="dxa" w:w="1871"/>
           </w:tcPr>
           <w:p>
             <w:pPr>
+              <w:keepNext w:val="0"/>
+              <w:spacing w:before="0" w:after="0" w:line="360" w:lineRule="auto"/>
               <w:ind w:firstLine="0"/>
               <w:jc w:val="left"/>
             </w:pPr>
             <w:r>
+              <w:rPr>
+                <w:rFonts w:ascii="Times New Roman" w:hAnsi="Times New Roman" w:eastAsia="Times New Roman" w:cs="Times New Roman"/>
+                <w:b w:val="0"/>
+                <w:i w:val="0"/>
+                <w:color w:val="000000"/>
+                <w:sz w:val="28"/>
+                <w:u w:val="none"/>
+              </w:rPr>
               <w:t>23.06</w:t>
             </w:r>
           </w:p>
         </w:tc>
       </w:tr>
       <w:tr>
+        <w:trPr>
+          <w:cantSplit/>
+        </w:trPr>
         <w:tc>
           <w:tcPr>
-            <w:tcW w:type="dxa" w:w="1994"/>
+            <w:tcW w:type="dxa" w:w="1871"/>
           </w:tcPr>
           <w:p>
             <w:pPr>
+              <w:keepNext w:val="0"/>
+              <w:spacing w:before="0" w:after="0" w:line="360" w:lineRule="auto"/>
               <w:ind w:firstLine="0"/>
               <w:jc w:val="left"/>
             </w:pPr>
             <w:r>
+              <w:rPr>
+                <w:rFonts w:ascii="Times New Roman" w:hAnsi="Times New Roman" w:eastAsia="Times New Roman" w:cs="Times New Roman"/>
+                <w:b w:val="0"/>
+                <w:i w:val="0"/>
+                <w:color w:val="000000"/>
+                <w:sz w:val="28"/>
+                <w:u w:val="none"/>
+              </w:rPr>
               <w:t>Среднее 3×3</w:t>
             </w:r>
           </w:p>
         </w:tc>
         <w:tc>
           <w:tcPr>
-            <w:tcW w:type="dxa" w:w="1994"/>
+            <w:tcW w:type="dxa" w:w="1871"/>
           </w:tcPr>
           <w:p>
             <w:pPr>
+              <w:keepNext w:val="0"/>
+              <w:spacing w:before="0" w:after="0" w:line="360" w:lineRule="auto"/>
               <w:ind w:firstLine="0"/>
               <w:jc w:val="left"/>
             </w:pPr>
             <w:r>
+              <w:rPr>
+                <w:rFonts w:ascii="Times New Roman" w:hAnsi="Times New Roman" w:eastAsia="Times New Roman" w:cs="Times New Roman"/>
+                <w:b w:val="0"/>
+                <w:i w:val="0"/>
+                <w:color w:val="000000"/>
+                <w:sz w:val="28"/>
+                <w:u w:val="none"/>
+              </w:rPr>
               <w:t>111.66</w:t>
             </w:r>
           </w:p>
         </w:tc>
         <w:tc>
           <w:tcPr>
-            <w:tcW w:type="dxa" w:w="1994"/>
+            <w:tcW w:type="dxa" w:w="1871"/>
           </w:tcPr>
           <w:p>
             <w:pPr>
+              <w:keepNext w:val="0"/>
+              <w:spacing w:before="0" w:after="0" w:line="360" w:lineRule="auto"/>
               <w:ind w:firstLine="0"/>
               <w:jc w:val="left"/>
             </w:pPr>
             <w:r>
+              <w:rPr>
+                <w:rFonts w:ascii="Times New Roman" w:hAnsi="Times New Roman" w:eastAsia="Times New Roman" w:cs="Times New Roman"/>
+                <w:b w:val="0"/>
+                <w:i w:val="0"/>
+                <w:color w:val="000000"/>
+                <w:sz w:val="28"/>
+                <w:u w:val="none"/>
+              </w:rPr>
               <w:t>27.65</w:t>
             </w:r>
           </w:p>
         </w:tc>
         <w:tc>
           <w:tcPr>
-            <w:tcW w:type="dxa" w:w="1994"/>
+            <w:tcW w:type="dxa" w:w="1871"/>
           </w:tcPr>
           <w:p>
             <w:pPr>
+              <w:keepNext w:val="0"/>
+              <w:spacing w:before="0" w:after="0" w:line="360" w:lineRule="auto"/>
               <w:ind w:firstLine="0"/>
               <w:jc w:val="left"/>
             </w:pPr>
             <w:r>
+              <w:rPr>
+                <w:rFonts w:ascii="Times New Roman" w:hAnsi="Times New Roman" w:eastAsia="Times New Roman" w:cs="Times New Roman"/>
+                <w:b w:val="0"/>
+                <w:i w:val="0"/>
+                <w:color w:val="000000"/>
+                <w:sz w:val="28"/>
+                <w:u w:val="none"/>
+              </w:rPr>
               <w:t>437.16</w:t>
             </w:r>
           </w:p>
         </w:tc>
         <w:tc>
           <w:tcPr>
-            <w:tcW w:type="dxa" w:w="1994"/>
+            <w:tcW w:type="dxa" w:w="1871"/>
           </w:tcPr>
           <w:p>
             <w:pPr>
+              <w:keepNext w:val="0"/>
+              <w:spacing w:before="0" w:after="0" w:line="360" w:lineRule="auto"/>
               <w:ind w:firstLine="0"/>
               <w:jc w:val="left"/>
             </w:pPr>
             <w:r>
+              <w:rPr>
+                <w:rFonts w:ascii="Times New Roman" w:hAnsi="Times New Roman" w:eastAsia="Times New Roman" w:cs="Times New Roman"/>
+                <w:b w:val="0"/>
+                <w:i w:val="0"/>
+                <w:color w:val="000000"/>
+                <w:sz w:val="28"/>
+                <w:u w:val="none"/>
+              </w:rPr>
               <w:t>21.72</w:t>
             </w:r>
           </w:p>
         </w:tc>
       </w:tr>
       <w:tr>
+        <w:trPr>
+          <w:cantSplit/>
+        </w:trPr>
         <w:tc>
           <w:tcPr>
-            <w:tcW w:type="dxa" w:w="1994"/>
+            <w:tcW w:type="dxa" w:w="1871"/>
           </w:tcPr>
           <w:p>
             <w:pPr>
+              <w:keepNext w:val="0"/>
+              <w:spacing w:before="0" w:after="0" w:line="360" w:lineRule="auto"/>
               <w:ind w:firstLine="0"/>
               <w:jc w:val="left"/>
             </w:pPr>
             <w:r>
+              <w:rPr>
+                <w:rFonts w:ascii="Times New Roman" w:hAnsi="Times New Roman" w:eastAsia="Times New Roman" w:cs="Times New Roman"/>
+                <w:b w:val="0"/>
+                <w:i w:val="0"/>
+                <w:color w:val="000000"/>
+                <w:sz w:val="28"/>
+                <w:u w:val="none"/>
+              </w:rPr>
               <w:t>Среднее 5×5</w:t>
             </w:r>
           </w:p>
         </w:tc>
         <w:tc>
           <w:tcPr>
-            <w:tcW w:type="dxa" w:w="1994"/>
+            <w:tcW w:type="dxa" w:w="1871"/>
           </w:tcPr>
           <w:p>
             <w:pPr>
+              <w:keepNext w:val="0"/>
+              <w:spacing w:before="0" w:after="0" w:line="360" w:lineRule="auto"/>
               <w:ind w:firstLine="0"/>
               <w:jc w:val="left"/>
             </w:pPr>
             <w:r>
+              <w:rPr>
+                <w:rFonts w:ascii="Times New Roman" w:hAnsi="Times New Roman" w:eastAsia="Times New Roman" w:cs="Times New Roman"/>
+                <w:b w:val="0"/>
+                <w:i w:val="0"/>
+                <w:color w:val="000000"/>
+                <w:sz w:val="28"/>
+                <w:u w:val="none"/>
+              </w:rPr>
               <w:t>147.53</w:t>
             </w:r>
           </w:p>
         </w:tc>
         <w:tc>
           <w:tcPr>
-            <w:tcW w:type="dxa" w:w="1994"/>
+            <w:tcW w:type="dxa" w:w="1871"/>
           </w:tcPr>
           <w:p>
             <w:pPr>
+              <w:keepNext w:val="0"/>
+              <w:spacing w:before="0" w:after="0" w:line="360" w:lineRule="auto"/>
               <w:ind w:firstLine="0"/>
               <w:jc w:val="left"/>
             </w:pPr>
             <w:r>
+              <w:rPr>
+                <w:rFonts w:ascii="Times New Roman" w:hAnsi="Times New Roman" w:eastAsia="Times New Roman" w:cs="Times New Roman"/>
+                <w:b w:val="0"/>
+                <w:i w:val="0"/>
+                <w:color w:val="000000"/>
+                <w:sz w:val="28"/>
+                <w:u w:val="none"/>
+              </w:rPr>
               <w:t>26.44</w:t>
             </w:r>
           </w:p>
         </w:tc>
         <w:tc>
           <w:tcPr>
-            <w:tcW w:type="dxa" w:w="1994"/>
+            <w:tcW w:type="dxa" w:w="1871"/>
           </w:tcPr>
           <w:p>
             <w:pPr>
+              <w:keepNext w:val="0"/>
+              <w:spacing w:before="0" w:after="0" w:line="360" w:lineRule="auto"/>
               <w:ind w:firstLine="0"/>
               <w:jc w:val="left"/>
             </w:pPr>
             <w:r>
+              <w:rPr>
+                <w:rFonts w:ascii="Times New Roman" w:hAnsi="Times New Roman" w:eastAsia="Times New Roman" w:cs="Times New Roman"/>
+                <w:b w:val="0"/>
+                <w:i w:val="0"/>
+                <w:color w:val="000000"/>
+                <w:sz w:val="28"/>
+                <w:u w:val="none"/>
+              </w:rPr>
               <w:t>873.40</w:t>
             </w:r>
           </w:p>
         </w:tc>
         <w:tc>
           <w:tcPr>
-            <w:tcW w:type="dxa" w:w="1994"/>
+            <w:tcW w:type="dxa" w:w="1871"/>
           </w:tcPr>
           <w:p>
             <w:pPr>
+              <w:keepNext w:val="0"/>
+              <w:spacing w:before="0" w:after="0" w:line="360" w:lineRule="auto"/>
               <w:ind w:firstLine="0"/>
               <w:jc w:val="left"/>
             </w:pPr>
             <w:r>
+              <w:rPr>
+                <w:rFonts w:ascii="Times New Roman" w:hAnsi="Times New Roman" w:eastAsia="Times New Roman" w:cs="Times New Roman"/>
+                <w:b w:val="0"/>
+                <w:i w:val="0"/>
+                <w:color w:val="000000"/>
+                <w:sz w:val="28"/>
+                <w:u w:val="none"/>
+              </w:rPr>
               <w:t>18.72</w:t>
             </w:r>
           </w:p>
         </w:tc>
       </w:tr>
       <w:tr>
+        <w:trPr>
+          <w:cantSplit/>
+        </w:trPr>
         <w:tc>
           <w:tcPr>
-            <w:tcW w:type="dxa" w:w="1994"/>
+            <w:tcW w:type="dxa" w:w="1871"/>
           </w:tcPr>
           <w:p>
             <w:pPr>
+              <w:keepNext w:val="0"/>
+              <w:spacing w:before="0" w:after="0" w:line="360" w:lineRule="auto"/>
               <w:ind w:firstLine="0"/>
               <w:jc w:val="left"/>
             </w:pPr>
             <w:r>
+              <w:rPr>
+                <w:rFonts w:ascii="Times New Roman" w:hAnsi="Times New Roman" w:eastAsia="Times New Roman" w:cs="Times New Roman"/>
+                <w:b w:val="0"/>
+                <w:i w:val="0"/>
+                <w:color w:val="000000"/>
+                <w:sz w:val="28"/>
+                <w:u w:val="none"/>
+              </w:rPr>
               <w:t>Гаусс 5×5</w:t>
             </w:r>
           </w:p>
         </w:tc>
         <w:tc>
           <w:tcPr>
-            <w:tcW w:type="dxa" w:w="1994"/>
+            <w:tcW w:type="dxa" w:w="1871"/>
           </w:tcPr>
           <w:p>
             <w:pPr>
+              <w:keepNext w:val="0"/>
+              <w:spacing w:before="0" w:after="0" w:line="360" w:lineRule="auto"/>
               <w:ind w:firstLine="0"/>
               <w:jc w:val="left"/>
             </w:pPr>
             <w:r>
+              <w:rPr>
+                <w:rFonts w:ascii="Times New Roman" w:hAnsi="Times New Roman" w:eastAsia="Times New Roman" w:cs="Times New Roman"/>
+                <w:b w:val="0"/>
+                <w:i w:val="0"/>
+                <w:color w:val="000000"/>
+                <w:sz w:val="28"/>
+                <w:u w:val="none"/>
+              </w:rPr>
               <w:t>95.38</w:t>
             </w:r>
           </w:p>
         </w:tc>
         <w:tc>
           <w:tcPr>
-            <w:tcW w:type="dxa" w:w="1994"/>
+            <w:tcW w:type="dxa" w:w="1871"/>
           </w:tcPr>
           <w:p>
             <w:pPr>
+              <w:keepNext w:val="0"/>
+              <w:spacing w:before="0" w:after="0" w:line="360" w:lineRule="auto"/>
               <w:ind w:firstLine="0"/>
               <w:jc w:val="left"/>
             </w:pPr>
             <w:r>
+              <w:rPr>
+                <w:rFonts w:ascii="Times New Roman" w:hAnsi="Times New Roman" w:eastAsia="Times New Roman" w:cs="Times New Roman"/>
+                <w:b w:val="0"/>
+                <w:i w:val="0"/>
+                <w:color w:val="000000"/>
+                <w:sz w:val="28"/>
+                <w:u w:val="none"/>
+              </w:rPr>
               <w:t>28.34</w:t>
             </w:r>
           </w:p>
         </w:tc>
         <w:tc>
           <w:tcPr>
-            <w:tcW w:type="dxa" w:w="1994"/>
+            <w:tcW w:type="dxa" w:w="1871"/>
           </w:tcPr>
           <w:p>
             <w:pPr>
+              <w:keepNext w:val="0"/>
+              <w:spacing w:before="0" w:after="0" w:line="360" w:lineRule="auto"/>
               <w:ind w:firstLine="0"/>
               <w:jc w:val="left"/>
             </w:pPr>
             <w:r>
+              <w:rPr>
+                <w:rFonts w:ascii="Times New Roman" w:hAnsi="Times New Roman" w:eastAsia="Times New Roman" w:cs="Times New Roman"/>
+                <w:b w:val="0"/>
+                <w:i w:val="0"/>
+                <w:color w:val="000000"/>
+                <w:sz w:val="28"/>
+                <w:u w:val="none"/>
+              </w:rPr>
               <w:t>400.27</w:t>
             </w:r>
           </w:p>
         </w:tc>
         <w:tc>
           <w:tcPr>
-            <w:tcW w:type="dxa" w:w="1994"/>
+            <w:tcW w:type="dxa" w:w="1871"/>
           </w:tcPr>
           <w:p>
             <w:pPr>
+              <w:keepNext w:val="0"/>
+              <w:spacing w:before="0" w:after="0" w:line="360" w:lineRule="auto"/>
               <w:ind w:firstLine="0"/>
               <w:jc w:val="left"/>
             </w:pPr>
             <w:r>
+              <w:rPr>
+                <w:rFonts w:ascii="Times New Roman" w:hAnsi="Times New Roman" w:eastAsia="Times New Roman" w:cs="Times New Roman"/>
+                <w:b w:val="0"/>
+                <w:i w:val="0"/>
+                <w:color w:val="000000"/>
+                <w:sz w:val="28"/>
+                <w:u w:val="none"/>
+              </w:rPr>
               <w:t>22.11</w:t>
             </w:r>
           </w:p>
@@ -1277,38 +2729,131 @@
       </w:tr>
     </w:tbl>
     <w:p>
+      <w:pPr>
+        <w:keepNext w:val="0"/>
+        <w:keepLines w:val="0"/>
+        <w:pageBreakBefore w:val="0"/>
+        <w:spacing w:before="0" w:after="0" w:line="360" w:lineRule="auto"/>
+        <w:ind w:firstLine="720" w:left="0" w:right="0"/>
+        <w:jc w:val="both"/>
+      </w:pPr>
       <w:r>
+        <w:rPr>
+          <w:rFonts w:ascii="Times New Roman" w:hAnsi="Times New Roman" w:eastAsia="Times New Roman" w:cs="Times New Roman"/>
+          <w:b w:val="0"/>
+          <w:i w:val="0"/>
+          <w:color w:val="000000"/>
+          <w:sz w:val="28"/>
+          <w:u w:val="none"/>
+        </w:rPr>
         <w:t>На крупных фигурах все три фильтра уменьшают ошибку относительно зашумлённого входа. Из усредняющих методов лучшие значения на обоих наборах получены для гауссова окна 5×5 с σ=1. Более низкие веса удалённых пикселей снижают смешивание яркостей по разные стороны границы по сравнению с равными весами окна 5×5.</w:t>
       </w:r>
     </w:p>
     <w:p>
+      <w:pPr>
+        <w:keepNext w:val="0"/>
+        <w:keepLines w:val="0"/>
+        <w:pageBreakBefore w:val="0"/>
+        <w:spacing w:before="0" w:after="0" w:line="360" w:lineRule="auto"/>
+        <w:ind w:firstLine="720" w:left="0" w:right="0"/>
+        <w:jc w:val="both"/>
+      </w:pPr>
       <w:r>
+        <w:rPr>
+          <w:rFonts w:ascii="Times New Roman" w:hAnsi="Times New Roman" w:eastAsia="Times New Roman" w:cs="Times New Roman"/>
+          <w:b w:val="0"/>
+          <w:i w:val="0"/>
+          <w:color w:val="000000"/>
+          <w:sz w:val="28"/>
+          <w:u w:val="none"/>
+        </w:rPr>
         <w:t>Увеличение арифметического окна с 3×3 до 5×5 сильнее сглаживает фон, но не обязательно улучшает результат целиком: MSE на А возрастает с 111.66 до 147.53 из-за размытия краёв. На Б тонкие штрихи имеют ширину, сопоставимую с окном, поэтому усреднение смешивает их с фоном. Ошибка всех трёх усредняющих методов на этом наборе оказывается выше, чем у входа с шумом.</w:t>
       </w:r>
     </w:p>
     <w:p>
+      <w:pPr>
+        <w:keepNext w:val="0"/>
+        <w:keepLines w:val="0"/>
+        <w:pageBreakBefore w:val="0"/>
+        <w:spacing w:before="0" w:after="0" w:line="360" w:lineRule="auto"/>
+        <w:ind w:firstLine="720" w:left="0" w:right="0"/>
+        <w:jc w:val="both"/>
+      </w:pPr>
       <w:r>
+        <w:rPr>
+          <w:rFonts w:ascii="Times New Roman" w:hAnsi="Times New Roman" w:eastAsia="Times New Roman" w:cs="Times New Roman"/>
+          <w:b w:val="0"/>
+          <w:i w:val="0"/>
+          <w:color w:val="000000"/>
+          <w:sz w:val="28"/>
+          <w:u w:val="none"/>
+        </w:rPr>
         <w:t>Такой результат согласуется с (6), (7): усредняется не только шум, но и полезное изменение яркости. Шум на однородных участках ослабляется, однако общий PSNR может ухудшиться из-за утраты мелких объектов. Следовательно, размер окна следует выбирать с учётом масштаба деталей, а не только видимой гладкости изображения.</w:t>
       </w:r>
     </w:p>
     <w:p>
+      <w:pPr>
+        <w:keepNext w:val="0"/>
+        <w:keepLines w:val="0"/>
+        <w:pageBreakBefore w:val="0"/>
+        <w:spacing w:before="0" w:after="0" w:line="20" w:lineRule="exact"/>
+        <w:ind w:firstLine="720" w:left="0" w:right="0"/>
+        <w:jc w:val="both"/>
+      </w:pPr>
       <w:r>
-        <w:br w:type="page"/>
+        <w:rPr>
+          <w:rFonts w:ascii="Times New Roman" w:hAnsi="Times New Roman" w:eastAsia="Times New Roman" w:cs="Times New Roman"/>
+          <w:b w:val="0"/>
+          <w:i w:val="0"/>
+          <w:color w:val="000000"/>
+          <w:sz w:val="2"/>
+          <w:u w:val="none"/>
+        </w:rPr>
       </w:r>
     </w:p>
     <w:p>
       <w:pPr>
         <w:pStyle w:val="Heading1"/>
+        <w:keepNext/>
+        <w:keepLines/>
+        <w:pageBreakBefore w:val="0"/>
+        <w:spacing w:before="0" w:after="0" w:line="360" w:lineRule="auto"/>
+        <w:ind w:left="0" w:right="0" w:firstLine="0"/>
+        <w:jc w:val="center"/>
       </w:pPr>
       <w:r>
+        <w:rPr>
+          <w:rFonts w:ascii="Times New Roman" w:hAnsi="Times New Roman" w:eastAsia="Times New Roman" w:cs="Times New Roman"/>
+          <w:b/>
+          <w:i w:val="0"/>
+          <w:color w:val="000000"/>
+          <w:sz w:val="28"/>
+          <w:u w:val="none"/>
+        </w:rPr>
         <w:t>7. Вариант 3: порядковые фильтры</w:t>
       </w:r>
     </w:p>
     <w:p>
+      <w:pPr>
+        <w:keepNext/>
+        <w:keepLines/>
+        <w:pageBreakBefore w:val="0"/>
+        <w:spacing w:before="0" w:after="0" w:line="360" w:lineRule="auto"/>
+        <w:ind w:left="0" w:right="0" w:firstLine="0"/>
+        <w:jc w:val="center"/>
+      </w:pPr>
       <w:r>
+        <w:rPr>
+          <w:rFonts w:ascii="Times New Roman" w:hAnsi="Times New Roman" w:eastAsia="Times New Roman" w:cs="Times New Roman"/>
+          <w:b w:val="0"/>
+          <w:i w:val="0"/>
+          <w:color w:val="000000"/>
+          <w:sz w:val="28"/>
+          <w:u w:val="none"/>
+        </w:rPr>
         <w:drawing>
           <wp:inline xmlns:a="http://schemas.openxmlformats.org/drawingml/2006/main" xmlns:pic="http://schemas.openxmlformats.org/drawingml/2006/picture">
-            <wp:extent cx="6120000" cy="2520000"/>
+            <wp:extent cx="5940425" cy="2446057"/>
             <wp:docPr id="5" name="Picture 5"/>
             <wp:cNvGraphicFramePr>
               <a:graphicFrameLocks noChangeAspect="1"/>
@@ -1329,7 +2874,7 @@
                   <pic:spPr>
                     <a:xfrm>
                       <a:off x="0" y="0"/>
-                      <a:ext cx="6120000" cy="2520000"/>
+                      <a:ext cx="5940425" cy="2446057"/>
                     </a:xfrm>
                     <a:prstGeom prst="rect"/>
                   </pic:spPr>
@@ -1342,12 +2887,21 @@
     </w:p>
     <w:p>
       <w:pPr>
-        <w:ind w:firstLine="0"/>
+        <w:keepNext w:val="0"/>
+        <w:keepLines/>
+        <w:pageBreakBefore w:val="0"/>
+        <w:spacing w:before="0" w:after="0" w:line="360" w:lineRule="auto"/>
+        <w:ind w:left="0" w:right="0" w:firstLine="720"/>
         <w:jc w:val="center"/>
       </w:pPr>
       <w:r>
         <w:rPr>
-          <w:sz w:val="20"/>
+          <w:rFonts w:ascii="Times New Roman" w:hAnsi="Times New Roman" w:eastAsia="Times New Roman" w:cs="Times New Roman"/>
+          <w:b w:val="0"/>
+          <w:i w:val="0"/>
+          <w:color w:val="000000"/>
+          <w:sz w:val="28"/>
+          <w:u w:val="none"/>
         </w:rPr>
         <w:t>Рисунок 5. Сверху набор А, снизу набор Б. Медиана 3×3; медиана 5×5; минимум 3×3; максимум 3×3.</w:t>
       </w:r>
@@ -1355,443 +2909,763 @@
     <w:tbl>
       <w:tblPr>
         <w:tblStyle w:val="TableGrid"/>
-        <w:tblW w:type="auto" w:w="0"/>
+        <w:tblW w:type="dxa" w:w="9355"/>
+        <w:tblLayout w:type="fixed"/>
         <w:tblLook w:firstColumn="1" w:firstRow="1" w:lastColumn="0" w:lastRow="0" w:noHBand="0" w:noVBand="1" w:val="04A0"/>
       </w:tblPr>
       <w:tblGrid>
-        <w:gridCol w:w="1994"/>
-        <w:gridCol w:w="1994"/>
-        <w:gridCol w:w="1994"/>
-        <w:gridCol w:w="1994"/>
-        <w:gridCol w:w="1994"/>
+        <w:gridCol w:w="1871"/>
+        <w:gridCol w:w="1871"/>
+        <w:gridCol w:w="1871"/>
+        <w:gridCol w:w="1871"/>
+        <w:gridCol w:w="1871"/>
       </w:tblGrid>
       <w:tr>
+        <w:trPr>
+          <w:cantSplit/>
+          <w:tblHeader/>
+        </w:trPr>
         <w:tc>
           <w:tcPr>
-            <w:tcW w:type="dxa" w:w="1994"/>
+            <w:tcW w:type="dxa" w:w="1871"/>
           </w:tcPr>
           <w:p>
             <w:pPr>
+              <w:keepNext/>
+              <w:spacing w:before="0" w:after="0" w:line="360" w:lineRule="auto"/>
               <w:ind w:firstLine="0"/>
               <w:jc w:val="left"/>
             </w:pPr>
             <w:r>
+              <w:rPr>
+                <w:rFonts w:ascii="Times New Roman" w:hAnsi="Times New Roman" w:eastAsia="Times New Roman" w:cs="Times New Roman"/>
+                <w:b w:val="0"/>
+                <w:i w:val="0"/>
+                <w:color w:val="000000"/>
+                <w:sz w:val="28"/>
+                <w:u w:val="none"/>
+              </w:rPr>
               <w:t>Метод</w:t>
             </w:r>
           </w:p>
         </w:tc>
         <w:tc>
           <w:tcPr>
-            <w:tcW w:type="dxa" w:w="1994"/>
+            <w:tcW w:type="dxa" w:w="1871"/>
           </w:tcPr>
           <w:p>
             <w:pPr>
+              <w:keepNext/>
+              <w:spacing w:before="0" w:after="0" w:line="360" w:lineRule="auto"/>
               <w:ind w:firstLine="0"/>
               <w:jc w:val="left"/>
             </w:pPr>
             <w:r>
+              <w:rPr>
+                <w:rFonts w:ascii="Times New Roman" w:hAnsi="Times New Roman" w:eastAsia="Times New Roman" w:cs="Times New Roman"/>
+                <w:b w:val="0"/>
+                <w:i w:val="0"/>
+                <w:color w:val="000000"/>
+                <w:sz w:val="28"/>
+                <w:u w:val="none"/>
+              </w:rPr>
               <w:t>А: MSE</w:t>
             </w:r>
           </w:p>
         </w:tc>
         <w:tc>
           <w:tcPr>
-            <w:tcW w:type="dxa" w:w="1994"/>
+            <w:tcW w:type="dxa" w:w="1871"/>
           </w:tcPr>
           <w:p>
             <w:pPr>
+              <w:keepNext/>
+              <w:spacing w:before="0" w:after="0" w:line="360" w:lineRule="auto"/>
               <w:ind w:firstLine="0"/>
               <w:jc w:val="left"/>
             </w:pPr>
             <w:r>
+              <w:rPr>
+                <w:rFonts w:ascii="Times New Roman" w:hAnsi="Times New Roman" w:eastAsia="Times New Roman" w:cs="Times New Roman"/>
+                <w:b w:val="0"/>
+                <w:i w:val="0"/>
+                <w:color w:val="000000"/>
+                <w:sz w:val="28"/>
+                <w:u w:val="none"/>
+              </w:rPr>
               <w:t>А: PSNR, дБ</w:t>
             </w:r>
           </w:p>
         </w:tc>
         <w:tc>
           <w:tcPr>
-            <w:tcW w:type="dxa" w:w="1994"/>
+            <w:tcW w:type="dxa" w:w="1871"/>
           </w:tcPr>
           <w:p>
             <w:pPr>
+              <w:keepNext/>
+              <w:spacing w:before="0" w:after="0" w:line="360" w:lineRule="auto"/>
               <w:ind w:firstLine="0"/>
               <w:jc w:val="left"/>
             </w:pPr>
             <w:r>
+              <w:rPr>
+                <w:rFonts w:ascii="Times New Roman" w:hAnsi="Times New Roman" w:eastAsia="Times New Roman" w:cs="Times New Roman"/>
+                <w:b w:val="0"/>
+                <w:i w:val="0"/>
+                <w:color w:val="000000"/>
+                <w:sz w:val="28"/>
+                <w:u w:val="none"/>
+              </w:rPr>
               <w:t>Б: MSE</w:t>
             </w:r>
           </w:p>
         </w:tc>
         <w:tc>
           <w:tcPr>
-            <w:tcW w:type="dxa" w:w="1994"/>
+            <w:tcW w:type="dxa" w:w="1871"/>
           </w:tcPr>
           <w:p>
             <w:pPr>
+              <w:keepNext/>
+              <w:spacing w:before="0" w:after="0" w:line="360" w:lineRule="auto"/>
               <w:ind w:firstLine="0"/>
               <w:jc w:val="left"/>
             </w:pPr>
             <w:r>
+              <w:rPr>
+                <w:rFonts w:ascii="Times New Roman" w:hAnsi="Times New Roman" w:eastAsia="Times New Roman" w:cs="Times New Roman"/>
+                <w:b w:val="0"/>
+                <w:i w:val="0"/>
+                <w:color w:val="000000"/>
+                <w:sz w:val="28"/>
+                <w:u w:val="none"/>
+              </w:rPr>
               <w:t>Б: PSNR, дБ</w:t>
             </w:r>
           </w:p>
         </w:tc>
       </w:tr>
       <w:tr>
+        <w:trPr>
+          <w:cantSplit/>
+        </w:trPr>
         <w:tc>
           <w:tcPr>
-            <w:tcW w:type="dxa" w:w="1994"/>
+            <w:tcW w:type="dxa" w:w="1871"/>
           </w:tcPr>
           <w:p>
             <w:pPr>
+              <w:keepNext w:val="0"/>
+              <w:spacing w:before="0" w:after="0" w:line="360" w:lineRule="auto"/>
               <w:ind w:firstLine="0"/>
               <w:jc w:val="left"/>
             </w:pPr>
             <w:r>
+              <w:rPr>
+                <w:rFonts w:ascii="Times New Roman" w:hAnsi="Times New Roman" w:eastAsia="Times New Roman" w:cs="Times New Roman"/>
+                <w:b w:val="0"/>
+                <w:i w:val="0"/>
+                <w:color w:val="000000"/>
+                <w:sz w:val="28"/>
+                <w:u w:val="none"/>
+              </w:rPr>
               <w:t>Вход с шумом</w:t>
             </w:r>
           </w:p>
         </w:tc>
         <w:tc>
           <w:tcPr>
-            <w:tcW w:type="dxa" w:w="1994"/>
+            <w:tcW w:type="dxa" w:w="1871"/>
           </w:tcPr>
           <w:p>
             <w:pPr>
+              <w:keepNext w:val="0"/>
+              <w:spacing w:before="0" w:after="0" w:line="360" w:lineRule="auto"/>
               <w:ind w:firstLine="0"/>
               <w:jc w:val="left"/>
             </w:pPr>
             <w:r>
+              <w:rPr>
+                <w:rFonts w:ascii="Times New Roman" w:hAnsi="Times New Roman" w:eastAsia="Times New Roman" w:cs="Times New Roman"/>
+                <w:b w:val="0"/>
+                <w:i w:val="0"/>
+                <w:color w:val="000000"/>
+                <w:sz w:val="28"/>
+                <w:u w:val="none"/>
+              </w:rPr>
               <w:t>321.50</w:t>
             </w:r>
           </w:p>
         </w:tc>
         <w:tc>
           <w:tcPr>
-            <w:tcW w:type="dxa" w:w="1994"/>
+            <w:tcW w:type="dxa" w:w="1871"/>
           </w:tcPr>
           <w:p>
             <w:pPr>
+              <w:keepNext w:val="0"/>
+              <w:spacing w:before="0" w:after="0" w:line="360" w:lineRule="auto"/>
               <w:ind w:firstLine="0"/>
               <w:jc w:val="left"/>
             </w:pPr>
             <w:r>
+              <w:rPr>
+                <w:rFonts w:ascii="Times New Roman" w:hAnsi="Times New Roman" w:eastAsia="Times New Roman" w:cs="Times New Roman"/>
+                <w:b w:val="0"/>
+                <w:i w:val="0"/>
+                <w:color w:val="000000"/>
+                <w:sz w:val="28"/>
+                <w:u w:val="none"/>
+              </w:rPr>
               <w:t>23.06</w:t>
             </w:r>
           </w:p>
         </w:tc>
         <w:tc>
           <w:tcPr>
-            <w:tcW w:type="dxa" w:w="1994"/>
+            <w:tcW w:type="dxa" w:w="1871"/>
           </w:tcPr>
           <w:p>
             <w:pPr>
+              <w:keepNext w:val="0"/>
+              <w:spacing w:before="0" w:after="0" w:line="360" w:lineRule="auto"/>
               <w:ind w:firstLine="0"/>
               <w:jc w:val="left"/>
             </w:pPr>
             <w:r>
+              <w:rPr>
+                <w:rFonts w:ascii="Times New Roman" w:hAnsi="Times New Roman" w:eastAsia="Times New Roman" w:cs="Times New Roman"/>
+                <w:b w:val="0"/>
+                <w:i w:val="0"/>
+                <w:color w:val="000000"/>
+                <w:sz w:val="28"/>
+                <w:u w:val="none"/>
+              </w:rPr>
               <w:t>321.63</w:t>
             </w:r>
           </w:p>
         </w:tc>
         <w:tc>
           <w:tcPr>
-            <w:tcW w:type="dxa" w:w="1994"/>
+            <w:tcW w:type="dxa" w:w="1871"/>
           </w:tcPr>
           <w:p>
             <w:pPr>
+              <w:keepNext w:val="0"/>
+              <w:spacing w:before="0" w:after="0" w:line="360" w:lineRule="auto"/>
               <w:ind w:firstLine="0"/>
               <w:jc w:val="left"/>
             </w:pPr>
             <w:r>
+              <w:rPr>
+                <w:rFonts w:ascii="Times New Roman" w:hAnsi="Times New Roman" w:eastAsia="Times New Roman" w:cs="Times New Roman"/>
+                <w:b w:val="0"/>
+                <w:i w:val="0"/>
+                <w:color w:val="000000"/>
+                <w:sz w:val="28"/>
+                <w:u w:val="none"/>
+              </w:rPr>
               <w:t>23.06</w:t>
             </w:r>
           </w:p>
         </w:tc>
       </w:tr>
       <w:tr>
+        <w:trPr>
+          <w:cantSplit/>
+        </w:trPr>
         <w:tc>
           <w:tcPr>
-            <w:tcW w:type="dxa" w:w="1994"/>
+            <w:tcW w:type="dxa" w:w="1871"/>
           </w:tcPr>
           <w:p>
             <w:pPr>
+              <w:keepNext w:val="0"/>
+              <w:spacing w:before="0" w:after="0" w:line="360" w:lineRule="auto"/>
               <w:ind w:firstLine="0"/>
               <w:jc w:val="left"/>
             </w:pPr>
             <w:r>
+              <w:rPr>
+                <w:rFonts w:ascii="Times New Roman" w:hAnsi="Times New Roman" w:eastAsia="Times New Roman" w:cs="Times New Roman"/>
+                <w:b w:val="0"/>
+                <w:i w:val="0"/>
+                <w:color w:val="000000"/>
+                <w:sz w:val="28"/>
+                <w:u w:val="none"/>
+              </w:rPr>
               <w:t>Медиана 3×3</w:t>
             </w:r>
           </w:p>
         </w:tc>
         <w:tc>
           <w:tcPr>
-            <w:tcW w:type="dxa" w:w="1994"/>
+            <w:tcW w:type="dxa" w:w="1871"/>
           </w:tcPr>
           <w:p>
             <w:pPr>
+              <w:keepNext w:val="0"/>
+              <w:spacing w:before="0" w:after="0" w:line="360" w:lineRule="auto"/>
               <w:ind w:firstLine="0"/>
               <w:jc w:val="left"/>
             </w:pPr>
             <w:r>
+              <w:rPr>
+                <w:rFonts w:ascii="Times New Roman" w:hAnsi="Times New Roman" w:eastAsia="Times New Roman" w:cs="Times New Roman"/>
+                <w:b w:val="0"/>
+                <w:i w:val="0"/>
+                <w:color w:val="000000"/>
+                <w:sz w:val="28"/>
+                <w:u w:val="none"/>
+              </w:rPr>
               <w:t>65.27</w:t>
             </w:r>
           </w:p>
         </w:tc>
         <w:tc>
           <w:tcPr>
-            <w:tcW w:type="dxa" w:w="1994"/>
+            <w:tcW w:type="dxa" w:w="1871"/>
           </w:tcPr>
           <w:p>
             <w:pPr>
+              <w:keepNext w:val="0"/>
+              <w:spacing w:before="0" w:after="0" w:line="360" w:lineRule="auto"/>
               <w:ind w:firstLine="0"/>
               <w:jc w:val="left"/>
             </w:pPr>
             <w:r>
+              <w:rPr>
+                <w:rFonts w:ascii="Times New Roman" w:hAnsi="Times New Roman" w:eastAsia="Times New Roman" w:cs="Times New Roman"/>
+                <w:b w:val="0"/>
+                <w:i w:val="0"/>
+                <w:color w:val="000000"/>
+                <w:sz w:val="28"/>
+                <w:u w:val="none"/>
+              </w:rPr>
               <w:t>29.98</w:t>
             </w:r>
           </w:p>
         </w:tc>
         <w:tc>
           <w:tcPr>
-            <w:tcW w:type="dxa" w:w="1994"/>
+            <w:tcW w:type="dxa" w:w="1871"/>
           </w:tcPr>
           <w:p>
             <w:pPr>
+              <w:keepNext w:val="0"/>
+              <w:spacing w:before="0" w:after="0" w:line="360" w:lineRule="auto"/>
               <w:ind w:firstLine="0"/>
               <w:jc w:val="left"/>
             </w:pPr>
             <w:r>
+              <w:rPr>
+                <w:rFonts w:ascii="Times New Roman" w:hAnsi="Times New Roman" w:eastAsia="Times New Roman" w:cs="Times New Roman"/>
+                <w:b w:val="0"/>
+                <w:i w:val="0"/>
+                <w:color w:val="000000"/>
+                <w:sz w:val="28"/>
+                <w:u w:val="none"/>
+              </w:rPr>
               <w:t>124.90</w:t>
             </w:r>
           </w:p>
         </w:tc>
         <w:tc>
           <w:tcPr>
-            <w:tcW w:type="dxa" w:w="1994"/>
+            <w:tcW w:type="dxa" w:w="1871"/>
           </w:tcPr>
           <w:p>
             <w:pPr>
+              <w:keepNext w:val="0"/>
+              <w:spacing w:before="0" w:after="0" w:line="360" w:lineRule="auto"/>
               <w:ind w:firstLine="0"/>
               <w:jc w:val="left"/>
             </w:pPr>
             <w:r>
+              <w:rPr>
+                <w:rFonts w:ascii="Times New Roman" w:hAnsi="Times New Roman" w:eastAsia="Times New Roman" w:cs="Times New Roman"/>
+                <w:b w:val="0"/>
+                <w:i w:val="0"/>
+                <w:color w:val="000000"/>
+                <w:sz w:val="28"/>
+                <w:u w:val="none"/>
+              </w:rPr>
               <w:t>27.17</w:t>
             </w:r>
           </w:p>
         </w:tc>
       </w:tr>
       <w:tr>
+        <w:trPr>
+          <w:cantSplit/>
+        </w:trPr>
         <w:tc>
           <w:tcPr>
-            <w:tcW w:type="dxa" w:w="1994"/>
+            <w:tcW w:type="dxa" w:w="1871"/>
           </w:tcPr>
           <w:p>
             <w:pPr>
+              <w:keepNext w:val="0"/>
+              <w:spacing w:before="0" w:after="0" w:line="360" w:lineRule="auto"/>
               <w:ind w:firstLine="0"/>
               <w:jc w:val="left"/>
             </w:pPr>
             <w:r>
+              <w:rPr>
+                <w:rFonts w:ascii="Times New Roman" w:hAnsi="Times New Roman" w:eastAsia="Times New Roman" w:cs="Times New Roman"/>
+                <w:b w:val="0"/>
+                <w:i w:val="0"/>
+                <w:color w:val="000000"/>
+                <w:sz w:val="28"/>
+                <w:u w:val="none"/>
+              </w:rPr>
               <w:t>Медиана 5×5</w:t>
             </w:r>
           </w:p>
         </w:tc>
         <w:tc>
           <w:tcPr>
-            <w:tcW w:type="dxa" w:w="1994"/>
+            <w:tcW w:type="dxa" w:w="1871"/>
           </w:tcPr>
           <w:p>
             <w:pPr>
+              <w:keepNext w:val="0"/>
+              <w:spacing w:before="0" w:after="0" w:line="360" w:lineRule="auto"/>
               <w:ind w:firstLine="0"/>
               <w:jc w:val="left"/>
             </w:pPr>
             <w:r>
+              <w:rPr>
+                <w:rFonts w:ascii="Times New Roman" w:hAnsi="Times New Roman" w:eastAsia="Times New Roman" w:cs="Times New Roman"/>
+                <w:b w:val="0"/>
+                <w:i w:val="0"/>
+                <w:color w:val="000000"/>
+                <w:sz w:val="28"/>
+                <w:u w:val="none"/>
+              </w:rPr>
               <w:t>44.62</w:t>
             </w:r>
           </w:p>
         </w:tc>
         <w:tc>
           <w:tcPr>
-            <w:tcW w:type="dxa" w:w="1994"/>
+            <w:tcW w:type="dxa" w:w="1871"/>
           </w:tcPr>
           <w:p>
             <w:pPr>
+              <w:keepNext w:val="0"/>
+              <w:spacing w:before="0" w:after="0" w:line="360" w:lineRule="auto"/>
               <w:ind w:firstLine="0"/>
               <w:jc w:val="left"/>
             </w:pPr>
             <w:r>
+              <w:rPr>
+                <w:rFonts w:ascii="Times New Roman" w:hAnsi="Times New Roman" w:eastAsia="Times New Roman" w:cs="Times New Roman"/>
+                <w:b w:val="0"/>
+                <w:i w:val="0"/>
+                <w:color w:val="000000"/>
+                <w:sz w:val="28"/>
+                <w:u w:val="none"/>
+              </w:rPr>
               <w:t>31.64</w:t>
             </w:r>
           </w:p>
         </w:tc>
         <w:tc>
           <w:tcPr>
-            <w:tcW w:type="dxa" w:w="1994"/>
+            <w:tcW w:type="dxa" w:w="1871"/>
           </w:tcPr>
           <w:p>
             <w:pPr>
+              <w:keepNext w:val="0"/>
+              <w:spacing w:before="0" w:after="0" w:line="360" w:lineRule="auto"/>
               <w:ind w:firstLine="0"/>
               <w:jc w:val="left"/>
             </w:pPr>
             <w:r>
+              <w:rPr>
+                <w:rFonts w:ascii="Times New Roman" w:hAnsi="Times New Roman" w:eastAsia="Times New Roman" w:cs="Times New Roman"/>
+                <w:b w:val="0"/>
+                <w:i w:val="0"/>
+                <w:color w:val="000000"/>
+                <w:sz w:val="28"/>
+                <w:u w:val="none"/>
+              </w:rPr>
               <w:t>830.54</w:t>
             </w:r>
           </w:p>
         </w:tc>
         <w:tc>
           <w:tcPr>
-            <w:tcW w:type="dxa" w:w="1994"/>
+            <w:tcW w:type="dxa" w:w="1871"/>
           </w:tcPr>
           <w:p>
             <w:pPr>
+              <w:keepNext w:val="0"/>
+              <w:spacing w:before="0" w:after="0" w:line="360" w:lineRule="auto"/>
               <w:ind w:firstLine="0"/>
               <w:jc w:val="left"/>
             </w:pPr>
             <w:r>
+              <w:rPr>
+                <w:rFonts w:ascii="Times New Roman" w:hAnsi="Times New Roman" w:eastAsia="Times New Roman" w:cs="Times New Roman"/>
+                <w:b w:val="0"/>
+                <w:i w:val="0"/>
+                <w:color w:val="000000"/>
+                <w:sz w:val="28"/>
+                <w:u w:val="none"/>
+              </w:rPr>
               <w:t>18.94</w:t>
             </w:r>
           </w:p>
         </w:tc>
       </w:tr>
       <w:tr>
+        <w:trPr>
+          <w:cantSplit/>
+        </w:trPr>
         <w:tc>
           <w:tcPr>
-            <w:tcW w:type="dxa" w:w="1994"/>
+            <w:tcW w:type="dxa" w:w="1871"/>
           </w:tcPr>
           <w:p>
             <w:pPr>
+              <w:keepNext w:val="0"/>
+              <w:spacing w:before="0" w:after="0" w:line="360" w:lineRule="auto"/>
               <w:ind w:firstLine="0"/>
               <w:jc w:val="left"/>
             </w:pPr>
             <w:r>
+              <w:rPr>
+                <w:rFonts w:ascii="Times New Roman" w:hAnsi="Times New Roman" w:eastAsia="Times New Roman" w:cs="Times New Roman"/>
+                <w:b w:val="0"/>
+                <w:i w:val="0"/>
+                <w:color w:val="000000"/>
+                <w:sz w:val="28"/>
+                <w:u w:val="none"/>
+              </w:rPr>
               <w:t>Минимум 3×3</w:t>
             </w:r>
           </w:p>
         </w:tc>
         <w:tc>
           <w:tcPr>
-            <w:tcW w:type="dxa" w:w="1994"/>
+            <w:tcW w:type="dxa" w:w="1871"/>
           </w:tcPr>
           <w:p>
             <w:pPr>
+              <w:keepNext w:val="0"/>
+              <w:spacing w:before="0" w:after="0" w:line="360" w:lineRule="auto"/>
               <w:ind w:firstLine="0"/>
               <w:jc w:val="left"/>
             </w:pPr>
             <w:r>
+              <w:rPr>
+                <w:rFonts w:ascii="Times New Roman" w:hAnsi="Times New Roman" w:eastAsia="Times New Roman" w:cs="Times New Roman"/>
+                <w:b w:val="0"/>
+                <w:i w:val="0"/>
+                <w:color w:val="000000"/>
+                <w:sz w:val="28"/>
+                <w:u w:val="none"/>
+              </w:rPr>
               <w:t>1306.65</w:t>
             </w:r>
           </w:p>
         </w:tc>
         <w:tc>
           <w:tcPr>
-            <w:tcW w:type="dxa" w:w="1994"/>
+            <w:tcW w:type="dxa" w:w="1871"/>
           </w:tcPr>
           <w:p>
             <w:pPr>
+              <w:keepNext w:val="0"/>
+              <w:spacing w:before="0" w:after="0" w:line="360" w:lineRule="auto"/>
               <w:ind w:firstLine="0"/>
               <w:jc w:val="left"/>
             </w:pPr>
             <w:r>
+              <w:rPr>
+                <w:rFonts w:ascii="Times New Roman" w:hAnsi="Times New Roman" w:eastAsia="Times New Roman" w:cs="Times New Roman"/>
+                <w:b w:val="0"/>
+                <w:i w:val="0"/>
+                <w:color w:val="000000"/>
+                <w:sz w:val="28"/>
+                <w:u w:val="none"/>
+              </w:rPr>
               <w:t>16.97</w:t>
             </w:r>
           </w:p>
         </w:tc>
         <w:tc>
           <w:tcPr>
-            <w:tcW w:type="dxa" w:w="1994"/>
+            <w:tcW w:type="dxa" w:w="1871"/>
           </w:tcPr>
           <w:p>
             <w:pPr>
+              <w:keepNext w:val="0"/>
+              <w:spacing w:before="0" w:after="0" w:line="360" w:lineRule="auto"/>
               <w:ind w:firstLine="0"/>
               <w:jc w:val="left"/>
             </w:pPr>
             <w:r>
+              <w:rPr>
+                <w:rFonts w:ascii="Times New Roman" w:hAnsi="Times New Roman" w:eastAsia="Times New Roman" w:cs="Times New Roman"/>
+                <w:b w:val="0"/>
+                <w:i w:val="0"/>
+                <w:color w:val="000000"/>
+                <w:sz w:val="28"/>
+                <w:u w:val="none"/>
+              </w:rPr>
               <w:t>2975.02</w:t>
             </w:r>
           </w:p>
         </w:tc>
         <w:tc>
           <w:tcPr>
-            <w:tcW w:type="dxa" w:w="1994"/>
+            <w:tcW w:type="dxa" w:w="1871"/>
           </w:tcPr>
           <w:p>
             <w:pPr>
+              <w:keepNext w:val="0"/>
+              <w:spacing w:before="0" w:after="0" w:line="360" w:lineRule="auto"/>
               <w:ind w:firstLine="0"/>
               <w:jc w:val="left"/>
             </w:pPr>
             <w:r>
+              <w:rPr>
+                <w:rFonts w:ascii="Times New Roman" w:hAnsi="Times New Roman" w:eastAsia="Times New Roman" w:cs="Times New Roman"/>
+                <w:b w:val="0"/>
+                <w:i w:val="0"/>
+                <w:color w:val="000000"/>
+                <w:sz w:val="28"/>
+                <w:u w:val="none"/>
+              </w:rPr>
               <w:t>13.40</w:t>
             </w:r>
           </w:p>
         </w:tc>
       </w:tr>
       <w:tr>
+        <w:trPr>
+          <w:cantSplit/>
+        </w:trPr>
         <w:tc>
           <w:tcPr>
-            <w:tcW w:type="dxa" w:w="1994"/>
+            <w:tcW w:type="dxa" w:w="1871"/>
           </w:tcPr>
           <w:p>
             <w:pPr>
+              <w:keepNext w:val="0"/>
+              <w:spacing w:before="0" w:after="0" w:line="360" w:lineRule="auto"/>
               <w:ind w:firstLine="0"/>
               <w:jc w:val="left"/>
             </w:pPr>
             <w:r>
+              <w:rPr>
+                <w:rFonts w:ascii="Times New Roman" w:hAnsi="Times New Roman" w:eastAsia="Times New Roman" w:cs="Times New Roman"/>
+                <w:b w:val="0"/>
+                <w:i w:val="0"/>
+                <w:color w:val="000000"/>
+                <w:sz w:val="28"/>
+                <w:u w:val="none"/>
+              </w:rPr>
               <w:t>Максимум 3×3</w:t>
             </w:r>
           </w:p>
         </w:tc>
         <w:tc>
           <w:tcPr>
-            <w:tcW w:type="dxa" w:w="1994"/>
+            <w:tcW w:type="dxa" w:w="1871"/>
           </w:tcPr>
           <w:p>
             <w:pPr>
+              <w:keepNext w:val="0"/>
+              <w:spacing w:before="0" w:after="0" w:line="360" w:lineRule="auto"/>
               <w:ind w:firstLine="0"/>
               <w:jc w:val="left"/>
             </w:pPr>
             <w:r>
+              <w:rPr>
+                <w:rFonts w:ascii="Times New Roman" w:hAnsi="Times New Roman" w:eastAsia="Times New Roman" w:cs="Times New Roman"/>
+                <w:b w:val="0"/>
+                <w:i w:val="0"/>
+                <w:color w:val="000000"/>
+                <w:sz w:val="28"/>
+                <w:u w:val="none"/>
+              </w:rPr>
               <w:t>1230.13</w:t>
             </w:r>
           </w:p>
         </w:tc>
         <w:tc>
           <w:tcPr>
-            <w:tcW w:type="dxa" w:w="1994"/>
+            <w:tcW w:type="dxa" w:w="1871"/>
           </w:tcPr>
           <w:p>
             <w:pPr>
+              <w:keepNext w:val="0"/>
+              <w:spacing w:before="0" w:after="0" w:line="360" w:lineRule="auto"/>
               <w:ind w:firstLine="0"/>
               <w:jc w:val="left"/>
             </w:pPr>
             <w:r>
+              <w:rPr>
+                <w:rFonts w:ascii="Times New Roman" w:hAnsi="Times New Roman" w:eastAsia="Times New Roman" w:cs="Times New Roman"/>
+                <w:b w:val="0"/>
+                <w:i w:val="0"/>
+                <w:color w:val="000000"/>
+                <w:sz w:val="28"/>
+                <w:u w:val="none"/>
+              </w:rPr>
               <w:t>17.23</w:t>
             </w:r>
           </w:p>
         </w:tc>
         <w:tc>
           <w:tcPr>
-            <w:tcW w:type="dxa" w:w="1994"/>
+            <w:tcW w:type="dxa" w:w="1871"/>
           </w:tcPr>
           <w:p>
             <w:pPr>
+              <w:keepNext w:val="0"/>
+              <w:spacing w:before="0" w:after="0" w:line="360" w:lineRule="auto"/>
               <w:ind w:firstLine="0"/>
               <w:jc w:val="left"/>
             </w:pPr>
             <w:r>
+              <w:rPr>
+                <w:rFonts w:ascii="Times New Roman" w:hAnsi="Times New Roman" w:eastAsia="Times New Roman" w:cs="Times New Roman"/>
+                <w:b w:val="0"/>
+                <w:i w:val="0"/>
+                <w:color w:val="000000"/>
+                <w:sz w:val="28"/>
+                <w:u w:val="none"/>
+              </w:rPr>
               <w:t>2866.88</w:t>
             </w:r>
           </w:p>
         </w:tc>
         <w:tc>
           <w:tcPr>
-            <w:tcW w:type="dxa" w:w="1994"/>
+            <w:tcW w:type="dxa" w:w="1871"/>
           </w:tcPr>
           <w:p>
             <w:pPr>
+              <w:keepNext w:val="0"/>
+              <w:spacing w:before="0" w:after="0" w:line="360" w:lineRule="auto"/>
               <w:ind w:firstLine="0"/>
               <w:jc w:val="left"/>
             </w:pPr>
             <w:r>
+              <w:rPr>
+                <w:rFonts w:ascii="Times New Roman" w:hAnsi="Times New Roman" w:eastAsia="Times New Roman" w:cs="Times New Roman"/>
+                <w:b w:val="0"/>
+                <w:i w:val="0"/>
+                <w:color w:val="000000"/>
+                <w:sz w:val="28"/>
+                <w:u w:val="none"/>
+              </w:rPr>
               <w:t>13.56</w:t>
             </w:r>
           </w:p>
@@ -1799,117 +3673,403 @@
       </w:tr>
     </w:tbl>
     <w:p>
+      <w:pPr>
+        <w:keepNext w:val="0"/>
+        <w:keepLines w:val="0"/>
+        <w:pageBreakBefore w:val="0"/>
+        <w:spacing w:before="0" w:after="0" w:line="360" w:lineRule="auto"/>
+        <w:ind w:firstLine="720" w:left="0" w:right="0"/>
+        <w:jc w:val="both"/>
+      </w:pPr>
       <w:r>
+        <w:rPr>
+          <w:rFonts w:ascii="Times New Roman" w:hAnsi="Times New Roman" w:eastAsia="Times New Roman" w:cs="Times New Roman"/>
+          <w:b w:val="0"/>
+          <w:i w:val="0"/>
+          <w:color w:val="000000"/>
+          <w:sz w:val="28"/>
+          <w:u w:val="none"/>
+        </w:rPr>
         <w:t>На наборе А медиана 5×5 даёт наименьшую ошибку среди проверенных методов: MSE=44.62. Большинство элементов окна на широком однородном участке относятся к одному уровню яркости; медиана подавляет колебания без арифметического смешивания яркостей всех элементов. Однако около углов и малых фигур граница изменяется.</w:t>
       </w:r>
     </w:p>
     <w:p>
+      <w:pPr>
+        <w:keepNext w:val="0"/>
+        <w:keepLines w:val="0"/>
+        <w:pageBreakBefore w:val="0"/>
+        <w:spacing w:before="0" w:after="0" w:line="360" w:lineRule="auto"/>
+        <w:ind w:firstLine="720" w:left="0" w:right="0"/>
+        <w:jc w:val="both"/>
+      </w:pPr>
       <w:r>
+        <w:rPr>
+          <w:rFonts w:ascii="Times New Roman" w:hAnsi="Times New Roman" w:eastAsia="Times New Roman" w:cs="Times New Roman"/>
+          <w:b w:val="0"/>
+          <w:i w:val="0"/>
+          <w:color w:val="000000"/>
+          <w:sz w:val="28"/>
+          <w:u w:val="none"/>
+        </w:rPr>
         <w:t>На наборе Б медиана 3×3 сохраняет больше деталей и даёт MSE=124.90. Для окна 5×5 ошибка возрастает до 830.54: тонкая светлая линия может занимать меньше половины окна, поэтому медиана заменяет её фоном. Таким образом, выигрыш большого окна на первом наборе не переносится на второй.</w:t>
       </w:r>
     </w:p>
     <w:p>
+      <w:pPr>
+        <w:keepNext w:val="0"/>
+        <w:keepLines w:val="0"/>
+        <w:pageBreakBefore w:val="0"/>
+        <w:spacing w:before="0" w:after="0" w:line="360" w:lineRule="auto"/>
+        <w:ind w:firstLine="720" w:left="0" w:right="0"/>
+        <w:jc w:val="both"/>
+      </w:pPr>
       <w:r>
+        <w:rPr>
+          <w:rFonts w:ascii="Times New Roman" w:hAnsi="Times New Roman" w:eastAsia="Times New Roman" w:cs="Times New Roman"/>
+          <w:b w:val="0"/>
+          <w:i w:val="0"/>
+          <w:color w:val="000000"/>
+          <w:sz w:val="28"/>
+          <w:u w:val="none"/>
+        </w:rPr>
         <w:t>Минимум и максимум не являются универсальными средствами устранения гауссова шума. Первый выбирает преимущественно отрицательные отклонения и затемняет изображение; второй выбирает положительные и осветляет его. Среднее смещение относительно эталона для А равно −29.71 и +28.41, для Б — −38.96 и +37.80 соответственно. При этом светлые детали сужаются после минимума и расширяются после максимума, что прямо следует из (8).</w:t>
       </w:r>
     </w:p>
     <w:p>
+      <w:pPr>
+        <w:keepNext w:val="0"/>
+        <w:keepLines w:val="0"/>
+        <w:pageBreakBefore w:val="0"/>
+        <w:spacing w:before="0" w:after="0" w:line="360" w:lineRule="auto"/>
+        <w:ind w:firstLine="720" w:left="0" w:right="0"/>
+        <w:jc w:val="both"/>
+      </w:pPr>
       <w:r>
+        <w:rPr>
+          <w:rFonts w:ascii="Times New Roman" w:hAnsi="Times New Roman" w:eastAsia="Times New Roman" w:cs="Times New Roman"/>
+          <w:b w:val="0"/>
+          <w:i w:val="0"/>
+          <w:color w:val="000000"/>
+          <w:sz w:val="28"/>
+          <w:u w:val="none"/>
+        </w:rPr>
         <w:t>На данных двух сценах медианные фильтры с подходящим размером окна превосходят проверенные усредняющие методы по MSE. Это наблюдение относится к выбранным изображениям и уровню шума; оно не устанавливает преимущество медианы для любого гауссова шума или любого содержания изображения.</w:t>
       </w:r>
     </w:p>
     <w:p>
+      <w:pPr>
+        <w:keepNext w:val="0"/>
+        <w:keepLines w:val="0"/>
+        <w:pageBreakBefore w:val="0"/>
+        <w:spacing w:before="0" w:after="0" w:line="20" w:lineRule="exact"/>
+        <w:ind w:firstLine="720" w:left="0" w:right="0"/>
+        <w:jc w:val="both"/>
+      </w:pPr>
       <w:r>
-        <w:br w:type="page"/>
+        <w:rPr>
+          <w:rFonts w:ascii="Times New Roman" w:hAnsi="Times New Roman" w:eastAsia="Times New Roman" w:cs="Times New Roman"/>
+          <w:b w:val="0"/>
+          <w:i w:val="0"/>
+          <w:color w:val="000000"/>
+          <w:sz w:val="2"/>
+          <w:u w:val="none"/>
+        </w:rPr>
       </w:r>
     </w:p>
     <w:p>
       <w:pPr>
         <w:pStyle w:val="Heading1"/>
+        <w:keepNext/>
+        <w:keepLines/>
+        <w:pageBreakBefore w:val="0"/>
+        <w:spacing w:before="0" w:after="0" w:line="360" w:lineRule="auto"/>
+        <w:ind w:left="0" w:right="0" w:firstLine="0"/>
+        <w:jc w:val="center"/>
       </w:pPr>
       <w:r>
+        <w:rPr>
+          <w:rFonts w:ascii="Times New Roman" w:hAnsi="Times New Roman" w:eastAsia="Times New Roman" w:cs="Times New Roman"/>
+          <w:b/>
+          <w:i w:val="0"/>
+          <w:color w:val="000000"/>
+          <w:sz w:val="28"/>
+          <w:u w:val="none"/>
+        </w:rPr>
         <w:t>8. Вывод</w:t>
       </w:r>
     </w:p>
     <w:p>
+      <w:pPr>
+        <w:keepNext w:val="0"/>
+        <w:keepLines w:val="0"/>
+        <w:pageBreakBefore w:val="0"/>
+        <w:spacing w:before="0" w:after="0" w:line="360" w:lineRule="auto"/>
+        <w:ind w:firstLine="720" w:left="0" w:right="0"/>
+        <w:jc w:val="both"/>
+      </w:pPr>
       <w:r>
+        <w:rPr>
+          <w:rFonts w:ascii="Times New Roman" w:hAnsi="Times New Roman" w:eastAsia="Times New Roman" w:cs="Times New Roman"/>
+          <w:b w:val="0"/>
+          <w:i w:val="0"/>
+          <w:color w:val="000000"/>
+          <w:sz w:val="28"/>
+          <w:u w:val="none"/>
+        </w:rPr>
         <w:t>Реализован заданный класс Image с неизменённым интерфейсом и единая программа для всех трёх вариантов. Операторы Лапласа, Робертса и Собела выделяют разные по форме и ширине отклики на границы. Непосредственная обработка зашумлённого входа показывает появление ложных контуров.</w:t>
       </w:r>
     </w:p>
     <w:p>
+      <w:pPr>
+        <w:keepNext w:val="0"/>
+        <w:keepLines w:val="0"/>
+        <w:pageBreakBefore w:val="0"/>
+        <w:spacing w:before="0" w:after="0" w:line="360" w:lineRule="auto"/>
+        <w:ind w:firstLine="720" w:left="0" w:right="0"/>
+        <w:jc w:val="both"/>
+      </w:pPr>
       <w:r>
+        <w:rPr>
+          <w:rFonts w:ascii="Times New Roman" w:hAnsi="Times New Roman" w:eastAsia="Times New Roman" w:cs="Times New Roman"/>
+          <w:b w:val="0"/>
+          <w:i w:val="0"/>
+          <w:color w:val="000000"/>
+          <w:sz w:val="28"/>
+          <w:u w:val="none"/>
+        </w:rPr>
         <w:t>Усредняющие фильтры уменьшают колебания на равномерном фоне, но размывают мелкие объекты. Гауссово окно 5×5 с σ=1 показало меньшую ошибку, чем два рассмотренных арифметических окна. Медиана 5×5 эффективна на крупных фигурах, а на изображении с тонкими деталями лучше сработало окно 3×3. Минимум и максимум меняют геометрию светлых областей и дают значительное смещение яркости.</w:t>
       </w:r>
     </w:p>
     <w:p>
+      <w:pPr>
+        <w:keepNext w:val="0"/>
+        <w:keepLines w:val="0"/>
+        <w:pageBreakBefore w:val="0"/>
+        <w:spacing w:before="0" w:after="0" w:line="360" w:lineRule="auto"/>
+        <w:ind w:firstLine="720" w:left="0" w:right="0"/>
+        <w:jc w:val="both"/>
+      </w:pPr>
       <w:r>
+        <w:rPr>
+          <w:rFonts w:ascii="Times New Roman" w:hAnsi="Times New Roman" w:eastAsia="Times New Roman" w:cs="Times New Roman"/>
+          <w:b w:val="0"/>
+          <w:i w:val="0"/>
+          <w:color w:val="000000"/>
+          <w:sz w:val="28"/>
+          <w:u w:val="none"/>
+        </w:rPr>
         <w:t>Все 18 тестовых случаев пройдены. Демонстрационный запуск обработал четыре входных PNG и сохранил 44 выходных файла. Выводы основаны на полученных изображениях и сравнении с чистыми эталонами; заранее заданного универсального победителя среди методов нет.</w:t>
       </w:r>
     </w:p>
     <w:p>
       <w:pPr>
         <w:pStyle w:val="Heading1"/>
+        <w:keepNext/>
+        <w:keepLines/>
+        <w:pageBreakBefore w:val="0"/>
+        <w:spacing w:before="0" w:after="0" w:line="360" w:lineRule="auto"/>
+        <w:ind w:left="0" w:right="0" w:firstLine="0"/>
+        <w:jc w:val="center"/>
       </w:pPr>
       <w:r>
+        <w:rPr>
+          <w:rFonts w:ascii="Times New Roman" w:hAnsi="Times New Roman" w:eastAsia="Times New Roman" w:cs="Times New Roman"/>
+          <w:b/>
+          <w:i w:val="0"/>
+          <w:color w:val="000000"/>
+          <w:sz w:val="28"/>
+          <w:u w:val="none"/>
+        </w:rPr>
         <w:t>Источники</w:t>
       </w:r>
     </w:p>
     <w:p>
+      <w:pPr>
+        <w:keepNext w:val="0"/>
+        <w:keepLines w:val="0"/>
+        <w:pageBreakBefore w:val="0"/>
+        <w:spacing w:before="0" w:after="0" w:line="360" w:lineRule="auto"/>
+        <w:ind w:firstLine="720" w:left="0" w:right="0"/>
+        <w:jc w:val="both"/>
+      </w:pPr>
       <w:r>
+        <w:rPr>
+          <w:rFonts w:ascii="Times New Roman" w:hAnsi="Times New Roman" w:eastAsia="Times New Roman" w:cs="Times New Roman"/>
+          <w:b w:val="0"/>
+          <w:i w:val="0"/>
+          <w:color w:val="000000"/>
+          <w:sz w:val="28"/>
+          <w:u w:val="none"/>
+        </w:rPr>
         <w:t>1. Материалы задания: lab_1.pdf (внутри — «Лабораторная работа №2»), image_env.pdf, ReadMe.pdf, исходный интерфейс Image и tests_image.cpp.</w:t>
       </w:r>
     </w:p>
     <w:p>
+      <w:pPr>
+        <w:keepNext w:val="0"/>
+        <w:keepLines w:val="0"/>
+        <w:pageBreakBefore w:val="0"/>
+        <w:spacing w:before="0" w:after="0" w:line="360" w:lineRule="auto"/>
+        <w:ind w:firstLine="720" w:left="0" w:right="0"/>
+        <w:jc w:val="both"/>
+      </w:pPr>
       <w:r>
+        <w:rPr>
+          <w:rFonts w:ascii="Times New Roman" w:hAnsi="Times New Roman" w:eastAsia="Times New Roman" w:cs="Times New Roman"/>
+          <w:b w:val="0"/>
+          <w:i w:val="0"/>
+          <w:color w:val="000000"/>
+          <w:sz w:val="28"/>
+          <w:u w:val="none"/>
+        </w:rPr>
         <w:t>2. Библиотеки stb_image и stb_image_write для чтения и записи PNG. Заголовочные файлы предоставлены вместе с заданием.</w:t>
       </w:r>
     </w:p>
     <w:p>
+      <w:pPr>
+        <w:keepNext w:val="0"/>
+        <w:keepLines w:val="0"/>
+        <w:pageBreakBefore w:val="0"/>
+        <w:spacing w:before="0" w:after="0" w:line="360" w:lineRule="auto"/>
+        <w:ind w:firstLine="720" w:left="0" w:right="0"/>
+        <w:jc w:val="both"/>
+      </w:pPr>
       <w:r>
+        <w:rPr>
+          <w:rFonts w:ascii="Times New Roman" w:hAnsi="Times New Roman" w:eastAsia="Times New Roman" w:cs="Times New Roman"/>
+          <w:b w:val="0"/>
+          <w:i w:val="0"/>
+          <w:color w:val="000000"/>
+          <w:sz w:val="28"/>
+          <w:u w:val="none"/>
+        </w:rPr>
         <w:t>3. Библиотека doctest. Тестовое окружение и проверки класса Image из материалов задания.</w:t>
       </w:r>
     </w:p>
     <w:p>
+      <w:pPr>
+        <w:keepNext w:val="0"/>
+        <w:keepLines w:val="0"/>
+        <w:pageBreakBefore w:val="0"/>
+        <w:spacing w:before="0" w:after="0" w:line="360" w:lineRule="auto"/>
+        <w:ind w:firstLine="720" w:left="0" w:right="0"/>
+        <w:jc w:val="both"/>
+      </w:pPr>
       <w:r>
+        <w:rPr>
+          <w:rFonts w:ascii="Times New Roman" w:hAnsi="Times New Roman" w:eastAsia="Times New Roman" w:cs="Times New Roman"/>
+          <w:b w:val="0"/>
+          <w:i w:val="0"/>
+          <w:color w:val="000000"/>
+          <w:sz w:val="28"/>
+          <w:u w:val="none"/>
+        </w:rPr>
         <w:t>4. Справочная документация ImageMagick. Добавление гауссова шума, выбор его интенсивности и начального значения генератора.</w:t>
       </w:r>
     </w:p>
     <w:p>
       <w:pPr>
         <w:pStyle w:val="Heading1"/>
+        <w:keepNext/>
+        <w:keepLines/>
+        <w:pageBreakBefore w:val="0"/>
+        <w:spacing w:before="0" w:after="0" w:line="360" w:lineRule="auto"/>
+        <w:ind w:left="0" w:right="0" w:firstLine="0"/>
+        <w:jc w:val="center"/>
       </w:pPr>
       <w:r>
+        <w:rPr>
+          <w:rFonts w:ascii="Times New Roman" w:hAnsi="Times New Roman" w:eastAsia="Times New Roman" w:cs="Times New Roman"/>
+          <w:b/>
+          <w:i w:val="0"/>
+          <w:color w:val="000000"/>
+          <w:sz w:val="28"/>
+          <w:u w:val="none"/>
+        </w:rPr>
         <w:t>Приложения</w:t>
       </w:r>
     </w:p>
     <w:p>
+      <w:pPr>
+        <w:keepNext w:val="0"/>
+        <w:keepLines w:val="0"/>
+        <w:pageBreakBefore w:val="0"/>
+        <w:spacing w:before="0" w:after="0" w:line="360" w:lineRule="auto"/>
+        <w:ind w:firstLine="720" w:left="0" w:right="0"/>
+        <w:jc w:val="both"/>
+      </w:pPr>
       <w:r>
+        <w:rPr>
+          <w:rFonts w:ascii="Times New Roman" w:hAnsi="Times New Roman" w:eastAsia="Times New Roman" w:cs="Times New Roman"/>
+          <w:b w:val="0"/>
+          <w:i w:val="0"/>
+          <w:color w:val="000000"/>
+          <w:sz w:val="28"/>
+          <w:u w:val="none"/>
+        </w:rPr>
         <w:t>В приложении А приведён модуль обработки: вспомогательные функции, преобразование в оттенки серого и реализации всех трёх вариантов. В приложении Б приведена реализация класса Image. Точка входа и тесты находятся в проекте; сторонние заголовки в текст отчёта не включены.</w:t>
       </w:r>
     </w:p>
     <w:p>
+      <w:pPr>
+        <w:keepNext w:val="0"/>
+        <w:keepLines w:val="0"/>
+        <w:pageBreakBefore w:val="0"/>
+        <w:spacing w:before="0" w:after="0" w:line="20" w:lineRule="exact"/>
+        <w:ind w:firstLine="720" w:left="0" w:right="0"/>
+        <w:jc w:val="both"/>
+      </w:pPr>
       <w:r>
-        <w:br w:type="page"/>
+        <w:rPr>
+          <w:rFonts w:ascii="Times New Roman" w:hAnsi="Times New Roman" w:eastAsia="Times New Roman" w:cs="Times New Roman"/>
+          <w:b w:val="0"/>
+          <w:i w:val="0"/>
+          <w:color w:val="000000"/>
+          <w:sz w:val="2"/>
+          <w:u w:val="none"/>
+        </w:rPr>
       </w:r>
     </w:p>
     <w:p>
       <w:pPr>
         <w:pStyle w:val="Heading1"/>
+        <w:keepNext/>
+        <w:keepLines/>
+        <w:pageBreakBefore/>
+        <w:spacing w:before="0" w:after="0" w:line="360" w:lineRule="auto"/>
+        <w:ind w:left="0" w:right="0" w:firstLine="0"/>
+        <w:jc w:val="center"/>
       </w:pPr>
       <w:r>
+        <w:rPr>
+          <w:rFonts w:ascii="Times New Roman" w:hAnsi="Times New Roman" w:eastAsia="Times New Roman" w:cs="Times New Roman"/>
+          <w:b/>
+          <w:i w:val="0"/>
+          <w:color w:val="000000"/>
+          <w:sz w:val="28"/>
+          <w:u w:val="none"/>
+        </w:rPr>
         <w:t>Приложение А. Алгоритмы обработки</w:t>
       </w:r>
     </w:p>
     <w:p>
       <w:pPr>
-        <w:spacing w:line="240" w:lineRule="auto"/>
-        <w:ind w:firstLine="0"/>
-        <w:jc w:val="left"/>
+        <w:keepNext w:val="0"/>
+        <w:keepLines w:val="0"/>
+        <w:pageBreakBefore w:val="0"/>
+        <w:widowControl w:val="0"/>
+        <w:spacing w:line="240" w:lineRule="auto" w:before="0" w:after="0"/>
+        <w:ind w:left="0" w:right="0" w:firstLine="0"/>
+        <w:jc w:val="both"/>
       </w:pPr>
       <w:r>
         <w:rPr>
-          <w:rFonts w:ascii="Courier New" w:hAnsi="Courier New"/>
-          <w:sz w:val="16"/>
+          <w:rFonts w:ascii="Consolas" w:hAnsi="Consolas" w:eastAsia="Consolas" w:cs="Consolas"/>
+          <w:b w:val="0"/>
+          <w:i w:val="0"/>
+          <w:color w:val="000000"/>
+          <w:sz w:val="24"/>
+          <w:u w:val="none"/>
         </w:rPr>
         <w:t>#include "Processing.h"</w:t>
         <w:br/>
@@ -2040,28 +4200,65 @@
       </w:r>
     </w:p>
     <w:p>
+      <w:pPr>
+        <w:keepNext w:val="0"/>
+        <w:keepLines w:val="0"/>
+        <w:pageBreakBefore w:val="0"/>
+        <w:spacing w:before="0" w:after="0" w:line="20" w:lineRule="exact"/>
+        <w:ind w:firstLine="720" w:left="0" w:right="0"/>
+        <w:jc w:val="both"/>
+      </w:pPr>
       <w:r>
-        <w:br w:type="page"/>
+        <w:rPr>
+          <w:rFonts w:ascii="Times New Roman" w:hAnsi="Times New Roman" w:eastAsia="Times New Roman" w:cs="Times New Roman"/>
+          <w:b w:val="0"/>
+          <w:i w:val="0"/>
+          <w:color w:val="000000"/>
+          <w:sz w:val="2"/>
+          <w:u w:val="none"/>
+        </w:rPr>
       </w:r>
     </w:p>
     <w:p>
       <w:pPr>
         <w:pStyle w:val="Heading1"/>
+        <w:keepNext/>
+        <w:keepLines/>
+        <w:pageBreakBefore/>
+        <w:spacing w:before="0" w:after="0" w:line="360" w:lineRule="auto"/>
+        <w:ind w:left="0" w:right="0" w:firstLine="0"/>
+        <w:jc w:val="center"/>
       </w:pPr>
       <w:r>
+        <w:rPr>
+          <w:rFonts w:ascii="Times New Roman" w:hAnsi="Times New Roman" w:eastAsia="Times New Roman" w:cs="Times New Roman"/>
+          <w:b/>
+          <w:i w:val="0"/>
+          <w:color w:val="000000"/>
+          <w:sz w:val="28"/>
+          <w:u w:val="none"/>
+        </w:rPr>
         <w:t>Приложение А. Алгоритмы обработки (продолжение)</w:t>
       </w:r>
     </w:p>
     <w:p>
       <w:pPr>
-        <w:spacing w:line="240" w:lineRule="auto"/>
-        <w:ind w:firstLine="0"/>
-        <w:jc w:val="left"/>
+        <w:keepNext w:val="0"/>
+        <w:keepLines w:val="0"/>
+        <w:pageBreakBefore w:val="0"/>
+        <w:widowControl w:val="0"/>
+        <w:spacing w:line="240" w:lineRule="auto" w:before="0" w:after="0"/>
+        <w:ind w:left="0" w:right="0" w:firstLine="0"/>
+        <w:jc w:val="both"/>
       </w:pPr>
       <w:r>
         <w:rPr>
-          <w:rFonts w:ascii="Courier New" w:hAnsi="Courier New"/>
-          <w:sz w:val="16"/>
+          <w:rFonts w:ascii="Consolas" w:hAnsi="Consolas" w:eastAsia="Consolas" w:cs="Consolas"/>
+          <w:b w:val="0"/>
+          <w:i w:val="0"/>
+          <w:color w:val="000000"/>
+          <w:sz w:val="24"/>
+          <w:u w:val="none"/>
         </w:rPr>
         <w:t xml:space="preserve">                value = std::hypot(gx, gy);</w:t>
         <w:br/>
@@ -2185,28 +4382,65 @@
       </w:r>
     </w:p>
     <w:p>
+      <w:pPr>
+        <w:keepNext w:val="0"/>
+        <w:keepLines w:val="0"/>
+        <w:pageBreakBefore w:val="0"/>
+        <w:spacing w:before="0" w:after="0" w:line="20" w:lineRule="exact"/>
+        <w:ind w:firstLine="720" w:left="0" w:right="0"/>
+        <w:jc w:val="both"/>
+      </w:pPr>
       <w:r>
-        <w:br w:type="page"/>
+        <w:rPr>
+          <w:rFonts w:ascii="Times New Roman" w:hAnsi="Times New Roman" w:eastAsia="Times New Roman" w:cs="Times New Roman"/>
+          <w:b w:val="0"/>
+          <w:i w:val="0"/>
+          <w:color w:val="000000"/>
+          <w:sz w:val="2"/>
+          <w:u w:val="none"/>
+        </w:rPr>
       </w:r>
     </w:p>
     <w:p>
       <w:pPr>
         <w:pStyle w:val="Heading1"/>
+        <w:keepNext/>
+        <w:keepLines/>
+        <w:pageBreakBefore/>
+        <w:spacing w:before="0" w:after="0" w:line="360" w:lineRule="auto"/>
+        <w:ind w:left="0" w:right="0" w:firstLine="0"/>
+        <w:jc w:val="center"/>
       </w:pPr>
       <w:r>
+        <w:rPr>
+          <w:rFonts w:ascii="Times New Roman" w:hAnsi="Times New Roman" w:eastAsia="Times New Roman" w:cs="Times New Roman"/>
+          <w:b/>
+          <w:i w:val="0"/>
+          <w:color w:val="000000"/>
+          <w:sz w:val="28"/>
+          <w:u w:val="none"/>
+        </w:rPr>
         <w:t>Приложение Б. Класс Image</w:t>
       </w:r>
     </w:p>
     <w:p>
       <w:pPr>
-        <w:spacing w:line="240" w:lineRule="auto"/>
-        <w:ind w:firstLine="0"/>
-        <w:jc w:val="left"/>
+        <w:keepNext w:val="0"/>
+        <w:keepLines w:val="0"/>
+        <w:pageBreakBefore w:val="0"/>
+        <w:widowControl w:val="0"/>
+        <w:spacing w:line="240" w:lineRule="auto" w:before="0" w:after="0"/>
+        <w:ind w:left="0" w:right="0" w:firstLine="0"/>
+        <w:jc w:val="both"/>
       </w:pPr>
       <w:r>
         <w:rPr>
-          <w:rFonts w:ascii="Courier New" w:hAnsi="Courier New"/>
-          <w:sz w:val="16"/>
+          <w:rFonts w:ascii="Consolas" w:hAnsi="Consolas" w:eastAsia="Consolas" w:cs="Consolas"/>
+          <w:b w:val="0"/>
+          <w:i w:val="0"/>
+          <w:color w:val="000000"/>
+          <w:sz w:val="24"/>
+          <w:u w:val="none"/>
         </w:rPr>
         <w:t>#define STB_IMAGE_IMPLEMENTATION</w:t>
         <w:br/>
@@ -2333,28 +4567,65 @@
       </w:r>
     </w:p>
     <w:p>
+      <w:pPr>
+        <w:keepNext w:val="0"/>
+        <w:keepLines w:val="0"/>
+        <w:pageBreakBefore w:val="0"/>
+        <w:spacing w:before="0" w:after="0" w:line="20" w:lineRule="exact"/>
+        <w:ind w:firstLine="720" w:left="0" w:right="0"/>
+        <w:jc w:val="both"/>
+      </w:pPr>
       <w:r>
-        <w:br w:type="page"/>
+        <w:rPr>
+          <w:rFonts w:ascii="Times New Roman" w:hAnsi="Times New Roman" w:eastAsia="Times New Roman" w:cs="Times New Roman"/>
+          <w:b w:val="0"/>
+          <w:i w:val="0"/>
+          <w:color w:val="000000"/>
+          <w:sz w:val="2"/>
+          <w:u w:val="none"/>
+        </w:rPr>
       </w:r>
     </w:p>
     <w:p>
       <w:pPr>
         <w:pStyle w:val="Heading1"/>
+        <w:keepNext/>
+        <w:keepLines/>
+        <w:pageBreakBefore/>
+        <w:spacing w:before="0" w:after="0" w:line="360" w:lineRule="auto"/>
+        <w:ind w:left="0" w:right="0" w:firstLine="0"/>
+        <w:jc w:val="center"/>
       </w:pPr>
       <w:r>
+        <w:rPr>
+          <w:rFonts w:ascii="Times New Roman" w:hAnsi="Times New Roman" w:eastAsia="Times New Roman" w:cs="Times New Roman"/>
+          <w:b/>
+          <w:i w:val="0"/>
+          <w:color w:val="000000"/>
+          <w:sz w:val="28"/>
+          <w:u w:val="none"/>
+        </w:rPr>
         <w:t>Приложение Б. Класс Image (продолжение)</w:t>
       </w:r>
     </w:p>
     <w:p>
       <w:pPr>
-        <w:spacing w:line="240" w:lineRule="auto"/>
-        <w:ind w:firstLine="0"/>
-        <w:jc w:val="left"/>
+        <w:keepNext w:val="0"/>
+        <w:keepLines w:val="0"/>
+        <w:pageBreakBefore w:val="0"/>
+        <w:widowControl w:val="0"/>
+        <w:spacing w:line="240" w:lineRule="auto" w:before="0" w:after="0"/>
+        <w:ind w:left="0" w:right="0" w:firstLine="0"/>
+        <w:jc w:val="both"/>
       </w:pPr>
       <w:r>
         <w:rPr>
-          <w:rFonts w:ascii="Courier New" w:hAnsi="Courier New"/>
-          <w:sz w:val="16"/>
+          <w:rFonts w:ascii="Consolas" w:hAnsi="Consolas" w:eastAsia="Consolas" w:cs="Consolas"/>
+          <w:b w:val="0"/>
+          <w:i w:val="0"/>
+          <w:color w:val="000000"/>
+          <w:sz w:val="24"/>
+          <w:u w:val="none"/>
         </w:rPr>
         <w:t xml:space="preserve">    if (!m_data) return false;</w:t>
         <w:br/>
@@ -2405,8 +4676,8 @@
     </w:p>
     <w:sectPr>
       <w:footerReference w:type="default" r:id="rId9"/>
-      <w:pgSz w:w="12240" w:h="15840"/>
-      <w:pgMar w:top="1134" w:right="1134" w:bottom="1134" w:left="1134" w:header="720" w:footer="720" w:gutter="0"/>
+      <w:pgSz w:w="11906" w:h="16838"/>
+      <w:pgMar w:top="1134" w:right="850" w:bottom="1134" w:left="1701" w:header="720" w:footer="720" w:gutter="0"/>
       <w:cols w:space="720"/>
       <w:titlePg/>
       <w:docGrid w:linePitch="360"/>
@@ -2420,6 +4691,7 @@
   <w:p>
     <w:pPr>
       <w:pStyle w:val="Footer"/>
+      <w:spacing w:line="276" w:lineRule="auto" w:before="0" w:after="0"/>
       <w:ind w:firstLine="0"/>
       <w:jc w:val="center"/>
     </w:pPr>
@@ -2793,14 +5065,15 @@
     <w:rsid w:val="00FC693F"/>
     <w:pPr>
       <w:widowControl/>
-      <w:spacing w:after="120" w:line="276" w:lineRule="auto"/>
-      <w:ind w:firstLine="709"/>
+      <w:spacing w:after="0" w:line="360" w:lineRule="auto" w:before="0"/>
+      <w:ind w:firstLine="720"/>
       <w:jc w:val="both"/>
     </w:pPr>
     <w:rPr>
       <w:rFonts w:ascii="Times New Roman" w:hAnsi="Times New Roman"/>
+      <w:b w:val="0"/>
       <w:color w:val="000000"/>
-      <w:sz w:val="24"/>
+      <w:sz w:val="28"/>
       <w:u w:val="none"/>
     </w:rPr>
   </w:style>
@@ -2879,9 +5152,9 @@
     <w:pPr>
       <w:keepNext/>
       <w:keepLines/>
-      <w:spacing w:before="480" w:after="0"/>
+      <w:spacing w:before="0" w:after="0" w:line="360" w:lineRule="auto"/>
       <w:ind w:firstLine="0"/>
-      <w:jc w:val="left"/>
+      <w:jc w:val="center"/>
       <w:outlineLvl w:val="0"/>
     </w:pPr>
     <w:rPr>

</xml_diff>

<commit_message>
Restore complete reference report layout with contents and verified page numbers
</commit_message>
<xml_diff>
--- a/reports/Отчет.docx
+++ b/reports/Отчет.docx
@@ -21,6 +21,8 @@
           <w:u w:val="none"/>
         </w:rPr>
         <w:t>МИНОБРНАУКИ РОССИИ</w:t>
+        <w:br/>
+        <w:t>ФЕДЕРАЛЬНОЕ ГОСУДАРСТВЕННОЕ БЮДЖЕТНОЕ ОБРАЗОВАТЕЛЬНОЕ УЧРЕЖДЕНИЕ ВЫСШЕГО ОБРАЗОВАНИЯ «ВОРОНЕЖСКИЙ ГОСУДАРСТВЕННЫЙ УНИВЕРСИТЕТ» (ФГБОУ ВО «ВГУ»)</w:t>
       </w:r>
     </w:p>
     <w:p>
@@ -41,8 +43,6 @@
           <w:sz w:val="28"/>
           <w:u w:val="none"/>
         </w:rPr>
-        <w:t>Воронежский государственный университет</w:t>
-        <w:br/>
         <w:t>Факультет прикладной математики, информатики и механики</w:t>
         <w:br/>
         <w:t>Кафедра математического обеспечения ЭВМ</w:t>
@@ -66,7 +66,6 @@
           <w:sz w:val="28"/>
           <w:u w:val="none"/>
         </w:rPr>
-        <w:br/>
         <w:br/>
         <w:br/>
       </w:r>
@@ -156,7 +155,6 @@
         </w:rPr>
         <w:br/>
         <w:br/>
-        <w:br/>
       </w:r>
     </w:p>
     <w:p>
@@ -177,7 +175,7 @@
           <w:sz w:val="28"/>
           <w:u w:val="none"/>
         </w:rPr>
-        <w:t>Выполнил(а): __________________________</w:t>
+        <w:t>Студент: __________________________</w:t>
         <w:br/>
         <w:t>Группа: ______________________________</w:t>
         <w:br/>
@@ -202,7 +200,6 @@
           <w:sz w:val="28"/>
           <w:u w:val="none"/>
         </w:rPr>
-        <w:br/>
         <w:br/>
       </w:r>
     </w:p>
@@ -249,7 +246,6 @@
     </w:p>
     <w:p>
       <w:pPr>
-        <w:pStyle w:val="Heading1"/>
         <w:keepNext/>
         <w:keepLines/>
         <w:pageBreakBefore/>
@@ -266,8 +262,355 @@
           <w:sz w:val="28"/>
           <w:u w:val="none"/>
         </w:rPr>
-        <w:t>Постановка задачи</w:t>
+        <w:t>Содержание</w:t>
       </w:r>
+    </w:p>
+    <w:p>
+      <w:pPr>
+        <w:pStyle w:val="TOC1"/>
+        <w:keepNext w:val="0"/>
+        <w:keepLines/>
+        <w:pageBreakBefore w:val="0"/>
+        <w:tabs>
+          <w:tab w:pos="9350" w:val="right" w:leader="dot"/>
+        </w:tabs>
+        <w:spacing w:before="0" w:after="100" w:line="276" w:lineRule="auto"/>
+        <w:ind w:left="0" w:right="0" w:firstLine="0"/>
+        <w:jc w:val="left"/>
+      </w:pPr>
+      <w:r>
+        <w:rPr>
+          <w:rFonts w:ascii="Times New Roman" w:hAnsi="Times New Roman" w:eastAsia="Times New Roman" w:cs="Times New Roman"/>
+          <w:b w:val="0"/>
+          <w:i w:val="0"/>
+          <w:color w:val="000000"/>
+          <w:sz w:val="22"/>
+          <w:u w:val="none"/>
+        </w:rPr>
+        <w:fldChar w:fldCharType="begin"/>
+      </w:r>
+      <w:r>
+        <w:rPr>
+          <w:rFonts w:ascii="Times New Roman" w:hAnsi="Times New Roman" w:eastAsia="Times New Roman" w:cs="Times New Roman"/>
+          <w:b w:val="0"/>
+          <w:i w:val="0"/>
+          <w:color w:val="000000"/>
+          <w:sz w:val="22"/>
+          <w:u w:val="none"/>
+        </w:rPr>
+        <w:instrText xml:space="preserve"> TOC \o "1-2" \z \u </w:instrText>
+      </w:r>
+      <w:r>
+        <w:rPr>
+          <w:rFonts w:ascii="Times New Roman" w:hAnsi="Times New Roman" w:eastAsia="Times New Roman" w:cs="Times New Roman"/>
+          <w:b w:val="0"/>
+          <w:i w:val="0"/>
+          <w:color w:val="000000"/>
+          <w:sz w:val="22"/>
+          <w:u w:val="none"/>
+        </w:rPr>
+        <w:fldChar w:fldCharType="separate"/>
+      </w:r>
+      <w:r>
+        <w:rPr>
+          <w:rFonts w:ascii="Times New Roman" w:hAnsi="Times New Roman" w:eastAsia="Times New Roman" w:cs="Times New Roman"/>
+          <w:b w:val="0"/>
+          <w:i w:val="0"/>
+          <w:color w:val="000000"/>
+          <w:sz w:val="22"/>
+          <w:u w:val="none"/>
+        </w:rPr>
+        <w:t>1. Постановка задачи</w:t>
+        <w:tab/>
+      </w:r>
+      <w:fldSimple w:instr="PAGEREF _LabSection0">
+        <w:r>
+          <w:t>3</w:t>
+        </w:r>
+      </w:fldSimple>
+    </w:p>
+    <w:p>
+      <w:pPr>
+        <w:pStyle w:val="TOC1"/>
+        <w:keepNext w:val="0"/>
+        <w:keepLines/>
+        <w:pageBreakBefore w:val="0"/>
+        <w:tabs>
+          <w:tab w:pos="9350" w:val="right" w:leader="dot"/>
+        </w:tabs>
+        <w:spacing w:before="0" w:after="100" w:line="276" w:lineRule="auto"/>
+        <w:ind w:left="0" w:right="0" w:firstLine="0"/>
+        <w:jc w:val="left"/>
+      </w:pPr>
+      <w:r>
+        <w:rPr>
+          <w:rFonts w:ascii="Times New Roman" w:hAnsi="Times New Roman" w:eastAsia="Times New Roman" w:cs="Times New Roman"/>
+          <w:b w:val="0"/>
+          <w:i w:val="0"/>
+          <w:color w:val="000000"/>
+          <w:sz w:val="22"/>
+          <w:u w:val="none"/>
+        </w:rPr>
+        <w:t>2. Математическое описание алгоритма</w:t>
+        <w:tab/>
+      </w:r>
+      <w:fldSimple w:instr="PAGEREF _LabSection1">
+        <w:r>
+          <w:t>4</w:t>
+        </w:r>
+      </w:fldSimple>
+    </w:p>
+    <w:p>
+      <w:pPr>
+        <w:pStyle w:val="TOC2"/>
+        <w:keepNext w:val="0"/>
+        <w:keepLines/>
+        <w:pageBreakBefore w:val="0"/>
+        <w:tabs>
+          <w:tab w:pos="9350" w:val="right" w:leader="dot"/>
+        </w:tabs>
+        <w:spacing w:before="0" w:after="100" w:line="276" w:lineRule="auto"/>
+        <w:ind w:left="0" w:right="0" w:firstLine="0"/>
+        <w:jc w:val="left"/>
+      </w:pPr>
+      <w:r>
+        <w:rPr>
+          <w:rFonts w:ascii="Times New Roman" w:hAnsi="Times New Roman" w:eastAsia="Times New Roman" w:cs="Times New Roman"/>
+          <w:b w:val="0"/>
+          <w:i w:val="0"/>
+          <w:color w:val="000000"/>
+          <w:sz w:val="22"/>
+          <w:u w:val="none"/>
+        </w:rPr>
+        <w:t>2.1. Алгоритмы выделения контуров</w:t>
+        <w:tab/>
+      </w:r>
+      <w:fldSimple w:instr="PAGEREF _LabSection2">
+        <w:r>
+          <w:t>4</w:t>
+        </w:r>
+      </w:fldSimple>
+    </w:p>
+    <w:p>
+      <w:pPr>
+        <w:pStyle w:val="TOC2"/>
+        <w:keepNext w:val="0"/>
+        <w:keepLines/>
+        <w:pageBreakBefore w:val="0"/>
+        <w:tabs>
+          <w:tab w:pos="9350" w:val="right" w:leader="dot"/>
+        </w:tabs>
+        <w:spacing w:before="0" w:after="100" w:line="276" w:lineRule="auto"/>
+        <w:ind w:left="0" w:right="0" w:firstLine="0"/>
+        <w:jc w:val="left"/>
+      </w:pPr>
+      <w:r>
+        <w:rPr>
+          <w:rFonts w:ascii="Times New Roman" w:hAnsi="Times New Roman" w:eastAsia="Times New Roman" w:cs="Times New Roman"/>
+          <w:b w:val="0"/>
+          <w:i w:val="0"/>
+          <w:color w:val="000000"/>
+          <w:sz w:val="22"/>
+          <w:u w:val="none"/>
+        </w:rPr>
+        <w:t>2.2. Линейные усредняющие фильтры</w:t>
+        <w:tab/>
+      </w:r>
+      <w:fldSimple w:instr="PAGEREF _LabSection3">
+        <w:r>
+          <w:t>6</w:t>
+        </w:r>
+      </w:fldSimple>
+    </w:p>
+    <w:p>
+      <w:pPr>
+        <w:pStyle w:val="TOC1"/>
+        <w:keepNext w:val="0"/>
+        <w:keepLines/>
+        <w:pageBreakBefore w:val="0"/>
+        <w:tabs>
+          <w:tab w:pos="9350" w:val="right" w:leader="dot"/>
+        </w:tabs>
+        <w:spacing w:before="0" w:after="100" w:line="276" w:lineRule="auto"/>
+        <w:ind w:left="0" w:right="0" w:firstLine="0"/>
+        <w:jc w:val="left"/>
+      </w:pPr>
+      <w:r>
+        <w:rPr>
+          <w:rFonts w:ascii="Times New Roman" w:hAnsi="Times New Roman" w:eastAsia="Times New Roman" w:cs="Times New Roman"/>
+          <w:b w:val="0"/>
+          <w:i w:val="0"/>
+          <w:color w:val="000000"/>
+          <w:sz w:val="22"/>
+          <w:u w:val="none"/>
+        </w:rPr>
+        <w:t>3. Программное описание алгоритма</w:t>
+        <w:tab/>
+      </w:r>
+      <w:fldSimple w:instr="PAGEREF _LabSection4">
+        <w:r>
+          <w:t>8</w:t>
+        </w:r>
+      </w:fldSimple>
+    </w:p>
+    <w:p>
+      <w:pPr>
+        <w:pStyle w:val="TOC1"/>
+        <w:keepNext w:val="0"/>
+        <w:keepLines/>
+        <w:pageBreakBefore w:val="0"/>
+        <w:tabs>
+          <w:tab w:pos="9350" w:val="right" w:leader="dot"/>
+        </w:tabs>
+        <w:spacing w:before="0" w:after="100" w:line="276" w:lineRule="auto"/>
+        <w:ind w:left="0" w:right="0" w:firstLine="0"/>
+        <w:jc w:val="left"/>
+      </w:pPr>
+      <w:r>
+        <w:rPr>
+          <w:rFonts w:ascii="Times New Roman" w:hAnsi="Times New Roman" w:eastAsia="Times New Roman" w:cs="Times New Roman"/>
+          <w:b w:val="0"/>
+          <w:i w:val="0"/>
+          <w:color w:val="000000"/>
+          <w:sz w:val="22"/>
+          <w:u w:val="none"/>
+        </w:rPr>
+        <w:t>4. Результат работы программы</w:t>
+        <w:tab/>
+      </w:r>
+      <w:fldSimple w:instr="PAGEREF _LabSection5">
+        <w:r>
+          <w:t>10</w:t>
+        </w:r>
+      </w:fldSimple>
+    </w:p>
+    <w:p>
+      <w:pPr>
+        <w:pStyle w:val="TOC1"/>
+        <w:keepNext w:val="0"/>
+        <w:keepLines/>
+        <w:pageBreakBefore w:val="0"/>
+        <w:tabs>
+          <w:tab w:pos="9350" w:val="right" w:leader="dot"/>
+        </w:tabs>
+        <w:spacing w:before="0" w:after="100" w:line="276" w:lineRule="auto"/>
+        <w:ind w:left="0" w:right="0" w:firstLine="0"/>
+        <w:jc w:val="left"/>
+      </w:pPr>
+      <w:r>
+        <w:rPr>
+          <w:rFonts w:ascii="Times New Roman" w:hAnsi="Times New Roman" w:eastAsia="Times New Roman" w:cs="Times New Roman"/>
+          <w:b w:val="0"/>
+          <w:i w:val="0"/>
+          <w:color w:val="000000"/>
+          <w:sz w:val="22"/>
+          <w:u w:val="none"/>
+        </w:rPr>
+        <w:t>5. Заключение</w:t>
+        <w:tab/>
+      </w:r>
+      <w:fldSimple w:instr="PAGEREF _LabSection6">
+        <w:r>
+          <w:t>17</w:t>
+        </w:r>
+      </w:fldSimple>
+    </w:p>
+    <w:p>
+      <w:pPr>
+        <w:pStyle w:val="TOC1"/>
+        <w:keepNext w:val="0"/>
+        <w:keepLines/>
+        <w:pageBreakBefore w:val="0"/>
+        <w:tabs>
+          <w:tab w:pos="9350" w:val="right" w:leader="dot"/>
+        </w:tabs>
+        <w:spacing w:before="0" w:after="100" w:line="276" w:lineRule="auto"/>
+        <w:ind w:left="0" w:right="0" w:firstLine="0"/>
+        <w:jc w:val="left"/>
+      </w:pPr>
+      <w:r>
+        <w:rPr>
+          <w:rFonts w:ascii="Times New Roman" w:hAnsi="Times New Roman" w:eastAsia="Times New Roman" w:cs="Times New Roman"/>
+          <w:b w:val="0"/>
+          <w:i w:val="0"/>
+          <w:color w:val="000000"/>
+          <w:sz w:val="22"/>
+          <w:u w:val="none"/>
+        </w:rPr>
+        <w:t>Приложение А</w:t>
+        <w:tab/>
+      </w:r>
+      <w:fldSimple w:instr="PAGEREF _LabSection7">
+        <w:r>
+          <w:t>18</w:t>
+        </w:r>
+      </w:fldSimple>
+    </w:p>
+    <w:p>
+      <w:pPr>
+        <w:pStyle w:val="TOC1"/>
+        <w:keepNext w:val="0"/>
+        <w:keepLines/>
+        <w:pageBreakBefore w:val="0"/>
+        <w:tabs>
+          <w:tab w:pos="9350" w:val="right" w:leader="dot"/>
+        </w:tabs>
+        <w:spacing w:before="0" w:after="100" w:line="276" w:lineRule="auto"/>
+        <w:ind w:left="0" w:right="0" w:firstLine="0"/>
+        <w:jc w:val="left"/>
+      </w:pPr>
+      <w:r>
+        <w:rPr>
+          <w:rFonts w:ascii="Times New Roman" w:hAnsi="Times New Roman" w:eastAsia="Times New Roman" w:cs="Times New Roman"/>
+          <w:b w:val="0"/>
+          <w:i w:val="0"/>
+          <w:color w:val="000000"/>
+          <w:sz w:val="22"/>
+          <w:u w:val="none"/>
+        </w:rPr>
+        <w:t>Приложение Б</w:t>
+        <w:tab/>
+      </w:r>
+      <w:fldSimple w:instr="PAGEREF _LabSection8">
+        <w:r>
+          <w:t>20</w:t>
+        </w:r>
+      </w:fldSimple>
+      <w:r>
+        <w:rPr>
+          <w:rFonts w:ascii="Times New Roman" w:hAnsi="Times New Roman" w:eastAsia="Times New Roman" w:cs="Times New Roman"/>
+          <w:b w:val="0"/>
+          <w:i w:val="0"/>
+          <w:color w:val="000000"/>
+          <w:sz w:val="22"/>
+          <w:u w:val="none"/>
+        </w:rPr>
+        <w:fldChar w:fldCharType="end"/>
+      </w:r>
+    </w:p>
+    <w:p>
+      <w:pPr>
+        <w:pStyle w:val="Heading1"/>
+        <w:keepNext/>
+        <w:keepLines/>
+        <w:pageBreakBefore/>
+        <w:spacing w:before="0" w:after="0" w:line="360" w:lineRule="auto"/>
+        <w:ind w:left="0" w:right="0" w:firstLine="0"/>
+        <w:jc w:val="center"/>
+      </w:pPr>
+      <w:bookmarkStart w:id="100" w:name="_LabSection0"/>
+      <w:r>
+        <w:rPr>
+          <w:rFonts w:ascii="Times New Roman" w:hAnsi="Times New Roman" w:eastAsia="Times New Roman" w:cs="Times New Roman"/>
+          <w:b/>
+          <w:i w:val="0"/>
+          <w:color w:val="000000"/>
+          <w:sz w:val="28"/>
+          <w:u w:val="none"/>
+        </w:rPr>
+        <w:t>1. Постановка задачи</w:t>
+      </w:r>
+      <w:bookmarkEnd w:id="100"/>
     </w:p>
     <w:p>
       <w:pPr>
@@ -308,7 +651,7 @@
           <w:sz w:val="28"/>
           <w:u w:val="none"/>
         </w:rPr>
-        <w:t>Вариант 1 — выделение контуров с помощью операторов Лапласа, Робертса и Собела.</w:t>
+        <w:t>Выделение контуров на изображении с применением следующих операторов:</w:t>
       </w:r>
     </w:p>
     <w:p>
@@ -329,7 +672,70 @@
           <w:sz w:val="28"/>
           <w:u w:val="none"/>
         </w:rPr>
-        <w:t>Вариант 2 — подавление гауссова шума пространственными усредняющими фильтрами. Зашумлённые изображения следует подготовить в графическом редакторе.</w:t>
+        <w:t>1. Оператор Лапласа;</w:t>
+      </w:r>
+    </w:p>
+    <w:p>
+      <w:pPr>
+        <w:keepNext w:val="0"/>
+        <w:keepLines w:val="0"/>
+        <w:pageBreakBefore w:val="0"/>
+        <w:spacing w:before="0" w:after="0" w:line="360" w:lineRule="auto"/>
+        <w:ind w:firstLine="720" w:left="0" w:right="0"/>
+        <w:jc w:val="both"/>
+      </w:pPr>
+      <w:r>
+        <w:rPr>
+          <w:rFonts w:ascii="Times New Roman" w:hAnsi="Times New Roman" w:eastAsia="Times New Roman" w:cs="Times New Roman"/>
+          <w:b w:val="0"/>
+          <w:i w:val="0"/>
+          <w:color w:val="000000"/>
+          <w:sz w:val="28"/>
+          <w:u w:val="none"/>
+        </w:rPr>
+        <w:t>2. Оператор Робертса;</w:t>
+      </w:r>
+    </w:p>
+    <w:p>
+      <w:pPr>
+        <w:keepNext w:val="0"/>
+        <w:keepLines w:val="0"/>
+        <w:pageBreakBefore w:val="0"/>
+        <w:spacing w:before="0" w:after="0" w:line="360" w:lineRule="auto"/>
+        <w:ind w:firstLine="720" w:left="0" w:right="0"/>
+        <w:jc w:val="both"/>
+      </w:pPr>
+      <w:r>
+        <w:rPr>
+          <w:rFonts w:ascii="Times New Roman" w:hAnsi="Times New Roman" w:eastAsia="Times New Roman" w:cs="Times New Roman"/>
+          <w:b w:val="0"/>
+          <w:i w:val="0"/>
+          <w:color w:val="000000"/>
+          <w:sz w:val="28"/>
+          <w:u w:val="none"/>
+        </w:rPr>
+        <w:t>3. Оператор Собела.</w:t>
+      </w:r>
+    </w:p>
+    <w:p>
+      <w:pPr>
+        <w:keepNext w:val="0"/>
+        <w:keepLines w:val="0"/>
+        <w:pageBreakBefore w:val="0"/>
+        <w:spacing w:before="0" w:after="0" w:line="360" w:lineRule="auto"/>
+        <w:ind w:firstLine="720" w:left="0" w:right="0"/>
+        <w:jc w:val="both"/>
+      </w:pPr>
+      <w:r>
+        <w:rPr>
+          <w:rFonts w:ascii="Times New Roman" w:hAnsi="Times New Roman" w:eastAsia="Times New Roman" w:cs="Times New Roman"/>
+          <w:b w:val="0"/>
+          <w:i w:val="0"/>
+          <w:color w:val="000000"/>
+          <w:sz w:val="28"/>
+          <w:u w:val="none"/>
+        </w:rPr>
+        <w:t>Подавление шума на изображениях в пространственной области усредняющими фильтрами. Для проверки используется гауссов шум, добавленный в Photoshop или другом графическом редакторе.</w:t>
       </w:r>
     </w:p>
     <w:p>
@@ -363,6 +769,7 @@
         <w:ind w:left="0" w:right="0" w:firstLine="0"/>
         <w:jc w:val="center"/>
       </w:pPr>
+      <w:bookmarkStart w:id="101" w:name="_LabSection1"/>
       <w:r>
         <w:rPr>
           <w:rFonts w:ascii="Times New Roman" w:hAnsi="Times New Roman" w:eastAsia="Times New Roman" w:cs="Times New Roman"/>
@@ -372,8 +779,9 @@
           <w:sz w:val="28"/>
           <w:u w:val="none"/>
         </w:rPr>
-        <w:t>Математическое описание алгоритма</w:t>
+        <w:t>2. Математическое описание алгоритма</w:t>
       </w:r>
+      <w:bookmarkEnd w:id="101"/>
     </w:p>
     <w:p>
       <w:pPr>
@@ -393,7 +801,7 @@
           <w:sz w:val="28"/>
           <w:u w:val="none"/>
         </w:rPr>
-        <w:t>Пусть f(x,y) задаёт яркость пикселя в позиции (x,y), а W и H — размеры изображения. Для восьмибитного представления допустимы значения от 0 до 255. Если исходное изображение цветное, перед обработкой вычисляется полутоновая яркость по формуле (1). Для одно- и двухканального входа используется существующий канал яркости.</w:t>
+        <w:t>Изображение рассматривается как двумерная дискретная функция f(x,y), где W и H обозначают ширину и высоту растра, а f — яркость пикселя в пределах 0–255. Цветной вход предварительно переводится в полутоновое представление по формуле (1). Для одно- и двухканального входа используется существующий канал яркости.</w:t>
       </w:r>
     </w:p>
     <w:p>
@@ -440,7 +848,7 @@
     </w:p>
     <w:p>
       <w:pPr>
-        <w:pStyle w:val="Heading1"/>
+        <w:pStyle w:val="Heading2"/>
         <w:keepNext/>
         <w:keepLines/>
         <w:pageBreakBefore w:val="0"/>
@@ -448,6 +856,7 @@
         <w:ind w:left="0" w:right="0" w:firstLine="0"/>
         <w:jc w:val="center"/>
       </w:pPr>
+      <w:bookmarkStart w:id="102" w:name="_LabSection2"/>
       <w:r>
         <w:rPr>
           <w:rFonts w:ascii="Times New Roman" w:hAnsi="Times New Roman" w:eastAsia="Times New Roman" w:cs="Times New Roman"/>
@@ -457,8 +866,9 @@
           <w:sz w:val="28"/>
           <w:u w:val="none"/>
         </w:rPr>
-        <w:t>Алгоритмы выделения контуров</w:t>
+        <w:t>2.1. Алгоритмы выделения контуров</w:t>
       </w:r>
+      <w:bookmarkEnd w:id="102"/>
     </w:p>
     <w:p>
       <w:pPr>
@@ -478,7 +888,7 @@
           <w:sz w:val="28"/>
           <w:u w:val="none"/>
         </w:rPr>
-        <w:t>Граница объекта проявляется как быстрое изменение яркости. Для её обнаружения используются дискретные приближения производных: первые разности у Робертса и Собела и вторая разность у Лапласа.</w:t>
+        <w:t>Контуры соответствуют резким локальным изменениям яркости, которые выявляются с помощью производных первого и второго порядков. В дискретном изображении они заменяются разностными приближениями.</w:t>
       </w:r>
     </w:p>
     <w:p>
@@ -520,7 +930,7 @@
           <w:sz w:val="28"/>
           <w:u w:val="none"/>
         </w:rPr>
-        <w:t>В окне 3×3 рассчитываются изменения яркости по горизонтали и вертикали. Маски (2) объединяют разностную оценку с локальным сглаживанием в поперечном направлении:</w:t>
+        <w:t>Оператор вычисляет градиент яркости, одновременно выполняя локальное сглаживание поперёк направления дифференцирования. Для этого применяются две пространственные маски размера 3×3 (2):</w:t>
       </w:r>
     </w:p>
     <w:p>
@@ -778,7 +1188,7 @@
           <w:sz w:val="28"/>
           <w:u w:val="none"/>
         </w:rPr>
-        <w:t>Вместо окна 3×3 используются две диагонали ячейки 2×2. Соответствующие маски записываются в виде (5):</w:t>
+        <w:t>Используются диагональные конечные разности в компактном окне 2×2. Этому соответствуют две маски (5):</w:t>
       </w:r>
     </w:p>
     <w:p>
@@ -969,7 +1379,7 @@
           <w:sz w:val="28"/>
           <w:u w:val="none"/>
         </w:rPr>
-        <w:t>В непрерывном представлении Лапласиан равен сумме вторых производных по двум пространственным координатам:</w:t>
+        <w:t>Лапласиан является оператором второй пространственной производной. В непрерывной форме он определяется суммой вторых производных по координатам:</w:t>
       </w:r>
     </w:p>
     <w:p>
@@ -1165,7 +1575,7 @@
     </w:p>
     <w:p>
       <w:pPr>
-        <w:pStyle w:val="Heading1"/>
+        <w:pStyle w:val="Heading2"/>
         <w:keepNext/>
         <w:keepLines/>
         <w:pageBreakBefore w:val="0"/>
@@ -1173,6 +1583,7 @@
         <w:ind w:left="0" w:right="0" w:firstLine="0"/>
         <w:jc w:val="center"/>
       </w:pPr>
+      <w:bookmarkStart w:id="103" w:name="_LabSection3"/>
       <w:r>
         <w:rPr>
           <w:rFonts w:ascii="Times New Roman" w:hAnsi="Times New Roman" w:eastAsia="Times New Roman" w:cs="Times New Roman"/>
@@ -1182,8 +1593,9 @@
           <w:sz w:val="28"/>
           <w:u w:val="none"/>
         </w:rPr>
-        <w:t>Линейные усредняющие фильтры</w:t>
+        <w:t>2.2. Линейные усредняющие фильтры</w:t>
       </w:r>
+      <w:bookmarkEnd w:id="103"/>
     </w:p>
     <w:p>
       <w:pPr>
@@ -1203,7 +1615,7 @@
           <w:sz w:val="28"/>
           <w:u w:val="none"/>
         </w:rPr>
-        <w:t>Для уменьшения случайных колебаний яркости выходной пиксель вычисляется по его окрестности. При этом сглаживается не только шум, но и полезные изменения сигнала, поэтому выбор окна влияет на сохранность границ и мелких объектов.</w:t>
+        <w:t>Усредняющие фильтры предназначены для ослабления аддитивного гауссова шума за счёт объединения значений в окрестности пикселя. Сглаживание затрагивает и полезные перепады яркости, поэтому размер окна влияет на сохранение деталей.</w:t>
       </w:r>
     </w:p>
     <w:p>
@@ -1245,7 +1657,7 @@
           <w:sz w:val="28"/>
           <w:u w:val="none"/>
         </w:rPr>
-        <w:t>Все значения квадратного окна имеют одинаковый вес. Для нечётного размера k радиус r=(k−1)/2, а число элементов равно k². Арифметическое усреднение описывается формулой (10):</w:t>
+        <w:t>Яркость пикселя заменяется средним арифметическим значений его окрестности размером k×k. Радиус окна r=(k−1)/2, а число элементов равно k². Вычисление выполняется по формуле (10):</w:t>
       </w:r>
     </w:p>
     <w:p>
@@ -1413,7 +1825,7 @@
           <w:sz w:val="28"/>
           <w:u w:val="none"/>
         </w:rPr>
-        <w:t>В отличие от равномерного окна, здесь центральные пиксели сильнее влияют на выход. Распределение весов задаётся гауссовой функцией (11), где σ определяет пространственный масштаб сглаживания:</w:t>
+        <w:t>Весовые коэффициенты задаются двумерной гауссовой функцией (11). Параметр σ определяет масштаб сглаживания: близкие к центру элементы получают больший вес, чем удалённые.</w:t>
       </w:r>
     </w:p>
     <w:p>
@@ -1636,6 +2048,7 @@
         <w:ind w:left="0" w:right="0" w:firstLine="0"/>
         <w:jc w:val="center"/>
       </w:pPr>
+      <w:bookmarkStart w:id="104" w:name="_LabSection4"/>
       <w:r>
         <w:rPr>
           <w:rFonts w:ascii="Times New Roman" w:hAnsi="Times New Roman" w:eastAsia="Times New Roman" w:cs="Times New Roman"/>
@@ -1645,8 +2058,9 @@
           <w:sz w:val="28"/>
           <w:u w:val="none"/>
         </w:rPr>
-        <w:t>Программное описание алгоритма</w:t>
+        <w:t>3. Программное описание алгоритма</w:t>
       </w:r>
+      <w:bookmarkEnd w:id="104"/>
     </w:p>
     <w:p>
       <w:pPr>
@@ -1666,7 +2080,7 @@
           <w:sz w:val="28"/>
           <w:u w:val="none"/>
         </w:rPr>
-        <w:t>Программа написана на C++17. Объект Image отвечает за память, PNG и доступ к пикселям. Его исходный интерфейс сохранён; алгоритмы вынесены в пространство имён Filters. Данные хранятся в std::unique_ptr&lt;uint8_t[]&gt;, а копирование создаёт независимый массив. Для серого входа getColor возвращает яркость в r, устанавливая g и b в ноль; setColor сохраняет альфа-канал. При недопустимых координатах доступ безопасно игнорируется.</w:t>
+        <w:t>Программная реализация выполнена на C++17. Поскольку по условию нельзя расширять класс Image, все алгоритмы обработки вынесены в пространство имён Filters. Класс Image сохраняет заданный интерфейс и отвечает за память, PNG и доступ к пикселям. Данные хранятся в std::unique_ptr&lt;uint8_t[]&gt;, а копирование создаёт независимый массив. Для серого входа getColor возвращает яркость в r, устанавливая g и b в ноль; setColor сохраняет альфа-канал. При недопустимых координатах доступ безопасно игнорируется.</w:t>
       </w:r>
     </w:p>
     <w:p>
@@ -1847,6 +2261,7 @@
         <w:ind w:left="0" w:right="0" w:firstLine="0"/>
         <w:jc w:val="center"/>
       </w:pPr>
+      <w:bookmarkStart w:id="105" w:name="_LabSection5"/>
       <w:r>
         <w:rPr>
           <w:rFonts w:ascii="Times New Roman" w:hAnsi="Times New Roman" w:eastAsia="Times New Roman" w:cs="Times New Roman"/>
@@ -1856,8 +2271,9 @@
           <w:sz w:val="28"/>
           <w:u w:val="none"/>
         </w:rPr>
-        <w:t>Результат работы программы</w:t>
+        <w:t>4. Результат работы программы</w:t>
       </w:r>
+      <w:bookmarkEnd w:id="105"/>
     </w:p>
     <w:p>
       <w:pPr>
@@ -1950,7 +2366,7 @@
           <w:sz w:val="28"/>
           <w:u w:val="none"/>
         </w:rPr>
-        <w:t>Рисунок 1. Слева — чистые изображения А и Б, справа — соответствующие версии с гауссовым шумом.</w:t>
+        <w:t>Рис. 1. Слева — чистые изображения А и Б, справа — соответствующие версии с гауссовым шумом.</w:t>
       </w:r>
     </w:p>
     <w:p>
@@ -1997,6 +2413,417 @@
     </w:p>
     <w:p>
       <w:pPr>
+        <w:keepNext w:val="0"/>
+        <w:keepLines w:val="0"/>
+        <w:pageBreakBefore w:val="0"/>
+        <w:spacing w:before="0" w:after="0" w:line="360" w:lineRule="auto"/>
+        <w:ind w:firstLine="720" w:left="0" w:right="0"/>
+        <w:jc w:val="both"/>
+      </w:pPr>
+      <w:r>
+        <w:rPr>
+          <w:rFonts w:ascii="Times New Roman" w:hAnsi="Times New Roman" w:eastAsia="Times New Roman" w:cs="Times New Roman"/>
+          <w:b w:val="0"/>
+          <w:i w:val="0"/>
+          <w:color w:val="000000"/>
+          <w:sz w:val="28"/>
+          <w:u w:val="none"/>
+        </w:rPr>
+        <w:t>Тестовые изображения подобраны так, чтобы содержать:</w:t>
+      </w:r>
+    </w:p>
+    <w:p>
+      <w:pPr>
+        <w:pStyle w:val="ListBullet"/>
+        <w:keepNext w:val="0"/>
+        <w:keepLines w:val="0"/>
+        <w:pageBreakBefore w:val="0"/>
+        <w:spacing w:before="0" w:after="0" w:line="360" w:lineRule="auto"/>
+        <w:ind w:left="720" w:right="0" w:hanging="360"/>
+        <w:jc w:val="both"/>
+      </w:pPr>
+      <w:r>
+        <w:rPr>
+          <w:rFonts w:ascii="Times New Roman" w:hAnsi="Times New Roman" w:eastAsia="Times New Roman" w:cs="Times New Roman"/>
+          <w:b w:val="0"/>
+          <w:i w:val="0"/>
+          <w:color w:val="000000"/>
+          <w:sz w:val="28"/>
+          <w:u w:val="none"/>
+        </w:rPr>
+        <w:t>мелкие детали и отчётливые границы — для проверки точности выделения контуров;</w:t>
+      </w:r>
+    </w:p>
+    <w:p>
+      <w:pPr>
+        <w:pStyle w:val="ListBullet"/>
+        <w:keepNext w:val="0"/>
+        <w:keepLines w:val="0"/>
+        <w:pageBreakBefore w:val="0"/>
+        <w:spacing w:before="0" w:after="0" w:line="360" w:lineRule="auto"/>
+        <w:ind w:left="720" w:right="0" w:hanging="360"/>
+        <w:jc w:val="both"/>
+      </w:pPr>
+      <w:r>
+        <w:rPr>
+          <w:rFonts w:ascii="Times New Roman" w:hAnsi="Times New Roman" w:eastAsia="Times New Roman" w:cs="Times New Roman"/>
+          <w:b w:val="0"/>
+          <w:i w:val="0"/>
+          <w:color w:val="000000"/>
+          <w:sz w:val="28"/>
+          <w:u w:val="none"/>
+        </w:rPr>
+        <w:t>однородные области — для оценки подавления случайных колебаний яркости;</w:t>
+      </w:r>
+    </w:p>
+    <w:p>
+      <w:pPr>
+        <w:pStyle w:val="ListBullet"/>
+        <w:keepNext w:val="0"/>
+        <w:keepLines w:val="0"/>
+        <w:pageBreakBefore w:val="0"/>
+        <w:spacing w:before="0" w:after="0" w:line="360" w:lineRule="auto"/>
+        <w:ind w:left="720" w:right="0" w:hanging="360"/>
+        <w:jc w:val="both"/>
+      </w:pPr>
+      <w:r>
+        <w:rPr>
+          <w:rFonts w:ascii="Times New Roman" w:hAnsi="Times New Roman" w:eastAsia="Times New Roman" w:cs="Times New Roman"/>
+          <w:b w:val="0"/>
+          <w:i w:val="0"/>
+          <w:color w:val="000000"/>
+          <w:sz w:val="28"/>
+          <w:u w:val="none"/>
+        </w:rPr>
+        <w:t>плавные переходы — для выявления искажений, возникающих при округлении.</w:t>
+      </w:r>
+    </w:p>
+    <w:p>
+      <w:pPr>
+        <w:keepNext w:val="0"/>
+        <w:keepLines w:val="0"/>
+        <w:pageBreakBefore w:val="0"/>
+        <w:spacing w:before="0" w:after="0" w:line="360" w:lineRule="auto"/>
+        <w:ind w:firstLine="720" w:left="0" w:right="0"/>
+        <w:jc w:val="both"/>
+      </w:pPr>
+      <w:r>
+        <w:rPr>
+          <w:rFonts w:ascii="Times New Roman" w:hAnsi="Times New Roman" w:eastAsia="Times New Roman" w:cs="Times New Roman"/>
+          <w:b w:val="0"/>
+          <w:i w:val="0"/>
+          <w:color w:val="000000"/>
+          <w:sz w:val="28"/>
+          <w:u w:val="none"/>
+        </w:rPr>
+        <w:t>Преимущества и ограничения методов оцениваются по результатам обработки и сопоставляются с математической моделью.</w:t>
+      </w:r>
+    </w:p>
+    <w:p>
+      <w:pPr>
+        <w:keepNext/>
+        <w:keepLines/>
+        <w:pageBreakBefore w:val="0"/>
+        <w:spacing w:before="0" w:after="0" w:line="360" w:lineRule="auto"/>
+        <w:ind w:left="0" w:right="0" w:firstLine="0"/>
+        <w:jc w:val="center"/>
+      </w:pPr>
+      <w:r>
+        <w:rPr>
+          <w:rFonts w:ascii="Times New Roman" w:hAnsi="Times New Roman" w:eastAsia="Times New Roman" w:cs="Times New Roman"/>
+          <w:b w:val="0"/>
+          <w:i w:val="0"/>
+          <w:color w:val="000000"/>
+          <w:sz w:val="28"/>
+          <w:u w:val="none"/>
+        </w:rPr>
+        <w:drawing>
+          <wp:inline xmlns:a="http://schemas.openxmlformats.org/drawingml/2006/main" xmlns:pic="http://schemas.openxmlformats.org/drawingml/2006/picture">
+            <wp:extent cx="5220000" cy="4298824"/>
+            <wp:docPr id="2" name="Picture 2"/>
+            <wp:cNvGraphicFramePr>
+              <a:graphicFrameLocks noChangeAspect="1"/>
+            </wp:cNvGraphicFramePr>
+            <a:graphic>
+              <a:graphicData uri="http://schemas.openxmlformats.org/drawingml/2006/picture">
+                <pic:pic>
+                  <pic:nvPicPr>
+                    <pic:cNvPr id="0" name="laplace.png"/>
+                    <pic:cNvPicPr/>
+                  </pic:nvPicPr>
+                  <pic:blipFill>
+                    <a:blip r:embed="rId11"/>
+                    <a:stretch>
+                      <a:fillRect/>
+                    </a:stretch>
+                  </pic:blipFill>
+                  <pic:spPr>
+                    <a:xfrm>
+                      <a:off x="0" y="0"/>
+                      <a:ext cx="5220000" cy="4298824"/>
+                    </a:xfrm>
+                    <a:prstGeom prst="rect"/>
+                  </pic:spPr>
+                </pic:pic>
+              </a:graphicData>
+            </a:graphic>
+          </wp:inline>
+        </w:drawing>
+      </w:r>
+    </w:p>
+    <w:p>
+      <w:pPr>
+        <w:keepNext w:val="0"/>
+        <w:keepLines/>
+        <w:pageBreakBefore w:val="0"/>
+        <w:spacing w:before="0" w:after="0" w:line="360" w:lineRule="auto"/>
+        <w:ind w:left="0" w:right="0" w:firstLine="720"/>
+        <w:jc w:val="center"/>
+      </w:pPr>
+      <w:r>
+        <w:rPr>
+          <w:rFonts w:ascii="Times New Roman" w:hAnsi="Times New Roman" w:eastAsia="Times New Roman" w:cs="Times New Roman"/>
+          <w:b w:val="0"/>
+          <w:i w:val="0"/>
+          <w:color w:val="000000"/>
+          <w:sz w:val="28"/>
+          <w:u w:val="none"/>
+        </w:rPr>
+        <w:t>Рис. 2. Результат действия оператора Лапласа: сверху А, снизу Б; слева чистый вход, справа шумный.</w:t>
+      </w:r>
+    </w:p>
+    <w:p>
+      <w:pPr>
+        <w:keepNext w:val="0"/>
+        <w:keepLines w:val="0"/>
+        <w:pageBreakBefore w:val="0"/>
+        <w:spacing w:before="0" w:after="0" w:line="360" w:lineRule="auto"/>
+        <w:ind w:firstLine="720" w:left="0" w:right="0"/>
+        <w:jc w:val="both"/>
+      </w:pPr>
+      <w:r>
+        <w:rPr>
+          <w:rFonts w:ascii="Times New Roman" w:hAnsi="Times New Roman" w:eastAsia="Times New Roman" w:cs="Times New Roman"/>
+          <w:b w:val="0"/>
+          <w:i w:val="0"/>
+          <w:color w:val="000000"/>
+          <w:sz w:val="28"/>
+          <w:u w:val="none"/>
+        </w:rPr>
+        <w:t>Оператор Лапласа подчёркивает перепады яркости, но сильно реагирует и на шум. После взятия модуля становятся видимыми отклики разных знаков по обе стороны границы, поэтому она может выглядеть двойной. На шумном фоне появляется множество дополнительных откликов.</w:t>
+      </w:r>
+    </w:p>
+    <w:p>
+      <w:pPr>
+        <w:keepNext/>
+        <w:keepLines/>
+        <w:pageBreakBefore w:val="0"/>
+        <w:spacing w:before="0" w:after="0" w:line="360" w:lineRule="auto"/>
+        <w:ind w:left="0" w:right="0" w:firstLine="0"/>
+        <w:jc w:val="center"/>
+      </w:pPr>
+      <w:r>
+        <w:rPr>
+          <w:rFonts w:ascii="Times New Roman" w:hAnsi="Times New Roman" w:eastAsia="Times New Roman" w:cs="Times New Roman"/>
+          <w:b w:val="0"/>
+          <w:i w:val="0"/>
+          <w:color w:val="000000"/>
+          <w:sz w:val="28"/>
+          <w:u w:val="none"/>
+        </w:rPr>
+        <w:drawing>
+          <wp:inline xmlns:a="http://schemas.openxmlformats.org/drawingml/2006/main" xmlns:pic="http://schemas.openxmlformats.org/drawingml/2006/picture">
+            <wp:extent cx="5220000" cy="4298824"/>
+            <wp:docPr id="3" name="Picture 3"/>
+            <wp:cNvGraphicFramePr>
+              <a:graphicFrameLocks noChangeAspect="1"/>
+            </wp:cNvGraphicFramePr>
+            <a:graphic>
+              <a:graphicData uri="http://schemas.openxmlformats.org/drawingml/2006/picture">
+                <pic:pic>
+                  <pic:nvPicPr>
+                    <pic:cNvPr id="0" name="roberts.png"/>
+                    <pic:cNvPicPr/>
+                  </pic:nvPicPr>
+                  <pic:blipFill>
+                    <a:blip r:embed="rId12"/>
+                    <a:stretch>
+                      <a:fillRect/>
+                    </a:stretch>
+                  </pic:blipFill>
+                  <pic:spPr>
+                    <a:xfrm>
+                      <a:off x="0" y="0"/>
+                      <a:ext cx="5220000" cy="4298824"/>
+                    </a:xfrm>
+                    <a:prstGeom prst="rect"/>
+                  </pic:spPr>
+                </pic:pic>
+              </a:graphicData>
+            </a:graphic>
+          </wp:inline>
+        </w:drawing>
+      </w:r>
+    </w:p>
+    <w:p>
+      <w:pPr>
+        <w:keepNext w:val="0"/>
+        <w:keepLines/>
+        <w:pageBreakBefore w:val="0"/>
+        <w:spacing w:before="0" w:after="0" w:line="360" w:lineRule="auto"/>
+        <w:ind w:left="0" w:right="0" w:firstLine="720"/>
+        <w:jc w:val="center"/>
+      </w:pPr>
+      <w:r>
+        <w:rPr>
+          <w:rFonts w:ascii="Times New Roman" w:hAnsi="Times New Roman" w:eastAsia="Times New Roman" w:cs="Times New Roman"/>
+          <w:b w:val="0"/>
+          <w:i w:val="0"/>
+          <w:color w:val="000000"/>
+          <w:sz w:val="28"/>
+          <w:u w:val="none"/>
+        </w:rPr>
+        <w:t>Рис. 3. Результат действия оператора Робертса в том же расположении.</w:t>
+      </w:r>
+    </w:p>
+    <w:p>
+      <w:pPr>
+        <w:keepNext w:val="0"/>
+        <w:keepLines w:val="0"/>
+        <w:pageBreakBefore w:val="0"/>
+        <w:spacing w:before="0" w:after="0" w:line="360" w:lineRule="auto"/>
+        <w:ind w:firstLine="720" w:left="0" w:right="0"/>
+        <w:jc w:val="both"/>
+      </w:pPr>
+      <w:r>
+        <w:rPr>
+          <w:rFonts w:ascii="Times New Roman" w:hAnsi="Times New Roman" w:eastAsia="Times New Roman" w:cs="Times New Roman"/>
+          <w:b w:val="0"/>
+          <w:i w:val="0"/>
+          <w:color w:val="000000"/>
+          <w:sz w:val="28"/>
+          <w:u w:val="none"/>
+        </w:rPr>
+        <w:t>Компактное окно 2×2 позволяет получить тонкие границы. Однако отсутствие предварительного сглаживания делает метод чувствительным к случайным перепадам: на однородных областях шумного входа возникают ложные контуры.</w:t>
+      </w:r>
+    </w:p>
+    <w:p>
+      <w:pPr>
+        <w:keepNext/>
+        <w:keepLines/>
+        <w:pageBreakBefore w:val="0"/>
+        <w:spacing w:before="0" w:after="0" w:line="360" w:lineRule="auto"/>
+        <w:ind w:left="0" w:right="0" w:firstLine="0"/>
+        <w:jc w:val="center"/>
+      </w:pPr>
+      <w:r>
+        <w:rPr>
+          <w:rFonts w:ascii="Times New Roman" w:hAnsi="Times New Roman" w:eastAsia="Times New Roman" w:cs="Times New Roman"/>
+          <w:b w:val="0"/>
+          <w:i w:val="0"/>
+          <w:color w:val="000000"/>
+          <w:sz w:val="28"/>
+          <w:u w:val="none"/>
+        </w:rPr>
+        <w:drawing>
+          <wp:inline xmlns:a="http://schemas.openxmlformats.org/drawingml/2006/main" xmlns:pic="http://schemas.openxmlformats.org/drawingml/2006/picture">
+            <wp:extent cx="5220000" cy="4298824"/>
+            <wp:docPr id="4" name="Picture 4"/>
+            <wp:cNvGraphicFramePr>
+              <a:graphicFrameLocks noChangeAspect="1"/>
+            </wp:cNvGraphicFramePr>
+            <a:graphic>
+              <a:graphicData uri="http://schemas.openxmlformats.org/drawingml/2006/picture">
+                <pic:pic>
+                  <pic:nvPicPr>
+                    <pic:cNvPr id="0" name="sobel.png"/>
+                    <pic:cNvPicPr/>
+                  </pic:nvPicPr>
+                  <pic:blipFill>
+                    <a:blip r:embed="rId13"/>
+                    <a:stretch>
+                      <a:fillRect/>
+                    </a:stretch>
+                  </pic:blipFill>
+                  <pic:spPr>
+                    <a:xfrm>
+                      <a:off x="0" y="0"/>
+                      <a:ext cx="5220000" cy="4298824"/>
+                    </a:xfrm>
+                    <a:prstGeom prst="rect"/>
+                  </pic:spPr>
+                </pic:pic>
+              </a:graphicData>
+            </a:graphic>
+          </wp:inline>
+        </w:drawing>
+      </w:r>
+    </w:p>
+    <w:p>
+      <w:pPr>
+        <w:keepNext w:val="0"/>
+        <w:keepLines/>
+        <w:pageBreakBefore w:val="0"/>
+        <w:spacing w:before="0" w:after="0" w:line="360" w:lineRule="auto"/>
+        <w:ind w:left="0" w:right="0" w:firstLine="720"/>
+        <w:jc w:val="center"/>
+      </w:pPr>
+      <w:r>
+        <w:rPr>
+          <w:rFonts w:ascii="Times New Roman" w:hAnsi="Times New Roman" w:eastAsia="Times New Roman" w:cs="Times New Roman"/>
+          <w:b w:val="0"/>
+          <w:i w:val="0"/>
+          <w:color w:val="000000"/>
+          <w:sz w:val="28"/>
+          <w:u w:val="none"/>
+        </w:rPr>
+        <w:t>Рис. 4. Результат действия оператора Собела в том же расположении.</w:t>
+      </w:r>
+    </w:p>
+    <w:p>
+      <w:pPr>
+        <w:keepNext w:val="0"/>
+        <w:keepLines w:val="0"/>
+        <w:pageBreakBefore w:val="0"/>
+        <w:spacing w:before="0" w:after="0" w:line="360" w:lineRule="auto"/>
+        <w:ind w:firstLine="720" w:left="0" w:right="0"/>
+        <w:jc w:val="both"/>
+      </w:pPr>
+      <w:r>
+        <w:rPr>
+          <w:rFonts w:ascii="Times New Roman" w:hAnsi="Times New Roman" w:eastAsia="Times New Roman" w:cs="Times New Roman"/>
+          <w:b w:val="0"/>
+          <w:i w:val="0"/>
+          <w:color w:val="000000"/>
+          <w:sz w:val="28"/>
+          <w:u w:val="none"/>
+        </w:rPr>
+        <w:t>Собел совмещает оценку градиента со сглаживанием в поперечном направлении. Он формирует более широкий отклик, чем Робертс, но также выделяет шумовые изменения. Яркость разных контурных карт нельзя напрямую считать мерой качества: коэффициенты масок и степень насыщения у операторов различаются.</w:t>
+      </w:r>
+    </w:p>
+    <w:p>
+      <w:pPr>
+        <w:keepNext w:val="0"/>
+        <w:keepLines w:val="0"/>
+        <w:pageBreakBefore w:val="0"/>
+        <w:spacing w:before="0" w:after="0" w:line="360" w:lineRule="auto"/>
+        <w:ind w:firstLine="720" w:left="0" w:right="0"/>
+        <w:jc w:val="both"/>
+      </w:pPr>
+      <w:r>
+        <w:rPr>
+          <w:rFonts w:ascii="Times New Roman" w:hAnsi="Times New Roman" w:eastAsia="Times New Roman" w:cs="Times New Roman"/>
+          <w:b w:val="0"/>
+          <w:i w:val="0"/>
+          <w:color w:val="000000"/>
+          <w:sz w:val="28"/>
+          <w:u w:val="none"/>
+        </w:rPr>
+        <w:t>На наборе Б близкие границы тонких штрихов и клеток могут сливаться. Внутри линейного градиента вторая разность близка к нулю, а первые разности реагируют на плавное изменение яркости. Округление значений и ограничение сильных откликов до 255 влияют на отображаемый результат.</w:t>
+      </w:r>
+    </w:p>
+    <w:p>
+      <w:pPr>
         <w:keepNext/>
         <w:keepLines/>
         <w:pageBreakBefore w:val="0"/>
@@ -2016,7 +2843,7 @@
         <w:drawing>
           <wp:inline xmlns:a="http://schemas.openxmlformats.org/drawingml/2006/main" xmlns:pic="http://schemas.openxmlformats.org/drawingml/2006/picture">
             <wp:extent cx="5940000" cy="2445882"/>
-            <wp:docPr id="2" name="Picture 2"/>
+            <wp:docPr id="5" name="Picture 5"/>
             <wp:cNvGraphicFramePr>
               <a:graphicFrameLocks noChangeAspect="1"/>
             </wp:cNvGraphicFramePr>
@@ -2024,11 +2851,11 @@
               <a:graphicData uri="http://schemas.openxmlformats.org/drawingml/2006/picture">
                 <pic:pic>
                   <pic:nvPicPr>
-                    <pic:cNvPr id="0" name="edges.png"/>
+                    <pic:cNvPr id="0" name="mean3.png"/>
                     <pic:cNvPicPr/>
                   </pic:nvPicPr>
                   <pic:blipFill>
-                    <a:blip r:embed="rId11"/>
+                    <a:blip r:embed="rId14"/>
                     <a:stretch>
                       <a:fillRect/>
                     </a:stretch>
@@ -2065,143 +2892,7 @@
           <w:sz w:val="28"/>
           <w:u w:val="none"/>
         </w:rPr>
-        <w:t>Рисунок 2. Контуры чистых сцен: сверху А, снизу Б. В каждом ряду — вход, Лаплас, Робертс и Собел.</w:t>
-      </w:r>
-    </w:p>
-    <w:p>
-      <w:pPr>
-        <w:keepNext w:val="0"/>
-        <w:keepLines w:val="0"/>
-        <w:pageBreakBefore w:val="0"/>
-        <w:spacing w:before="0" w:after="0" w:line="360" w:lineRule="auto"/>
-        <w:ind w:firstLine="720" w:left="0" w:right="0"/>
-        <w:jc w:val="both"/>
-      </w:pPr>
-      <w:r>
-        <w:rPr>
-          <w:rFonts w:ascii="Times New Roman" w:hAnsi="Times New Roman" w:eastAsia="Times New Roman" w:cs="Times New Roman"/>
-          <w:b w:val="0"/>
-          <w:i w:val="0"/>
-          <w:color w:val="000000"/>
-          <w:sz w:val="28"/>
-          <w:u w:val="none"/>
-        </w:rPr>
-        <w:t>Все три оператора реагируют на границы крупных фигур. У Лапласа после взятия модуля становятся видимыми отклики разных знаков с обеих сторон перепада, что объясняет двойную границу. Робертс даёт компактный отклик на диагональных разностях, а Собел формирует более широкий и яркий контур из-за маски 3×3 и её коэффициентов. Поэтому сравнение только по яркости линии недостаточно.</w:t>
-      </w:r>
-    </w:p>
-    <w:p>
-      <w:pPr>
-        <w:keepNext w:val="0"/>
-        <w:keepLines w:val="0"/>
-        <w:pageBreakBefore w:val="0"/>
-        <w:spacing w:before="0" w:after="0" w:line="360" w:lineRule="auto"/>
-        <w:ind w:firstLine="720" w:left="0" w:right="0"/>
-        <w:jc w:val="both"/>
-      </w:pPr>
-      <w:r>
-        <w:rPr>
-          <w:rFonts w:ascii="Times New Roman" w:hAnsi="Times New Roman" w:eastAsia="Times New Roman" w:cs="Times New Roman"/>
-          <w:b w:val="0"/>
-          <w:i w:val="0"/>
-          <w:color w:val="000000"/>
-          <w:sz w:val="28"/>
-          <w:u w:val="none"/>
-        </w:rPr>
-        <w:t>На сцене с деталями рядом расположенные границы штрихов и клеток могут сливаться. Внутри линейного градиента вторая разность близка к нулю, тогда как первые разности реагируют на плавное изменение яркости. Остаточные слабые отклики связаны в том числе с округлением значений при создании градиента.</w:t>
-      </w:r>
-    </w:p>
-    <w:p>
-      <w:pPr>
-        <w:keepNext/>
-        <w:keepLines/>
-        <w:pageBreakBefore w:val="0"/>
-        <w:spacing w:before="0" w:after="0" w:line="360" w:lineRule="auto"/>
-        <w:ind w:left="0" w:right="0" w:firstLine="0"/>
-        <w:jc w:val="center"/>
-      </w:pPr>
-      <w:r>
-        <w:rPr>
-          <w:rFonts w:ascii="Times New Roman" w:hAnsi="Times New Roman" w:eastAsia="Times New Roman" w:cs="Times New Roman"/>
-          <w:b w:val="0"/>
-          <w:i w:val="0"/>
-          <w:color w:val="000000"/>
-          <w:sz w:val="28"/>
-          <w:u w:val="none"/>
-        </w:rPr>
-        <w:drawing>
-          <wp:inline xmlns:a="http://schemas.openxmlformats.org/drawingml/2006/main" xmlns:pic="http://schemas.openxmlformats.org/drawingml/2006/picture">
-            <wp:extent cx="5940000" cy="1222941"/>
-            <wp:docPr id="3" name="Picture 3"/>
-            <wp:cNvGraphicFramePr>
-              <a:graphicFrameLocks noChangeAspect="1"/>
-            </wp:cNvGraphicFramePr>
-            <a:graphic>
-              <a:graphicData uri="http://schemas.openxmlformats.org/drawingml/2006/picture">
-                <pic:pic>
-                  <pic:nvPicPr>
-                    <pic:cNvPr id="0" name="edges_noisy.png"/>
-                    <pic:cNvPicPr/>
-                  </pic:nvPicPr>
-                  <pic:blipFill>
-                    <a:blip r:embed="rId12"/>
-                    <a:stretch>
-                      <a:fillRect/>
-                    </a:stretch>
-                  </pic:blipFill>
-                  <pic:spPr>
-                    <a:xfrm>
-                      <a:off x="0" y="0"/>
-                      <a:ext cx="5940000" cy="1222941"/>
-                    </a:xfrm>
-                    <a:prstGeom prst="rect"/>
-                  </pic:spPr>
-                </pic:pic>
-              </a:graphicData>
-            </a:graphic>
-          </wp:inline>
-        </w:drawing>
-      </w:r>
-    </w:p>
-    <w:p>
-      <w:pPr>
-        <w:keepNext w:val="0"/>
-        <w:keepLines/>
-        <w:pageBreakBefore w:val="0"/>
-        <w:spacing w:before="0" w:after="0" w:line="360" w:lineRule="auto"/>
-        <w:ind w:left="0" w:right="0" w:firstLine="720"/>
-        <w:jc w:val="center"/>
-      </w:pPr>
-      <w:r>
-        <w:rPr>
-          <w:rFonts w:ascii="Times New Roman" w:hAnsi="Times New Roman" w:eastAsia="Times New Roman" w:cs="Times New Roman"/>
-          <w:b w:val="0"/>
-          <w:i w:val="0"/>
-          <w:color w:val="000000"/>
-          <w:sz w:val="28"/>
-          <w:u w:val="none"/>
-        </w:rPr>
-        <w:t>Рисунок 3. Шумный вход А и результаты контурных операторов в том же порядке.</w:t>
-      </w:r>
-    </w:p>
-    <w:p>
-      <w:pPr>
-        <w:keepNext w:val="0"/>
-        <w:keepLines w:val="0"/>
-        <w:pageBreakBefore w:val="0"/>
-        <w:spacing w:before="0" w:after="0" w:line="360" w:lineRule="auto"/>
-        <w:ind w:firstLine="720" w:left="0" w:right="0"/>
-        <w:jc w:val="both"/>
-      </w:pPr>
-      <w:r>
-        <w:rPr>
-          <w:rFonts w:ascii="Times New Roman" w:hAnsi="Times New Roman" w:eastAsia="Times New Roman" w:cs="Times New Roman"/>
-          <w:b w:val="0"/>
-          <w:i w:val="0"/>
-          <w:color w:val="000000"/>
-          <w:sz w:val="28"/>
-          <w:u w:val="none"/>
-        </w:rPr>
-        <w:t>При обработке шумного входа появляются ложные контуры на исходно однородных участках. Случайные отклонения также являются перепадами яркости и усиливаются разностными операциями. Поперечное сглаживание Собела снижает влияние отдельных колебаний, но не устраняет его полностью. Значения выше 255 насыщаются по (4), поэтому после ограничения яркость уже не отражает точную величину производной.</w:t>
+        <w:t>Рис. 5. Результат действия прямоугольного усредняющего фильтра 3×3: слева А, справа Б.</w:t>
       </w:r>
     </w:p>
     <w:p>
@@ -2225,7 +2916,7 @@
         <w:drawing>
           <wp:inline xmlns:a="http://schemas.openxmlformats.org/drawingml/2006/main" xmlns:pic="http://schemas.openxmlformats.org/drawingml/2006/picture">
             <wp:extent cx="5940000" cy="2445882"/>
-            <wp:docPr id="4" name="Picture 4"/>
+            <wp:docPr id="6" name="Picture 6"/>
             <wp:cNvGraphicFramePr>
               <a:graphicFrameLocks noChangeAspect="1"/>
             </wp:cNvGraphicFramePr>
@@ -2233,11 +2924,11 @@
               <a:graphicData uri="http://schemas.openxmlformats.org/drawingml/2006/picture">
                 <pic:pic>
                   <pic:nvPicPr>
-                    <pic:cNvPr id="0" name="averages.png"/>
+                    <pic:cNvPr id="0" name="mean5.png"/>
                     <pic:cNvPicPr/>
                   </pic:nvPicPr>
                   <pic:blipFill>
-                    <a:blip r:embed="rId13"/>
+                    <a:blip r:embed="rId15"/>
                     <a:stretch>
                       <a:fillRect/>
                     </a:stretch>
@@ -2274,7 +2965,101 @@
           <w:sz w:val="28"/>
           <w:u w:val="none"/>
         </w:rPr>
-        <w:t>Рисунок 4. Подавление шума: вход, среднее 3×3, среднее 5×5 и Гаусс 5×5 с σ=1. Сверху А, снизу Б.</w:t>
+        <w:t>Рис. 6. Результат действия прямоугольного усредняющего фильтра 5×5 в том же расположении.</w:t>
+      </w:r>
+    </w:p>
+    <w:p>
+      <w:pPr>
+        <w:keepNext/>
+        <w:keepLines/>
+        <w:pageBreakBefore w:val="0"/>
+        <w:spacing w:before="0" w:after="0" w:line="360" w:lineRule="auto"/>
+        <w:ind w:left="0" w:right="0" w:firstLine="0"/>
+        <w:jc w:val="center"/>
+      </w:pPr>
+      <w:r>
+        <w:rPr>
+          <w:rFonts w:ascii="Times New Roman" w:hAnsi="Times New Roman" w:eastAsia="Times New Roman" w:cs="Times New Roman"/>
+          <w:b w:val="0"/>
+          <w:i w:val="0"/>
+          <w:color w:val="000000"/>
+          <w:sz w:val="28"/>
+          <w:u w:val="none"/>
+        </w:rPr>
+        <w:drawing>
+          <wp:inline xmlns:a="http://schemas.openxmlformats.org/drawingml/2006/main" xmlns:pic="http://schemas.openxmlformats.org/drawingml/2006/picture">
+            <wp:extent cx="5940000" cy="2445882"/>
+            <wp:docPr id="7" name="Picture 7"/>
+            <wp:cNvGraphicFramePr>
+              <a:graphicFrameLocks noChangeAspect="1"/>
+            </wp:cNvGraphicFramePr>
+            <a:graphic>
+              <a:graphicData uri="http://schemas.openxmlformats.org/drawingml/2006/picture">
+                <pic:pic>
+                  <pic:nvPicPr>
+                    <pic:cNvPr id="0" name="gauss5.png"/>
+                    <pic:cNvPicPr/>
+                  </pic:nvPicPr>
+                  <pic:blipFill>
+                    <a:blip r:embed="rId16"/>
+                    <a:stretch>
+                      <a:fillRect/>
+                    </a:stretch>
+                  </pic:blipFill>
+                  <pic:spPr>
+                    <a:xfrm>
+                      <a:off x="0" y="0"/>
+                      <a:ext cx="5940000" cy="2445882"/>
+                    </a:xfrm>
+                    <a:prstGeom prst="rect"/>
+                  </pic:spPr>
+                </pic:pic>
+              </a:graphicData>
+            </a:graphic>
+          </wp:inline>
+        </w:drawing>
+      </w:r>
+    </w:p>
+    <w:p>
+      <w:pPr>
+        <w:keepNext w:val="0"/>
+        <w:keepLines/>
+        <w:pageBreakBefore w:val="0"/>
+        <w:spacing w:before="0" w:after="0" w:line="360" w:lineRule="auto"/>
+        <w:ind w:left="0" w:right="0" w:firstLine="720"/>
+        <w:jc w:val="center"/>
+      </w:pPr>
+      <w:r>
+        <w:rPr>
+          <w:rFonts w:ascii="Times New Roman" w:hAnsi="Times New Roman" w:eastAsia="Times New Roman" w:cs="Times New Roman"/>
+          <w:b w:val="0"/>
+          <w:i w:val="0"/>
+          <w:color w:val="000000"/>
+          <w:sz w:val="28"/>
+          <w:u w:val="none"/>
+        </w:rPr>
+        <w:t>Рис. 7. Результат действия усредняющего фильтра Гаусса 5×5, σ=1.</w:t>
+      </w:r>
+    </w:p>
+    <w:p>
+      <w:pPr>
+        <w:keepNext w:val="0"/>
+        <w:keepLines w:val="0"/>
+        <w:pageBreakBefore w:val="0"/>
+        <w:spacing w:before="0" w:after="0" w:line="360" w:lineRule="auto"/>
+        <w:ind w:firstLine="720" w:left="0" w:right="0"/>
+        <w:jc w:val="both"/>
+      </w:pPr>
+      <w:r>
+        <w:rPr>
+          <w:rFonts w:ascii="Times New Roman" w:hAnsi="Times New Roman" w:eastAsia="Times New Roman" w:cs="Times New Roman"/>
+          <w:b w:val="0"/>
+          <w:i w:val="0"/>
+          <w:color w:val="000000"/>
+          <w:sz w:val="28"/>
+          <w:u w:val="none"/>
+        </w:rPr>
+        <w:t>Линейное усреднение уменьшает гауссов шум, но сопровождается размытием контрастных границ. Гауссово окно слабее учитывает удалённые пиксели, поэтому в данном эксперименте оно лучше сохраняет переходы, чем равномерное окно 5×5. Полностью избежать потери деталей при увеличении области усреднения не удаётся.</w:t>
       </w:r>
     </w:p>
     <w:p>
@@ -3035,6 +3820,7 @@
         <w:ind w:left="0" w:right="0" w:firstLine="0"/>
         <w:jc w:val="center"/>
       </w:pPr>
+      <w:bookmarkStart w:id="106" w:name="_LabSection6"/>
       <w:r>
         <w:rPr>
           <w:rFonts w:ascii="Times New Roman" w:hAnsi="Times New Roman" w:eastAsia="Times New Roman" w:cs="Times New Roman"/>
@@ -3044,8 +3830,9 @@
           <w:sz w:val="28"/>
           <w:u w:val="none"/>
         </w:rPr>
-        <w:t>Заключение</w:t>
+        <w:t>5. Заключение</w:t>
       </w:r>
+      <w:bookmarkEnd w:id="106"/>
     </w:p>
     <w:p>
       <w:pPr>
@@ -3065,7 +3852,7 @@
           <w:sz w:val="28"/>
           <w:u w:val="none"/>
         </w:rPr>
-        <w:t>В работе выполнены два выбранных варианта: выделение контуров и пространственное подавление гауссова шума усреднением. Реализован заданный класс Image, а функции обработки отделены от хранения изображения. Четыре демонстрационных запуска сформировали 28 выходных PNG, проверка из 18 тестовых случаев завершилась успешно.</w:t>
+        <w:t>В результате достигнута цель работы: реализованы методы выделения контуров и пространственного подавления гауссова шума усредняющими фильтрами. Реализован заданный класс Image, а функции обработки отделены от хранения изображения. Четыре демонстрационных запуска сформировали 28 выходных PNG, проверка из 18 тестовых случаев завершилась успешно.</w:t>
       </w:r>
     </w:p>
     <w:p>
@@ -3099,6 +3886,7 @@
         <w:ind w:left="0" w:right="0" w:firstLine="0"/>
         <w:jc w:val="center"/>
       </w:pPr>
+      <w:bookmarkStart w:id="107" w:name="_LabSection7"/>
       <w:r>
         <w:rPr>
           <w:rFonts w:ascii="Times New Roman" w:hAnsi="Times New Roman" w:eastAsia="Times New Roman" w:cs="Times New Roman"/>
@@ -3110,6 +3898,7 @@
         </w:rPr>
         <w:t>Приложение А</w:t>
       </w:r>
+      <w:bookmarkEnd w:id="107"/>
     </w:p>
     <w:p>
       <w:pPr>
@@ -3129,7 +3918,7 @@
           <w:sz w:val="28"/>
           <w:u w:val="none"/>
         </w:rPr>
-        <w:t>Фрагменты Filters.cpp для выделения контуров. Сначала приведены общие вспомогательные функции и преобразование яркости, затем расчёт трёх операторов. Общие функции также используются листингом приложения Б. Полный проект содержит необходимые объявления и точку входа.</w:t>
+        <w:t>Реализация операторов applySobel, applyRoberts и applyLaplacian. В начале листинга приведены общие вспомогательные функции и преобразование в полутоновый вид; они также используются в приложении Б.</w:t>
       </w:r>
     </w:p>
     <w:p>
@@ -5027,6 +5816,7 @@
         <w:ind w:left="0" w:right="0" w:firstLine="0"/>
         <w:jc w:val="center"/>
       </w:pPr>
+      <w:bookmarkStart w:id="108" w:name="_LabSection8"/>
       <w:r>
         <w:rPr>
           <w:rFonts w:ascii="Times New Roman" w:hAnsi="Times New Roman" w:eastAsia="Times New Roman" w:cs="Times New Roman"/>
@@ -5038,6 +5828,7 @@
         </w:rPr>
         <w:t>Приложение Б</w:t>
       </w:r>
+      <w:bookmarkEnd w:id="108"/>
     </w:p>
     <w:p>
       <w:pPr>
@@ -5057,7 +5848,7 @@
           <w:sz w:val="28"/>
           <w:u w:val="none"/>
         </w:rPr>
-        <w:t>Фрагменты Filters.cpp для усредняющих фильтров. Внутренний расчёт average используется функциями applyBoxBlur и applyGaussianBlur; toGrayscale, sample и put приведены в приложении А.</w:t>
+        <w:t>Реализация усреднения applyBoxBlur и applyGaussianBlur. Общий расчёт average использует вспомогательные функции, приведённые в приложении А.</w:t>
       </w:r>
     </w:p>
     <w:p>
@@ -18495,6 +19286,42 @@
         <w:shd w:val="clear" w:color="auto" w:fill="FBCAA2" w:themeFill="accent6" w:themeFillTint="7F"/>
       </w:tcPr>
     </w:tblStylePr>
+  </w:style>
+  <w:style w:type="paragraph" w:customStyle="1" w:styleId="TOC1">
+    <w:name w:val="TOC 1"/>
+    <w:basedOn w:val="Normal"/>
+    <w:pPr>
+      <w:tabs>
+        <w:tab w:pos="9350" w:val="right" w:leader="dot"/>
+      </w:tabs>
+      <w:spacing w:before="0" w:after="100" w:line="276" w:lineRule="auto"/>
+      <w:ind w:firstLine="0" w:left="0"/>
+      <w:jc w:val="left"/>
+    </w:pPr>
+    <w:rPr>
+      <w:rFonts w:ascii="Times New Roman" w:hAnsi="Times New Roman"/>
+      <w:b w:val="0"/>
+      <w:color w:val="000000"/>
+      <w:sz w:val="22"/>
+    </w:rPr>
+  </w:style>
+  <w:style w:type="paragraph" w:customStyle="1" w:styleId="TOC2">
+    <w:name w:val="TOC 2"/>
+    <w:basedOn w:val="Normal"/>
+    <w:pPr>
+      <w:tabs>
+        <w:tab w:pos="9350" w:val="right" w:leader="dot"/>
+      </w:tabs>
+      <w:spacing w:before="0" w:after="100" w:line="276" w:lineRule="auto"/>
+      <w:ind w:firstLine="0" w:left="0"/>
+      <w:jc w:val="left"/>
+    </w:pPr>
+    <w:rPr>
+      <w:rFonts w:ascii="Times New Roman" w:hAnsi="Times New Roman"/>
+      <w:b w:val="0"/>
+      <w:color w:val="000000"/>
+      <w:sz w:val="22"/>
+    </w:rPr>
   </w:style>
 </w:styles>
 </file>

</xml_diff>